<commit_message>
chore(docs): sync constitution docx/html/pdf exports after §11.4.166 semgrep mandate
</commit_message>
<xml_diff>
--- a/GEMINI.docx
+++ b/GEMINI.docx
@@ -2,7 +2,15 @@
 <file path=word/document.xml><?xml version="1.0" encoding="utf-8"?>
 <w:document xmlns:w="http://schemas.openxmlformats.org/wordprocessingml/2006/main" xmlns:m="http://schemas.openxmlformats.org/officeDocument/2006/math" xmlns:r="http://schemas.openxmlformats.org/officeDocument/2006/relationships" xmlns:o="urn:schemas-microsoft-com:office:office" xmlns:v="urn:schemas-microsoft-com:vml" xmlns:w10="urn:schemas-microsoft-com:office:word" xmlns:a="http://schemas.openxmlformats.org/drawingml/2006/main" xmlns:pic="http://schemas.openxmlformats.org/drawingml/2006/picture" xmlns:wp="http://schemas.openxmlformats.org/drawingml/2006/wordprocessingDrawing">
   <w:body>
-    <w:bookmarkStart w:id="15" w:name="helix-constitution--universal-geminimd"/>
+    <w:p>
+      <w:pPr>
+        <w:pStyle w:val="Title"/>
+      </w:pPr>
+      <w:r>
+        <w:t xml:space="preserve">GEMINI</w:t>
+      </w:r>
+    </w:p>
+    <w:bookmarkStart w:id="16" w:name="helix-constitution--universal-geminimd"/>
     <w:p>
       <w:pPr>
         <w:pStyle w:val="Heading1"/>
@@ -67,7 +75,7 @@
               <w:pStyle w:val="Compact"/>
             </w:pPr>
             <w:r>
-              <w:t xml:space="preserve">2</w:t>
+              <w:t xml:space="preserve">3</w:t>
             </w:r>
           </w:p>
         </w:tc>
@@ -115,7 +123,7 @@
               <w:pStyle w:val="Compact"/>
             </w:pPr>
             <w:r>
-              <w:t xml:space="preserve">2026-06-15T00:00:00Z</w:t>
+              <w:t xml:space="preserve">2026-06-21T00:00:00Z</w:t>
             </w:r>
           </w:p>
         </w:tc>
@@ -163,7 +171,7 @@
               <w:pStyle w:val="Compact"/>
             </w:pPr>
             <w:r>
-              <w:t xml:space="preserve">New Gemini CLI carrier of the Helix Constitution — added by §11.4.140 (universal action-prefix system) so Gemini CLI gets the LAYER-1 action-prefix recognition floor out of the box, plus the §11.4.141 token-efficiency mandate mirror. This file is one of the four canonical agent context carriers (</w:t>
+              <w:t xml:space="preserve">Added §11.4.163 mirror — Universal Media Validation: every recorded artifact MUST pass MEDIA VALIDATION pipeline (OCR/transcription/text parsing vs patterns, self-validated analyzer, structured verdict, pinpoint on FAIL, real-time trigger, §1.1 mutation). Added §11.4.164 mirror — Universal Auto-Propagation Hook: post_update_hook.sh detects/registers/installs skills/MCP/hooks/scripts; consumer invokes after every pull. Added §11.4.165 mirror — Universal Independent Verification Agent: every output passes INDEPENDENT verifier (§11.4.70/.20), zero-finding GO. All Classification: universal (§11.4.17). Prior round: Added §11.4.160–162 mirror entries — Vision-verified recording + HelixQA bridge (User mandate 2026-06-21): every video recording MUST be processed through a vision/OCR pipeline reading on-screen content against SPECIFY-phase expected patterns; ≤5s frame capture, self-validated analyzer, per-frame PASS/FAIL with evidence path. Rootless container runtime (User mandate 2026-06-21): Podman rootless mandatory; rootful Docker/sudo FORBIDDEN unless §11.4.112; vasic-digital/containers sole orchestration layer. OpenDesign UI design system (User mandate 2026-06-21): mandatory UI design-and-refinement system for all user-facing interfaces; design tokens for color/typography/spacing; light+dark themes; extend upstream per §11.4.74. All three Classification: universal (§11.4.17). GEMINI.md mirrors updated in lockstep per §11.4.157. Prior round: New Gemini CLI carrier of the Helix Constitution — added by §11.4.140 (universal action-prefix system) so Gemini CLI gets the LAYER-1 action-prefix recognition floor out of the box, plus the §11.4.141 token-efficiency mandate mirror. This file is one of the four canonical agent context carriers (</w:t>
             </w:r>
             <w:r>
               <w:rPr>
@@ -1600,7 +1608,7 @@
       </w:r>
     </w:p>
     <w:bookmarkEnd w:id="11"/>
-    <w:bookmarkStart w:id="13" w:name="token-efficiency-mandate-114141"/>
+    <w:bookmarkStart w:id="14" w:name="token-efficiency-mandate-114141"/>
     <w:p>
       <w:pPr>
         <w:pStyle w:val="Heading2"/>
@@ -6100,7 +6108,53 @@
         <w:t xml:space="preserve"> </w:t>
       </w:r>
       <w:r>
-        <w:t xml:space="preserve">(this doc class ADDS DOCX to the §11.4.65 HTML+PDF set; other classes unchanged), in sync per §11.4.60. (7) Follows §11.4.44/.45/.56/.57/.59/.60. Honest boundary §11.4.6 — guarantees a complete video-confirmed always-synced ledger, NOT per-feature correctness (rests on each row's §11.4.69/.107/.123 evidence) and NOT a §11.4.40 retest substitute. Classification: universal (§11.4.17). Composes §11.4.2/.5/.44/.45/.52/.56/.57/.59/.60/.65/.86/.102/.106/.107/.108/.118/.123/.134/.146/§1.1. Propagation gate</w:t>
+        <w:t xml:space="preserve">(this doc class ADDS DOCX to the §11.4.65 HTML+PDF set; other classes unchanged), in sync per §11.4.60. (7) Follows §11.4.44/.45/.56/.57/.59/.60. (8)</w:t>
+      </w:r>
+      <w:r>
+        <w:t xml:space="preserve"> </w:t>
+      </w:r>
+      <w:r>
+        <w:rPr>
+          <w:b/>
+          <w:bCs/>
+        </w:rPr>
+        <w:t xml:space="preserve">MP4 format REQUIRED.</w:t>
+      </w:r>
+      <w:r>
+        <w:t xml:space="preserve"> </w:t>
+      </w:r>
+      <w:r>
+        <w:t xml:space="preserve">All video confirmations MUST be in</w:t>
+      </w:r>
+      <w:r>
+        <w:t xml:space="preserve"> </w:t>
+      </w:r>
+      <w:r>
+        <w:rPr>
+          <w:rStyle w:val="VerbatimChar"/>
+        </w:rPr>
+        <w:t xml:space="preserve">.mp4</w:t>
+      </w:r>
+      <w:r>
+        <w:t xml:space="preserve"> </w:t>
+      </w:r>
+      <w:r>
+        <w:t xml:space="preserve">format (H.264). Window-specific capture ONLY (§11.4.159(A)). Vision validation REQUIRED (§11.4.159(D)).</w:t>
+      </w:r>
+      <w:r>
+        <w:t xml:space="preserve"> </w:t>
+      </w:r>
+      <w:r>
+        <w:rPr>
+          <w:rStyle w:val="VerbatimChar"/>
+        </w:rPr>
+        <w:t xml:space="preserve">.cast</w:t>
+      </w:r>
+      <w:r>
+        <w:t xml:space="preserve"> </w:t>
+      </w:r>
+      <w:r>
+        <w:t xml:space="preserve">files are supplementary only. Honest boundary §11.4.6 — guarantees a complete video-confirmed always-synced ledger, NOT per-feature correctness (rests on each row's §11.4.69/.107/.123 evidence) and NOT a §11.4.40 retest substitute. Classification: universal (§11.4.17). Composes §11.4.2/.5/.44/.45/.52/.56/.57/.59/.60/.65/.86/.102/.106/.107/.108/.118/.123/.134/.146/§1.1. Propagation gate</w:t>
       </w:r>
       <w:r>
         <w:t xml:space="preserve"> </w:t>
@@ -6498,6 +6552,112 @@
       <w:r>
         <w:t xml:space="preserve">flag.</w:t>
       </w:r>
+      <w:r>
+        <w:t xml:space="preserve"> </w:t>
+      </w:r>
+      <w:r>
+        <w:rPr>
+          <w:b/>
+          <w:bCs/>
+        </w:rPr>
+        <w:t xml:space="preserve">(C) MP4 auto-conversion REQUIRED.</w:t>
+      </w:r>
+      <w:r>
+        <w:t xml:space="preserve"> </w:t>
+      </w:r>
+      <w:r>
+        <w:t xml:space="preserve">Any</w:t>
+      </w:r>
+      <w:r>
+        <w:t xml:space="preserve"> </w:t>
+      </w:r>
+      <w:r>
+        <w:rPr>
+          <w:rStyle w:val="VerbatimChar"/>
+        </w:rPr>
+        <w:t xml:space="preserve">.cast</w:t>
+      </w:r>
+      <w:r>
+        <w:t xml:space="preserve"> </w:t>
+      </w:r>
+      <w:r>
+        <w:t xml:space="preserve">file produced MUST be auto-converted to</w:t>
+      </w:r>
+      <w:r>
+        <w:t xml:space="preserve"> </w:t>
+      </w:r>
+      <w:r>
+        <w:rPr>
+          <w:rStyle w:val="VerbatimChar"/>
+        </w:rPr>
+        <w:t xml:space="preserve">.mp4</w:t>
+      </w:r>
+      <w:r>
+        <w:t xml:space="preserve"> </w:t>
+      </w:r>
+      <w:r>
+        <w:t xml:space="preserve">via</w:t>
+      </w:r>
+      <w:r>
+        <w:t xml:space="preserve"> </w:t>
+      </w:r>
+      <w:r>
+        <w:rPr>
+          <w:rStyle w:val="VerbatimChar"/>
+        </w:rPr>
+        <w:t xml:space="preserve">agg</w:t>
+      </w:r>
+      <w:r>
+        <w:t xml:space="preserve"> </w:t>
+      </w:r>
+      <w:r>
+        <w:t xml:space="preserve">+</w:t>
+      </w:r>
+      <w:r>
+        <w:t xml:space="preserve"> </w:t>
+      </w:r>
+      <w:r>
+        <w:rPr>
+          <w:rStyle w:val="VerbatimChar"/>
+        </w:rPr>
+        <w:t xml:space="preserve">ffmpeg</w:t>
+      </w:r>
+      <w:r>
+        <w:t xml:space="preserve"> </w:t>
+      </w:r>
+      <w:r>
+        <w:t xml:space="preserve">immediately after capture. The</w:t>
+      </w:r>
+      <w:r>
+        <w:t xml:space="preserve"> </w:t>
+      </w:r>
+      <w:r>
+        <w:rPr>
+          <w:rStyle w:val="VerbatimChar"/>
+        </w:rPr>
+        <w:t xml:space="preserve">.mp4</w:t>
+      </w:r>
+      <w:r>
+        <w:t xml:space="preserve"> </w:t>
+      </w:r>
+      <w:r>
+        <w:t xml:space="preserve">is the primary evidence;</w:t>
+      </w:r>
+      <w:r>
+        <w:t xml:space="preserve"> </w:t>
+      </w:r>
+      <w:r>
+        <w:rPr>
+          <w:rStyle w:val="VerbatimChar"/>
+        </w:rPr>
+        <w:t xml:space="preserve">.cast</w:t>
+      </w:r>
+      <w:r>
+        <w:t xml:space="preserve"> </w:t>
+      </w:r>
+      <w:r>
+        <w:t xml:space="preserve">is supplementary only.</w:t>
+      </w:r>
     </w:p>
     <w:p>
       <w:pPr>
@@ -7492,7 +7652,23 @@
         <w:t xml:space="preserve"> </w:t>
       </w:r>
       <w:r>
-        <w:t xml:space="preserve">(host user's home Downloads, resolved at runtime never hardcoded) unless a project declares an override per §11.4.35; §11.4.155 project-prefix + §11.4.154 window-scope/rotation + §11.4.128 git-ignored raw corpus + §11.4.83 curated docs/qa evidence apply. Composes §11.4.2/.5/.25/.27/.52/.69/.83/.85/.107/.108/.117/.118/.128/.137/.138/.153/.154/.155/§1.1. Classification: universal (§11.4.17). Propagation gate</w:t>
+        <w:t xml:space="preserve">(host user's home Downloads, resolved at runtime never hardcoded) unless a project declares an override per §11.4.35; §11.4.155 project-prefix + §11.4.154 window-scope/rotation + §11.4.128 git-ignored raw corpus + §11.4.83 curated docs/qa evidence apply.</w:t>
+      </w:r>
+      <w:r>
+        <w:t xml:space="preserve"> </w:t>
+      </w:r>
+      <w:r>
+        <w:rPr>
+          <w:b/>
+          <w:bCs/>
+        </w:rPr>
+        <w:t xml:space="preserve">Vision analysis MANDATORY for every recording</w:t>
+      </w:r>
+      <w:r>
+        <w:t xml:space="preserve"> </w:t>
+      </w:r>
+      <w:r>
+        <w:t xml:space="preserve">— after every recording, the agent MUST read the terminal output / video content and verify the feature actually works. A recording without a vision-confirmed verdict is a §11.4.158 violation. Composes §11.4.2/.5/.25/.27/.52/.69/.83/.85/.107/.108/.117/.118/.128/.137/.138/.153/.154/.155/§1.1. Classification: universal (§11.4.17). Propagation gate</w:t>
       </w:r>
       <w:r>
         <w:t xml:space="preserve"> </w:t>
@@ -7660,8 +7836,974 @@
         <w:t xml:space="preserve">flag.</w:t>
       </w:r>
     </w:p>
-    <w:bookmarkEnd w:id="13"/>
-    <w:bookmarkStart w:id="14" w:name="when-in-doubt"/>
+    <w:p>
+      <w:pPr>
+        <w:pStyle w:val="BodyText"/>
+      </w:pPr>
+      <w:r>
+        <w:rPr>
+          <w:b/>
+          <w:bCs/>
+        </w:rPr>
+        <w:t xml:space="preserve">§11.4.159 — Mandatory window-specific video recording + vision validation mandate (User mandate, 2026-06-20).</w:t>
+      </w:r>
+      <w:r>
+        <w:t xml:space="preserve"> </w:t>
+      </w:r>
+      <w:r>
+        <w:t xml:space="preserve">Every feature test, validation, verification, challenge, and QA session that produces video evidence MUST comply with ALL of the following:</w:t>
+      </w:r>
+      <w:r>
+        <w:t xml:space="preserve"> </w:t>
+      </w:r>
+      <w:r>
+        <w:rPr>
+          <w:b/>
+          <w:bCs/>
+        </w:rPr>
+        <w:t xml:space="preserve">(A) Window-specific recording ONLY</w:t>
+      </w:r>
+      <w:r>
+        <w:t xml:space="preserve"> </w:t>
+      </w:r>
+      <w:r>
+        <w:t xml:space="preserve">— every video MUST record ONLY the target application window (Terminal pane, TUI app, browser tab, emulator frame), NEVER the whole desktop/monitor screen; use macOS</w:t>
+      </w:r>
+      <w:r>
+        <w:t xml:space="preserve"> </w:t>
+      </w:r>
+      <w:r>
+        <w:rPr>
+          <w:rStyle w:val="VerbatimChar"/>
+        </w:rPr>
+        <w:t xml:space="preserve">screencapture -l&lt;window_id&gt;</w:t>
+      </w:r>
+      <w:r>
+        <w:t xml:space="preserve">, Linux</w:t>
+      </w:r>
+      <w:r>
+        <w:t xml:space="preserve"> </w:t>
+      </w:r>
+      <w:r>
+        <w:rPr>
+          <w:rStyle w:val="VerbatimChar"/>
+        </w:rPr>
+        <w:t xml:space="preserve">xdotool</w:t>
+      </w:r>
+      <w:r>
+        <w:t xml:space="preserve">+</w:t>
+      </w:r>
+      <w:r>
+        <w:rPr>
+          <w:rStyle w:val="VerbatimChar"/>
+        </w:rPr>
+        <w:t xml:space="preserve">ffmpeg</w:t>
+      </w:r>
+      <w:r>
+        <w:t xml:space="preserve">, or equivalent; whole-desktop capture leaks operator-private content (§11.4.10), dilutes the §11.4.107 liveness oracle, and breaks §11.4.137 OCR/ROI; platform genuinely cannot capture below whole-screen =&gt; honest §11.4.3 SKIP + tracked migration item.</w:t>
+      </w:r>
+      <w:r>
+        <w:t xml:space="preserve"> </w:t>
+      </w:r>
+      <w:r>
+        <w:rPr>
+          <w:b/>
+          <w:bCs/>
+        </w:rPr>
+        <w:t xml:space="preserve">(B) MP4 format REQUIRED</w:t>
+      </w:r>
+      <w:r>
+        <w:t xml:space="preserve"> </w:t>
+      </w:r>
+      <w:r>
+        <w:t xml:space="preserve">—</w:t>
+      </w:r>
+      <w:r>
+        <w:t xml:space="preserve"> </w:t>
+      </w:r>
+      <w:r>
+        <w:rPr>
+          <w:rStyle w:val="VerbatimChar"/>
+        </w:rPr>
+        <w:t xml:space="preserve">.mp4</w:t>
+      </w:r>
+      <w:r>
+        <w:t xml:space="preserve"> </w:t>
+      </w:r>
+      <w:r>
+        <w:t xml:space="preserve">(H.264,</w:t>
+      </w:r>
+      <w:r>
+        <w:t xml:space="preserve"> </w:t>
+      </w:r>
+      <w:r>
+        <w:rPr>
+          <w:rStyle w:val="VerbatimChar"/>
+        </w:rPr>
+        <w:t xml:space="preserve">movflags +faststart</w:t>
+      </w:r>
+      <w:r>
+        <w:t xml:space="preserve">,</w:t>
+      </w:r>
+      <w:r>
+        <w:t xml:space="preserve"> </w:t>
+      </w:r>
+      <w:r>
+        <w:rPr>
+          <w:rStyle w:val="VerbatimChar"/>
+        </w:rPr>
+        <w:t xml:space="preserve">pix_fmt yuv420p</w:t>
+      </w:r>
+      <w:r>
+        <w:t xml:space="preserve">);</w:t>
+      </w:r>
+      <w:r>
+        <w:t xml:space="preserve"> </w:t>
+      </w:r>
+      <w:r>
+        <w:rPr>
+          <w:rStyle w:val="VerbatimChar"/>
+        </w:rPr>
+        <w:t xml:space="preserve">.cast</w:t>
+      </w:r>
+      <w:r>
+        <w:t xml:space="preserve"> </w:t>
+      </w:r>
+      <w:r>
+        <w:t xml:space="preserve">files are supplementary only; auto-convert via</w:t>
+      </w:r>
+      <w:r>
+        <w:t xml:space="preserve"> </w:t>
+      </w:r>
+      <w:r>
+        <w:rPr>
+          <w:rStyle w:val="VerbatimChar"/>
+        </w:rPr>
+        <w:t xml:space="preserve">agg</w:t>
+      </w:r>
+      <w:r>
+        <w:t xml:space="preserve">+</w:t>
+      </w:r>
+      <w:r>
+        <w:rPr>
+          <w:rStyle w:val="VerbatimChar"/>
+        </w:rPr>
+        <w:t xml:space="preserve">ffmpeg</w:t>
+      </w:r>
+      <w:r>
+        <w:t xml:space="preserve"> </w:t>
+      </w:r>
+      <w:r>
+        <w:t xml:space="preserve">per §11.4.154(C).</w:t>
+      </w:r>
+      <w:r>
+        <w:t xml:space="preserve"> </w:t>
+      </w:r>
+      <w:r>
+        <w:rPr>
+          <w:b/>
+          <w:bCs/>
+        </w:rPr>
+        <w:t xml:space="preserve">(C) Project-name prefix REQUIRED</w:t>
+      </w:r>
+      <w:r>
+        <w:t xml:space="preserve"> </w:t>
+      </w:r>
+      <w:r>
+        <w:t xml:space="preserve">— filename MUST start with project name in snake_case from</w:t>
+      </w:r>
+      <w:r>
+        <w:t xml:space="preserve"> </w:t>
+      </w:r>
+      <w:r>
+        <w:rPr>
+          <w:rStyle w:val="VerbatimChar"/>
+        </w:rPr>
+        <w:t xml:space="preserve">HELIX_RELEASE_PREFIX</w:t>
+      </w:r>
+      <w:r>
+        <w:t xml:space="preserve"> </w:t>
+      </w:r>
+      <w:r>
+        <w:t xml:space="preserve">in</w:t>
+      </w:r>
+      <w:r>
+        <w:t xml:space="preserve"> </w:t>
+      </w:r>
+      <w:r>
+        <w:rPr>
+          <w:rStyle w:val="VerbatimChar"/>
+        </w:rPr>
+        <w:t xml:space="preserve">.env</w:t>
+      </w:r>
+      <w:r>
+        <w:t xml:space="preserve"> </w:t>
+      </w:r>
+      <w:r>
+        <w:t xml:space="preserve">(§11.4.151) or lowercased project root dir name (§11.4.29); format</w:t>
+      </w:r>
+      <w:r>
+        <w:t xml:space="preserve"> </w:t>
+      </w:r>
+      <w:r>
+        <w:rPr>
+          <w:rStyle w:val="VerbatimChar"/>
+        </w:rPr>
+        <w:t xml:space="preserve">&lt;project_name&gt;-&lt;feature&gt;-&lt;timestamp&gt;.mp4</w:t>
+      </w:r>
+      <w:r>
+        <w:t xml:space="preserve">; unprefixed = violation.</w:t>
+      </w:r>
+      <w:r>
+        <w:t xml:space="preserve"> </w:t>
+      </w:r>
+      <w:r>
+        <w:rPr>
+          <w:b/>
+          <w:bCs/>
+        </w:rPr>
+        <w:t xml:space="preserve">(D) Mandatory vision validation</w:t>
+      </w:r>
+      <w:r>
+        <w:t xml:space="preserve"> </w:t>
+      </w:r>
+      <w:r>
+        <w:t xml:space="preserve">— after EVERY recording, the agent MUST read the terminal output / video content and verify: (i) feature ACTUALLY WORKS, (ii) LLM responses are REAL, (iii) all tests show PASS, (iv) no "TODO implement" / "simulate" / "for now" patterns, (v) output demonstrates end-user working feature; MUST produce a verdict (PASS/FAIL) with evidence path (§11.4.69).</w:t>
+      </w:r>
+      <w:r>
+        <w:t xml:space="preserve"> </w:t>
+      </w:r>
+      <w:r>
+        <w:rPr>
+          <w:b/>
+          <w:bCs/>
+        </w:rPr>
+        <w:t xml:space="preserve">(E) Terminal window cleanup</w:t>
+      </w:r>
+      <w:r>
+        <w:t xml:space="preserve"> </w:t>
+      </w:r>
+      <w:r>
+        <w:t xml:space="preserve">— after each recording, dismiss/close ONLY the Terminal window used for that recording (window-specific close via</w:t>
+      </w:r>
+      <w:r>
+        <w:t xml:space="preserve"> </w:t>
+      </w:r>
+      <w:r>
+        <w:rPr>
+          <w:rStyle w:val="VerbatimChar"/>
+        </w:rPr>
+        <w:t xml:space="preserve">osascript</w:t>
+      </w:r>
+      <w:r>
+        <w:t xml:space="preserve">/</w:t>
+      </w:r>
+      <w:r>
+        <w:rPr>
+          <w:rStyle w:val="VerbatimChar"/>
+        </w:rPr>
+        <w:t xml:space="preserve">xdotool</w:t>
+      </w:r>
+      <w:r>
+        <w:t xml:space="preserve">); MUST NOT close windows belonging to other processes.</w:t>
+      </w:r>
+      <w:r>
+        <w:t xml:space="preserve"> </w:t>
+      </w:r>
+      <w:r>
+        <w:rPr>
+          <w:b/>
+          <w:bCs/>
+        </w:rPr>
+        <w:t xml:space="preserve">(F) Real results ONLY</w:t>
+      </w:r>
+      <w:r>
+        <w:t xml:space="preserve"> </w:t>
+      </w:r>
+      <w:r>
+        <w:t xml:space="preserve">— every recording MUST show REAL working features; errors/empty output/simulated responses trigger fix→retest→re-record.</w:t>
+      </w:r>
+      <w:r>
+        <w:t xml:space="preserve"> </w:t>
+      </w:r>
+      <w:r>
+        <w:rPr>
+          <w:b/>
+          <w:bCs/>
+        </w:rPr>
+        <w:t xml:space="preserve">(G) Re-runnable evidence</w:t>
+      </w:r>
+      <w:r>
+        <w:t xml:space="preserve"> </w:t>
+      </w:r>
+      <w:r>
+        <w:t xml:space="preserve">— the command shown MUST be re-runnable to produce the same results.</w:t>
+      </w:r>
+      <w:r>
+        <w:t xml:space="preserve"> </w:t>
+      </w:r>
+      <w:r>
+        <w:rPr>
+          <w:b/>
+          <w:bCs/>
+        </w:rPr>
+        <w:t xml:space="preserve">(H) Fresh-corpus rotation</w:t>
+      </w:r>
+      <w:r>
+        <w:t xml:space="preserve"> </w:t>
+      </w:r>
+      <w:r>
+        <w:t xml:space="preserve">— remove agent's own prior in-scope stale recordings FIRST (§11.4.154).</w:t>
+      </w:r>
+      <w:r>
+        <w:t xml:space="preserve"> </w:t>
+      </w:r>
+      <w:r>
+        <w:rPr>
+          <w:b/>
+          <w:bCs/>
+        </w:rPr>
+        <w:t xml:space="preserve">(I) Content verification MANDATORY — not duration-based</w:t>
+      </w:r>
+      <w:r>
+        <w:t xml:space="preserve"> </w:t>
+      </w:r>
+      <w:r>
+        <w:t xml:space="preserve">— the value of a recording is NOT its duration but its CONTENT; a recording MUST demonstrate the ACTUAL feature being used with REAL results; before accepting ANY recording, the agent MUST verify: expected output patterns ARE present (e.g., test PASS lines, API response data, feature-specific output), the feature ACTUALLY WORKS as demonstrated (not just "something ran"), LLM responses are REAL content (not simulated, not placeholder, not empty), every claim of "working" is backed by visible evidence; a 5-second recording showing a feature working correctly is MORE valuable than a 60-second recording of empty terminal; duration is NOT a proxy for quality.</w:t>
+      </w:r>
+      <w:r>
+        <w:t xml:space="preserve"> </w:t>
+      </w:r>
+      <w:r>
+        <w:rPr>
+          <w:b/>
+          <w:bCs/>
+        </w:rPr>
+        <w:t xml:space="preserve">(J) Expected-content specification REQUIRED</w:t>
+      </w:r>
+      <w:r>
+        <w:t xml:space="preserve"> </w:t>
+      </w:r>
+      <w:r>
+        <w:t xml:space="preserve">— before recording, the agent MUST specify what content SHOULD appear (expected patterns, expected test results, expected API responses); after recording, the agent MUST verify these patterns ARE present; if expected content is MISSING, the recording is REJECTED regardless of duration.</w:t>
+      </w:r>
+      <w:r>
+        <w:t xml:space="preserve"> </w:t>
+      </w:r>
+      <w:r>
+        <w:rPr>
+          <w:b/>
+          <w:bCs/>
+        </w:rPr>
+        <w:t xml:space="preserve">(K) Content-verification recording workflow</w:t>
+      </w:r>
+      <w:r>
+        <w:t xml:space="preserve"> </w:t>
+      </w:r>
+      <w:r>
+        <w:t xml:space="preserve">— mandated workflow: (1) SPECIFY expected content patterns, (2) RECORD the feature execution, (3) EXTRACT all text from the recording, (4) VERIFY expected patterns are present, (5) CHECK for simulated/placeholder content, (6) ACCEPT only if ALL patterns found AND zero bluffs detected, (7) REJECT and re-record if ANY pattern missing or bluff detected.</w:t>
+      </w:r>
+      <w:r>
+        <w:t xml:space="preserve"> </w:t>
+      </w:r>
+      <w:r>
+        <w:rPr>
+          <w:b/>
+          <w:bCs/>
+        </w:rPr>
+        <w:t xml:space="preserve">(L) Root cause analysis REQUIRED for rejected recordings</w:t>
+      </w:r>
+      <w:r>
+        <w:t xml:space="preserve"> </w:t>
+      </w:r>
+      <w:r>
+        <w:t xml:space="preserve">— when a recording is rejected (missing expected content, bluff detected, or empty capture), the agent MUST investigate WHY before re-recording per §11.4.102; determine the root cause (timing issue, wrong command, tool failure, etc.) and fix it; simply re-recording without understanding WHY the first attempt failed is a §11.4.159 violation.</w:t>
+      </w:r>
+      <w:r>
+        <w:t xml:space="preserve"> </w:t>
+      </w:r>
+      <w:r>
+        <w:rPr>
+          <w:b/>
+          <w:bCs/>
+        </w:rPr>
+        <w:t xml:space="preserve">(M) Real-time monitoring RECOMMENDED</w:t>
+      </w:r>
+      <w:r>
+        <w:t xml:space="preserve"> </w:t>
+      </w:r>
+      <w:r>
+        <w:t xml:space="preserve">— for complex features, use real-time monitoring that analyzes output DURING recording (not after); this catches issues immediately and allows corrective action before the recording completes. Classification: universal (§11.4.17). Composes §11.4.2/.3/.5/.10/.29/.69/.83/.107/.111/.128/.137/.151/.153/.154/.155/.158/§1.1. Propagation gate</w:t>
+      </w:r>
+      <w:r>
+        <w:t xml:space="preserve"> </w:t>
+      </w:r>
+      <w:r>
+        <w:rPr>
+          <w:rStyle w:val="VerbatimChar"/>
+        </w:rPr>
+        <w:t xml:space="preserve">CM-COVENANT-114-159-PROPAGATION</w:t>
+      </w:r>
+      <w:r>
+        <w:t xml:space="preserve"> </w:t>
+      </w:r>
+      <w:r>
+        <w:t xml:space="preserve">(literal</w:t>
+      </w:r>
+      <w:r>
+        <w:t xml:space="preserve"> </w:t>
+      </w:r>
+      <w:r>
+        <w:rPr>
+          <w:rStyle w:val="VerbatimChar"/>
+        </w:rPr>
+        <w:t xml:space="preserve">11.4.159</w:t>
+      </w:r>
+      <w:r>
+        <w:t xml:space="preserve">) + recommended gate</w:t>
+      </w:r>
+      <w:r>
+        <w:t xml:space="preserve"> </w:t>
+      </w:r>
+      <w:r>
+        <w:rPr>
+          <w:rStyle w:val="VerbatimChar"/>
+        </w:rPr>
+        <w:t xml:space="preserve">CM-WINDOW-VIDEO-VALIDATED</w:t>
+      </w:r>
+      <w:r>
+        <w:t xml:space="preserve"> </w:t>
+      </w:r>
+      <w:r>
+        <w:t xml:space="preserve">+ paired §1.1 mutation.</w:t>
+      </w:r>
+      <w:r>
+        <w:t xml:space="preserve"> </w:t>
+      </w:r>
+      <w:r>
+        <w:rPr>
+          <w:b/>
+          <w:bCs/>
+        </w:rPr>
+        <w:t xml:space="preserve">Canonical authority:</w:t>
+      </w:r>
+      <w:r>
+        <w:t xml:space="preserve"> </w:t>
+      </w:r>
+      <w:r>
+        <w:t xml:space="preserve">constitution submodule</w:t>
+      </w:r>
+      <w:r>
+        <w:t xml:space="preserve"> </w:t>
+      </w:r>
+      <w:hyperlink r:id="rId12">
+        <w:r>
+          <w:rPr>
+            <w:rStyle w:val="VerbatimChar"/>
+          </w:rPr>
+          <w:t xml:space="preserve">Constitution.md</w:t>
+        </w:r>
+      </w:hyperlink>
+      <w:r>
+        <w:t xml:space="preserve"> </w:t>
+      </w:r>
+      <w:r>
+        <w:t xml:space="preserve">§11.4.159. Non-compliance is a release blocker. No escape hatch — no</w:t>
+      </w:r>
+      <w:r>
+        <w:t xml:space="preserve"> </w:t>
+      </w:r>
+      <w:r>
+        <w:rPr>
+          <w:rStyle w:val="VerbatimChar"/>
+        </w:rPr>
+        <w:t xml:space="preserve">--whole-screen-ok</w:t>
+      </w:r>
+      <w:r>
+        <w:t xml:space="preserve">,</w:t>
+      </w:r>
+      <w:r>
+        <w:t xml:space="preserve"> </w:t>
+      </w:r>
+      <w:r>
+        <w:rPr>
+          <w:rStyle w:val="VerbatimChar"/>
+        </w:rPr>
+        <w:t xml:space="preserve">--cast-only</w:t>
+      </w:r>
+      <w:r>
+        <w:t xml:space="preserve">,</w:t>
+      </w:r>
+      <w:r>
+        <w:t xml:space="preserve"> </w:t>
+      </w:r>
+      <w:r>
+        <w:rPr>
+          <w:rStyle w:val="VerbatimChar"/>
+        </w:rPr>
+        <w:t xml:space="preserve">--skip-vision-validation</w:t>
+      </w:r>
+      <w:r>
+        <w:t xml:space="preserve">,</w:t>
+      </w:r>
+      <w:r>
+        <w:t xml:space="preserve"> </w:t>
+      </w:r>
+      <w:r>
+        <w:rPr>
+          <w:rStyle w:val="VerbatimChar"/>
+        </w:rPr>
+        <w:t xml:space="preserve">--no-cleanup</w:t>
+      </w:r>
+      <w:r>
+        <w:t xml:space="preserve">,</w:t>
+      </w:r>
+      <w:r>
+        <w:t xml:space="preserve"> </w:t>
+      </w:r>
+      <w:r>
+        <w:rPr>
+          <w:rStyle w:val="VerbatimChar"/>
+        </w:rPr>
+        <w:t xml:space="preserve">--simulated-recording-ok</w:t>
+      </w:r>
+      <w:r>
+        <w:t xml:space="preserve">,</w:t>
+      </w:r>
+      <w:r>
+        <w:t xml:space="preserve"> </w:t>
+      </w:r>
+      <w:r>
+        <w:rPr>
+          <w:rStyle w:val="VerbatimChar"/>
+        </w:rPr>
+        <w:t xml:space="preserve">--unprefixed-recording</w:t>
+      </w:r>
+      <w:r>
+        <w:t xml:space="preserve"> </w:t>
+      </w:r>
+      <w:r>
+        <w:t xml:space="preserve">flag.</w:t>
+      </w:r>
+    </w:p>
+    <w:p>
+      <w:pPr>
+        <w:pStyle w:val="BodyText"/>
+      </w:pPr>
+      <w:r>
+        <w:rPr>
+          <w:b/>
+          <w:bCs/>
+        </w:rPr>
+        <w:t xml:space="preserve">§11.4.160 — Vision-verified recording + HelixQA bridge mandate (User mandate, 2026-06-21).</w:t>
+      </w:r>
+      <w:r>
+        <w:t xml:space="preserve"> </w:t>
+      </w:r>
+      <w:r>
+        <w:t xml:space="preserve">Compact summary: every video recording for feature/QA evidence MUST be processed through a vision/OCR pipeline that reads on-screen content and confirms expected results BEFORE acceptance; the recording system MUST provide a bridge feeding captured frames to HelixQA's test infrastructure (or equivalent) for automated read-the-screen verification against SPECIFY-phase expected patterns (§11.4.159(J)); capture frames at ≤5s intervals, run OCR/vision with self-validated analyzer (§11.4.107(10)), compare text against patterns, produce per-frame PASS/FAIL with evidence path, surface failures immediately for re-record (§11.4.159(L)). Project-configured parameters per §11.4.35. Honest boundary: does NOT replace §11.4.5 quality analysis nor §11.4.108 runtime-signature; FLAG_SECURE uses §11.4.117 proxy oracle. Classification: universal (§11.4.17). Propagation gate</w:t>
+      </w:r>
+      <w:r>
+        <w:t xml:space="preserve"> </w:t>
+      </w:r>
+      <w:r>
+        <w:rPr>
+          <w:rStyle w:val="VerbatimChar"/>
+        </w:rPr>
+        <w:t xml:space="preserve">CM-COVENANT-114-160-PROPAGATION</w:t>
+      </w:r>
+      <w:r>
+        <w:t xml:space="preserve"> </w:t>
+      </w:r>
+      <w:r>
+        <w:t xml:space="preserve">+ recommended gate</w:t>
+      </w:r>
+      <w:r>
+        <w:t xml:space="preserve"> </w:t>
+      </w:r>
+      <w:r>
+        <w:rPr>
+          <w:rStyle w:val="VerbatimChar"/>
+        </w:rPr>
+        <w:t xml:space="preserve">CM-VISION-VERIFIED-RECORDING-BRIDGE</w:t>
+      </w:r>
+      <w:r>
+        <w:t xml:space="preserve"> </w:t>
+      </w:r>
+      <w:r>
+        <w:t xml:space="preserve">+ paired §1.1 mutation.</w:t>
+      </w:r>
+    </w:p>
+    <w:p>
+      <w:pPr>
+        <w:pStyle w:val="BodyText"/>
+      </w:pPr>
+      <w:r>
+        <w:rPr>
+          <w:b/>
+          <w:bCs/>
+        </w:rPr>
+        <w:t xml:space="preserve">§11.4.161 — Rootless container runtime mandate (User mandate, 2026-06-21).</w:t>
+      </w:r>
+      <w:r>
+        <w:t xml:space="preserve"> </w:t>
+      </w:r>
+      <w:r>
+        <w:t xml:space="preserve">Compact summary: every project MUST use Podman rootless (or equivalent) for ALL containerized workloads — rootful Docker/sudo FORBIDDEN unless §11.4.112 platform constraint documented;</w:t>
+      </w:r>
+      <w:r>
+        <w:t xml:space="preserve"> </w:t>
+      </w:r>
+      <w:r>
+        <w:rPr>
+          <w:rStyle w:val="VerbatimChar"/>
+        </w:rPr>
+        <w:t xml:space="preserve">vasic-digital/containers</w:t>
+      </w:r>
+      <w:r>
+        <w:t xml:space="preserve"> </w:t>
+      </w:r>
+      <w:r>
+        <w:t xml:space="preserve">Submodule (§11.4.76) sole orchestration layer via</w:t>
+      </w:r>
+      <w:r>
+        <w:t xml:space="preserve"> </w:t>
+      </w:r>
+      <w:r>
+        <w:rPr>
+          <w:rStyle w:val="VerbatimChar"/>
+        </w:rPr>
+        <w:t xml:space="preserve">pkg/boot</w:t>
+      </w:r>
+      <w:r>
+        <w:t xml:space="preserve">/</w:t>
+      </w:r>
+      <w:r>
+        <w:rPr>
+          <w:rStyle w:val="VerbatimChar"/>
+        </w:rPr>
+        <w:t xml:space="preserve">pkg/compose</w:t>
+      </w:r>
+      <w:r>
+        <w:t xml:space="preserve">/</w:t>
+      </w:r>
+      <w:r>
+        <w:rPr>
+          <w:rStyle w:val="VerbatimChar"/>
+        </w:rPr>
+        <w:t xml:space="preserve">pkg/health</w:t>
+      </w:r>
+      <w:r>
+        <w:t xml:space="preserve">; extend upstream per §11.4.74 for missing capabilities; integration tests boot infra on-demand. Honest boundary: does NOT replace §11.4.10 credentials nor §12.3 hygiene. Classification: universal (§11.4.17). Propagation gate</w:t>
+      </w:r>
+      <w:r>
+        <w:t xml:space="preserve"> </w:t>
+      </w:r>
+      <w:r>
+        <w:rPr>
+          <w:rStyle w:val="VerbatimChar"/>
+        </w:rPr>
+        <w:t xml:space="preserve">CM-COVENANT-114-161-PROPAGATION</w:t>
+      </w:r>
+      <w:r>
+        <w:t xml:space="preserve"> </w:t>
+      </w:r>
+      <w:r>
+        <w:t xml:space="preserve">+ recommended gate</w:t>
+      </w:r>
+      <w:r>
+        <w:t xml:space="preserve"> </w:t>
+      </w:r>
+      <w:r>
+        <w:rPr>
+          <w:rStyle w:val="VerbatimChar"/>
+        </w:rPr>
+        <w:t xml:space="preserve">CM-ROOTLESS-CONTAINER-RUNTIME</w:t>
+      </w:r>
+      <w:r>
+        <w:t xml:space="preserve"> </w:t>
+      </w:r>
+      <w:r>
+        <w:t xml:space="preserve">+ paired §1.1 mutation.</w:t>
+      </w:r>
+    </w:p>
+    <w:p>
+      <w:pPr>
+        <w:pStyle w:val="BodyText"/>
+      </w:pPr>
+      <w:r>
+        <w:rPr>
+          <w:b/>
+          <w:bCs/>
+        </w:rPr>
+        <w:t xml:space="preserve">§11.4.162 — OpenDesign UI design system mandate (User mandate, 2026-06-21).</w:t>
+      </w:r>
+      <w:r>
+        <w:t xml:space="preserve"> </w:t>
+      </w:r>
+      <w:r>
+        <w:t xml:space="preserve">Compact summary: every project with user-facing interfaces MUST use OpenDesign (</w:t>
+      </w:r>
+      <w:hyperlink r:id="rId13">
+        <w:r>
+          <w:rPr>
+            <w:rStyle w:val="Hyperlink"/>
+          </w:rPr>
+          <w:t xml:space="preserve">https://github.com/nexu-io/open-design</w:t>
+        </w:r>
+      </w:hyperlink>
+      <w:r>
+        <w:t xml:space="preserve">) as mandatory UI design system — NOT ad-hoc CSS; install as dependency, use token system for all color (light+dark from brand assets), typography, spacing, component tokens; extend upstream (§11.4.74) for unsupported patterns; every UI component ships light+dark + token-diff regression tests via visual regression; no element overlap/font collision/label overlay. Honest boundary: does NOT replace §11.4.27 functional testing nor §11.4.48/.49 UI testing. Classification: universal (§11.4.17). Propagation gate</w:t>
+      </w:r>
+      <w:r>
+        <w:t xml:space="preserve"> </w:t>
+      </w:r>
+      <w:r>
+        <w:rPr>
+          <w:rStyle w:val="VerbatimChar"/>
+        </w:rPr>
+        <w:t xml:space="preserve">CM-COVENANT-114-162-PROPAGATION</w:t>
+      </w:r>
+      <w:r>
+        <w:t xml:space="preserve"> </w:t>
+      </w:r>
+      <w:r>
+        <w:t xml:space="preserve">+ recommended gate</w:t>
+      </w:r>
+      <w:r>
+        <w:t xml:space="preserve"> </w:t>
+      </w:r>
+      <w:r>
+        <w:rPr>
+          <w:rStyle w:val="VerbatimChar"/>
+        </w:rPr>
+        <w:t xml:space="preserve">CM-OPENDESIGN-UI-SYSTEM</w:t>
+      </w:r>
+      <w:r>
+        <w:t xml:space="preserve"> </w:t>
+      </w:r>
+      <w:r>
+        <w:t xml:space="preserve">+ paired §1.1 mutation.</w:t>
+      </w:r>
+    </w:p>
+    <w:p>
+      <w:pPr>
+        <w:pStyle w:val="BodyText"/>
+      </w:pPr>
+      <w:r>
+        <w:rPr>
+          <w:b/>
+          <w:bCs/>
+        </w:rPr>
+        <w:t xml:space="preserve">§11.4.163 — Universal Media Validation (User mandate).</w:t>
+      </w:r>
+      <w:r>
+        <w:t xml:space="preserve"> </w:t>
+      </w:r>
+      <w:r>
+        <w:t xml:space="preserve">Every recorded artifact MUST pass MEDIA VALIDATION pipeline — OCR/transcription/text parsing, compare vs SPECIFY-phase patterns (§11.4.159(J)), self-validated analyzer (§11.4.107(10)), structured verdict, pinpoint on FAIL, REAL-TIME trigger option. Paired §1.1 mutation on golden-bad fixture. Classification: universal. Propagation gate</w:t>
+      </w:r>
+      <w:r>
+        <w:t xml:space="preserve"> </w:t>
+      </w:r>
+      <w:r>
+        <w:rPr>
+          <w:rStyle w:val="VerbatimChar"/>
+        </w:rPr>
+        <w:t xml:space="preserve">CM-COVENANT-114-163-PROPAGATION</w:t>
+      </w:r>
+      <w:r>
+        <w:t xml:space="preserve"> </w:t>
+      </w:r>
+      <w:r>
+        <w:t xml:space="preserve">+ paired §1.1 mutation.</w:t>
+      </w:r>
+    </w:p>
+    <w:p>
+      <w:pPr>
+        <w:pStyle w:val="BodyText"/>
+      </w:pPr>
+      <w:r>
+        <w:rPr>
+          <w:b/>
+          <w:bCs/>
+        </w:rPr>
+        <w:t xml:space="preserve">§11.4.164 — Universal Auto-Propagation Hook (User mandate).</w:t>
+      </w:r>
+      <w:r>
+        <w:t xml:space="preserve"> </w:t>
+      </w:r>
+      <w:r>
+        <w:t xml:space="preserve">Every constitutional pull triggers</w:t>
+      </w:r>
+      <w:r>
+        <w:t xml:space="preserve"> </w:t>
+      </w:r>
+      <w:r>
+        <w:rPr>
+          <w:rStyle w:val="VerbatimChar"/>
+        </w:rPr>
+        <w:t xml:space="preserve">post_update_hook.sh</w:t>
+      </w:r>
+      <w:r>
+        <w:t xml:space="preserve"> </w:t>
+      </w:r>
+      <w:r>
+        <w:t xml:space="preserve">— detects changed files, registers skills/MCP/hooks/scripts, logs summary. Consumer invokes after every pull. Classification: universal. Propagation gate</w:t>
+      </w:r>
+      <w:r>
+        <w:t xml:space="preserve"> </w:t>
+      </w:r>
+      <w:r>
+        <w:rPr>
+          <w:rStyle w:val="VerbatimChar"/>
+        </w:rPr>
+        <w:t xml:space="preserve">CM-COVENANT-114-164-PROPAGATION</w:t>
+      </w:r>
+      <w:r>
+        <w:t xml:space="preserve"> </w:t>
+      </w:r>
+      <w:r>
+        <w:t xml:space="preserve">+ paired §1.1 mutation.</w:t>
+      </w:r>
+    </w:p>
+    <w:p>
+      <w:pPr>
+        <w:pStyle w:val="BodyText"/>
+      </w:pPr>
+      <w:r>
+        <w:rPr>
+          <w:b/>
+          <w:bCs/>
+        </w:rPr>
+        <w:t xml:space="preserve">§11.4.165 — Universal Independent Verification Agent (User mandate).</w:t>
+      </w:r>
+      <w:r>
+        <w:t xml:space="preserve"> </w:t>
+      </w:r>
+      <w:r>
+        <w:t xml:space="preserve">Every code/media/docs/config output passes independent verifier (§11.4.70/.20), zero-finding GO (§11.4.134). CODE: review+build+mutations+runtime-signature. MEDIA: pipeline+genuine+format. DOCS: exports+revision. CONFIG: syntax+schema+leaks. Self-validated §1.1 mutation. Classification: universal. Propagation gate</w:t>
+      </w:r>
+      <w:r>
+        <w:t xml:space="preserve"> </w:t>
+      </w:r>
+      <w:r>
+        <w:rPr>
+          <w:rStyle w:val="VerbatimChar"/>
+        </w:rPr>
+        <w:t xml:space="preserve">CM-COVENANT-114-165-PROPAGATION</w:t>
+      </w:r>
+      <w:r>
+        <w:t xml:space="preserve"> </w:t>
+      </w:r>
+      <w:r>
+        <w:t xml:space="preserve">+ paired §1.1 mutation.</w:t>
+      </w:r>
+    </w:p>
+    <w:p>
+      <w:pPr>
+        <w:pStyle w:val="BodyText"/>
+      </w:pPr>
+      <w:r>
+        <w:rPr>
+          <w:b/>
+          <w:bCs/>
+        </w:rPr>
+        <w:t xml:space="preserve">§11.4.166 — Universal Semgrep static analysis (User mandate).</w:t>
+      </w:r>
+      <w:r>
+        <w:t xml:space="preserve"> </w:t>
+      </w:r>
+      <w:r>
+        <w:t xml:space="preserve">Verbatim: "semgrep MUST be available and used by all projects governed by this Constitution for static analysis / security scanning of all code changes, before any commit or push to any upstream! semgrep MUST be installed on every development host, auto-configured, and available on the system PATH for ALL users." Every consuming project MUST ensure semgrep is installed + configured: (1)</w:t>
+      </w:r>
+      <w:r>
+        <w:t xml:space="preserve"> </w:t>
+      </w:r>
+      <w:r>
+        <w:rPr>
+          <w:rStyle w:val="VerbatimChar"/>
+        </w:rPr>
+        <w:t xml:space="preserve">pip install --user semgrep</w:t>
+      </w:r>
+      <w:r>
+        <w:t xml:space="preserve"> </w:t>
+      </w:r>
+      <w:r>
+        <w:t xml:space="preserve">or via</w:t>
+      </w:r>
+      <w:r>
+        <w:t xml:space="preserve"> </w:t>
+      </w:r>
+      <w:r>
+        <w:rPr>
+          <w:rStyle w:val="VerbatimChar"/>
+        </w:rPr>
+        <w:t xml:space="preserve">scripts/semgrep/semgrep_setup.sh</w:t>
+      </w:r>
+      <w:r>
+        <w:t xml:space="preserve">; (2) PATH via</w:t>
+      </w:r>
+      <w:r>
+        <w:t xml:space="preserve"> </w:t>
+      </w:r>
+      <w:r>
+        <w:rPr>
+          <w:rStyle w:val="VerbatimChar"/>
+        </w:rPr>
+        <w:t xml:space="preserve">scripts/semgrep/semgrep_path.sh</w:t>
+      </w:r>
+      <w:r>
+        <w:t xml:space="preserve"> </w:t>
+      </w:r>
+      <w:r>
+        <w:t xml:space="preserve">sourced from .bashrc/.zshrc; (3) scan before commit+push via</w:t>
+      </w:r>
+      <w:r>
+        <w:t xml:space="preserve"> </w:t>
+      </w:r>
+      <w:r>
+        <w:rPr>
+          <w:rStyle w:val="VerbatimChar"/>
+        </w:rPr>
+        <w:t xml:space="preserve">semgrep scan --config auto --error</w:t>
+      </w:r>
+      <w:r>
+        <w:t xml:space="preserve"> </w:t>
+      </w:r>
+      <w:r>
+        <w:t xml:space="preserve">— blocks on findings; (4) MCP integration per §11.4.78 step 3; (5) anti-bluff validation via</w:t>
+      </w:r>
+      <w:r>
+        <w:t xml:space="preserve"> </w:t>
+      </w:r>
+      <w:r>
+        <w:rPr>
+          <w:rStyle w:val="VerbatimChar"/>
+        </w:rPr>
+        <w:t xml:space="preserve">scripts/semgrep/semgrep_validate.sh</w:t>
+      </w:r>
+      <w:r>
+        <w:t xml:space="preserve">; (6) docs_chain context; (7) inherited by reference per §11.4.28/§11.4.35. Classification: universal. Propagation gate</w:t>
+      </w:r>
+      <w:r>
+        <w:t xml:space="preserve"> </w:t>
+      </w:r>
+      <w:r>
+        <w:rPr>
+          <w:rStyle w:val="VerbatimChar"/>
+        </w:rPr>
+        <w:t xml:space="preserve">CM-COVENANT-114-166-PROPAGATION</w:t>
+      </w:r>
+      <w:r>
+        <w:t xml:space="preserve"> </w:t>
+      </w:r>
+      <w:r>
+        <w:t xml:space="preserve">+ paired §1.1 mutation.</w:t>
+      </w:r>
+    </w:p>
+    <w:bookmarkEnd w:id="14"/>
+    <w:bookmarkStart w:id="15" w:name="when-in-doubt"/>
     <w:p>
       <w:pPr>
         <w:pStyle w:val="Heading2"/>
@@ -7766,8 +8908,8 @@
         <w:t xml:space="preserve">If still unclear, ask the operator. Do NOT guess. Do NOT bluff (§11.4.6).</w:t>
       </w:r>
     </w:p>
-    <w:bookmarkEnd w:id="14"/>
     <w:bookmarkEnd w:id="15"/>
+    <w:bookmarkEnd w:id="16"/>
     <w:sectPr>
       <w:footnotePr>
         <w:numRestart w:val="eachSect"/>
@@ -7998,7 +9140,7 @@
         <w:rFonts w:asciiTheme="minorHAnsi" w:cstheme="minorBidi" w:eastAsiaTheme="minorEastAsia" w:hAnsiTheme="minorHAnsi"/>
         <w:sz w:val="24"/>
         <w:szCs w:val="24"/>
-        <w:lang w:bidi="ar-SA" w:eastAsia="zh-CN" w:val="en-US"/>
+        <w:lang w:bidi="ar-SA" w:eastAsia="zh-CN" w:val="en"/>
       </w:rPr>
     </w:rPrDefault>
     <w:pPrDefault>

</xml_diff>

<commit_message>
style(§11.4.162/§11.4.73): enterprise OpenDesign export CSS + restyled governance exports
default-md.css (light+dark, 64 OpenDesign-derived palette tokens, version-tag balloons
green/blue/yellow, colorizer classes preserved) + default-pdf.css (print-safe). Universal +
reusable by every consuming project (operator universal-reusability mandate). Governance-doc
exports (CLAUDE/AGENTS/Constitution/GEMINI/QWEN + codegraph Status) restyled with the new CSS.
</commit_message>
<xml_diff>
--- a/GEMINI.docx
+++ b/GEMINI.docx
@@ -2,7 +2,15 @@
 <file path=word/document.xml><?xml version="1.0" encoding="utf-8"?>
 <w:document xmlns:w="http://schemas.openxmlformats.org/wordprocessingml/2006/main" xmlns:m="http://schemas.openxmlformats.org/officeDocument/2006/math" xmlns:r="http://schemas.openxmlformats.org/officeDocument/2006/relationships" xmlns:o="urn:schemas-microsoft-com:office:office" xmlns:v="urn:schemas-microsoft-com:vml" xmlns:w10="urn:schemas-microsoft-com:office:word" xmlns:a="http://schemas.openxmlformats.org/drawingml/2006/main" xmlns:pic="http://schemas.openxmlformats.org/drawingml/2006/picture" xmlns:wp="http://schemas.openxmlformats.org/drawingml/2006/wordprocessingDrawing">
   <w:body>
-    <w:bookmarkStart w:id="15" w:name="helix-constitution-universal-gemini.md"/>
+    <w:p>
+      <w:pPr>
+        <w:pStyle w:val="Title"/>
+      </w:pPr>
+      <w:r>
+        <w:t xml:space="preserve">GEMINI</w:t>
+      </w:r>
+    </w:p>
+    <w:bookmarkStart w:id="16" w:name="helix-constitution--universal-geminimd"/>
     <w:p>
       <w:pPr>
         <w:pStyle w:val="Heading1"/>
@@ -14,8 +22,7 @@
     <w:tbl>
       <w:tblPr>
         <w:tblStyle w:val="Table"/>
-        <w:tblW w:type="pct" w:w="5000"/>
-        <w:tblLayout w:type="fixed"/>
+        <w:tblW w:type="auto" w:w="0"/>
         <w:tblLook w:firstRow="1" w:lastRow="0" w:firstColumn="0" w:lastColumn="0" w:noHBand="0" w:noVBand="0" w:val="0020"/>
       </w:tblPr>
       <w:tblGrid>
@@ -68,7 +75,7 @@
               <w:pStyle w:val="Compact"/>
             </w:pPr>
             <w:r>
-              <w:t xml:space="preserve">4</w:t>
+              <w:t xml:space="preserve">5</w:t>
             </w:r>
           </w:p>
         </w:tc>
@@ -164,7 +171,7 @@
               <w:pStyle w:val="Compact"/>
             </w:pPr>
             <w:r>
-              <w:t xml:space="preserve">§11.4.166 REPEALED (operator decision 2026-06-22): Universal Semgrep static-analysis mandate repealed — Semgrep no longer mandatory; scaffolding, submodules/semgrep, MCP/pre-commit/PATH wiring, docs_chain semgrep_status context, and CM-COVENANT-114-166-PROPAGATION/CM-SEMGREP-WIRED gates removed. Added §11.4.163 mirror — Universal Media Validation: every recorded artifact MUST pass MEDIA VALIDATION pipeline (OCR/transcription/text parsing vs patterns, self-validated analyzer, structured verdict, pinpoint on FAIL, real-time trigger, §1.1 mutation). Added §11.4.164 mirror — Universal Auto-Propagation Hook: post_update_hook.sh detects/registers/installs skills/MCP/hooks/scripts; consumer invokes after every pull. Added §11.4.165 mirror — Universal Independent Verification Agent: every output passes INDEPENDENT verifier (§11.4.70/.20), zero-finding GO. All Classification: universal (§11.4.17). Prior round: Added §11.4.160–162 mirror entries — Vision-verified recording + HelixQA bridge (User mandate 2026-06-21): every video recording MUST be processed through a vision/OCR pipeline reading on-screen content against SPECIFY-phase expected patterns; ≤5s frame capture, self-validated analyzer, per-frame PASS/FAIL with evidence path. Rootless container runtime (User mandate 2026-06-21): Podman rootless mandatory; rootful Docker/sudo FORBIDDEN unless §11.4.112; vasic-digital/containers sole orchestration layer. OpenDesign UI design system (User mandate 2026-06-21): mandatory UI design-and-refinement system for all user-facing interfaces; design tokens for color/typography/spacing; light+dark themes; extend upstream per §11.4.74. All three Classification: universal (§11.4.17). GEMINI.md mirrors updated in lockstep per §11.4.157. Prior round: New Gemini CLI carrier of the Helix Constitution — added by §11.4.140 (universal action-prefix system) so Gemini CLI gets the LAYER-1 action-prefix recognition floor out of the box, plus the §11.4.141 token-efficiency mandate mirror. This file is one of the four canonical agent context carriers (</w:t>
+              <w:t xml:space="preserve">Added §11.4.170 — Device-independent host-side rendered-UI visual-proof mandate (User mandate 2026-06-25): every change to ANY user-facing UI surface MUST be proven by DEVICE-INDEPENDENT host-side RENDERED PIXELS before claimed correct — the real component rendered to a PNG ON THE HOST (no device/emulator/running app; Compose→Roborazzi/Paparazzi, web→Playwright/Storybook, SwiftUI→snapshot-testing, equiv per stack) for EVERY screen×state×{light,dark} theme, dual-validated by (i) golden image-diff AND (ii) an OCR/vision oracle reading rendered text+labels+control bounds (NO overlap / label-over-label / clipping / off-screen / collapsed-or-giant-unbounded widget). VALUE/token-equality / property-assertion UI tests are FORBIDDEN as the PROOF a UI is correct (forensic FACT 2026-06-25: hex/sp/dp value-equality unit tests stayed GREEN while the operator opened a broken giant-button screen) — may supplement, NEVER substitute the rendered-pixel proof; self-validated golden-good/golden-bad analyzer §11.4.107(10); device-offline is NEVER a valid skip (host-render IS the device-independent path); COMPLEMENTS not replaces §11.4.153/.158/.159/.160 live-device recording + §11.4.162 OpenDesign tokens + §11.4.168 exported-doc visual validation. Propagation gate CM-COVENANT-114-170-PROPAGATION + recommended gate CM-HOST-RENDERED-UI-VISUAL-PROOF + paired §1.1 mutation. Classification: universal (§11.4.17). Prior round: §11.4.166 REPEALED (operator decision 2026-06-22): Universal Semgrep static-analysis mandate repealed — Semgrep no longer mandatory; scaffolding, submodules/semgrep, MCP/pre-commit/PATH wiring, docs_chain semgrep_status context, and CM-COVENANT-114-166-PROPAGATION/CM-SEMGREP-WIRED gates removed. Added §11.4.163 mirror — Universal Media Validation: every recorded artifact MUST pass MEDIA VALIDATION pipeline (OCR/transcription/text parsing vs patterns, self-validated analyzer, structured verdict, pinpoint on FAIL, real-time trigger, §1.1 mutation). Added §11.4.164 mirror — Universal Auto-Propagation Hook: post_update_hook.sh detects/registers/installs skills/MCP/hooks/scripts; consumer invokes after every pull. Added §11.4.165 mirror — Universal Independent Verification Agent: every output passes INDEPENDENT verifier (§11.4.70/.20), zero-finding GO. All Classification: universal (§11.4.17). Prior round: Added §11.4.160–162 mirror entries — Vision-verified recording + HelixQA bridge (User mandate 2026-06-21): every video recording MUST be processed through a vision/OCR pipeline reading on-screen content against SPECIFY-phase expected patterns; ≤5s frame capture, self-validated analyzer, per-frame PASS/FAIL with evidence path. Rootless container runtime (User mandate 2026-06-21): Podman rootless mandatory; rootful Docker/sudo FORBIDDEN unless §11.4.112; vasic-digital/containers sole orchestration layer. OpenDesign UI design system (User mandate 2026-06-21): mandatory UI design-and-refinement system for all user-facing interfaces; design tokens for color/typography/spacing; light+dark themes; extend upstream per §11.4.74. All three Classification: universal (§11.4.17). GEMINI.md mirrors updated in lockstep per §11.4.157. Prior round: New Gemini CLI carrier of the Helix Constitution — added by §11.4.140 (universal action-prefix system) so Gemini CLI gets the LAYER-1 action-prefix recognition floor out of the box, plus the §11.4.141 token-efficiency mandate mirror. This file is one of the four canonical agent context carriers (</w:t>
             </w:r>
             <w:r>
               <w:rPr>
@@ -500,7 +507,7 @@
         <w:t xml:space="preserve"> </w:t>
       </w:r>
       <w:r>
-        <w:t xml:space="preserve">project’s own repo-root</w:t>
+        <w:t xml:space="preserve">project's own repo-root</w:t>
       </w:r>
       <w:r>
         <w:t xml:space="preserve"> </w:t>
@@ -535,7 +542,7 @@
         <w:pStyle w:val="BodyText"/>
       </w:pPr>
       <w:r>
-        <w:t xml:space="preserve">For agents driven from a consuming project, the project’s repo-root carrier</w:t>
+        <w:t xml:space="preserve">For agents driven from a consuming project, the project's repo-root carrier</w:t>
       </w:r>
       <w:r>
         <w:t xml:space="preserve"> </w:t>
@@ -604,7 +611,7 @@
       </w:r>
     </w:p>
     <w:bookmarkEnd w:id="9"/>
-    <w:bookmarkStart w:id="11" w:name="X2c10a2e76b685975585d4bbddc3d6345f162bd6"/>
+    <w:bookmarkStart w:id="11" w:name="Xa248266842dbec6af31dbcf1ca91a15c9292d5b"/>
     <w:p>
       <w:pPr>
         <w:pStyle w:val="Heading2"/>
@@ -716,7 +723,7 @@
         <w:t xml:space="preserve"> </w:t>
       </w:r>
       <w:r>
-        <w:t xml:space="preserve">When a user prompt’s FIRST</w:t>
+        <w:t xml:space="preserve">When a user prompt's FIRST</w:t>
       </w:r>
       <w:r>
         <w:t xml:space="preserve"> </w:t>
@@ -761,7 +768,7 @@
         <w:t xml:space="preserve"> </w:t>
       </w:r>
       <w:r>
-        <w:t xml:space="preserve">(2) if it is a registered action, REPLACE the prefix with that action’s</w:t>
+        <w:t xml:space="preserve">(2) if it is a registered action, REPLACE the prefix with that action's</w:t>
       </w:r>
       <w:r>
         <w:t xml:space="preserve"> </w:t>
@@ -1397,7 +1404,7 @@
           <w:i/>
           <w:iCs/>
         </w:rPr>
-        <w:t xml:space="preserve">“The following prompt that we will provide MUST BE executed in background</w:t>
+        <w:t xml:space="preserve">"The following prompt that we will provide MUST BE executed in background</w:t>
       </w:r>
       <w:r>
         <w:rPr>
@@ -1453,7 +1460,7 @@
           <w:i/>
           <w:iCs/>
         </w:rPr>
-        <w:t xml:space="preserve">any false results and without any bluff!”</w:t>
+        <w:t xml:space="preserve">any false results and without any bluff!"</w:t>
       </w:r>
       <w:r>
         <w:t xml:space="preserve"> </w:t>
@@ -1599,12 +1606,9 @@
       <w:r>
         <w:t xml:space="preserve">flag.</w:t>
       </w:r>
-      <w:r>
-        <w:t xml:space="preserve"> </w:t>
-      </w:r>
     </w:p>
     <w:bookmarkEnd w:id="11"/>
-    <w:bookmarkStart w:id="13" w:name="token-efficiency-mandate-11.4.141"/>
+    <w:bookmarkStart w:id="14" w:name="token-efficiency-mandate-114141"/>
     <w:p>
       <w:pPr>
         <w:pStyle w:val="Heading2"/>
@@ -2047,70 +2051,7 @@
         <w:t xml:space="preserve"> </w:t>
       </w:r>
       <w:r>
-        <w:t xml:space="preserve">Verbatim operator mandate:</w:t>
-      </w:r>
-      <w:r>
-        <w:t xml:space="preserve"> </w:t>
-      </w:r>
-      <w:r>
-        <w:t xml:space="preserve">“ALL changes we do MUST pass through the code review step!!! ALWAYS!!!”</w:t>
-      </w:r>
-      <w:r>
-        <w:t xml:space="preserve"> </w:t>
-      </w:r>
-      <w:r>
-        <w:t xml:space="preserve">EVERY change made to ANY repository this Constitution governs — without exception — MUST pass through an INDEPENDENT code-review step BEFORE it is accepted, committed, or built. NO change class is exempt: source code, fixes, tests, gates, meta-test mutations, documentation, doc-tooling, build/CI scripts, configuration, governance files (Constitution / CLAUDE / AGENTS / QWEN), conductor main-stream edits, sub-agent output, refactors, single-line edits — if a diff exists, it gets an independent review. This is the ABSOLUTE form of §11.4.125 (code-review agent gate after a batch, before pre-build sweep + main build): §11.4.142 strips every implicit scoping §11.4.125’s</w:t>
-      </w:r>
-      <w:r>
-        <w:t xml:space="preserve"> </w:t>
-      </w:r>
-      <w:r>
-        <w:t xml:space="preserve">“after all fixes/changes/implementations are done”</w:t>
-      </w:r>
-      <w:r>
-        <w:t xml:space="preserve"> </w:t>
-      </w:r>
-      <w:r>
-        <w:t xml:space="preserve">phrasing could leave open — no</w:t>
-      </w:r>
-      <w:r>
-        <w:t xml:space="preserve"> </w:t>
-      </w:r>
-      <w:r>
-        <w:t xml:space="preserve">“just a doc edit”</w:t>
-      </w:r>
-      <w:r>
-        <w:t xml:space="preserve">, no</w:t>
-      </w:r>
-      <w:r>
-        <w:t xml:space="preserve"> </w:t>
-      </w:r>
-      <w:r>
-        <w:t xml:space="preserve">“just a one-liner”</w:t>
-      </w:r>
-      <w:r>
-        <w:t xml:space="preserve">, no</w:t>
-      </w:r>
-      <w:r>
-        <w:t xml:space="preserve"> </w:t>
-      </w:r>
-      <w:r>
-        <w:t xml:space="preserve">“the author already self-reviewed (§11.4.92)”</w:t>
-      </w:r>
-      <w:r>
-        <w:t xml:space="preserve">, no</w:t>
-      </w:r>
-      <w:r>
-        <w:t xml:space="preserve"> </w:t>
-      </w:r>
-      <w:r>
-        <w:t xml:space="preserve">“trivial change”</w:t>
-      </w:r>
-      <w:r>
-        <w:t xml:space="preserve"> </w:t>
-      </w:r>
-      <w:r>
-        <w:t xml:space="preserve">carve-out.</w:t>
+        <w:t xml:space="preserve">Verbatim operator mandate: "ALL changes we do MUST pass through the code review step!!! ALWAYS!!!" EVERY change made to ANY repository this Constitution governs — without exception — MUST pass through an INDEPENDENT code-review step BEFORE it is accepted, committed, or built. NO change class is exempt: source code, fixes, tests, gates, meta-test mutations, documentation, doc-tooling, build/CI scripts, configuration, governance files (Constitution / CLAUDE / AGENTS / QWEN), conductor main-stream edits, sub-agent output, refactors, single-line edits — if a diff exists, it gets an independent review. This is the ABSOLUTE form of §11.4.125 (code-review agent gate after a batch, before pre-build sweep + main build): §11.4.142 strips every implicit scoping §11.4.125's "after all fixes/changes/implementations are done" phrasing could leave open — no "just a doc edit", no "just a one-liner", no "the author already self-reviewed (§11.4.92)", no "trivial change" carve-out.</w:t>
       </w:r>
       <w:r>
         <w:t xml:space="preserve"> </w:t>
@@ -2126,7 +2067,7 @@
         <w:t xml:space="preserve"> </w:t>
       </w:r>
       <w:r>
-        <w:t xml:space="preserve">— the reviewer MUST be structurally separated from the author (a dedicated code-review agent, subagent-driven by default per §11.4.70 / §11.4.20, or a distinct human), NEVER the author re-reading their own work; §11.4.92’s multi-pass self-evaluation is the AUTHOR-side discipline and PRECEDES (never satisfies) §11.4.142.</w:t>
+        <w:t xml:space="preserve">— the reviewer MUST be structurally separated from the author (a dedicated code-review agent, subagent-driven by default per §11.4.70 / §11.4.20, or a distinct human), NEVER the author re-reading their own work; §11.4.92's multi-pass self-evaluation is the AUTHOR-side discipline and PRECEDES (never satisfies) §11.4.142.</w:t>
       </w:r>
       <w:r>
         <w:t xml:space="preserve"> </w:t>
@@ -2142,19 +2083,7 @@
         <w:t xml:space="preserve"> </w:t>
       </w:r>
       <w:r>
-        <w:t xml:space="preserve">(§11.4 / §11.4.1) — a rubber-stamp</w:t>
-      </w:r>
-      <w:r>
-        <w:t xml:space="preserve"> </w:t>
-      </w:r>
-      <w:r>
-        <w:t xml:space="preserve">“looks good”</w:t>
-      </w:r>
-      <w:r>
-        <w:t xml:space="preserve"> </w:t>
-      </w:r>
-      <w:r>
-        <w:t xml:space="preserve">is not a review; it MUST genuinely analyse correctness, safety (no host §12 / data §9 / target-hardware §11.4.133 regression), will-it-really-work (no solve-A-create-B), end-user behaviour (§11.4 / §107), and test-genuineness (§1.1), its conclusions captured evidence per §11.4.5 / §11.4.69, and</w:t>
+        <w:t xml:space="preserve">(§11.4 / §11.4.1) — a rubber-stamp "looks good" is not a review; it MUST genuinely analyse correctness, safety (no host §12 / data §9 / target-hardware §11.4.133 regression), will-it-really-work (no solve-A-create-B), end-user behaviour (§11.4 / §107), and test-genuineness (§1.1), its conclusions captured evidence per §11.4.5 / §11.4.69, and</w:t>
       </w:r>
       <w:r>
         <w:t xml:space="preserve"> </w:t>
@@ -2353,19 +2282,7 @@
         <w:t xml:space="preserve"> </w:t>
       </w:r>
       <w:r>
-        <w:t xml:space="preserve">Verbatim operator mandate:</w:t>
-      </w:r>
-      <w:r>
-        <w:t xml:space="preserve"> </w:t>
-      </w:r>
-      <w:r>
-        <w:t xml:space="preserve">“All video streaming apps … require to choose some title and to press proper UI button to start or resume playing! Proper UI interaction to play exact show with proper content and subtitles is MANDATORY! Without it we just eventually play on 2nd display sample, and that’s it mostly! THIS MUST BE ADDED as MANDATORY RULE regarding testing of any video streaming app in general with full automation tests! Universal in root constitution + a consuming project’s extensions.”</w:t>
-      </w:r>
-      <w:r>
-        <w:t xml:space="preserve"> </w:t>
-      </w:r>
-      <w:r>
-        <w:t xml:space="preserve">Any full-automation test that asserts a video player / streaming application plays content MUST drive the REAL end-user journey through the app’s OWN UI — launch → BROWSE the actual catalog → choose a SPECIFIC title → press the real Play/Resume button → confirm THAT chosen content is genuinely playing, with its correct subtitles, on the intended routing target. A test that bypasses the journey with a sample / demo / built-in-loop clip, a deep-link /</w:t>
+        <w:t xml:space="preserve">Verbatim operator mandate: "All video streaming apps ... require to choose some title and to press proper UI button to start or resume playing! Proper UI interaction to play exact show with proper content and subtitles is MANDATORY! Without it we just eventually play on 2nd display sample, and that's it mostly! THIS MUST BE ADDED as MANDATORY RULE regarding testing of any video streaming app in general with full automation tests! Universal in root constitution + a consuming project's extensions." Any full-automation test that asserts a video player / streaming application plays content MUST drive the REAL end-user journey through the app's OWN UI — launch → BROWSE the actual catalog → choose a SPECIFIC title → press the real Play/Resume button → confirm THAT chosen content is genuinely playing, with its correct subtitles, on the intended routing target. A test that bypasses the journey with a sample / demo / built-in-loop clip, a deep-link /</w:t>
       </w:r>
       <w:r>
         <w:t xml:space="preserve"> </w:t>
@@ -2380,7 +2297,7 @@
         <w:t xml:space="preserve"> </w:t>
       </w:r>
       <w:r>
-        <w:t xml:space="preserve">/ intent shortcut, a synthetic or pre-staged stream, or any path that does NOT exercise the app’s own browse-select-play UI is a §11.4 PASS-bluff at the user-journey layer: it validates ROUTING (that</w:t>
+        <w:t xml:space="preserve">/ intent shortcut, a synthetic or pre-staged stream, or any path that does NOT exercise the app's own browse-select-play UI is a §11.4 PASS-bluff at the user-journey layer: it validates ROUTING (that</w:t>
       </w:r>
       <w:r>
         <w:t xml:space="preserve"> </w:t>
@@ -2396,31 +2313,7 @@
         <w:t xml:space="preserve"> </w:t>
       </w:r>
       <w:r>
-        <w:t xml:space="preserve">reaches the display) while leaving the user-visible behaviour the operator cares about —</w:t>
-      </w:r>
-      <w:r>
-        <w:t xml:space="preserve"> </w:t>
-      </w:r>
-      <w:r>
-        <w:t xml:space="preserve">“the show I picked actually plays”</w:t>
-      </w:r>
-      <w:r>
-        <w:t xml:space="preserve"> </w:t>
-      </w:r>
-      <w:r>
-        <w:t xml:space="preserve">— unproven (the operator’s</w:t>
-      </w:r>
-      <w:r>
-        <w:t xml:space="preserve"> </w:t>
-      </w:r>
-      <w:r>
-        <w:t xml:space="preserve">“we just eventually play on 2nd display sample, and that’s it mostly”</w:t>
-      </w:r>
-      <w:r>
-        <w:t xml:space="preserve"> </w:t>
-      </w:r>
-      <w:r>
-        <w:t xml:space="preserve">gap). The mandate (ALL hold): (1)</w:t>
+        <w:t xml:space="preserve">reaches the display) while leaving the user-visible behaviour the operator cares about — "the show I picked actually plays" — unproven (the operator's "we just eventually play on 2nd display sample, and that's it mostly" gap). The mandate (ALL hold): (1)</w:t>
       </w:r>
       <w:r>
         <w:t xml:space="preserve"> </w:t>
@@ -2436,7 +2329,7 @@
         <w:t xml:space="preserve"> </w:t>
       </w:r>
       <w:r>
-        <w:t xml:space="preserve">— launch → catalog browse → specific-title selection → real Play/Resume press through the app’s own UI (§11.4.48 UI-driven), NEVER a deep-link / intent / sample / loop-clip shortcut; (2)</w:t>
+        <w:t xml:space="preserve">— launch → catalog browse → specific-title selection → real Play/Resume press through the app's own UI (§11.4.48 UI-driven), NEVER a deep-link / intent / sample / loop-clip shortcut; (2)</w:t>
       </w:r>
       <w:r>
         <w:t xml:space="preserve"> </w:t>
@@ -2452,7 +2345,7 @@
         <w:t xml:space="preserve"> </w:t>
       </w:r>
       <w:r>
-        <w:t xml:space="preserve">— the PASS proves the SPECIFIC selected title is playing (not merely that pixels move on the target) via the §11.4.107 liveness battery on the §11.4.136 real-content path + the §11.4.137 subtitle content-correctness oracle for the chosen title’s captions; (3)</w:t>
+        <w:t xml:space="preserve">— the PASS proves the SPECIFIC selected title is playing (not merely that pixels move on the target) via the §11.4.107 liveness battery on the §11.4.136 real-content path + the §11.4.137 subtitle content-correctness oracle for the chosen title's captions; (3)</w:t>
       </w:r>
       <w:r>
         <w:t xml:space="preserve"> </w:t>
@@ -2468,7 +2361,7 @@
         <w:t xml:space="preserve"> </w:t>
       </w:r>
       <w:r>
-        <w:t xml:space="preserve">— when the app’s accessibility hierarchy is blank/unreliable (TV-Compose / leanback / canvas / GL), DRIVE input + ASSERT content via the §11.4.117 CV/OCR pixel oracle, never a hierarchy-only tool; (4)</w:t>
+        <w:t xml:space="preserve">— when the app's accessibility hierarchy is blank/unreliable (TV-Compose / leanback / canvas / GL), DRIVE input + ASSERT content via the §11.4.117 CV/OCR pixel oracle, never a hierarchy-only tool; (4)</w:t>
       </w:r>
       <w:r>
         <w:t xml:space="preserve"> </w:t>
@@ -2515,19 +2408,7 @@
         <w:t xml:space="preserve"> </w:t>
       </w:r>
       <w:r>
-        <w:t xml:space="preserve">SKIP-with-reason per §11.4.52 + §11.4.3 with a tracked migration item — NEVER a metadata-only / sample-played / routing-only PASS. Honest boundary (§11.4.6):</w:t>
-      </w:r>
-      <w:r>
-        <w:t xml:space="preserve"> </w:t>
-      </w:r>
-      <w:r>
-        <w:t xml:space="preserve">“the routing fired so the title is playing”</w:t>
-      </w:r>
-      <w:r>
-        <w:t xml:space="preserve"> </w:t>
-      </w:r>
-      <w:r>
-        <w:t xml:space="preserve">is a guess — only the chosen-content liveness + subtitle oracle on the real journey proves it. Composes §11.4.48 / §11.4.107 / §11.4.117 / §11.4.136 / §11.4.137 / §11.4.52 / §11.4.3 / §107 / §1.1. Classification: universal (§11.4.17) — the consuming project supplies its concrete app roster, login-credential source, routing target, and UI-driving / pixel-oracle harness per §11.4.35. Propagation gate</w:t>
+        <w:t xml:space="preserve">SKIP-with-reason per §11.4.52 + §11.4.3 with a tracked migration item — NEVER a metadata-only / sample-played / routing-only PASS. Honest boundary (§11.4.6): "the routing fired so the title is playing" is a guess — only the chosen-content liveness + subtitle oracle on the real journey proves it. Composes §11.4.48 / §11.4.107 / §11.4.117 / §11.4.136 / §11.4.137 / §11.4.52 / §11.4.3 / §107 / §1.1. Classification: universal (§11.4.17) — the consuming project supplies its concrete app roster, login-credential source, routing target, and UI-driving / pixel-oracle harness per §11.4.35. Propagation gate</w:t>
       </w:r>
       <w:r>
         <w:t xml:space="preserve"> </w:t>
@@ -2569,7 +2450,7 @@
         <w:t xml:space="preserve"> </w:t>
       </w:r>
       <w:r>
-        <w:t xml:space="preserve">(every video-streaming-app playback test drives the real browse-select-play journey + confirms the chosen content + subtitles, or SKIPs-with-reason) + paired §1.1 mutation (replace a real-journey test’s browse-select-play path with a deep-link / sample shortcut → gate FAILs; strip the literal → propagation gate FAILs; gate-code = separate work item).</w:t>
+        <w:t xml:space="preserve">(every video-streaming-app playback test drives the real browse-select-play journey + confirms the chosen content + subtitles, or SKIPs-with-reason) + paired §1.1 mutation (replace a real-journey test's browse-select-play path with a deep-link / sample shortcut → gate FAILs; strip the literal → propagation gate FAILs; gate-code = separate work item).</w:t>
       </w:r>
       <w:r>
         <w:t xml:space="preserve"> </w:t>
@@ -2731,7 +2612,7 @@
         <w:t xml:space="preserve"> </w:t>
       </w:r>
       <w:r>
-        <w:t xml:space="preserve">for the device to return using the project’s ALREADY-DEFINED reconnection timings — never invented numbers (§11.4.6), the SAME grace / reconnect / poll budgets the project’s recovery path already uses; (c)</w:t>
+        <w:t xml:space="preserve">for the device to return using the project's ALREADY-DEFINED reconnection timings — never invented numbers (§11.4.6), the SAME grace / reconnect / poll budgets the project's recovery path already uses; (c)</w:t>
       </w:r>
       <w:r>
         <w:t xml:space="preserve"> </w:t>
@@ -2763,7 +2644,7 @@
         <w:t xml:space="preserve"> </w:t>
       </w:r>
       <w:r>
-        <w:t xml:space="preserve">to the project’s sanctioned device-recovery path (per §11.4.69 feature class</w:t>
+        <w:t xml:space="preserve">to the project's sanctioned device-recovery path (per §11.4.69 feature class</w:t>
       </w:r>
       <w:r>
         <w:t xml:space="preserve"> </w:t>
@@ -2775,7 +2656,7 @@
         <w:t xml:space="preserve">device_recovery</w:t>
       </w:r>
       <w:r>
-        <w:t xml:space="preserve">) if the device does not return within the defined timeout — through the sanctioned, authorization-gated recovery entry point ONLY, never bypassing its gate and never performing a destructive recovery (e.g. a power-cycle) autonomously without that authorization (§11.4.21 / §11.4.101 — high-blast-radius recovery is gated; while blocked the system keeps following the device, logging the blocked-escalation honestly). A tracked-device drop that produces a silent corpus hole, a never-resumed recording, or a never-escalated permanent absence is the bluff this anchor forbids. Composes §11.4.128 (always-on recording — §11.4.144 closes its drop-handling gap) / §11.4.69 (</w:t>
+        <w:t xml:space="preserve">) if the device does not return within the defined timeout — through the sanctioned, authorization-gated recovery entry point ONLY, never bypassing its gate and never performing a destructive recovery (e.g. a power-cycle) autonomously without that authorization (§11.4.21 / §11.4.101 — high-blast-radius recovery is gated; while blocked the system keeps following the device, logging the blocked-escalation honestly). A tracked-device drop that produces a silent corpus hole, a never-resumed recording, or a never-escalated permanent absence is the bluff this anchor forbids. Composes §11.4.128 (always-on recording — §11.4.144 closes its drop-handling gap) / §11.4.69 (</w:t>
       </w:r>
       <w:r>
         <w:rPr>
@@ -2955,28 +2836,7 @@
         <w:t xml:space="preserve"> </w:t>
       </w:r>
       <w:r>
-        <w:t xml:space="preserve">For EVERY fix / change / new feature, INDEPENDENT impact-research agents (subagent-driven §11.4.70/§11.4.20, structurally separate from the author — §11.4.92 self-eval PRECEDES, never satisfies — adversarial</w:t>
-      </w:r>
-      <w:r>
-        <w:t xml:space="preserve"> </w:t>
-      </w:r>
-      <w:r>
-        <w:t xml:space="preserve">“refute-the-change”</w:t>
-      </w:r>
-      <w:r>
-        <w:t xml:space="preserve"> </w:t>
-      </w:r>
-      <w:r>
-        <w:t xml:space="preserve">stance to defeat the documented LLM confirmation-bias failure mode) MUST research the change AND its connected/dependent features across a CLOSED SET OF EIGHT ANGLES — (1) correctness/logic, (2) regression (what existing working feature could break — via call-graph impact enumerating every direct + transitive caller and contract-dependent feature, each mapped to its test), (3) latent/dangerous-code — the recents class (runtime-only failure, interface/ABI/contract mismatch, concurrency/data-race, resource lifecycle), (4) security (taint/injection/secret/unsafe-API), (5) performance (latency/memory/thermal under load vs baseline), (6) host/data/target-hardware safety per §12/§9/§11.4.133, (7) cross-feature interaction (shared state/timing/hardware contention), (8) business-logic conformance (matches the spec AND the connected features’ contracts, not merely compiles). Forensic anchor (FACT, project-internal): the recents / 3-button-nav path shipped a latent AIDL-interface-contract mismatch that PASSED code review yet failed at RUNTIME ONLY (ANR on a recents-reaping gesture) because no review angle interrogated the interface contract / concurrency-lifecycle / silently-broken connected feature — the §11.4.108 SOURCE→ARTIFACT→RUNTIME→USER-VISIBLE gap caught only after the fact; §11.4.145 shifts that discovery LEFT. Each angle MUST name the TOOL(S) used + obtain the required DEPTH (the diff, the full changed unit, its declared contract, the spec section, every connected feature — NEVER the diff lines alone) + emit a captured-evidence conclusion per §11.4.5/§11.4.69 (</w:t>
-      </w:r>
-      <w:r>
-        <w:t xml:space="preserve">“looks fine”</w:t>
-      </w:r>
-      <w:r>
-        <w:t xml:space="preserve"> </w:t>
-      </w:r>
-      <w:r>
-        <w:t xml:space="preserve">forbidden, §11.4.1); a genuinely-N/A angle is recorded</w:t>
+        <w:t xml:space="preserve">For EVERY fix / change / new feature, INDEPENDENT impact-research agents (subagent-driven §11.4.70/§11.4.20, structurally separate from the author — §11.4.92 self-eval PRECEDES, never satisfies — adversarial "refute-the-change" stance to defeat the documented LLM confirmation-bias failure mode) MUST research the change AND its connected/dependent features across a CLOSED SET OF EIGHT ANGLES — (1) correctness/logic, (2) regression (what existing working feature could break — via call-graph impact enumerating every direct + transitive caller and contract-dependent feature, each mapped to its test), (3) latent/dangerous-code — the recents class (runtime-only failure, interface/ABI/contract mismatch, concurrency/data-race, resource lifecycle), (4) security (taint/injection/secret/unsafe-API), (5) performance (latency/memory/thermal under load vs baseline), (6) host/data/target-hardware safety per §12/§9/§11.4.133, (7) cross-feature interaction (shared state/timing/hardware contention), (8) business-logic conformance (matches the spec AND the connected features' contracts, not merely compiles). Forensic anchor (FACT, project-internal): the recents / 3-button-nav path shipped a latent AIDL-interface-contract mismatch that PASSED code review yet failed at RUNTIME ONLY (ANR on a recents-reaping gesture) because no review angle interrogated the interface contract / concurrency-lifecycle / silently-broken connected feature — the §11.4.108 SOURCE→ARTIFACT→RUNTIME→USER-VISIBLE gap caught only after the fact; §11.4.145 shifts that discovery LEFT. Each angle MUST name the TOOL(S) used + obtain the required DEPTH (the diff, the full changed unit, its declared contract, the spec section, every connected feature — NEVER the diff lines alone) + emit a captured-evidence conclusion per §11.4.5/§11.4.69 ("looks fine" forbidden, §11.4.1); a genuinely-N/A angle is recorded</w:t>
       </w:r>
       <w:r>
         <w:t xml:space="preserve"> </w:t>
@@ -3174,7 +3034,7 @@
         <w:t xml:space="preserve"> </w:t>
       </w:r>
       <w:r>
-        <w:t xml:space="preserve">Every reported problem MUST be handled by a NAMED three-step test workflow — §11.4.146 does NOT re-author its component disciplines, it NAMES + BINDS them into the operator’s exact per-defect sequence and adds ONLY the two emphases the components leave implicit.</w:t>
+        <w:t xml:space="preserve">Every reported problem MUST be handled by a NAMED three-step test workflow — §11.4.146 does NOT re-author its component disciplines, it NAMES + BINDS them into the operator's exact per-defect sequence and adds ONLY the two emphases the components leave implicit.</w:t>
       </w:r>
       <w:r>
         <w:t xml:space="preserve"> </w:t>
@@ -3234,16 +3094,7 @@
         <w:t xml:space="preserve"> </w:t>
       </w:r>
       <w:r>
-        <w:t xml:space="preserve">NEW EMPHASIS (D2) immediately after STEP 2 the test MUST be FANNED OUT across the full case-space of the SAME functionality — all flows, valid + invalid + boundary (§11.4.85 empty/max/off-by-one) + concurrent (§11.4.85 contention) + failure-injection (§11.4.85 chaos) + topology variants (§11.4.3) — confirming no issue of any kind, with PROVABLE enumerated coverage per §11.4.118 (a listed case-set with per-case outcome, never</w:t>
-      </w:r>
-      <w:r>
-        <w:t xml:space="preserve"> </w:t>
-      </w:r>
-      <w:r>
-        <w:t xml:space="preserve">“no other issues found”</w:t>
-      </w:r>
-      <w:r>
-        <w:t xml:space="preserve">); a REQUIRED step, NOT deferred to a release-cycle discovery sweep and NOT reduced to a single guard; each user-visible case carries rock-solid physical evidence per §11.4.123 + is registered into the §11.4.135 standing regression-guard suite; a newly-discovered fan-out defect triggers §11.4.4 test-interrupt + re-enters STEP 1. (ANTI-BLUFF, all steps) every PASS is rock-solid CAPTURED physical evidence per §11.4.123 (§11.4.5/§11.4.69/§11.4.107) — metadata-only / config-only / absence-of-error / grep-without-runtime PASS forbidden (§11.4/§11.4.1); unclear validation method ⇒ deep-research-before-declaring-untestable per §11.4.123/§11.4.8/§11.4.99; an operator-found defect the green suite missed triggers §11.4.138. Honest boundary (§11.4.6): STEP 3 reduces the unknown-unknown surface but does not prove zero remaining defects (§11.4.118) — un-exercised cases stated as honest gaps, never silently implied clean. Composes §11.4.43/.115/.102/.130/.108/.139/.50/.85/.118/.135/.3/.123/.5/.69/.107/.138/.4/§107/§1.1. Classification: universal (§11.4.17). Propagation gate</w:t>
+        <w:t xml:space="preserve">NEW EMPHASIS (D2) immediately after STEP 2 the test MUST be FANNED OUT across the full case-space of the SAME functionality — all flows, valid + invalid + boundary (§11.4.85 empty/max/off-by-one) + concurrent (§11.4.85 contention) + failure-injection (§11.4.85 chaos) + topology variants (§11.4.3) — confirming no issue of any kind, with PROVABLE enumerated coverage per §11.4.118 (a listed case-set with per-case outcome, never "no other issues found"); a REQUIRED step, NOT deferred to a release-cycle discovery sweep and NOT reduced to a single guard; each user-visible case carries rock-solid physical evidence per §11.4.123 + is registered into the §11.4.135 standing regression-guard suite; a newly-discovered fan-out defect triggers §11.4.4 test-interrupt + re-enters STEP 1. (ANTI-BLUFF, all steps) every PASS is rock-solid CAPTURED physical evidence per §11.4.123 (§11.4.5/§11.4.69/§11.4.107) — metadata-only / config-only / absence-of-error / grep-without-runtime PASS forbidden (§11.4/§11.4.1); unclear validation method ⇒ deep-research-before-declaring-untestable per §11.4.123/§11.4.8/§11.4.99; an operator-found defect the green suite missed triggers §11.4.138. Honest boundary (§11.4.6): STEP 3 reduces the unknown-unknown surface but does not prove zero remaining defects (§11.4.118) — un-exercised cases stated as honest gaps, never silently implied clean. Composes §11.4.43/.115/.102/.130/.108/.139/.50/.85/.118/.135/.3/.123/.5/.69/.107/.138/.4/§107/§1.1. Classification: universal (§11.4.17). Propagation gate</w:t>
       </w:r>
       <w:r>
         <w:t xml:space="preserve"> </w:t>
@@ -3285,7 +3136,7 @@
         <w:t xml:space="preserve"> </w:t>
       </w:r>
       <w:r>
-        <w:t xml:space="preserve">(every closed defect’s fix carries a §11.4.115 reproduce-first polarity test with captured defect-characterisation [STEP 1] + its</w:t>
+        <w:t xml:space="preserve">(every closed defect's fix carries a §11.4.115 reproduce-first polarity test with captured defect-characterisation [STEP 1] + its</w:t>
       </w:r>
       <w:r>
         <w:t xml:space="preserve"> </w:t>
@@ -3453,19 +3304,7 @@
         <w:t xml:space="preserve"> </w:t>
       </w:r>
       <w:r>
-        <w:t xml:space="preserve">Verbatim operator intent:</w:t>
-      </w:r>
-      <w:r>
-        <w:t xml:space="preserve"> </w:t>
-      </w:r>
-      <w:r>
-        <w:t xml:space="preserve">“any agent that crashed because of something MUST BE respawned and finish its work at some point! We MUST NOT lose any work, forget about or have it corrupted!”</w:t>
-      </w:r>
-      <w:r>
-        <w:t xml:space="preserve"> </w:t>
-      </w:r>
-      <w:r>
-        <w:t xml:space="preserve">Forensic case study (FACT): dispatched subagents died on TRANSIENT causes (</w:t>
+        <w:t xml:space="preserve">Verbatim operator intent: "any agent that crashed because of something MUST BE respawned and finish its work at some point! We MUST NOT lose any work, forget about or have it corrupted!" Forensic case study (FACT): dispatched subagents died on TRANSIENT causes (</w:t>
       </w:r>
       <w:r>
         <w:rPr>
@@ -3492,19 +3331,7 @@
         <w:t xml:space="preserve"> </w:t>
       </w:r>
       <w:r>
-        <w:t xml:space="preserve">killed 2, one left PARTIAL edits — two source files written, the dependent SystemUI sliders + doc + test NOT done), each re-dispatched by pure conductor vigilance with NO mechanical guarantee — the moment conductor context is lost / compacted / the conductor itself crashes, an in-flight-but-dead work unit is silently dropped (lost / forgotten / corrupted). Every dispatched agent/subagent MUST be tracked through its full lifecycle so a crash NEVER loses, forgets, or corrupts its work; a crashed agent is NOT a completed agent (§11.4.6 —</w:t>
-      </w:r>
-      <w:r>
-        <w:t xml:space="preserve"> </w:t>
-      </w:r>
-      <w:r>
-        <w:t xml:space="preserve">“it probably finished before dying”</w:t>
-      </w:r>
-      <w:r>
-        <w:t xml:space="preserve"> </w:t>
-      </w:r>
-      <w:r>
-        <w:t xml:space="preserve">is a forbidden guess; abnormal termination is positive evidence the unit is OPEN). The mandate (ALL hold):</w:t>
+        <w:t xml:space="preserve">killed 2, one left PARTIAL edits — two source files written, the dependent SystemUI sliders + doc + test NOT done), each re-dispatched by pure conductor vigilance with NO mechanical guarantee — the moment conductor context is lost / compacted / the conductor itself crashes, an in-flight-but-dead work unit is silently dropped (lost / forgotten / corrupted). Every dispatched agent/subagent MUST be tracked through its full lifecycle so a crash NEVER loses, forgets, or corrupts its work; a crashed agent is NOT a completed agent (§11.4.6 — "it probably finished before dying" is a forbidden guess; abnormal termination is positive evidence the unit is OPEN). The mandate (ALL hold):</w:t>
       </w:r>
       <w:r>
         <w:t xml:space="preserve"> </w:t>
@@ -3532,13 +3359,7 @@
         <w:t xml:space="preserve">{dispatched | in-flight | crashed | respawned | complete}</w:t>
       </w:r>
       <w:r>
-        <w:t xml:space="preserve">), reusing the §11.4.116 sync substrate (JSONL event stream + atomic status snapshot;</w:t>
-      </w:r>
-      <w:r>
-        <w:t xml:space="preserve"> </w:t>
-      </w:r>
-      <w:r>
-        <w:t xml:space="preserve">“an entry with no dispatch-event cannot show</w:t>
+        <w:t xml:space="preserve">), reusing the §11.4.116 sync substrate (JSONL event stream + atomic status snapshot; "an entry with no dispatch-event cannot show</w:t>
       </w:r>
       <w:r>
         <w:t xml:space="preserve"> </w:t>
@@ -3550,22 +3371,7 @@
         <w:t xml:space="preserve">complete</w:t>
       </w:r>
       <w:r>
-        <w:t xml:space="preserve">”</w:t>
-      </w:r>
-      <w:r>
-        <w:t xml:space="preserve">); the registry is the SINGLE SOURCE OF TRUTH for</w:t>
-      </w:r>
-      <w:r>
-        <w:t xml:space="preserve"> </w:t>
-      </w:r>
-      <w:r>
-        <w:t xml:space="preserve">“is this work owed?”</w:t>
-      </w:r>
-      <w:r>
-        <w:t xml:space="preserve"> </w:t>
-      </w:r>
-      <w:r>
-        <w:t xml:space="preserve">and an unregistered dispatch is itself a violation;</w:t>
+        <w:t xml:space="preserve">"); the registry is the SINGLE SOURCE OF TRUTH for "is this work owed?" and an unregistered dispatch is itself a violation;</w:t>
       </w:r>
       <w:r>
         <w:t xml:space="preserve"> </w:t>
@@ -3581,7 +3387,7 @@
         <w:t xml:space="preserve"> </w:t>
       </w:r>
       <w:r>
-        <w:t xml:space="preserve">— any abnormal termination (transient rate-limit/socket-close, any non-completion exit, or a terminal error after the runtime’s own retries are exhausted) flips the entry to</w:t>
+        <w:t xml:space="preserve">— any abnormal termination (transient rate-limit/socket-close, any non-completion exit, or a terminal error after the runtime's own retries are exhausted) flips the entry to</w:t>
       </w:r>
       <w:r>
         <w:t xml:space="preserve"> </w:t>
@@ -3608,7 +3414,7 @@
         <w:t xml:space="preserve">complete</w:t>
       </w:r>
       <w:r>
-        <w:t xml:space="preserve">; respawn is the safe/reversible/bounded decision taken autonomously per §11.4.101 (never blocks the loop for a human), transient causes use the project’s ALREADY-DEFINED backoff budgets (never invented, §11.4.6), a deterministically-reproducible non-transient terminal error is investigated per §11.4.102 before further respawn (never a blind retry loop);</w:t>
+        <w:t xml:space="preserve">; respawn is the safe/reversible/bounded decision taken autonomously per §11.4.101 (never blocks the loop for a human), transient causes use the project's ALREADY-DEFINED backoff budgets (never invented, §11.4.6), a deterministically-reproducible non-transient terminal error is investigated per §11.4.102 before further respawn (never a blind retry loop);</w:t>
       </w:r>
       <w:r>
         <w:t xml:space="preserve"> </w:t>
@@ -3624,7 +3430,7 @@
         <w:t xml:space="preserve"> </w:t>
       </w:r>
       <w:r>
-        <w:t xml:space="preserve">— the crashed agent’s uncommitted edits + output doc are PRESERVED (never silently discarded → lost, never blindly committed → corruption), the respawn runs the §11.4.84 quiescence check on the preserved tree (every modified file accounted-for vs scope, no mutation/</w:t>
+        <w:t xml:space="preserve">— the crashed agent's uncommitted edits + output doc are PRESERVED (never silently discarded → lost, never blindly committed → corruption), the respawn runs the §11.4.84 quiescence check on the preserved tree (every modified file accounted-for vs scope, no mutation/</w:t>
       </w:r>
       <w:r>
         <w:rPr>
@@ -3670,35 +3476,7 @@
           <w:b/>
           <w:bCs/>
         </w:rPr>
-        <w:t xml:space="preserve">(d)</w:t>
-      </w:r>
-      <w:r>
-        <w:rPr>
-          <w:b/>
-          <w:bCs/>
-        </w:rPr>
-        <w:t xml:space="preserve"> </w:t>
-      </w:r>
-      <w:r>
-        <w:rPr>
-          <w:b/>
-          <w:bCs/>
-        </w:rPr>
-        <w:t xml:space="preserve">“crash ≠ done”</w:t>
-      </w:r>
-      <w:r>
-        <w:rPr>
-          <w:b/>
-          <w:bCs/>
-        </w:rPr>
-        <w:t xml:space="preserve"> </w:t>
-      </w:r>
-      <w:r>
-        <w:rPr>
-          <w:b/>
-          <w:bCs/>
-        </w:rPr>
-        <w:t xml:space="preserve">COMPLETION criterion</w:t>
+        <w:t xml:space="preserve">(d) "crash ≠ done" COMPLETION criterion</w:t>
       </w:r>
       <w:r>
         <w:t xml:space="preserve"> </w:t>
@@ -3851,7 +3629,7 @@
         <w:t xml:space="preserve"> </w:t>
       </w:r>
       <w:r>
-        <w:t xml:space="preserve">entry as the loop’s done-condition</w:t>
+        <w:t xml:space="preserve">entry as the loop's done-condition</w:t>
       </w:r>
       <w:r>
         <w:t xml:space="preserve"> </w:t>
@@ -4019,7 +3797,7 @@
         <w:t xml:space="preserve"> </w:t>
       </w:r>
       <w:r>
-        <w:t xml:space="preserve">BINDS + STRENGTHENS the workable-item discipline (§11.4.15 status / §11.4.16 type / §11.4.54 id / §11.4.21 Operator-blocked / §11.4.91 description-clarity / §11.4.93 + §11.4.95 SQLite SSoT / §11.4.106 docs_chain) into ONE integrity contract spanning DB ↔ docs ↔ external tracker, adding the operator’s three emphases:</w:t>
+        <w:t xml:space="preserve">BINDS + STRENGTHENS the workable-item discipline (§11.4.15 status / §11.4.16 type / §11.4.54 id / §11.4.21 Operator-blocked / §11.4.91 description-clarity / §11.4.93 + §11.4.95 SQLite SSoT / §11.4.106 docs_chain) into ONE integrity contract spanning DB ↔ docs ↔ external tracker, adding the operator's three emphases:</w:t>
       </w:r>
       <w:r>
         <w:t xml:space="preserve"> </w:t>
@@ -4097,7 +3875,10 @@
         <w:t xml:space="preserve"> </w:t>
       </w:r>
       <w:r>
-        <w:t xml:space="preserve">item (incl. </w:t>
+        <w:t xml:space="preserve">item (incl.</w:t>
+      </w:r>
+      <w:r>
+        <w:t xml:space="preserve"> </w:t>
       </w:r>
       <w:r>
         <w:rPr>
@@ -4139,7 +3920,7 @@
         <w:t xml:space="preserve">[A]…·[B]…·[C]…</w:t>
       </w:r>
       <w:r>
-        <w:t xml:space="preserve">, mirroring §11.4.66’s 2–4-option shape); a BLOCKED item with no enumerated choices FAILs;</w:t>
+        <w:t xml:space="preserve">, mirroring §11.4.66's 2–4-option shape); a BLOCKED item with no enumerated choices FAILs;</w:t>
       </w:r>
       <w:r>
         <w:t xml:space="preserve"> </w:t>
@@ -4198,7 +3979,7 @@
         <w:t xml:space="preserve"> </w:t>
       </w:r>
       <w:r>
-        <w:t xml:space="preserve">carries statuses (collapsed onto the tracker’s native set per §11.4.33/.112 when fixed, precise value preserved in a header, never lost), types, assignee (§11.4.104 participant handle, UNSET defaults from a project env var, never hardcoded/logged §11.4.10), and sub-tasks, IDEMPOTENT (dry-run-then-real, match-by-stable-key</w:t>
+        <w:t xml:space="preserve">carries statuses (collapsed onto the tracker's native set per §11.4.33/.112 when fixed, precise value preserved in a header, never lost), types, assignee (§11.4.104 participant handle, UNSET defaults from a project env var, never hardcoded/logged §11.4.10), and sub-tasks, IDEMPOTENT (dry-run-then-real, match-by-stable-key</w:t>
       </w:r>
       <w:r>
         <w:t xml:space="preserve"> </w:t>
@@ -4763,7 +4544,7 @@
         <w:t xml:space="preserve"> </w:t>
       </w:r>
       <w:r>
-        <w:t xml:space="preserve">external-tracker SUB-TASK model — the item task’s description stays the item (§11.4.148 D2, NOT polluted with diary text), each run a CHILD sub-task (type</w:t>
+        <w:t xml:space="preserve">external-tracker SUB-TASK model — the item task's description stays the item (§11.4.148 D2, NOT polluted with diary text), each run a CHILD sub-task (type</w:t>
       </w:r>
       <w:r>
         <w:t xml:space="preserve"> </w:t>
@@ -4821,7 +4602,7 @@
         <w:t xml:space="preserve"> </w:t>
       </w:r>
       <w:r>
-        <w:t xml:space="preserve">prose is authored by whoever ran the test; tooling only stores/renders/pushes/validates), 100% test-covered §11.4.27 (unit + integration-against-the-real-tracker with an honest §11.4.3 SKIP-when-token-absent never a faked PASS + export + HelixQA Challenge + paired §1.1 mutation) so a diary PASS-bluff is mechanically impossible. Honest boundary §11.4.6 — the diary guarantees a complete auditable per-item test-history, NOT that any single run’s verdict is correct (rests on its own §11.4.69/.107/.123 evidence). Composes §11.4.6/.27/.45/.50/.55/.65/.69/.86/.93/.95/.106/.107/.123/.132/.148/.10/.13/.28/.33/.112/§1.1. Classification: universal (§11.4.17) — consumer supplies its DB path, diary doc layout, export formats, tracker sub-task field map, docs_chain context per §11.4.35. Propagation gate</w:t>
+        <w:t xml:space="preserve">prose is authored by whoever ran the test; tooling only stores/renders/pushes/validates), 100% test-covered §11.4.27 (unit + integration-against-the-real-tracker with an honest §11.4.3 SKIP-when-token-absent never a faked PASS + export + HelixQA Challenge + paired §1.1 mutation) so a diary PASS-bluff is mechanically impossible. Honest boundary §11.4.6 — the diary guarantees a complete auditable per-item test-history, NOT that any single run's verdict is correct (rests on its own §11.4.69/.107/.123 evidence). Composes §11.4.6/.27/.45/.50/.55/.65/.69/.86/.93/.95/.106/.107/.123/.132/.148/.10/.13/.28/.33/.112/§1.1. Classification: universal (§11.4.17) — consumer supplies its DB path, diary doc layout, export formats, tracker sub-task field map, docs_chain context per §11.4.35. Propagation gate</w:t>
       </w:r>
       <w:r>
         <w:t xml:space="preserve"> </w:t>
@@ -5004,19 +4785,7 @@
         <w:t xml:space="preserve"> </w:t>
       </w:r>
       <w:r>
-        <w:t xml:space="preserve">Verbatim operator mandate:</w:t>
-      </w:r>
-      <w:r>
-        <w:t xml:space="preserve"> </w:t>
-      </w:r>
-      <w:r>
-        <w:t xml:space="preserve">“For every single issue we fix or improvement we make — besides tight systematic-debugging, fixing, code review by independent agents, comprehensive tests — we MUST ALWAYS do deep web research from various angles! No matter how big/small/simple/complex, dig deep the internet for articles, technical documentation, APIs, open-source code — EVERYTHING that can help make the best possible solution OR confirm we don’t have a more serious problem we’re unaware of! We MUST do everything possible to STOP the constant issue-reopening and finally start closing items as fixed+working! Do this ALWAYS in parallel with the main work stream!”</w:t>
-      </w:r>
-      <w:r>
-        <w:t xml:space="preserve"> </w:t>
-      </w:r>
-      <w:r>
-        <w:t xml:space="preserve">For EVERY fix / improvement / change / closure — no matter how big, small, simple, or complex — the agent MUST, IN ADDITION to tight systematic-debugging (§11.4.102), the fix, independent-agent code review (§11.4.125 / §11.4.142), and comprehensive multi-layer tests (§11.4.4(b) / §11.4.40), perform a DOCUMENTED</w:t>
+        <w:t xml:space="preserve">Verbatim operator mandate: "For every single issue we fix or improvement we make — besides tight systematic-debugging, fixing, code review by independent agents, comprehensive tests — we MUST ALWAYS do deep web research from various angles! No matter how big/small/simple/complex, dig deep the internet for articles, technical documentation, APIs, open-source code — EVERYTHING that can help make the best possible solution OR confirm we don't have a more serious problem we're unaware of! We MUST do everything possible to STOP the constant issue-reopening and finally start closing items as fixed+working! Do this ALWAYS in parallel with the main work stream!" For EVERY fix / improvement / change / closure — no matter how big, small, simple, or complex — the agent MUST, IN ADDITION to tight systematic-debugging (§11.4.102), the fix, independent-agent code review (§11.4.125 / §11.4.142), and comprehensive multi-layer tests (§11.4.4(b) / §11.4.40), perform a DOCUMENTED</w:t>
       </w:r>
       <w:r>
         <w:t xml:space="preserve"> </w:t>
@@ -5047,19 +4816,7 @@
         <w:t xml:space="preserve"> </w:t>
       </w:r>
       <w:r>
-        <w:t xml:space="preserve">(§11.4.112 secure-surface pixel-blanking) was OVERTURNED by a deep multi-angle research pass that surfaced the real OCR-of-the-PRIMARY-display path — a</w:t>
-      </w:r>
-      <w:r>
-        <w:t xml:space="preserve"> </w:t>
-      </w:r>
-      <w:r>
-        <w:t xml:space="preserve">“we can’t”</w:t>
-      </w:r>
-      <w:r>
-        <w:t xml:space="preserve"> </w:t>
-      </w:r>
-      <w:r>
-        <w:t xml:space="preserve">became a shipped capability; the canonical anti-pattern of a structural verdict reached for want of research. The mandate (ALL hold):</w:t>
+        <w:t xml:space="preserve">(§11.4.112 secure-surface pixel-blanking) was OVERTURNED by a deep multi-angle research pass that surfaced the real OCR-of-the-PRIMARY-display path — a "we can't" became a shipped capability; the canonical anti-pattern of a structural verdict reached for want of research. The mandate (ALL hold):</w:t>
       </w:r>
       <w:r>
         <w:t xml:space="preserve"> </w:t>
@@ -5123,7 +4880,7 @@
         <w:t xml:space="preserve"> </w:t>
       </w:r>
       <w:r>
-        <w:t xml:space="preserve">won’t-fix (§11.4.112) until a deep multi-angle pass is documented; §11.4.150 makes §11.4.8’s pass UNCONDITIONAL (every item, however trivial, at the closure AND structural-verdict gates).</w:t>
+        <w:t xml:space="preserve">won't-fix (§11.4.112) until a deep multi-angle pass is documented; §11.4.150 makes §11.4.8's pass UNCONDITIONAL (every item, however trivial, at the closure AND structural-verdict gates).</w:t>
       </w:r>
       <w:r>
         <w:t xml:space="preserve"> </w:t>
@@ -5155,19 +4912,7 @@
         <w:t xml:space="preserve"> </w:t>
       </w:r>
       <w:r>
-        <w:t xml:space="preserve">— explicitly seek evidence the fix does not mask a deeper defect AND the closure/verdict is genuinely safe;</w:t>
-      </w:r>
-      <w:r>
-        <w:t xml:space="preserve"> </w:t>
-      </w:r>
-      <w:r>
-        <w:t xml:space="preserve">“we found nothing worse”</w:t>
-      </w:r>
-      <w:r>
-        <w:t xml:space="preserve"> </w:t>
-      </w:r>
-      <w:r>
-        <w:t xml:space="preserve">requires the enumerated search (§11.4.118).</w:t>
+        <w:t xml:space="preserve">— explicitly seek evidence the fix does not mask a deeper defect AND the closure/verdict is genuinely safe; "we found nothing worse" requires the enumerated search (§11.4.118).</w:t>
       </w:r>
       <w:r>
         <w:t xml:space="preserve"> </w:t>
@@ -5258,19 +5003,7 @@
         <w:t xml:space="preserve"> </w:t>
       </w:r>
       <w:r>
-        <w:t xml:space="preserve">— retroactively + going forward across the §11.4.93 / §11.4.95 SSoT; items closed without a documented pass are re-audited in the §11.4.40 / §11.4.42 release-gate sweep. Honest boundary (§11.4.6): the pass reduces the unknown-unknown surface + breaks the most common reopen causes — it does NOT prove zero remaining defects (§11.4.118) and does NOT replace §11.4.108 runtime-signature verification, §11.4.125 / §11.4.142 review, or §11.4.40 retest; it is the research layer every fix/closure/structural-verdict additionally crosses, and</w:t>
-      </w:r>
-      <w:r>
-        <w:t xml:space="preserve"> </w:t>
-      </w:r>
-      <w:r>
-        <w:t xml:space="preserve">“we probably don’t have a bigger problem”</w:t>
-      </w:r>
-      <w:r>
-        <w:t xml:space="preserve"> </w:t>
-      </w:r>
-      <w:r>
-        <w:t xml:space="preserve">without the enumerated multi-angle search is a guess (§11.4.6), never a finding. Composes §11.4.8 / §11.4.99 / §11.4.123 / §11.4.118 / §11.4.145 / §11.4.125 / §11.4.142 / §11.4.7 / §11.4.112 / §11.4.34 / §11.4.55 / §11.4.70 / §11.4.20 / §11.4.89 / §11.4.103 / §11.4.40 / §11.4.42 / §11.4.93 / §11.4.95 / §11.4.6 / §1.1. Classification: universal (§11.4.17) — the consuming project supplies its concrete research corpora, angle set, item tracker, and closure-commit-footer convention per §11.4.35. Propagation gate</w:t>
+        <w:t xml:space="preserve">— retroactively + going forward across the §11.4.93 / §11.4.95 SSoT; items closed without a documented pass are re-audited in the §11.4.40 / §11.4.42 release-gate sweep. Honest boundary (§11.4.6): the pass reduces the unknown-unknown surface + breaks the most common reopen causes — it does NOT prove zero remaining defects (§11.4.118) and does NOT replace §11.4.108 runtime-signature verification, §11.4.125 / §11.4.142 review, or §11.4.40 retest; it is the research layer every fix/closure/structural-verdict additionally crosses, and "we probably don't have a bigger problem" without the enumerated multi-angle search is a guess (§11.4.6), never a finding. Composes §11.4.8 / §11.4.99 / §11.4.123 / §11.4.118 / §11.4.145 / §11.4.125 / §11.4.142 / §11.4.7 / §11.4.112 / §11.4.34 / §11.4.55 / §11.4.70 / §11.4.20 / §11.4.89 / §11.4.103 / §11.4.40 / §11.4.42 / §11.4.93 / §11.4.95 / §11.4.6 / §1.1. Classification: universal (§11.4.17) — the consuming project supplies its concrete research corpora, angle set, item tracker, and closure-commit-footer convention per §11.4.35. Propagation gate</w:t>
       </w:r>
       <w:r>
         <w:t xml:space="preserve"> </w:t>
@@ -5480,13 +5213,10 @@
         <w:t xml:space="preserve"> </w:t>
       </w:r>
       <w:r>
-        <w:t xml:space="preserve">Verbatim operator mandate:</w:t>
-      </w:r>
-      <w:r>
-        <w:t xml:space="preserve"> </w:t>
-      </w:r>
-      <w:r>
-        <w:t xml:space="preserve">“Every release tag and version name we create — on the main repository and on every Submodule we own — MUST be prefixed with the project’s release prefix, e.g. </w:t>
+        <w:t xml:space="preserve">Verbatim operator mandate: "Every release tag and version name we create — on the main repository and on every Submodule we own — MUST be prefixed with the project's release prefix, e.g.</w:t>
+      </w:r>
+      <w:r>
+        <w:t xml:space="preserve"> </w:t>
       </w:r>
       <w:r>
         <w:rPr>
@@ -5525,13 +5255,7 @@
         <w:t xml:space="preserve"> </w:t>
       </w:r>
       <w:r>
-        <w:t xml:space="preserve">if it is set, otherwise from the lowercased project root directory name. The SAME prefix MUST be used across the main repo and all owned Submodules in one release so a release is greppable across every repository.”</w:t>
-      </w:r>
-      <w:r>
-        <w:t xml:space="preserve"> </w:t>
-      </w:r>
-      <w:r>
-        <w:t xml:space="preserve">Every release tag AND every version name created on the main repository AND on every owned-by-us submodule (§11.4.28) MUST be prefixed with the project’s release prefix, form</w:t>
+        <w:t xml:space="preserve">if it is set, otherwise from the lowercased project root directory name. The SAME prefix MUST be used across the main repo and all owned Submodules in one release so a release is greppable across every repository." Every release tag AND every version name created on the main repository AND on every owned-by-us submodule (§11.4.28) MUST be prefixed with the project's release prefix, form</w:t>
       </w:r>
       <w:r>
         <w:t xml:space="preserve"> </w:t>
@@ -5604,7 +5328,7 @@
         <w:t xml:space="preserve"> </w:t>
       </w:r>
       <w:r>
-        <w:t xml:space="preserve">from the project’s</w:t>
+        <w:t xml:space="preserve">from the project's</w:t>
       </w:r>
       <w:r>
         <w:t xml:space="preserve"> </w:t>
@@ -5896,19 +5620,7 @@
         <w:t xml:space="preserve"> </w:t>
       </w:r>
       <w:r>
-        <w:t xml:space="preserve">Verbatim operator intent:</w:t>
-      </w:r>
-      <w:r>
-        <w:t xml:space="preserve"> </w:t>
-      </w:r>
-      <w:r>
-        <w:t xml:space="preserve">“For every project that has Firebase Crashlytics enabled / wired, we MUST continuously monitor ALL of the Crashlytics-recorded data — crashes, ANRs, performance traces, and non-fatals — systematically debug each, fix and improve, and cover everything with validation and verification tests. This MUST be checked regularly, with no false results and no bluff of any kind!”</w:t>
-      </w:r>
-      <w:r>
-        <w:t xml:space="preserve"> </w:t>
-      </w:r>
-      <w:r>
-        <w:t xml:space="preserve">Every project that has Firebase Crashlytics enabled/wired (SDK linked into a shipping artifact, crash+non-fatal+ANR reporting active) MUST treat the Crashlytics console as a first-class captured-evidence channel from real end-user devices and continuously process every datum it records — an open Crashlytics issue with a green test suite is a §11.4 PASS-bluff at the field-telemetry layer (a real user hitting a broken feature while the suite reports green). STRENGTHENS+COMPLETES §11.4.47: §11.4.47 owns the periodic REVIEW + dedup + Issue-creation pass that SURFACES Crashlytics/Analytics/Performance findings; §11.4.152 owns what happens to each surfaced item AFTER — the systematic-debug → fix/improve → regression-test-coverage lifecycle that drives it to a proven regression-immune closure (§11.4.47 finds it; §11.4.152 fixes it + proves it stays fixed; both mandatory, neither substitutes). The mandate (ALL hold): (1)</w:t>
+        <w:t xml:space="preserve">Verbatim operator intent: "For every project that has Firebase Crashlytics enabled / wired, we MUST continuously monitor ALL of the Crashlytics-recorded data — crashes, ANRs, performance traces, and non-fatals — systematically debug each, fix and improve, and cover everything with validation and verification tests. This MUST be checked regularly, with no false results and no bluff of any kind!" Every project that has Firebase Crashlytics enabled/wired (SDK linked into a shipping artifact, crash+non-fatal+ANR reporting active) MUST treat the Crashlytics console as a first-class captured-evidence channel from real end-user devices and continuously process every datum it records — an open Crashlytics issue with a green test suite is a §11.4 PASS-bluff at the field-telemetry layer (a real user hitting a broken feature while the suite reports green). STRENGTHENS+COMPLETES §11.4.47: §11.4.47 owns the periodic REVIEW + dedup + Issue-creation pass that SURFACES Crashlytics/Analytics/Performance findings; §11.4.152 owns what happens to each surfaced item AFTER — the systematic-debug → fix/improve → regression-test-coverage lifecycle that drives it to a proven regression-immune closure (§11.4.47 finds it; §11.4.152 fixes it + proves it stays fixed; both mandatory, neither substitutes). The mandate (ALL hold): (1)</w:t>
       </w:r>
       <w:r>
         <w:t xml:space="preserve"> </w:t>
@@ -5956,19 +5668,7 @@
         <w:t xml:space="preserve"> </w:t>
       </w:r>
       <w:r>
-        <w:t xml:space="preserve">against its proven root cause (§11.4.9/.43/.108),</w:t>
-      </w:r>
-      <w:r>
-        <w:t xml:space="preserve"> </w:t>
-      </w:r>
-      <w:r>
-        <w:t xml:space="preserve">“acknowledged in console”</w:t>
-      </w:r>
-      <w:r>
-        <w:t xml:space="preserve"> </w:t>
-      </w:r>
-      <w:r>
-        <w:t xml:space="preserve">is not a fix, muting a recurring issue without a tracked rationale is a §11.4.6/.90 violation; (4)</w:t>
+        <w:t xml:space="preserve">against its proven root cause (§11.4.9/.43/.108), "acknowledged in console" is not a fix, muting a recurring issue without a tracked rationale is a §11.4.6/.90 violation; (4)</w:t>
       </w:r>
       <w:r>
         <w:t xml:space="preserve"> </w:t>
@@ -6046,43 +5746,7 @@
         <w:t xml:space="preserve"> </w:t>
       </w:r>
       <w:r>
-        <w:t xml:space="preserve">(§11.4/.1/.6 —</w:t>
-      </w:r>
-      <w:r>
-        <w:t xml:space="preserve"> </w:t>
-      </w:r>
-      <w:r>
-        <w:t xml:space="preserve">“no new issues”</w:t>
-      </w:r>
-      <w:r>
-        <w:t xml:space="preserve"> </w:t>
-      </w:r>
-      <w:r>
-        <w:t xml:space="preserve">requires the enumerated monitored-surfaces+window §11.4.118;</w:t>
-      </w:r>
-      <w:r>
-        <w:t xml:space="preserve"> </w:t>
-      </w:r>
-      <w:r>
-        <w:t xml:space="preserve">“fixed”</w:t>
-      </w:r>
-      <w:r>
-        <w:t xml:space="preserve"> </w:t>
-      </w:r>
-      <w:r>
-        <w:t xml:space="preserve">requires the RED→GREEN flip §11.4.115/.130; a guard whose §1.1 mutation does not FAIL it is a bluff gate). Honest boundary §11.4.6: processing every recorded issue breaks the silent-recurrence vector — it does NOT prove zero remaining field defects nor replace §11.4.108/.40; an issue is</w:t>
-      </w:r>
-      <w:r>
-        <w:t xml:space="preserve"> </w:t>
-      </w:r>
-      <w:r>
-        <w:t xml:space="preserve">“closed”</w:t>
-      </w:r>
-      <w:r>
-        <w:t xml:space="preserve"> </w:t>
-      </w:r>
-      <w:r>
-        <w:t xml:space="preserve">only when its guard is GREEN on a clean artifact, never when the console mark is flipped. Classification: universal (§11.4.17) — the consuming project supplies its Crashlytics handle, console-access credential (§11.4.10, never logged), severity table, and per-issue closure-log path per §11.4.35; the reference project-level instantiation is a consuming project’s §6.O (Crashlytics-Resolved Issue Coverage — per-issue validation test + Challenge test +</w:t>
+        <w:t xml:space="preserve">(§11.4/.1/.6 — "no new issues" requires the enumerated monitored-surfaces+window §11.4.118; "fixed" requires the RED→GREEN flip §11.4.115/.130; a guard whose §1.1 mutation does not FAIL it is a bluff gate). Honest boundary §11.4.6: processing every recorded issue breaks the silent-recurrence vector — it does NOT prove zero remaining field defects nor replace §11.4.108/.40; an issue is "closed" only when its guard is GREEN on a clean artifact, never when the console mark is flipped. Classification: universal (§11.4.17) — the consuming project supplies its Crashlytics handle, console-access credential (§11.4.10, never logged), severity table, and per-issue closure-log path per §11.4.35; the reference project-level instantiation is a consuming project's §6.O (Crashlytics-Resolved Issue Coverage — per-issue validation test + Challenge test +</w:t>
       </w:r>
       <w:r>
         <w:t xml:space="preserve"> </w:t>
@@ -6380,19 +6044,7 @@
         <w:t xml:space="preserve"> </w:t>
       </w:r>
       <w:r>
-        <w:t xml:space="preserve">— every user-visible</w:t>
-      </w:r>
-      <w:r>
-        <w:t xml:space="preserve"> </w:t>
-      </w:r>
-      <w:r>
-        <w:t xml:space="preserve">“confirmed”</w:t>
-      </w:r>
-      <w:r>
-        <w:t xml:space="preserve"> </w:t>
-      </w:r>
-      <w:r>
-        <w:t xml:space="preserve">claim backed by a recorded real-use video of a genuine end-user scenario (real prompts → real LLM/service responses → real results), NEVER a frozen/stale frame (§11.4.107), NEVER faked/mocked/demo-loop/bluff response or LLM error passed off as success (§11.4.2/§11.4.5), stored at the project-declared recording path (§11.4.35); a confirmed row with no real video or a bluff video = §11.4 PASS-bluff; autonomous-infeasible ⇒ honest §11.4.3/§11.4.52 SKIP + tracked migration item, NEVER a faked confirmation. (4)</w:t>
+        <w:t xml:space="preserve">— every user-visible "confirmed" claim backed by a recorded real-use video of a genuine end-user scenario (real prompts → real LLM/service responses → real results), NEVER a frozen/stale frame (§11.4.107), NEVER faked/mocked/demo-loop/bluff response or LLM error passed off as success (§11.4.2/§11.4.5), stored at the project-declared recording path (§11.4.35); a confirmed row with no real video or a bluff video = §11.4 PASS-bluff; autonomous-infeasible ⇒ honest §11.4.3/§11.4.52 SKIP + tracked migration item, NEVER a faked confirmation. (4)</w:t>
       </w:r>
       <w:r>
         <w:t xml:space="preserve"> </w:t>
@@ -6408,19 +6060,7 @@
         <w:t xml:space="preserve"> </w:t>
       </w:r>
       <w:r>
-        <w:t xml:space="preserve">— every video analysed; any defect it surfaces triggers §11.4.102 systematic-debug → fix → §11.4.146 retest → re-record → clean GO per §11.4.134 before</w:t>
-      </w:r>
-      <w:r>
-        <w:t xml:space="preserve"> </w:t>
-      </w:r>
-      <w:r>
-        <w:t xml:space="preserve">“confirmed”</w:t>
-      </w:r>
-      <w:r>
-        <w:t xml:space="preserve"> </w:t>
-      </w:r>
-      <w:r>
-        <w:t xml:space="preserve">(a video exposing a broken feature is a §11.4.4 test-interrupt). (5)</w:t>
+        <w:t xml:space="preserve">— every video analysed; any defect it surfaces triggers §11.4.102 systematic-debug → fix → §11.4.146 retest → re-record → clean GO per §11.4.134 before "confirmed" (a video exposing a broken feature is a §11.4.4 test-interrupt). (5)</w:t>
       </w:r>
       <w:r>
         <w:t xml:space="preserve"> </w:t>
@@ -6514,7 +6154,7 @@
         <w:t xml:space="preserve"> </w:t>
       </w:r>
       <w:r>
-        <w:t xml:space="preserve">files are supplementary only. Honest boundary §11.4.6 — guarantees a complete video-confirmed always-synced ledger, NOT per-feature correctness (rests on each row’s §11.4.69/.107/.123 evidence) and NOT a §11.4.40 retest substitute. Classification: universal (§11.4.17). Composes §11.4.2/.5/.44/.45/.52/.56/.57/.59/.60/.65/.86/.102/.106/.107/.108/.118/.123/.134/.146/§1.1. Propagation gate</w:t>
+        <w:t xml:space="preserve">files are supplementary only. Honest boundary §11.4.6 — guarantees a complete video-confirmed always-synced ledger, NOT per-feature correctness (rests on each row's §11.4.69/.107/.123 evidence) and NOT a §11.4.40 retest substitute. Classification: universal (§11.4.17). Composes §11.4.2/.5/.44/.45/.52/.56/.57/.59/.60/.65/.86/.102/.106/.107/.108/.118/.123/.134/.146/§1.1. Propagation gate</w:t>
       </w:r>
       <w:r>
         <w:t xml:space="preserve"> </w:t>
@@ -6723,31 +6363,7 @@
         <w:t xml:space="preserve"> </w:t>
       </w:r>
       <w:r>
-        <w:t xml:space="preserve">Verbatim:</w:t>
-      </w:r>
-      <w:r>
-        <w:t xml:space="preserve"> </w:t>
-      </w:r>
-      <w:r>
-        <w:t xml:space="preserve">“recording you perform does record the window containing apps and services, not the whole desktop or monitor screen!”</w:t>
-      </w:r>
-      <w:r>
-        <w:t xml:space="preserve"> </w:t>
-      </w:r>
-      <w:r>
-        <w:t xml:space="preserve">+</w:t>
-      </w:r>
-      <w:r>
-        <w:t xml:space="preserve"> </w:t>
-      </w:r>
-      <w:r>
-        <w:t xml:space="preserve">“All old recording files MUST BE removed when new one starts!”</w:t>
-      </w:r>
-      <w:r>
-        <w:t xml:space="preserve"> </w:t>
-      </w:r>
-      <w:r>
-        <w:t xml:space="preserve">Refines §11.4.2/.5/.107/.153 recording discipline with two capture-hygiene invariants.</w:t>
+        <w:t xml:space="preserve">Verbatim: "recording you perform does record the window containing apps and services, not the whole desktop or monitor screen!" + "All old recording files MUST BE removed when new one starts!" Refines §11.4.2/.5/.107/.153 recording discipline with two capture-hygiene invariants.</w:t>
       </w:r>
       <w:r>
         <w:t xml:space="preserve"> </w:t>
@@ -6779,19 +6395,7 @@
         <w:t xml:space="preserve"> </w:t>
       </w:r>
       <w:r>
-        <w:t xml:space="preserve">— when a new recording run for a scope begins, the agent’s OWN prior in-scope stale recordings at the raw recording path MUST be removed FIRST so the live corpus reflects the current run (§11.4.107 not-stale + §11.4.86 roster-freshness). Honest boundary (§11.4.6 + §9.2):</w:t>
-      </w:r>
-      <w:r>
-        <w:t xml:space="preserve"> </w:t>
-      </w:r>
-      <w:r>
-        <w:t xml:space="preserve">“remove old”</w:t>
-      </w:r>
-      <w:r>
-        <w:t xml:space="preserve"> </w:t>
-      </w:r>
-      <w:r>
-        <w:t xml:space="preserve">= the agent’s own prior recordings for the SAME scope/project ONLY — NEVER another project’s/scope’s/operator-authored files; uncertain ⇒ surface, don’t delete (§11.4.122); committed</w:t>
+        <w:t xml:space="preserve">— when a new recording run for a scope begins, the agent's OWN prior in-scope stale recordings at the raw recording path MUST be removed FIRST so the live corpus reflects the current run (§11.4.107 not-stale + §11.4.86 roster-freshness). Honest boundary (§11.4.6 + §9.2): "remove old" = the agent's own prior recordings for the SAME scope/project ONLY — NEVER another project's/scope's/operator-authored files; uncertain ⇒ surface, don't delete (§11.4.122); committed</w:t>
       </w:r>
       <w:r>
         <w:t xml:space="preserve"> </w:t>
@@ -7070,19 +6674,7 @@
         <w:t xml:space="preserve"> </w:t>
       </w:r>
       <w:r>
-        <w:t xml:space="preserve">Verbatim:</w:t>
-      </w:r>
-      <w:r>
-        <w:t xml:space="preserve"> </w:t>
-      </w:r>
-      <w:r>
-        <w:t xml:space="preserve">“All recorded videos MUST START with prefix: the PROJECT NAME (ALWAYS USE THE PROJECT NAME). Project name MUST be obtained according to the constitution’s own project-name resolution.”</w:t>
-      </w:r>
-      <w:r>
-        <w:t xml:space="preserve"> </w:t>
-      </w:r>
-      <w:r>
-        <w:t xml:space="preserve">Every recorded video the project produces — every feature/QA real-use recording (§11.4.153), every window-scoped capture (§11.4.154), every always-on device recording (§11.4.128), every raw or curated artefact at the project-declared recording path (§11.4.35) + the committed</w:t>
+        <w:t xml:space="preserve">Verbatim: "All recorded videos MUST START with prefix: the PROJECT NAME (ALWAYS USE THE PROJECT NAME). Project name MUST be obtained according to the constitution's own project-name resolution." Every recorded video the project produces — every feature/QA real-use recording (§11.4.153), every window-scoped capture (§11.4.154), every always-on device recording (§11.4.128), every raw or curated artefact at the project-declared recording path (§11.4.35) + the committed</w:t>
       </w:r>
       <w:r>
         <w:t xml:space="preserve"> </w:t>
@@ -7200,7 +6792,7 @@
         <w:t xml:space="preserve"> </w:t>
       </w:r>
       <w:r>
-        <w:t xml:space="preserve">delimits the prefix unambiguously); MUST equal the §11.4.151-resolved release-tag prefix (divergence is itself a §11.4.155 violation — one project, one name). Honest boundary (§11.4.6): the prefix guarantees attribution + greppability, NOT content validity (still §11.4.107/.137/.153) and does NOT relax §11.4.154’s window-scope/rotation (rotation removes the agent’s OWN</w:t>
+        <w:t xml:space="preserve">delimits the prefix unambiguously); MUST equal the §11.4.151-resolved release-tag prefix (divergence is itself a §11.4.155 violation — one project, one name). Honest boundary (§11.4.6): the prefix guarantees attribution + greppability, NOT content validity (still §11.4.107/.137/.153) and does NOT relax §11.4.154's window-scope/rotation (rotation removes the agent's OWN</w:t>
       </w:r>
       <w:r>
         <w:t xml:space="preserve"> </w:t>
@@ -7373,19 +6965,7 @@
         <w:t xml:space="preserve"> </w:t>
       </w:r>
       <w:r>
-        <w:t xml:space="preserve">Verbatim operator mandate:</w:t>
-      </w:r>
-      <w:r>
-        <w:t xml:space="preserve"> </w:t>
-      </w:r>
-      <w:r>
-        <w:t xml:space="preserve">“Any GitHub actions or GitLab pipelines MUST BE disabled! Add this critical mandatory rule / mandatory constraint into the root constitution Submodule, commit and fetch all its changes to all upstreams and make sure we respect and follow this rule (we do apply it) ASAP!!!”</w:t>
-      </w:r>
-      <w:r>
-        <w:t xml:space="preserve"> </w:t>
-      </w:r>
-      <w:r>
-        <w:t xml:space="preserve">Every repository this Constitution governs — main repo, this constitution submodule, every owned + nested submodule we author and push — MUST ship with ALL server-side CI/CD automation DISABLED: no push to any owned upstream may trigger a GitHub Actions run, GitLab pipeline, or equivalent (Jenkins/CircleCI/Travis/Drone/Woodpecker/Bitbucket/Azure, any</w:t>
+        <w:t xml:space="preserve">Verbatim operator mandate: "Any GitHub actions or GitLab pipelines MUST BE disabled! Add this critical mandatory rule / mandatory constraint into the root constitution Submodule, commit and fetch all its changes to all upstreams and make sure we respect and follow this rule (we do apply it) ASAP!!!" Every repository this Constitution governs — main repo, this constitution submodule, every owned + nested submodule we author and push — MUST ship with ALL server-side CI/CD automation DISABLED: no push to any owned upstream may trigger a GitHub Actions run, GitLab pipeline, or equivalent (Jenkins/CircleCI/Travis/Drone/Woodpecker/Bitbucket/Azure, any</w:t>
       </w:r>
       <w:r>
         <w:t xml:space="preserve"> </w:t>
@@ -7519,13 +7099,7 @@
         <w:t xml:space="preserve"> </w:t>
       </w:r>
       <w:r>
-        <w:t xml:space="preserve">“disabled”</w:t>
-      </w:r>
-      <w:r>
-        <w:t xml:space="preserve"> </w:t>
-      </w:r>
-      <w:r>
-        <w:t xml:space="preserve">= a push triggers ZERO runs — delete OR rename to a non-trigger name (§11.4.75</w:t>
+        <w:t xml:space="preserve">"disabled" = a push triggers ZERO runs — delete OR rename to a non-trigger name (§11.4.75</w:t>
       </w:r>
       <w:r>
         <w:t xml:space="preserve"> </w:t>
@@ -7607,19 +7181,7 @@
         <w:t xml:space="preserve">prebuilts/**</w:t>
       </w:r>
       <w:r>
-        <w:t xml:space="preserve">, vendored submodules) are INERT (a provider never runs a non-root config), OUT of scope, MUST NOT be mass-edited (§11.4.29 vendor-exempt); test =</w:t>
-      </w:r>
-      <w:r>
-        <w:t xml:space="preserve"> </w:t>
-      </w:r>
-      <w:r>
-        <w:t xml:space="preserve">“does a push to OUR upstream trigger a run?”</w:t>
-      </w:r>
-      <w:r>
-        <w:t xml:space="preserve"> </w:t>
-      </w:r>
-      <w:r>
-        <w:t xml:space="preserve">yes⇒disable, inert⇒document+leave (§11.4.6 verify-not-assume);</w:t>
+        <w:t xml:space="preserve">, vendored submodules) are INERT (a provider never runs a non-root config), OUT of scope, MUST NOT be mass-edited (§11.4.29 vendor-exempt); test = "does a push to OUR upstream trigger a run?" yes⇒disable, inert⇒document+leave (§11.4.6 verify-not-assume);</w:t>
       </w:r>
       <w:r>
         <w:t xml:space="preserve"> </w:t>
@@ -7852,19 +7414,7 @@
         <w:t xml:space="preserve"> </w:t>
       </w:r>
       <w:r>
-        <w:t xml:space="preserve">Verbatim operator mandate:</w:t>
-      </w:r>
-      <w:r>
-        <w:t xml:space="preserve"> </w:t>
-      </w:r>
-      <w:r>
-        <w:t xml:space="preserve">“Make sure with CLAUDE.md, AGENTS.md, QWEN.md we maintain GEMINI.md too! Add this mandatory fact / rule to root constitution Submodule we are inheriting / extending - CONSITUTION.md, CLAUDE.md, QWEN.md, AGENTS.md, GEMINI.md and other related relevant files!”</w:t>
-      </w:r>
-      <w:r>
-        <w:t xml:space="preserve"> </w:t>
-      </w:r>
-      <w:r>
-        <w:t xml:space="preserve">Forensic FACT (2026-06-15): when §11.4.156/§11.4.157 were authored, Constitution/CLAUDE/AGENTS/QWEN carried the family through §11.4.155 but GEMINI.md had silently drifted to §11.4.141 — 14 mandates (§11.4.142–155) never propagated — a §11.4 propagation-bluff (a Gemini-CLI agent reads a stale Constitution). GEMINI.md is a FIRST-CLASS governance context carrier EQUAL to CLAUDE.md/AGENTS.md/QWEN.md, never optional/best-effort. ALL hold:</w:t>
+        <w:t xml:space="preserve">Verbatim operator mandate: "Make sure with CLAUDE.md, AGENTS.md, QWEN.md we maintain GEMINI.md too! Add this mandatory fact / rule to root constitution Submodule we are inheriting / extending - CONSITUTION.md, CLAUDE.md, QWEN.md, AGENTS.md, GEMINI.md and other related relevant files!" Forensic FACT (2026-06-15): when §11.4.156/§11.4.157 were authored, Constitution/CLAUDE/AGENTS/QWEN carried the family through §11.4.155 but GEMINI.md had silently drifted to §11.4.141 — 14 mandates (§11.4.142–155) never propagated — a §11.4 propagation-bluff (a Gemini-CLI agent reads a stale Constitution). GEMINI.md is a FIRST-CLASS governance context carrier EQUAL to CLAUDE.md/AGENTS.md/QWEN.md, never optional/best-effort. ALL hold:</w:t>
       </w:r>
       <w:r>
         <w:t xml:space="preserve"> </w:t>
@@ -7896,7 +7446,7 @@
         <w:t xml:space="preserve"> </w:t>
       </w:r>
       <w:r>
-        <w:t xml:space="preserve">no silent drift — GEMINI.md lagging the other mirrors’ highest rule is a §11.4.157 violation (§11.4.65-class), back-fill required;</w:t>
+        <w:t xml:space="preserve">no silent drift — GEMINI.md lagging the other mirrors' highest rule is a §11.4.157 violation (§11.4.65-class), back-fill required;</w:t>
       </w:r>
       <w:r>
         <w:t xml:space="preserve"> </w:t>
@@ -7943,19 +7493,7 @@
         <w:t xml:space="preserve"> </w:t>
       </w:r>
       <w:r>
-        <w:t xml:space="preserve">consumer projects’ own CLAUDE/AGENTS/QWEN/GEMINI bind too (§11.4.35). Honest boundary (§11.4.6): the §11.4.142–155 GEMINI.md back-fill is a tracked release-blocking remediation; claiming GEMINI.md</w:t>
-      </w:r>
-      <w:r>
-        <w:t xml:space="preserve"> </w:t>
-      </w:r>
-      <w:r>
-        <w:t xml:space="preserve">“in sync”</w:t>
-      </w:r>
-      <w:r>
-        <w:t xml:space="preserve"> </w:t>
-      </w:r>
-      <w:r>
-        <w:t xml:space="preserve">while the back-fill is incomplete is itself a §11.4.157 violation. Composes §11.4.26/.35/.17/.44/.65/.140/.156/§1.1. Classification: universal (§11.4.17). Propagation gate</w:t>
+        <w:t xml:space="preserve">consumer projects' own CLAUDE/AGENTS/QWEN/GEMINI bind too (§11.4.35). Honest boundary (§11.4.6): the §11.4.142–155 GEMINI.md back-fill is a tracked release-blocking remediation; claiming GEMINI.md "in sync" while the back-fill is incomplete is itself a §11.4.157 violation. Composes §11.4.26/.35/.17/.44/.65/.140/.156/§1.1. Classification: universal (§11.4.17). Propagation gate</w:t>
       </w:r>
       <w:r>
         <w:t xml:space="preserve"> </w:t>
@@ -8099,31 +7637,7 @@
         <w:t xml:space="preserve"> </w:t>
       </w:r>
       <w:r>
-        <w:t xml:space="preserve">Every project MUST be covered by intensive automated testing that exercises + RECORDS every feature/flow/use-case/edge-case (valid/invalid/boundary/concurrent/failure-injection §11.4.85), each recording showing the feature GENUINELY WORKING with REAL results (real prompts→real responses→real outputs §11.4.153) and NO false/simulated/stale/frozen result (§11.4.2/.5/.107) — a recording showing an error/bluff/non-working feature is a FINDING (→§11.4.153(4)/§11.4.4 fix→retest→re-record), never a confirmation. The testing System MUST ACTUALLY READ every shown log line / message / UI label / dialog / toast / status text and VERIFY it is a genuine working result (OCR/ROI §11.4.117/.137 + confidence floor for pixel surfaces; direct capture for terminal/log; §11.4.107(10) self-validated golden-good/golden-bad analyzer) —</w:t>
-      </w:r>
-      <w:r>
-        <w:t xml:space="preserve"> </w:t>
-      </w:r>
-      <w:r>
-        <w:t xml:space="preserve">“a video was produced”</w:t>
-      </w:r>
-      <w:r>
-        <w:t xml:space="preserve"> </w:t>
-      </w:r>
-      <w:r>
-        <w:t xml:space="preserve">is NOT evidence,</w:t>
-      </w:r>
-      <w:r>
-        <w:t xml:space="preserve"> </w:t>
-      </w:r>
-      <w:r>
-        <w:t xml:space="preserve">“the System read the screen + confirmed a genuine result”</w:t>
-      </w:r>
-      <w:r>
-        <w:t xml:space="preserve"> </w:t>
-      </w:r>
-      <w:r>
-        <w:t xml:space="preserve">is. HelixQA (§11.4.27) MUST drive this exercise→record→read→score pass, PASS only on a read-confirmed genuine result + captured artefact path (§11.4.69). Default recording save path =</w:t>
+        <w:t xml:space="preserve">Every project MUST be covered by intensive automated testing that exercises + RECORDS every feature/flow/use-case/edge-case (valid/invalid/boundary/concurrent/failure-injection §11.4.85), each recording showing the feature GENUINELY WORKING with REAL results (real prompts→real responses→real outputs §11.4.153) and NO false/simulated/stale/frozen result (§11.4.2/.5/.107) — a recording showing an error/bluff/non-working feature is a FINDING (→§11.4.153(4)/§11.4.4 fix→retest→re-record), never a confirmation. The testing System MUST ACTUALLY READ every shown log line / message / UI label / dialog / toast / status text and VERIFY it is a genuine working result (OCR/ROI §11.4.117/.137 + confidence floor for pixel surfaces; direct capture for terminal/log; §11.4.107(10) self-validated golden-good/golden-bad analyzer) — "a video was produced" is NOT evidence, "the System read the screen + confirmed a genuine result" is. HelixQA (§11.4.27) MUST drive this exercise→record→read→score pass, PASS only on a read-confirmed genuine result + captured artefact path (§11.4.69). Default recording save path =</w:t>
       </w:r>
       <w:r>
         <w:t xml:space="preserve"> </w:t>
@@ -8138,7 +7652,7 @@
         <w:t xml:space="preserve"> </w:t>
       </w:r>
       <w:r>
-        <w:t xml:space="preserve">(host user’s home Downloads, resolved at runtime never hardcoded) unless a project declares an override per §11.4.35; §11.4.155 project-prefix + §11.4.154 window-scope/rotation + §11.4.128 git-ignored raw corpus + §11.4.83 curated docs/qa evidence apply.</w:t>
+        <w:t xml:space="preserve">(host user's home Downloads, resolved at runtime never hardcoded) unless a project declares an override per §11.4.35; §11.4.155 project-prefix + §11.4.154 window-scope/rotation + §11.4.128 git-ignored raw corpus + §11.4.83 curated docs/qa evidence apply.</w:t>
       </w:r>
       <w:r>
         <w:t xml:space="preserve"> </w:t>
@@ -8554,73 +8068,37 @@
         <w:t xml:space="preserve"> </w:t>
       </w:r>
       <w:r>
-        <w:t xml:space="preserve">— after EVERY recording, the agent MUST read the terminal output / video content and verify: (i) feature ACTUALLY WORKS, (ii) LLM responses are REAL, (iii) all tests show PASS, (iv) no</w:t>
-      </w:r>
-      <w:r>
-        <w:t xml:space="preserve"> </w:t>
-      </w:r>
-      <w:r>
-        <w:t xml:space="preserve">“TODO implement”</w:t>
-      </w:r>
-      <w:r>
-        <w:t xml:space="preserve"> </w:t>
+        <w:t xml:space="preserve">— after EVERY recording, the agent MUST read the terminal output / video content and verify: (i) feature ACTUALLY WORKS, (ii) LLM responses are REAL, (iii) all tests show PASS, (iv) no "TODO implement" / "simulate" / "for now" patterns, (v) output demonstrates end-user working feature; MUST produce a verdict (PASS/FAIL) with evidence path (§11.4.69).</w:t>
+      </w:r>
+      <w:r>
+        <w:t xml:space="preserve"> </w:t>
+      </w:r>
+      <w:r>
+        <w:rPr>
+          <w:b/>
+          <w:bCs/>
+        </w:rPr>
+        <w:t xml:space="preserve">(E) Terminal window cleanup</w:t>
+      </w:r>
+      <w:r>
+        <w:t xml:space="preserve"> </w:t>
+      </w:r>
+      <w:r>
+        <w:t xml:space="preserve">— after each recording, dismiss/close ONLY the Terminal window used for that recording (window-specific close via</w:t>
+      </w:r>
+      <w:r>
+        <w:t xml:space="preserve"> </w:t>
+      </w:r>
+      <w:r>
+        <w:rPr>
+          <w:rStyle w:val="VerbatimChar"/>
+        </w:rPr>
+        <w:t xml:space="preserve">osascript</w:t>
       </w:r>
       <w:r>
         <w:t xml:space="preserve">/</w:t>
       </w:r>
       <w:r>
-        <w:t xml:space="preserve"> </w:t>
-      </w:r>
-      <w:r>
-        <w:t xml:space="preserve">“simulate”</w:t>
-      </w:r>
-      <w:r>
-        <w:t xml:space="preserve"> </w:t>
-      </w:r>
-      <w:r>
-        <w:t xml:space="preserve">/</w:t>
-      </w:r>
-      <w:r>
-        <w:t xml:space="preserve"> </w:t>
-      </w:r>
-      <w:r>
-        <w:t xml:space="preserve">“for now”</w:t>
-      </w:r>
-      <w:r>
-        <w:t xml:space="preserve"> </w:t>
-      </w:r>
-      <w:r>
-        <w:t xml:space="preserve">patterns, (v) output demonstrates end-user working feature; MUST produce a verdict (PASS/FAIL) with evidence path (§11.4.69).</w:t>
-      </w:r>
-      <w:r>
-        <w:t xml:space="preserve"> </w:t>
-      </w:r>
-      <w:r>
-        <w:rPr>
-          <w:b/>
-          <w:bCs/>
-        </w:rPr>
-        <w:t xml:space="preserve">(E) Terminal window cleanup</w:t>
-      </w:r>
-      <w:r>
-        <w:t xml:space="preserve"> </w:t>
-      </w:r>
-      <w:r>
-        <w:t xml:space="preserve">— after each recording, dismiss/close ONLY the Terminal window used for that recording (window-specific close via</w:t>
-      </w:r>
-      <w:r>
-        <w:t xml:space="preserve"> </w:t>
-      </w:r>
-      <w:r>
-        <w:rPr>
-          <w:rStyle w:val="VerbatimChar"/>
-        </w:rPr>
-        <w:t xml:space="preserve">osascript</w:t>
-      </w:r>
-      <w:r>
-        <w:t xml:space="preserve">/</w:t>
-      </w:r>
-      <w:r>
         <w:rPr>
           <w:rStyle w:val="VerbatimChar"/>
         </w:rPr>
@@ -8675,7 +8153,7 @@
         <w:t xml:space="preserve"> </w:t>
       </w:r>
       <w:r>
-        <w:t xml:space="preserve">— remove agent’s own prior in-scope stale recordings FIRST (§11.4.154).</w:t>
+        <w:t xml:space="preserve">— remove agent's own prior in-scope stale recordings FIRST (§11.4.154).</w:t>
       </w:r>
       <w:r>
         <w:t xml:space="preserve"> </w:t>
@@ -8691,28 +8169,7 @@
         <w:t xml:space="preserve"> </w:t>
       </w:r>
       <w:r>
-        <w:t xml:space="preserve">— the value of a recording is NOT its duration but its CONTENT; a recording MUST demonstrate the ACTUAL feature being used with REAL results; before accepting ANY recording, the agent MUST verify: expected output patterns ARE present (e.g., test PASS lines, API response data, feature-specific output), the feature ACTUALLY WORKS as demonstrated (not just</w:t>
-      </w:r>
-      <w:r>
-        <w:t xml:space="preserve"> </w:t>
-      </w:r>
-      <w:r>
-        <w:t xml:space="preserve">“something ran”</w:t>
-      </w:r>
-      <w:r>
-        <w:t xml:space="preserve">), LLM responses are REAL content (not simulated, not placeholder, not empty), every claim of</w:t>
-      </w:r>
-      <w:r>
-        <w:t xml:space="preserve"> </w:t>
-      </w:r>
-      <w:r>
-        <w:t xml:space="preserve">“working”</w:t>
-      </w:r>
-      <w:r>
-        <w:t xml:space="preserve"> </w:t>
-      </w:r>
-      <w:r>
-        <w:t xml:space="preserve">is backed by visible evidence; a 5-second recording showing a feature working correctly is MORE valuable than a 60-second recording of empty terminal; duration is NOT a proxy for quality.</w:t>
+        <w:t xml:space="preserve">— the value of a recording is NOT its duration but its CONTENT; a recording MUST demonstrate the ACTUAL feature being used with REAL results; before accepting ANY recording, the agent MUST verify: expected output patterns ARE present (e.g., test PASS lines, API response data, feature-specific output), the feature ACTUALLY WORKS as demonstrated (not just "something ran"), LLM responses are REAL content (not simulated, not placeholder, not empty), every claim of "working" is backed by visible evidence; a 5-second recording showing a feature working correctly is MORE valuable than a 60-second recording of empty terminal; duration is NOT a proxy for quality.</w:t>
       </w:r>
       <w:r>
         <w:t xml:space="preserve"> </w:t>
@@ -8944,7 +8401,7 @@
         <w:t xml:space="preserve"> </w:t>
       </w:r>
       <w:r>
-        <w:t xml:space="preserve">Compact summary: every video recording for feature/QA evidence MUST be processed through a vision/OCR pipeline that reads on-screen content and confirms expected results BEFORE acceptance; the recording system MUST provide a bridge feeding captured frames to HelixQA’s test infrastructure (or equivalent) for automated read-the-screen verification against SPECIFY-phase expected patterns (§11.4.159(J)); capture frames at ≤5s intervals, run OCR/vision with self-validated analyzer (§11.4.107(10)), compare text against patterns, produce per-frame PASS/FAIL with evidence path, surface failures immediately for re-record (§11.4.159(L)). Project-configured parameters per §11.4.35. Honest boundary: does NOT replace §11.4.5 quality analysis nor §11.4.108 runtime-signature; FLAG_SECURE uses §11.4.117 proxy oracle. Classification: universal (§11.4.17). Propagation gate</w:t>
+        <w:t xml:space="preserve">Compact summary: every video recording for feature/QA evidence MUST be processed through a vision/OCR pipeline that reads on-screen content and confirms expected results BEFORE acceptance; the recording system MUST provide a bridge feeding captured frames to HelixQA's test infrastructure (or equivalent) for automated read-the-screen verification against SPECIFY-phase expected patterns (§11.4.159(J)); capture frames at ≤5s intervals, run OCR/vision with self-validated analyzer (§11.4.107(10)), compare text against patterns, produce per-frame PASS/FAIL with evidence path, surface failures immediately for re-record (§11.4.159(L)). Project-configured parameters per §11.4.35. Honest boundary: does NOT replace §11.4.5 quality analysis nor §11.4.108 runtime-signature; FLAG_SECURE uses §11.4.117 proxy oracle. Classification: universal (§11.4.17). Propagation gate</w:t>
       </w:r>
       <w:r>
         <w:t xml:space="preserve"> </w:t>
@@ -9085,7 +8542,18 @@
         <w:t xml:space="preserve"> </w:t>
       </w:r>
       <w:r>
-        <w:t xml:space="preserve">Compact summary: every project with user-facing interfaces MUST use OpenDesign (https://github.com/nexu-io/open-design) as mandatory UI design system — NOT ad-hoc CSS; install as dependency, use token system for all color (light+dark from brand assets), typography, spacing, component tokens; extend upstream (§11.4.74) for unsupported patterns; every UI component ships light+dark + token-diff regression tests via visual regression; no element overlap/font collision/label overlay. Honest boundary: does NOT replace §11.4.27 functional testing nor §11.4.48/.49 UI testing. Classification: universal (§11.4.17). Propagation gate</w:t>
+        <w:t xml:space="preserve">Compact summary: every project with user-facing interfaces MUST use OpenDesign (</w:t>
+      </w:r>
+      <w:hyperlink r:id="rId13">
+        <w:r>
+          <w:rPr>
+            <w:rStyle w:val="Hyperlink"/>
+          </w:rPr>
+          <w:t xml:space="preserve">https://github.com/nexu-io/open-design</w:t>
+        </w:r>
+      </w:hyperlink>
+      <w:r>
+        <w:t xml:space="preserve">) as mandatory UI design system — NOT ad-hoc CSS; install as dependency, use token system for all color (light+dark from brand assets), typography, spacing, component tokens; extend upstream (§11.4.74) for unsupported patterns; every UI component ships light+dark + token-diff regression tests via visual regression; no element overlap/font collision/label overlay. Honest boundary: does NOT replace §11.4.27 functional testing nor §11.4.48/.49 UI testing. Classification: universal (§11.4.17). Propagation gate</w:t>
       </w:r>
       <w:r>
         <w:t xml:space="preserve"> </w:t>
@@ -9427,7 +8895,7 @@
         <w:t xml:space="preserve"> </w:t>
       </w:r>
       <w:r>
-        <w:t xml:space="preserve">GC’d (§11.4.77). (G) every change crosses full gauntlet (§11.4.142/.125/.134/.145 + anti-bluff). (H) stream registry (§11.4.116/.147) + atomic</w:t>
+        <w:t xml:space="preserve">GC'd (§11.4.77). (G) every change crosses full gauntlet (§11.4.142/.125/.134/.145 + anti-bluff). (H) stream registry (§11.4.116/.147) + atomic</w:t>
       </w:r>
       <w:r>
         <w:t xml:space="preserve"> </w:t>
@@ -9671,19 +9139,7 @@
         <w:t xml:space="preserve"> </w:t>
       </w:r>
       <w:r>
-        <w:t xml:space="preserve">MUST FAIL); iterate to clean GO §11.4.134. Forensic FACT (2026-06-23): a</w:t>
-      </w:r>
-      <w:r>
-        <w:t xml:space="preserve"> </w:t>
-      </w:r>
-      <w:r>
-        <w:t xml:space="preserve">“green”</w:t>
-      </w:r>
-      <w:r>
-        <w:t xml:space="preserve"> </w:t>
-      </w:r>
-      <w:r>
-        <w:t xml:space="preserve">Mermaid fix shipped raw gantt source as readable text into user PDFs because validation grepped HTML for</w:t>
+        <w:t xml:space="preserve">MUST FAIL); iterate to clean GO §11.4.134. Forensic FACT (2026-06-23): a "green" Mermaid fix shipped raw gantt source as readable text into user PDFs because validation grepped HTML for</w:t>
       </w:r>
       <w:r>
         <w:t xml:space="preserve"> </w:t>
@@ -9774,8 +9230,279 @@
         <w:t xml:space="preserve">§11.4.168.</w:t>
       </w:r>
     </w:p>
-    <w:bookmarkEnd w:id="13"/>
-    <w:bookmarkStart w:id="14" w:name="when-in-doubt"/>
+    <w:p>
+      <w:pPr>
+        <w:pStyle w:val="BodyText"/>
+      </w:pPr>
+      <w:r>
+        <w:rPr>
+          <w:b/>
+          <w:bCs/>
+        </w:rPr>
+        <w:t xml:space="preserve">§11.4.169 — Mandatory comprehensive test-type coverage with anti-bluff captured evidence (User mandate, 2026-06-25).</w:t>
+      </w:r>
+      <w:r>
+        <w:t xml:space="preserve"> </w:t>
+      </w:r>
+      <w:r>
+        <w:t xml:space="preserve">Every project MUST cover a CLOSED enumerated test-type set, each to as-close-to-100% as the domain permits, every PASS citing rock-solid captured PHYSICAL evidence (§11.4.5/.69/.107), zero false results/zero bluff (§11.4/.1/.6): (1) unit (only layer mocks allowed §11.4.27(A)); (2) integration (real System, infra via containers submodule §11.4.76); (3) e2e; (4) full-automation (autonomous, re-runnable, no manual step §11.4.25/.52/.98, deterministic §11.4.50); (5) Challenges (challenges submodule banks §11.4.27(B)); (6) HelixQA (helix_qa submodule — written test banks/suites per app/service/platform + comprehensive fully-autonomous QA sessions §11.4.27); (7) DDoS/load-flood (clean refuse or graceful degrade); (8) security (authz/injection/secret-leak §11.4.10/crypto/CVE/default-deny + security submodule); (9) stress+chaos (load+contention+boundary+failure-injection, categorised recovery §11.4.85); (10) concurrency/atomicity (no lost updates, transactional atomicity, idempotent replay); (11) race-condition/deadlock (race detector + lock-order analysis; no blocking op in shared-lock region §1); (12) memory (leak census + peak-RSS ceiling + 24h/N-iter soak, no unbounded growth); (13) benchmarking/performance (p50/p95/p99 + throughput vs recorded baseline). The ONLY permitted absence is an honest §11.4.3 SKIP-with-reason, never a silent gap; four-layer §11.4.4(b) enforcement + coverage ledger (§11.4.25/.52); missing required type or OPERATOR_ATTENDED_ONLY = release blocker. Strict enumerated expansion of §11.4.27. Composes §11.4.4/.5/.6/.25/.27/.50/.52/.69/.76/.85/.98/.107/.123/.135/.146/§1.1. Classification: universal (§11.4.17). Propagation gate</w:t>
+      </w:r>
+      <w:r>
+        <w:t xml:space="preserve"> </w:t>
+      </w:r>
+      <w:r>
+        <w:rPr>
+          <w:rStyle w:val="VerbatimChar"/>
+        </w:rPr>
+        <w:t xml:space="preserve">CM-COVENANT-114-169-PROPAGATION</w:t>
+      </w:r>
+      <w:r>
+        <w:t xml:space="preserve"> </w:t>
+      </w:r>
+      <w:r>
+        <w:t xml:space="preserve">(literal</w:t>
+      </w:r>
+      <w:r>
+        <w:t xml:space="preserve"> </w:t>
+      </w:r>
+      <w:r>
+        <w:rPr>
+          <w:rStyle w:val="VerbatimChar"/>
+        </w:rPr>
+        <w:t xml:space="preserve">11.4.169</w:t>
+      </w:r>
+      <w:r>
+        <w:t xml:space="preserve">) + recommended gate</w:t>
+      </w:r>
+      <w:r>
+        <w:t xml:space="preserve"> </w:t>
+      </w:r>
+      <w:r>
+        <w:rPr>
+          <w:rStyle w:val="VerbatimChar"/>
+        </w:rPr>
+        <w:t xml:space="preserve">CM-MANDATORY-TEST-TYPES-COVERED</w:t>
+      </w:r>
+      <w:r>
+        <w:t xml:space="preserve"> </w:t>
+      </w:r>
+      <w:r>
+        <w:t xml:space="preserve">+ paired §1.1 mutation.</w:t>
+      </w:r>
+      <w:r>
+        <w:t xml:space="preserve"> </w:t>
+      </w:r>
+      <w:r>
+        <w:rPr>
+          <w:b/>
+          <w:bCs/>
+        </w:rPr>
+        <w:t xml:space="preserve">Canonical authority:</w:t>
+      </w:r>
+      <w:r>
+        <w:t xml:space="preserve"> </w:t>
+      </w:r>
+      <w:r>
+        <w:t xml:space="preserve">constitution</w:t>
+      </w:r>
+      <w:r>
+        <w:t xml:space="preserve"> </w:t>
+      </w:r>
+      <w:r>
+        <w:rPr>
+          <w:rStyle w:val="VerbatimChar"/>
+        </w:rPr>
+        <w:t xml:space="preserve">Constitution.md</w:t>
+      </w:r>
+      <w:r>
+        <w:t xml:space="preserve"> </w:t>
+      </w:r>
+      <w:r>
+        <w:t xml:space="preserve">§11.4.169.</w:t>
+      </w:r>
+    </w:p>
+    <w:p>
+      <w:pPr>
+        <w:pStyle w:val="BodyText"/>
+      </w:pPr>
+      <w:r>
+        <w:rPr>
+          <w:b/>
+          <w:bCs/>
+        </w:rPr>
+        <w:t xml:space="preserve">§11.4.170 — Device-independent host-side rendered-UI visual-proof mandate (User mandate, 2026-06-25).</w:t>
+      </w:r>
+      <w:r>
+        <w:t xml:space="preserve"> </w:t>
+      </w:r>
+      <w:r>
+        <w:t xml:space="preserve">Compact summary: every change to ANY user-facing UI surface (screen/component/view/widget/layout/theme on any platform — Android-Compose, iOS-SwiftUI/UIKit, web, desktop, TUI) MUST be proven by DEVICE-INDEPENDENT host-side RENDERED PIXELS before it may be claimed correct — the real component rendered to a PNG ON THE HOST (NO device, NO emulator, NO running app) via a host-render harness (Compose→Roborazzi/Paparazzi on the JVM; web→Playwright/Storybook snapshot; SwiftUI→snapshot-testing; equivalent per stack), for EVERY relevant screen×state×{light,dark} theme, with the PNG validated by BOTH (i) golden image-diff (per-pixel/perceptual PASS/FAIL) AND (ii) an OCR/vision oracle reading rendered text+labels+control bounds to assert legibility + NO overlap / NO label-over-label / NO clipping / NO off-screen control / NO collapsed-or-giant-unbounded widget (the §11.4.162 layout invariants PROVEN on real pixels). Forensic FACT (2026-06-25): UI work was "validated" by VALUE-EQUALITY unit tests (a hex colour string / an sp/dp size integer / a design-token field == a constant) that NEVER RENDERED A PIXEL — GREEN while the operator opened a broken unbounded giant-button screen. A value/token-equality / property-assertion UI test is FORBIDDEN as the PROOF a UI is correct (it may SUPPLEMENT, NEVER SUBSTITUTE the rendered-pixel proof); a "green" UI suite with no rendered-pixel artefact for the changed surface is a §11.4 PASS-bluff at the visual layer. Self-validated golden-good/golden-bad analyzer §11.4.107(10), thresholds calibrated on the project's own fixtures §11.4.6. "device offline" is NEVER a valid skip — host-render IS the device-independent path; honest §11.4.3 SKIP only where the platform genuinely has no host-render harness (tracked migration item, never a value-only fallback). Honest boundary §11.4.6: host-render proves the COMPONENT renders correctly device-independently per commit — it does NOT prove the running app on real hardware (that remains §11.4.153/.158/.159/.160's live-device recording + read-the-screen layer, which §11.4.170 COMPLEMENTS not replaces — both mandatory), does NOT replace §11.4.162 OpenDesign token/theme governance (§11.4.170 PROVES the rendered RESULT of those tokens), DISTINCT from §11.4.168 exported-document visual validation. Classification: universal (§11.4.17). Composes §11.4.3/.5/.27/.40/.69/.107/.108/.117/.153/.158/.159/.160/.162/.163/.168/.169/§1.1. Propagation gate</w:t>
+      </w:r>
+      <w:r>
+        <w:t xml:space="preserve"> </w:t>
+      </w:r>
+      <w:r>
+        <w:rPr>
+          <w:rStyle w:val="VerbatimChar"/>
+        </w:rPr>
+        <w:t xml:space="preserve">CM-COVENANT-114-170-PROPAGATION</w:t>
+      </w:r>
+      <w:r>
+        <w:t xml:space="preserve"> </w:t>
+      </w:r>
+      <w:r>
+        <w:t xml:space="preserve">(literal</w:t>
+      </w:r>
+      <w:r>
+        <w:t xml:space="preserve"> </w:t>
+      </w:r>
+      <w:r>
+        <w:rPr>
+          <w:rStyle w:val="VerbatimChar"/>
+        </w:rPr>
+        <w:t xml:space="preserve">11.4.170</w:t>
+      </w:r>
+      <w:r>
+        <w:t xml:space="preserve">) + recommended gate</w:t>
+      </w:r>
+      <w:r>
+        <w:t xml:space="preserve"> </w:t>
+      </w:r>
+      <w:r>
+        <w:rPr>
+          <w:rStyle w:val="VerbatimChar"/>
+        </w:rPr>
+        <w:t xml:space="preserve">CM-HOST-RENDERED-UI-VISUAL-PROOF</w:t>
+      </w:r>
+      <w:r>
+        <w:t xml:space="preserve"> </w:t>
+      </w:r>
+      <w:r>
+        <w:t xml:space="preserve">+ paired §1.1 mutation.</w:t>
+      </w:r>
+      <w:r>
+        <w:t xml:space="preserve"> </w:t>
+      </w:r>
+      <w:r>
+        <w:rPr>
+          <w:b/>
+          <w:bCs/>
+        </w:rPr>
+        <w:t xml:space="preserve">Canonical authority:</w:t>
+      </w:r>
+      <w:r>
+        <w:t xml:space="preserve"> </w:t>
+      </w:r>
+      <w:r>
+        <w:t xml:space="preserve">constitution submodule</w:t>
+      </w:r>
+      <w:r>
+        <w:t xml:space="preserve"> </w:t>
+      </w:r>
+      <w:hyperlink r:id="rId10">
+        <w:r>
+          <w:rPr>
+            <w:rStyle w:val="VerbatimChar"/>
+          </w:rPr>
+          <w:t xml:space="preserve">Constitution.md</w:t>
+        </w:r>
+      </w:hyperlink>
+      <w:r>
+        <w:t xml:space="preserve"> </w:t>
+      </w:r>
+      <w:r>
+        <w:t xml:space="preserve">§11.4.170. Non-compliance is a release blocker. No escape hatch — no</w:t>
+      </w:r>
+      <w:r>
+        <w:t xml:space="preserve"> </w:t>
+      </w:r>
+      <w:r>
+        <w:rPr>
+          <w:rStyle w:val="VerbatimChar"/>
+        </w:rPr>
+        <w:t xml:space="preserve">--value-assertion-proves-ui</w:t>
+      </w:r>
+      <w:r>
+        <w:t xml:space="preserve">,</w:t>
+      </w:r>
+      <w:r>
+        <w:t xml:space="preserve"> </w:t>
+      </w:r>
+      <w:r>
+        <w:rPr>
+          <w:rStyle w:val="VerbatimChar"/>
+        </w:rPr>
+        <w:t xml:space="preserve">--skip-rendered-pixel-proof</w:t>
+      </w:r>
+      <w:r>
+        <w:t xml:space="preserve">,</w:t>
+      </w:r>
+      <w:r>
+        <w:t xml:space="preserve"> </w:t>
+      </w:r>
+      <w:r>
+        <w:rPr>
+          <w:rStyle w:val="VerbatimChar"/>
+        </w:rPr>
+        <w:t xml:space="preserve">--token-equality-suffices</w:t>
+      </w:r>
+      <w:r>
+        <w:t xml:space="preserve">,</w:t>
+      </w:r>
+      <w:r>
+        <w:t xml:space="preserve"> </w:t>
+      </w:r>
+      <w:r>
+        <w:rPr>
+          <w:rStyle w:val="VerbatimChar"/>
+        </w:rPr>
+        <w:t xml:space="preserve">--device-offline-skip-visual</w:t>
+      </w:r>
+      <w:r>
+        <w:t xml:space="preserve">,</w:t>
+      </w:r>
+      <w:r>
+        <w:t xml:space="preserve"> </w:t>
+      </w:r>
+      <w:r>
+        <w:rPr>
+          <w:rStyle w:val="VerbatimChar"/>
+        </w:rPr>
+        <w:t xml:space="preserve">--single-theme-only</w:t>
+      </w:r>
+      <w:r>
+        <w:t xml:space="preserve">,</w:t>
+      </w:r>
+      <w:r>
+        <w:t xml:space="preserve"> </w:t>
+      </w:r>
+      <w:r>
+        <w:rPr>
+          <w:rStyle w:val="VerbatimChar"/>
+        </w:rPr>
+        <w:t xml:space="preserve">--unvalidated-image-diff-OK</w:t>
+      </w:r>
+      <w:r>
+        <w:t xml:space="preserve">,</w:t>
+      </w:r>
+      <w:r>
+        <w:t xml:space="preserve"> </w:t>
+      </w:r>
+      <w:r>
+        <w:rPr>
+          <w:rStyle w:val="VerbatimChar"/>
+        </w:rPr>
+        <w:t xml:space="preserve">--no-ocr-layout-oracle</w:t>
+      </w:r>
+      <w:r>
+        <w:t xml:space="preserve"> </w:t>
+      </w:r>
+      <w:r>
+        <w:t xml:space="preserve">flag.</w:t>
+      </w:r>
+    </w:p>
+    <w:bookmarkEnd w:id="14"/>
+    <w:bookmarkStart w:id="15" w:name="when-in-doubt"/>
     <w:p>
       <w:pPr>
         <w:pStyle w:val="Heading2"/>
@@ -9880,8 +9607,167 @@
         <w:t xml:space="preserve">If still unclear, ask the operator. Do NOT guess. Do NOT bluff (§11.4.6).</w:t>
       </w:r>
     </w:p>
-    <w:bookmarkEnd w:id="14"/>
+    <w:p>
+      <w:pPr>
+        <w:pStyle w:val="FirstParagraph"/>
+      </w:pPr>
+      <w:r>
+        <w:rPr>
+          <w:b/>
+          <w:bCs/>
+        </w:rPr>
+        <w:t xml:space="preserve">§11.4.171 — Mandatory comprehensive human-readable workable-item descriptions (User mandate, 2026-06-29).</w:t>
+      </w:r>
+      <w:r>
+        <w:t xml:space="preserve"> </w:t>
+      </w:r>
+      <w:r>
+        <w:t xml:space="preserve">Every workable item (ATM-NNN ticket) in the project's workable-items database, Issues.md, Fixed.md, Issues_Summary.md, Fixed_Summary.md, and ALL derived documents MUST carry a comprehensive human-readable description that explains the item in plain, non-technical language suitable for non-developers (project managers, stakeholders, team leads, business partners). The description MUST be 5-7 sentences minimum, written so that ANY person — regardless of technical background — can understand: (a) WHAT the item is (the feature, fix, or task in simple terms); (b) WHY it matters (the user/business value); (c) HOW it works (the mechanism, without code references); (d) WHO benefits (the end user or stakeholder); (e) WHAT the expected outcome is (the measurable result). The description is MANDATORY — an item without a human-readable description is a §11.4 violation at the documentation layer. Descriptions MUST NOT use jargon, acronyms without expansion, code references, or technical implementation details as the primary explanation. Technical details MAY appear as supplementary context AFTER the plain-language explanation. The</w:t>
+      </w:r>
+      <w:r>
+        <w:t xml:space="preserve"> </w:t>
+      </w:r>
+      <w:r>
+        <w:rPr>
+          <w:rStyle w:val="VerbatimChar"/>
+        </w:rPr>
+        <w:t xml:space="preserve">description</w:t>
+      </w:r>
+      <w:r>
+        <w:t xml:space="preserve"> </w:t>
+      </w:r>
+      <w:r>
+        <w:t xml:space="preserve">column in the SQLite database (</w:t>
+      </w:r>
+      <w:r>
+        <w:rPr>
+          <w:rStyle w:val="VerbatimChar"/>
+        </w:rPr>
+        <w:t xml:space="preserve">docs/workable_items.db</w:t>
+      </w:r>
+      <w:r>
+        <w:t xml:space="preserve">) is the SINGLE SOURCE OF TRUTH for item descriptions; all derived documents (Issues.md, Fixed.md, summaries, exports) MUST carry the SAME description text. Pre-build gate</w:t>
+      </w:r>
+      <w:r>
+        <w:t xml:space="preserve"> </w:t>
+      </w:r>
+      <w:r>
+        <w:rPr>
+          <w:rStyle w:val="VerbatimChar"/>
+        </w:rPr>
+        <w:t xml:space="preserve">CM-HUMAN-READABLE-DESCRIPTION</w:t>
+      </w:r>
+      <w:r>
+        <w:t xml:space="preserve"> </w:t>
+      </w:r>
+      <w:r>
+        <w:t xml:space="preserve">(when implemented) walks every item in the DB and asserts the</w:t>
+      </w:r>
+      <w:r>
+        <w:t xml:space="preserve"> </w:t>
+      </w:r>
+      <w:r>
+        <w:rPr>
+          <w:rStyle w:val="VerbatimChar"/>
+        </w:rPr>
+        <w:t xml:space="preserve">description</w:t>
+      </w:r>
+      <w:r>
+        <w:t xml:space="preserve"> </w:t>
+      </w:r>
+      <w:r>
+        <w:t xml:space="preserve">field exists, is non-empty, and is ≥ 50 characters. Paired §1.1 meta-test mutation strips a description → gate FAILs. Classification: universal (§11.4.17). Composes §11.4.15 (item-status tracking), §11.4.16 (item-type tracking), §11.4.19 (column alignment), §11.4.91 (summary clarity), §11.4.93 (SQLite SSoT), §11.4.148 (item integrity), §11.4.65 (universal export). Propagation gate</w:t>
+      </w:r>
+      <w:r>
+        <w:t xml:space="preserve"> </w:t>
+      </w:r>
+      <w:r>
+        <w:rPr>
+          <w:rStyle w:val="VerbatimChar"/>
+        </w:rPr>
+        <w:t xml:space="preserve">CM-COVENANT-114-171-PROPAGATION</w:t>
+      </w:r>
+      <w:r>
+        <w:t xml:space="preserve"> </w:t>
+      </w:r>
+      <w:r>
+        <w:t xml:space="preserve">(literal</w:t>
+      </w:r>
+      <w:r>
+        <w:t xml:space="preserve"> </w:t>
+      </w:r>
+      <w:r>
+        <w:rPr>
+          <w:rStyle w:val="VerbatimChar"/>
+        </w:rPr>
+        <w:t xml:space="preserve">11.4.171</w:t>
+      </w:r>
+      <w:r>
+        <w:t xml:space="preserve">) + paired §1.1 mutation.</w:t>
+      </w:r>
+    </w:p>
+    <w:p>
+      <w:pPr>
+        <w:pStyle w:val="BodyText"/>
+      </w:pPr>
+      <w:r>
+        <w:rPr>
+          <w:b/>
+          <w:bCs/>
+        </w:rPr>
+        <w:t xml:space="preserve">§11.4.172 — Mandatory production-readiness planning with realistic timeline projection (User mandate, 2026-06-29).</w:t>
+      </w:r>
+      <w:r>
+        <w:t xml:space="preserve"> </w:t>
+      </w:r>
+      <w:r>
+        <w:t xml:space="preserve">Every project under this Constitution MUST maintain a living production-readiness planning document that: (a) provides REALISTIC timeline projections for all product milestones (MVP, beta, production-ready) based on actual development velocity data (items completed per week, reopening rate, blocking dependencies); (b) identifies ALL danger zones, weaknesses, and risk areas with mitigation strategies; (c) accounts for HW delivery timelines, licensing delays, and external dependency risks; (d) defines the critical path and identifies which items can slip without affecting MVP; (e) includes workstation/build-capacity analysis and optimization recommendations; (f) is updated at least monthly or whenever the item count changes by ≥ 10%; (g) is cross-referenced against the workable-items database for accuracy. The planning document MUST live at</w:t>
+      </w:r>
+      <w:r>
+        <w:t xml:space="preserve"> </w:t>
+      </w:r>
+      <w:r>
+        <w:rPr>
+          <w:rStyle w:val="VerbatimChar"/>
+        </w:rPr>
+        <w:t xml:space="preserve">docs/research/production_planning_&lt;YYYYMMDD&gt;/ANALYSIS.md</w:t>
+      </w:r>
+      <w:r>
+        <w:t xml:space="preserve"> </w:t>
+      </w:r>
+      <w:r>
+        <w:t xml:space="preserve">with HTML+PDF exports per §11.4.65. Honest boundary (§11.4.6): projections are estimates based on measured velocity — they guarantee the methodology is sound, NOT that specific dates will be met. Classification: universal (§11.4.17). Composes §11.4.6 (no-guessing — projections based on data, not wishful thinking), §11.4.40 (full retest before tag), §11.4.42 (iteration discipline), §11.4.93 (SQLite SSoT), §11.4.108 (four-layer verification). Propagation gate</w:t>
+      </w:r>
+      <w:r>
+        <w:t xml:space="preserve"> </w:t>
+      </w:r>
+      <w:r>
+        <w:rPr>
+          <w:rStyle w:val="VerbatimChar"/>
+        </w:rPr>
+        <w:t xml:space="preserve">CM-COVENANT-114-172-PROPAGATION</w:t>
+      </w:r>
+      <w:r>
+        <w:t xml:space="preserve"> </w:t>
+      </w:r>
+      <w:r>
+        <w:t xml:space="preserve">(literal</w:t>
+      </w:r>
+      <w:r>
+        <w:t xml:space="preserve"> </w:t>
+      </w:r>
+      <w:r>
+        <w:rPr>
+          <w:rStyle w:val="VerbatimChar"/>
+        </w:rPr>
+        <w:t xml:space="preserve">11.4.172</w:t>
+      </w:r>
+      <w:r>
+        <w:t xml:space="preserve">) + paired §1.1 mutation.</w:t>
+      </w:r>
+    </w:p>
     <w:bookmarkEnd w:id="15"/>
+    <w:bookmarkEnd w:id="16"/>
     <w:sectPr>
       <w:footnotePr>
         <w:numRestart w:val="eachSect"/>
@@ -10112,7 +9998,7 @@
         <w:rFonts w:asciiTheme="minorHAnsi" w:cstheme="minorBidi" w:eastAsiaTheme="minorEastAsia" w:hAnsiTheme="minorHAnsi"/>
         <w:sz w:val="24"/>
         <w:szCs w:val="24"/>
-        <w:lang w:bidi="ar-SA" w:eastAsia="zh-CN" w:val="en-US"/>
+        <w:lang w:bidi="ar-SA" w:eastAsia="zh-CN" w:val="en"/>
       </w:rPr>
     </w:rPrDefault>
     <w:pPrDefault>

</xml_diff>

<commit_message>
feat(§11.4.173): shared-host process-ownership verification mandate
Operator mandate 2026-06-29: never attribute/inspect/act-on a process without positively
verifying it is OURS (cwd/argv/launched-PID, never a loose pgrep name match); never kill a
process not positively ours (operator-workload-safety §12/§11.4.133); contention from another
project → surface not break (§11.4.66/§11.4.101); pgrep filters exclude self+other-project.
Forensic anchor: catalogizer gradle nearly mis-attributed to our build on the shared host.
Added to Constitution.md + 5-carrier lockstep (CLAUDE/AGENTS/QWEN/GEMINI). §11.4.157 lockstep ok.
</commit_message>
<xml_diff>
--- a/GEMINI.docx
+++ b/GEMINI.docx
@@ -2,15 +2,7 @@
 <file path=word/document.xml><?xml version="1.0" encoding="utf-8"?>
 <w:document xmlns:w="http://schemas.openxmlformats.org/wordprocessingml/2006/main" xmlns:m="http://schemas.openxmlformats.org/officeDocument/2006/math" xmlns:r="http://schemas.openxmlformats.org/officeDocument/2006/relationships" xmlns:o="urn:schemas-microsoft-com:office:office" xmlns:v="urn:schemas-microsoft-com:vml" xmlns:w10="urn:schemas-microsoft-com:office:word" xmlns:a="http://schemas.openxmlformats.org/drawingml/2006/main" xmlns:pic="http://schemas.openxmlformats.org/drawingml/2006/picture" xmlns:wp="http://schemas.openxmlformats.org/drawingml/2006/wordprocessingDrawing">
   <w:body>
-    <w:p>
-      <w:pPr>
-        <w:pStyle w:val="Title"/>
-      </w:pPr>
-      <w:r>
-        <w:t xml:space="preserve">GEMINI</w:t>
-      </w:r>
-    </w:p>
-    <w:bookmarkStart w:id="16" w:name="helix-constitution--universal-geminimd"/>
+    <w:bookmarkStart w:id="15" w:name="helix-constitution-universal-gemini.md"/>
     <w:p>
       <w:pPr>
         <w:pStyle w:val="Heading1"/>
@@ -22,7 +14,8 @@
     <w:tbl>
       <w:tblPr>
         <w:tblStyle w:val="Table"/>
-        <w:tblW w:type="auto" w:w="0"/>
+        <w:tblW w:type="pct" w:w="5000"/>
+        <w:tblLayout w:type="fixed"/>
         <w:tblLook w:firstRow="1" w:lastRow="0" w:firstColumn="0" w:lastColumn="0" w:noHBand="0" w:noVBand="0" w:val="0020"/>
       </w:tblPr>
       <w:tblGrid>
@@ -507,7 +500,7 @@
         <w:t xml:space="preserve"> </w:t>
       </w:r>
       <w:r>
-        <w:t xml:space="preserve">project's own repo-root</w:t>
+        <w:t xml:space="preserve">project’s own repo-root</w:t>
       </w:r>
       <w:r>
         <w:t xml:space="preserve"> </w:t>
@@ -542,7 +535,7 @@
         <w:pStyle w:val="BodyText"/>
       </w:pPr>
       <w:r>
-        <w:t xml:space="preserve">For agents driven from a consuming project, the project's repo-root carrier</w:t>
+        <w:t xml:space="preserve">For agents driven from a consuming project, the project’s repo-root carrier</w:t>
       </w:r>
       <w:r>
         <w:t xml:space="preserve"> </w:t>
@@ -611,7 +604,7 @@
       </w:r>
     </w:p>
     <w:bookmarkEnd w:id="9"/>
-    <w:bookmarkStart w:id="11" w:name="Xa248266842dbec6af31dbcf1ca91a15c9292d5b"/>
+    <w:bookmarkStart w:id="11" w:name="X2c10a2e76b685975585d4bbddc3d6345f162bd6"/>
     <w:p>
       <w:pPr>
         <w:pStyle w:val="Heading2"/>
@@ -723,7 +716,7 @@
         <w:t xml:space="preserve"> </w:t>
       </w:r>
       <w:r>
-        <w:t xml:space="preserve">When a user prompt's FIRST</w:t>
+        <w:t xml:space="preserve">When a user prompt’s FIRST</w:t>
       </w:r>
       <w:r>
         <w:t xml:space="preserve"> </w:t>
@@ -768,7 +761,7 @@
         <w:t xml:space="preserve"> </w:t>
       </w:r>
       <w:r>
-        <w:t xml:space="preserve">(2) if it is a registered action, REPLACE the prefix with that action's</w:t>
+        <w:t xml:space="preserve">(2) if it is a registered action, REPLACE the prefix with that action’s</w:t>
       </w:r>
       <w:r>
         <w:t xml:space="preserve"> </w:t>
@@ -1404,7 +1397,7 @@
           <w:i/>
           <w:iCs/>
         </w:rPr>
-        <w:t xml:space="preserve">"The following prompt that we will provide MUST BE executed in background</w:t>
+        <w:t xml:space="preserve">“The following prompt that we will provide MUST BE executed in background</w:t>
       </w:r>
       <w:r>
         <w:rPr>
@@ -1460,7 +1453,7 @@
           <w:i/>
           <w:iCs/>
         </w:rPr>
-        <w:t xml:space="preserve">any false results and without any bluff!"</w:t>
+        <w:t xml:space="preserve">any false results and without any bluff!”</w:t>
       </w:r>
       <w:r>
         <w:t xml:space="preserve"> </w:t>
@@ -1606,9 +1599,12 @@
       <w:r>
         <w:t xml:space="preserve">flag.</w:t>
       </w:r>
+      <w:r>
+        <w:t xml:space="preserve"> </w:t>
+      </w:r>
     </w:p>
     <w:bookmarkEnd w:id="11"/>
-    <w:bookmarkStart w:id="14" w:name="token-efficiency-mandate-114141"/>
+    <w:bookmarkStart w:id="13" w:name="token-efficiency-mandate-11.4.141"/>
     <w:p>
       <w:pPr>
         <w:pStyle w:val="Heading2"/>
@@ -2051,7 +2047,70 @@
         <w:t xml:space="preserve"> </w:t>
       </w:r>
       <w:r>
-        <w:t xml:space="preserve">Verbatim operator mandate: "ALL changes we do MUST pass through the code review step!!! ALWAYS!!!" EVERY change made to ANY repository this Constitution governs — without exception — MUST pass through an INDEPENDENT code-review step BEFORE it is accepted, committed, or built. NO change class is exempt: source code, fixes, tests, gates, meta-test mutations, documentation, doc-tooling, build/CI scripts, configuration, governance files (Constitution / CLAUDE / AGENTS / QWEN), conductor main-stream edits, sub-agent output, refactors, single-line edits — if a diff exists, it gets an independent review. This is the ABSOLUTE form of §11.4.125 (code-review agent gate after a batch, before pre-build sweep + main build): §11.4.142 strips every implicit scoping §11.4.125's "after all fixes/changes/implementations are done" phrasing could leave open — no "just a doc edit", no "just a one-liner", no "the author already self-reviewed (§11.4.92)", no "trivial change" carve-out.</w:t>
+        <w:t xml:space="preserve">Verbatim operator mandate:</w:t>
+      </w:r>
+      <w:r>
+        <w:t xml:space="preserve"> </w:t>
+      </w:r>
+      <w:r>
+        <w:t xml:space="preserve">“ALL changes we do MUST pass through the code review step!!! ALWAYS!!!”</w:t>
+      </w:r>
+      <w:r>
+        <w:t xml:space="preserve"> </w:t>
+      </w:r>
+      <w:r>
+        <w:t xml:space="preserve">EVERY change made to ANY repository this Constitution governs — without exception — MUST pass through an INDEPENDENT code-review step BEFORE it is accepted, committed, or built. NO change class is exempt: source code, fixes, tests, gates, meta-test mutations, documentation, doc-tooling, build/CI scripts, configuration, governance files (Constitution / CLAUDE / AGENTS / QWEN), conductor main-stream edits, sub-agent output, refactors, single-line edits — if a diff exists, it gets an independent review. This is the ABSOLUTE form of §11.4.125 (code-review agent gate after a batch, before pre-build sweep + main build): §11.4.142 strips every implicit scoping §11.4.125’s</w:t>
+      </w:r>
+      <w:r>
+        <w:t xml:space="preserve"> </w:t>
+      </w:r>
+      <w:r>
+        <w:t xml:space="preserve">“after all fixes/changes/implementations are done”</w:t>
+      </w:r>
+      <w:r>
+        <w:t xml:space="preserve"> </w:t>
+      </w:r>
+      <w:r>
+        <w:t xml:space="preserve">phrasing could leave open — no</w:t>
+      </w:r>
+      <w:r>
+        <w:t xml:space="preserve"> </w:t>
+      </w:r>
+      <w:r>
+        <w:t xml:space="preserve">“just a doc edit”</w:t>
+      </w:r>
+      <w:r>
+        <w:t xml:space="preserve">, no</w:t>
+      </w:r>
+      <w:r>
+        <w:t xml:space="preserve"> </w:t>
+      </w:r>
+      <w:r>
+        <w:t xml:space="preserve">“just a one-liner”</w:t>
+      </w:r>
+      <w:r>
+        <w:t xml:space="preserve">, no</w:t>
+      </w:r>
+      <w:r>
+        <w:t xml:space="preserve"> </w:t>
+      </w:r>
+      <w:r>
+        <w:t xml:space="preserve">“the author already self-reviewed (§11.4.92)”</w:t>
+      </w:r>
+      <w:r>
+        <w:t xml:space="preserve">, no</w:t>
+      </w:r>
+      <w:r>
+        <w:t xml:space="preserve"> </w:t>
+      </w:r>
+      <w:r>
+        <w:t xml:space="preserve">“trivial change”</w:t>
+      </w:r>
+      <w:r>
+        <w:t xml:space="preserve"> </w:t>
+      </w:r>
+      <w:r>
+        <w:t xml:space="preserve">carve-out.</w:t>
       </w:r>
       <w:r>
         <w:t xml:space="preserve"> </w:t>
@@ -2067,7 +2126,7 @@
         <w:t xml:space="preserve"> </w:t>
       </w:r>
       <w:r>
-        <w:t xml:space="preserve">— the reviewer MUST be structurally separated from the author (a dedicated code-review agent, subagent-driven by default per §11.4.70 / §11.4.20, or a distinct human), NEVER the author re-reading their own work; §11.4.92's multi-pass self-evaluation is the AUTHOR-side discipline and PRECEDES (never satisfies) §11.4.142.</w:t>
+        <w:t xml:space="preserve">— the reviewer MUST be structurally separated from the author (a dedicated code-review agent, subagent-driven by default per §11.4.70 / §11.4.20, or a distinct human), NEVER the author re-reading their own work; §11.4.92’s multi-pass self-evaluation is the AUTHOR-side discipline and PRECEDES (never satisfies) §11.4.142.</w:t>
       </w:r>
       <w:r>
         <w:t xml:space="preserve"> </w:t>
@@ -2083,7 +2142,19 @@
         <w:t xml:space="preserve"> </w:t>
       </w:r>
       <w:r>
-        <w:t xml:space="preserve">(§11.4 / §11.4.1) — a rubber-stamp "looks good" is not a review; it MUST genuinely analyse correctness, safety (no host §12 / data §9 / target-hardware §11.4.133 regression), will-it-really-work (no solve-A-create-B), end-user behaviour (§11.4 / §107), and test-genuineness (§1.1), its conclusions captured evidence per §11.4.5 / §11.4.69, and</w:t>
+        <w:t xml:space="preserve">(§11.4 / §11.4.1) — a rubber-stamp</w:t>
+      </w:r>
+      <w:r>
+        <w:t xml:space="preserve"> </w:t>
+      </w:r>
+      <w:r>
+        <w:t xml:space="preserve">“looks good”</w:t>
+      </w:r>
+      <w:r>
+        <w:t xml:space="preserve"> </w:t>
+      </w:r>
+      <w:r>
+        <w:t xml:space="preserve">is not a review; it MUST genuinely analyse correctness, safety (no host §12 / data §9 / target-hardware §11.4.133 regression), will-it-really-work (no solve-A-create-B), end-user behaviour (§11.4 / §107), and test-genuineness (§1.1), its conclusions captured evidence per §11.4.5 / §11.4.69, and</w:t>
       </w:r>
       <w:r>
         <w:t xml:space="preserve"> </w:t>
@@ -2282,7 +2353,19 @@
         <w:t xml:space="preserve"> </w:t>
       </w:r>
       <w:r>
-        <w:t xml:space="preserve">Verbatim operator mandate: "All video streaming apps ... require to choose some title and to press proper UI button to start or resume playing! Proper UI interaction to play exact show with proper content and subtitles is MANDATORY! Without it we just eventually play on 2nd display sample, and that's it mostly! THIS MUST BE ADDED as MANDATORY RULE regarding testing of any video streaming app in general with full automation tests! Universal in root constitution + a consuming project's extensions." Any full-automation test that asserts a video player / streaming application plays content MUST drive the REAL end-user journey through the app's OWN UI — launch → BROWSE the actual catalog → choose a SPECIFIC title → press the real Play/Resume button → confirm THAT chosen content is genuinely playing, with its correct subtitles, on the intended routing target. A test that bypasses the journey with a sample / demo / built-in-loop clip, a deep-link /</w:t>
+        <w:t xml:space="preserve">Verbatim operator mandate:</w:t>
+      </w:r>
+      <w:r>
+        <w:t xml:space="preserve"> </w:t>
+      </w:r>
+      <w:r>
+        <w:t xml:space="preserve">“All video streaming apps … require to choose some title and to press proper UI button to start or resume playing! Proper UI interaction to play exact show with proper content and subtitles is MANDATORY! Without it we just eventually play on 2nd display sample, and that’s it mostly! THIS MUST BE ADDED as MANDATORY RULE regarding testing of any video streaming app in general with full automation tests! Universal in root constitution + a consuming project’s extensions.”</w:t>
+      </w:r>
+      <w:r>
+        <w:t xml:space="preserve"> </w:t>
+      </w:r>
+      <w:r>
+        <w:t xml:space="preserve">Any full-automation test that asserts a video player / streaming application plays content MUST drive the REAL end-user journey through the app’s OWN UI — launch → BROWSE the actual catalog → choose a SPECIFIC title → press the real Play/Resume button → confirm THAT chosen content is genuinely playing, with its correct subtitles, on the intended routing target. A test that bypasses the journey with a sample / demo / built-in-loop clip, a deep-link /</w:t>
       </w:r>
       <w:r>
         <w:t xml:space="preserve"> </w:t>
@@ -2297,7 +2380,7 @@
         <w:t xml:space="preserve"> </w:t>
       </w:r>
       <w:r>
-        <w:t xml:space="preserve">/ intent shortcut, a synthetic or pre-staged stream, or any path that does NOT exercise the app's own browse-select-play UI is a §11.4 PASS-bluff at the user-journey layer: it validates ROUTING (that</w:t>
+        <w:t xml:space="preserve">/ intent shortcut, a synthetic or pre-staged stream, or any path that does NOT exercise the app’s own browse-select-play UI is a §11.4 PASS-bluff at the user-journey layer: it validates ROUTING (that</w:t>
       </w:r>
       <w:r>
         <w:t xml:space="preserve"> </w:t>
@@ -2313,7 +2396,31 @@
         <w:t xml:space="preserve"> </w:t>
       </w:r>
       <w:r>
-        <w:t xml:space="preserve">reaches the display) while leaving the user-visible behaviour the operator cares about — "the show I picked actually plays" — unproven (the operator's "we just eventually play on 2nd display sample, and that's it mostly" gap). The mandate (ALL hold): (1)</w:t>
+        <w:t xml:space="preserve">reaches the display) while leaving the user-visible behaviour the operator cares about —</w:t>
+      </w:r>
+      <w:r>
+        <w:t xml:space="preserve"> </w:t>
+      </w:r>
+      <w:r>
+        <w:t xml:space="preserve">“the show I picked actually plays”</w:t>
+      </w:r>
+      <w:r>
+        <w:t xml:space="preserve"> </w:t>
+      </w:r>
+      <w:r>
+        <w:t xml:space="preserve">— unproven (the operator’s</w:t>
+      </w:r>
+      <w:r>
+        <w:t xml:space="preserve"> </w:t>
+      </w:r>
+      <w:r>
+        <w:t xml:space="preserve">“we just eventually play on 2nd display sample, and that’s it mostly”</w:t>
+      </w:r>
+      <w:r>
+        <w:t xml:space="preserve"> </w:t>
+      </w:r>
+      <w:r>
+        <w:t xml:space="preserve">gap). The mandate (ALL hold): (1)</w:t>
       </w:r>
       <w:r>
         <w:t xml:space="preserve"> </w:t>
@@ -2329,7 +2436,7 @@
         <w:t xml:space="preserve"> </w:t>
       </w:r>
       <w:r>
-        <w:t xml:space="preserve">— launch → catalog browse → specific-title selection → real Play/Resume press through the app's own UI (§11.4.48 UI-driven), NEVER a deep-link / intent / sample / loop-clip shortcut; (2)</w:t>
+        <w:t xml:space="preserve">— launch → catalog browse → specific-title selection → real Play/Resume press through the app’s own UI (§11.4.48 UI-driven), NEVER a deep-link / intent / sample / loop-clip shortcut; (2)</w:t>
       </w:r>
       <w:r>
         <w:t xml:space="preserve"> </w:t>
@@ -2345,7 +2452,7 @@
         <w:t xml:space="preserve"> </w:t>
       </w:r>
       <w:r>
-        <w:t xml:space="preserve">— the PASS proves the SPECIFIC selected title is playing (not merely that pixels move on the target) via the §11.4.107 liveness battery on the §11.4.136 real-content path + the §11.4.137 subtitle content-correctness oracle for the chosen title's captions; (3)</w:t>
+        <w:t xml:space="preserve">— the PASS proves the SPECIFIC selected title is playing (not merely that pixels move on the target) via the §11.4.107 liveness battery on the §11.4.136 real-content path + the §11.4.137 subtitle content-correctness oracle for the chosen title’s captions; (3)</w:t>
       </w:r>
       <w:r>
         <w:t xml:space="preserve"> </w:t>
@@ -2361,7 +2468,7 @@
         <w:t xml:space="preserve"> </w:t>
       </w:r>
       <w:r>
-        <w:t xml:space="preserve">— when the app's accessibility hierarchy is blank/unreliable (TV-Compose / leanback / canvas / GL), DRIVE input + ASSERT content via the §11.4.117 CV/OCR pixel oracle, never a hierarchy-only tool; (4)</w:t>
+        <w:t xml:space="preserve">— when the app’s accessibility hierarchy is blank/unreliable (TV-Compose / leanback / canvas / GL), DRIVE input + ASSERT content via the §11.4.117 CV/OCR pixel oracle, never a hierarchy-only tool; (4)</w:t>
       </w:r>
       <w:r>
         <w:t xml:space="preserve"> </w:t>
@@ -2408,7 +2515,19 @@
         <w:t xml:space="preserve"> </w:t>
       </w:r>
       <w:r>
-        <w:t xml:space="preserve">SKIP-with-reason per §11.4.52 + §11.4.3 with a tracked migration item — NEVER a metadata-only / sample-played / routing-only PASS. Honest boundary (§11.4.6): "the routing fired so the title is playing" is a guess — only the chosen-content liveness + subtitle oracle on the real journey proves it. Composes §11.4.48 / §11.4.107 / §11.4.117 / §11.4.136 / §11.4.137 / §11.4.52 / §11.4.3 / §107 / §1.1. Classification: universal (§11.4.17) — the consuming project supplies its concrete app roster, login-credential source, routing target, and UI-driving / pixel-oracle harness per §11.4.35. Propagation gate</w:t>
+        <w:t xml:space="preserve">SKIP-with-reason per §11.4.52 + §11.4.3 with a tracked migration item — NEVER a metadata-only / sample-played / routing-only PASS. Honest boundary (§11.4.6):</w:t>
+      </w:r>
+      <w:r>
+        <w:t xml:space="preserve"> </w:t>
+      </w:r>
+      <w:r>
+        <w:t xml:space="preserve">“the routing fired so the title is playing”</w:t>
+      </w:r>
+      <w:r>
+        <w:t xml:space="preserve"> </w:t>
+      </w:r>
+      <w:r>
+        <w:t xml:space="preserve">is a guess — only the chosen-content liveness + subtitle oracle on the real journey proves it. Composes §11.4.48 / §11.4.107 / §11.4.117 / §11.4.136 / §11.4.137 / §11.4.52 / §11.4.3 / §107 / §1.1. Classification: universal (§11.4.17) — the consuming project supplies its concrete app roster, login-credential source, routing target, and UI-driving / pixel-oracle harness per §11.4.35. Propagation gate</w:t>
       </w:r>
       <w:r>
         <w:t xml:space="preserve"> </w:t>
@@ -2450,7 +2569,7 @@
         <w:t xml:space="preserve"> </w:t>
       </w:r>
       <w:r>
-        <w:t xml:space="preserve">(every video-streaming-app playback test drives the real browse-select-play journey + confirms the chosen content + subtitles, or SKIPs-with-reason) + paired §1.1 mutation (replace a real-journey test's browse-select-play path with a deep-link / sample shortcut → gate FAILs; strip the literal → propagation gate FAILs; gate-code = separate work item).</w:t>
+        <w:t xml:space="preserve">(every video-streaming-app playback test drives the real browse-select-play journey + confirms the chosen content + subtitles, or SKIPs-with-reason) + paired §1.1 mutation (replace a real-journey test’s browse-select-play path with a deep-link / sample shortcut → gate FAILs; strip the literal → propagation gate FAILs; gate-code = separate work item).</w:t>
       </w:r>
       <w:r>
         <w:t xml:space="preserve"> </w:t>
@@ -2612,7 +2731,7 @@
         <w:t xml:space="preserve"> </w:t>
       </w:r>
       <w:r>
-        <w:t xml:space="preserve">for the device to return using the project's ALREADY-DEFINED reconnection timings — never invented numbers (§11.4.6), the SAME grace / reconnect / poll budgets the project's recovery path already uses; (c)</w:t>
+        <w:t xml:space="preserve">for the device to return using the project’s ALREADY-DEFINED reconnection timings — never invented numbers (§11.4.6), the SAME grace / reconnect / poll budgets the project’s recovery path already uses; (c)</w:t>
       </w:r>
       <w:r>
         <w:t xml:space="preserve"> </w:t>
@@ -2644,7 +2763,7 @@
         <w:t xml:space="preserve"> </w:t>
       </w:r>
       <w:r>
-        <w:t xml:space="preserve">to the project's sanctioned device-recovery path (per §11.4.69 feature class</w:t>
+        <w:t xml:space="preserve">to the project’s sanctioned device-recovery path (per §11.4.69 feature class</w:t>
       </w:r>
       <w:r>
         <w:t xml:space="preserve"> </w:t>
@@ -2656,7 +2775,7 @@
         <w:t xml:space="preserve">device_recovery</w:t>
       </w:r>
       <w:r>
-        <w:t xml:space="preserve">) if the device does not return within the defined timeout — through the sanctioned, authorization-gated recovery entry point ONLY, never bypassing its gate and never performing a destructive recovery (e.g. a power-cycle) autonomously without that authorization (§11.4.21 / §11.4.101 — high-blast-radius recovery is gated; while blocked the system keeps following the device, logging the blocked-escalation honestly). A tracked-device drop that produces a silent corpus hole, a never-resumed recording, or a never-escalated permanent absence is the bluff this anchor forbids. Composes §11.4.128 (always-on recording — §11.4.144 closes its drop-handling gap) / §11.4.69 (</w:t>
+        <w:t xml:space="preserve">) if the device does not return within the defined timeout — through the sanctioned, authorization-gated recovery entry point ONLY, never bypassing its gate and never performing a destructive recovery (e.g. a power-cycle) autonomously without that authorization (§11.4.21 / §11.4.101 — high-blast-radius recovery is gated; while blocked the system keeps following the device, logging the blocked-escalation honestly). A tracked-device drop that produces a silent corpus hole, a never-resumed recording, or a never-escalated permanent absence is the bluff this anchor forbids. Composes §11.4.128 (always-on recording — §11.4.144 closes its drop-handling gap) / §11.4.69 (</w:t>
       </w:r>
       <w:r>
         <w:rPr>
@@ -2836,7 +2955,28 @@
         <w:t xml:space="preserve"> </w:t>
       </w:r>
       <w:r>
-        <w:t xml:space="preserve">For EVERY fix / change / new feature, INDEPENDENT impact-research agents (subagent-driven §11.4.70/§11.4.20, structurally separate from the author — §11.4.92 self-eval PRECEDES, never satisfies — adversarial "refute-the-change" stance to defeat the documented LLM confirmation-bias failure mode) MUST research the change AND its connected/dependent features across a CLOSED SET OF EIGHT ANGLES — (1) correctness/logic, (2) regression (what existing working feature could break — via call-graph impact enumerating every direct + transitive caller and contract-dependent feature, each mapped to its test), (3) latent/dangerous-code — the recents class (runtime-only failure, interface/ABI/contract mismatch, concurrency/data-race, resource lifecycle), (4) security (taint/injection/secret/unsafe-API), (5) performance (latency/memory/thermal under load vs baseline), (6) host/data/target-hardware safety per §12/§9/§11.4.133, (7) cross-feature interaction (shared state/timing/hardware contention), (8) business-logic conformance (matches the spec AND the connected features' contracts, not merely compiles). Forensic anchor (FACT, project-internal): the recents / 3-button-nav path shipped a latent AIDL-interface-contract mismatch that PASSED code review yet failed at RUNTIME ONLY (ANR on a recents-reaping gesture) because no review angle interrogated the interface contract / concurrency-lifecycle / silently-broken connected feature — the §11.4.108 SOURCE→ARTIFACT→RUNTIME→USER-VISIBLE gap caught only after the fact; §11.4.145 shifts that discovery LEFT. Each angle MUST name the TOOL(S) used + obtain the required DEPTH (the diff, the full changed unit, its declared contract, the spec section, every connected feature — NEVER the diff lines alone) + emit a captured-evidence conclusion per §11.4.5/§11.4.69 ("looks fine" forbidden, §11.4.1); a genuinely-N/A angle is recorded</w:t>
+        <w:t xml:space="preserve">For EVERY fix / change / new feature, INDEPENDENT impact-research agents (subagent-driven §11.4.70/§11.4.20, structurally separate from the author — §11.4.92 self-eval PRECEDES, never satisfies — adversarial</w:t>
+      </w:r>
+      <w:r>
+        <w:t xml:space="preserve"> </w:t>
+      </w:r>
+      <w:r>
+        <w:t xml:space="preserve">“refute-the-change”</w:t>
+      </w:r>
+      <w:r>
+        <w:t xml:space="preserve"> </w:t>
+      </w:r>
+      <w:r>
+        <w:t xml:space="preserve">stance to defeat the documented LLM confirmation-bias failure mode) MUST research the change AND its connected/dependent features across a CLOSED SET OF EIGHT ANGLES — (1) correctness/logic, (2) regression (what existing working feature could break — via call-graph impact enumerating every direct + transitive caller and contract-dependent feature, each mapped to its test), (3) latent/dangerous-code — the recents class (runtime-only failure, interface/ABI/contract mismatch, concurrency/data-race, resource lifecycle), (4) security (taint/injection/secret/unsafe-API), (5) performance (latency/memory/thermal under load vs baseline), (6) host/data/target-hardware safety per §12/§9/§11.4.133, (7) cross-feature interaction (shared state/timing/hardware contention), (8) business-logic conformance (matches the spec AND the connected features’ contracts, not merely compiles). Forensic anchor (FACT, project-internal): the recents / 3-button-nav path shipped a latent AIDL-interface-contract mismatch that PASSED code review yet failed at RUNTIME ONLY (ANR on a recents-reaping gesture) because no review angle interrogated the interface contract / concurrency-lifecycle / silently-broken connected feature — the §11.4.108 SOURCE→ARTIFACT→RUNTIME→USER-VISIBLE gap caught only after the fact; §11.4.145 shifts that discovery LEFT. Each angle MUST name the TOOL(S) used + obtain the required DEPTH (the diff, the full changed unit, its declared contract, the spec section, every connected feature — NEVER the diff lines alone) + emit a captured-evidence conclusion per §11.4.5/§11.4.69 (</w:t>
+      </w:r>
+      <w:r>
+        <w:t xml:space="preserve">“looks fine”</w:t>
+      </w:r>
+      <w:r>
+        <w:t xml:space="preserve"> </w:t>
+      </w:r>
+      <w:r>
+        <w:t xml:space="preserve">forbidden, §11.4.1); a genuinely-N/A angle is recorded</w:t>
       </w:r>
       <w:r>
         <w:t xml:space="preserve"> </w:t>
@@ -3034,7 +3174,7 @@
         <w:t xml:space="preserve"> </w:t>
       </w:r>
       <w:r>
-        <w:t xml:space="preserve">Every reported problem MUST be handled by a NAMED three-step test workflow — §11.4.146 does NOT re-author its component disciplines, it NAMES + BINDS them into the operator's exact per-defect sequence and adds ONLY the two emphases the components leave implicit.</w:t>
+        <w:t xml:space="preserve">Every reported problem MUST be handled by a NAMED three-step test workflow — §11.4.146 does NOT re-author its component disciplines, it NAMES + BINDS them into the operator’s exact per-defect sequence and adds ONLY the two emphases the components leave implicit.</w:t>
       </w:r>
       <w:r>
         <w:t xml:space="preserve"> </w:t>
@@ -3094,7 +3234,16 @@
         <w:t xml:space="preserve"> </w:t>
       </w:r>
       <w:r>
-        <w:t xml:space="preserve">NEW EMPHASIS (D2) immediately after STEP 2 the test MUST be FANNED OUT across the full case-space of the SAME functionality — all flows, valid + invalid + boundary (§11.4.85 empty/max/off-by-one) + concurrent (§11.4.85 contention) + failure-injection (§11.4.85 chaos) + topology variants (§11.4.3) — confirming no issue of any kind, with PROVABLE enumerated coverage per §11.4.118 (a listed case-set with per-case outcome, never "no other issues found"); a REQUIRED step, NOT deferred to a release-cycle discovery sweep and NOT reduced to a single guard; each user-visible case carries rock-solid physical evidence per §11.4.123 + is registered into the §11.4.135 standing regression-guard suite; a newly-discovered fan-out defect triggers §11.4.4 test-interrupt + re-enters STEP 1. (ANTI-BLUFF, all steps) every PASS is rock-solid CAPTURED physical evidence per §11.4.123 (§11.4.5/§11.4.69/§11.4.107) — metadata-only / config-only / absence-of-error / grep-without-runtime PASS forbidden (§11.4/§11.4.1); unclear validation method ⇒ deep-research-before-declaring-untestable per §11.4.123/§11.4.8/§11.4.99; an operator-found defect the green suite missed triggers §11.4.138. Honest boundary (§11.4.6): STEP 3 reduces the unknown-unknown surface but does not prove zero remaining defects (§11.4.118) — un-exercised cases stated as honest gaps, never silently implied clean. Composes §11.4.43/.115/.102/.130/.108/.139/.50/.85/.118/.135/.3/.123/.5/.69/.107/.138/.4/§107/§1.1. Classification: universal (§11.4.17). Propagation gate</w:t>
+        <w:t xml:space="preserve">NEW EMPHASIS (D2) immediately after STEP 2 the test MUST be FANNED OUT across the full case-space of the SAME functionality — all flows, valid + invalid + boundary (§11.4.85 empty/max/off-by-one) + concurrent (§11.4.85 contention) + failure-injection (§11.4.85 chaos) + topology variants (§11.4.3) — confirming no issue of any kind, with PROVABLE enumerated coverage per §11.4.118 (a listed case-set with per-case outcome, never</w:t>
+      </w:r>
+      <w:r>
+        <w:t xml:space="preserve"> </w:t>
+      </w:r>
+      <w:r>
+        <w:t xml:space="preserve">“no other issues found”</w:t>
+      </w:r>
+      <w:r>
+        <w:t xml:space="preserve">); a REQUIRED step, NOT deferred to a release-cycle discovery sweep and NOT reduced to a single guard; each user-visible case carries rock-solid physical evidence per §11.4.123 + is registered into the §11.4.135 standing regression-guard suite; a newly-discovered fan-out defect triggers §11.4.4 test-interrupt + re-enters STEP 1. (ANTI-BLUFF, all steps) every PASS is rock-solid CAPTURED physical evidence per §11.4.123 (§11.4.5/§11.4.69/§11.4.107) — metadata-only / config-only / absence-of-error / grep-without-runtime PASS forbidden (§11.4/§11.4.1); unclear validation method ⇒ deep-research-before-declaring-untestable per §11.4.123/§11.4.8/§11.4.99; an operator-found defect the green suite missed triggers §11.4.138. Honest boundary (§11.4.6): STEP 3 reduces the unknown-unknown surface but does not prove zero remaining defects (§11.4.118) — un-exercised cases stated as honest gaps, never silently implied clean. Composes §11.4.43/.115/.102/.130/.108/.139/.50/.85/.118/.135/.3/.123/.5/.69/.107/.138/.4/§107/§1.1. Classification: universal (§11.4.17). Propagation gate</w:t>
       </w:r>
       <w:r>
         <w:t xml:space="preserve"> </w:t>
@@ -3136,7 +3285,7 @@
         <w:t xml:space="preserve"> </w:t>
       </w:r>
       <w:r>
-        <w:t xml:space="preserve">(every closed defect's fix carries a §11.4.115 reproduce-first polarity test with captured defect-characterisation [STEP 1] + its</w:t>
+        <w:t xml:space="preserve">(every closed defect’s fix carries a §11.4.115 reproduce-first polarity test with captured defect-characterisation [STEP 1] + its</w:t>
       </w:r>
       <w:r>
         <w:t xml:space="preserve"> </w:t>
@@ -3304,7 +3453,19 @@
         <w:t xml:space="preserve"> </w:t>
       </w:r>
       <w:r>
-        <w:t xml:space="preserve">Verbatim operator intent: "any agent that crashed because of something MUST BE respawned and finish its work at some point! We MUST NOT lose any work, forget about or have it corrupted!" Forensic case study (FACT): dispatched subagents died on TRANSIENT causes (</w:t>
+        <w:t xml:space="preserve">Verbatim operator intent:</w:t>
+      </w:r>
+      <w:r>
+        <w:t xml:space="preserve"> </w:t>
+      </w:r>
+      <w:r>
+        <w:t xml:space="preserve">“any agent that crashed because of something MUST BE respawned and finish its work at some point! We MUST NOT lose any work, forget about or have it corrupted!”</w:t>
+      </w:r>
+      <w:r>
+        <w:t xml:space="preserve"> </w:t>
+      </w:r>
+      <w:r>
+        <w:t xml:space="preserve">Forensic case study (FACT): dispatched subagents died on TRANSIENT causes (</w:t>
       </w:r>
       <w:r>
         <w:rPr>
@@ -3331,7 +3492,19 @@
         <w:t xml:space="preserve"> </w:t>
       </w:r>
       <w:r>
-        <w:t xml:space="preserve">killed 2, one left PARTIAL edits — two source files written, the dependent SystemUI sliders + doc + test NOT done), each re-dispatched by pure conductor vigilance with NO mechanical guarantee — the moment conductor context is lost / compacted / the conductor itself crashes, an in-flight-but-dead work unit is silently dropped (lost / forgotten / corrupted). Every dispatched agent/subagent MUST be tracked through its full lifecycle so a crash NEVER loses, forgets, or corrupts its work; a crashed agent is NOT a completed agent (§11.4.6 — "it probably finished before dying" is a forbidden guess; abnormal termination is positive evidence the unit is OPEN). The mandate (ALL hold):</w:t>
+        <w:t xml:space="preserve">killed 2, one left PARTIAL edits — two source files written, the dependent SystemUI sliders + doc + test NOT done), each re-dispatched by pure conductor vigilance with NO mechanical guarantee — the moment conductor context is lost / compacted / the conductor itself crashes, an in-flight-but-dead work unit is silently dropped (lost / forgotten / corrupted). Every dispatched agent/subagent MUST be tracked through its full lifecycle so a crash NEVER loses, forgets, or corrupts its work; a crashed agent is NOT a completed agent (§11.4.6 —</w:t>
+      </w:r>
+      <w:r>
+        <w:t xml:space="preserve"> </w:t>
+      </w:r>
+      <w:r>
+        <w:t xml:space="preserve">“it probably finished before dying”</w:t>
+      </w:r>
+      <w:r>
+        <w:t xml:space="preserve"> </w:t>
+      </w:r>
+      <w:r>
+        <w:t xml:space="preserve">is a forbidden guess; abnormal termination is positive evidence the unit is OPEN). The mandate (ALL hold):</w:t>
       </w:r>
       <w:r>
         <w:t xml:space="preserve"> </w:t>
@@ -3359,7 +3532,13 @@
         <w:t xml:space="preserve">{dispatched | in-flight | crashed | respawned | complete}</w:t>
       </w:r>
       <w:r>
-        <w:t xml:space="preserve">), reusing the §11.4.116 sync substrate (JSONL event stream + atomic status snapshot; "an entry with no dispatch-event cannot show</w:t>
+        <w:t xml:space="preserve">), reusing the §11.4.116 sync substrate (JSONL event stream + atomic status snapshot;</w:t>
+      </w:r>
+      <w:r>
+        <w:t xml:space="preserve"> </w:t>
+      </w:r>
+      <w:r>
+        <w:t xml:space="preserve">“an entry with no dispatch-event cannot show</w:t>
       </w:r>
       <w:r>
         <w:t xml:space="preserve"> </w:t>
@@ -3371,7 +3550,22 @@
         <w:t xml:space="preserve">complete</w:t>
       </w:r>
       <w:r>
-        <w:t xml:space="preserve">"); the registry is the SINGLE SOURCE OF TRUTH for "is this work owed?" and an unregistered dispatch is itself a violation;</w:t>
+        <w:t xml:space="preserve">”</w:t>
+      </w:r>
+      <w:r>
+        <w:t xml:space="preserve">); the registry is the SINGLE SOURCE OF TRUTH for</w:t>
+      </w:r>
+      <w:r>
+        <w:t xml:space="preserve"> </w:t>
+      </w:r>
+      <w:r>
+        <w:t xml:space="preserve">“is this work owed?”</w:t>
+      </w:r>
+      <w:r>
+        <w:t xml:space="preserve"> </w:t>
+      </w:r>
+      <w:r>
+        <w:t xml:space="preserve">and an unregistered dispatch is itself a violation;</w:t>
       </w:r>
       <w:r>
         <w:t xml:space="preserve"> </w:t>
@@ -3387,7 +3581,7 @@
         <w:t xml:space="preserve"> </w:t>
       </w:r>
       <w:r>
-        <w:t xml:space="preserve">— any abnormal termination (transient rate-limit/socket-close, any non-completion exit, or a terminal error after the runtime's own retries are exhausted) flips the entry to</w:t>
+        <w:t xml:space="preserve">— any abnormal termination (transient rate-limit/socket-close, any non-completion exit, or a terminal error after the runtime’s own retries are exhausted) flips the entry to</w:t>
       </w:r>
       <w:r>
         <w:t xml:space="preserve"> </w:t>
@@ -3414,7 +3608,7 @@
         <w:t xml:space="preserve">complete</w:t>
       </w:r>
       <w:r>
-        <w:t xml:space="preserve">; respawn is the safe/reversible/bounded decision taken autonomously per §11.4.101 (never blocks the loop for a human), transient causes use the project's ALREADY-DEFINED backoff budgets (never invented, §11.4.6), a deterministically-reproducible non-transient terminal error is investigated per §11.4.102 before further respawn (never a blind retry loop);</w:t>
+        <w:t xml:space="preserve">; respawn is the safe/reversible/bounded decision taken autonomously per §11.4.101 (never blocks the loop for a human), transient causes use the project’s ALREADY-DEFINED backoff budgets (never invented, §11.4.6), a deterministically-reproducible non-transient terminal error is investigated per §11.4.102 before further respawn (never a blind retry loop);</w:t>
       </w:r>
       <w:r>
         <w:t xml:space="preserve"> </w:t>
@@ -3430,7 +3624,7 @@
         <w:t xml:space="preserve"> </w:t>
       </w:r>
       <w:r>
-        <w:t xml:space="preserve">— the crashed agent's uncommitted edits + output doc are PRESERVED (never silently discarded → lost, never blindly committed → corruption), the respawn runs the §11.4.84 quiescence check on the preserved tree (every modified file accounted-for vs scope, no mutation/</w:t>
+        <w:t xml:space="preserve">— the crashed agent’s uncommitted edits + output doc are PRESERVED (never silently discarded → lost, never blindly committed → corruption), the respawn runs the §11.4.84 quiescence check on the preserved tree (every modified file accounted-for vs scope, no mutation/</w:t>
       </w:r>
       <w:r>
         <w:rPr>
@@ -3476,7 +3670,35 @@
           <w:b/>
           <w:bCs/>
         </w:rPr>
-        <w:t xml:space="preserve">(d) "crash ≠ done" COMPLETION criterion</w:t>
+        <w:t xml:space="preserve">(d)</w:t>
+      </w:r>
+      <w:r>
+        <w:rPr>
+          <w:b/>
+          <w:bCs/>
+        </w:rPr>
+        <w:t xml:space="preserve"> </w:t>
+      </w:r>
+      <w:r>
+        <w:rPr>
+          <w:b/>
+          <w:bCs/>
+        </w:rPr>
+        <w:t xml:space="preserve">“crash ≠ done”</w:t>
+      </w:r>
+      <w:r>
+        <w:rPr>
+          <w:b/>
+          <w:bCs/>
+        </w:rPr>
+        <w:t xml:space="preserve"> </w:t>
+      </w:r>
+      <w:r>
+        <w:rPr>
+          <w:b/>
+          <w:bCs/>
+        </w:rPr>
+        <w:t xml:space="preserve">COMPLETION criterion</w:t>
       </w:r>
       <w:r>
         <w:t xml:space="preserve"> </w:t>
@@ -3629,7 +3851,7 @@
         <w:t xml:space="preserve"> </w:t>
       </w:r>
       <w:r>
-        <w:t xml:space="preserve">entry as the loop's done-condition</w:t>
+        <w:t xml:space="preserve">entry as the loop’s done-condition</w:t>
       </w:r>
       <w:r>
         <w:t xml:space="preserve"> </w:t>
@@ -3797,7 +4019,7 @@
         <w:t xml:space="preserve"> </w:t>
       </w:r>
       <w:r>
-        <w:t xml:space="preserve">BINDS + STRENGTHENS the workable-item discipline (§11.4.15 status / §11.4.16 type / §11.4.54 id / §11.4.21 Operator-blocked / §11.4.91 description-clarity / §11.4.93 + §11.4.95 SQLite SSoT / §11.4.106 docs_chain) into ONE integrity contract spanning DB ↔ docs ↔ external tracker, adding the operator's three emphases:</w:t>
+        <w:t xml:space="preserve">BINDS + STRENGTHENS the workable-item discipline (§11.4.15 status / §11.4.16 type / §11.4.54 id / §11.4.21 Operator-blocked / §11.4.91 description-clarity / §11.4.93 + §11.4.95 SQLite SSoT / §11.4.106 docs_chain) into ONE integrity contract spanning DB ↔ docs ↔ external tracker, adding the operator’s three emphases:</w:t>
       </w:r>
       <w:r>
         <w:t xml:space="preserve"> </w:t>
@@ -3875,10 +4097,7 @@
         <w:t xml:space="preserve"> </w:t>
       </w:r>
       <w:r>
-        <w:t xml:space="preserve">item (incl.</w:t>
-      </w:r>
-      <w:r>
-        <w:t xml:space="preserve"> </w:t>
+        <w:t xml:space="preserve">item (incl. </w:t>
       </w:r>
       <w:r>
         <w:rPr>
@@ -3920,7 +4139,7 @@
         <w:t xml:space="preserve">[A]…·[B]…·[C]…</w:t>
       </w:r>
       <w:r>
-        <w:t xml:space="preserve">, mirroring §11.4.66's 2–4-option shape); a BLOCKED item with no enumerated choices FAILs;</w:t>
+        <w:t xml:space="preserve">, mirroring §11.4.66’s 2–4-option shape); a BLOCKED item with no enumerated choices FAILs;</w:t>
       </w:r>
       <w:r>
         <w:t xml:space="preserve"> </w:t>
@@ -3979,7 +4198,7 @@
         <w:t xml:space="preserve"> </w:t>
       </w:r>
       <w:r>
-        <w:t xml:space="preserve">carries statuses (collapsed onto the tracker's native set per §11.4.33/.112 when fixed, precise value preserved in a header, never lost), types, assignee (§11.4.104 participant handle, UNSET defaults from a project env var, never hardcoded/logged §11.4.10), and sub-tasks, IDEMPOTENT (dry-run-then-real, match-by-stable-key</w:t>
+        <w:t xml:space="preserve">carries statuses (collapsed onto the tracker’s native set per §11.4.33/.112 when fixed, precise value preserved in a header, never lost), types, assignee (§11.4.104 participant handle, UNSET defaults from a project env var, never hardcoded/logged §11.4.10), and sub-tasks, IDEMPOTENT (dry-run-then-real, match-by-stable-key</w:t>
       </w:r>
       <w:r>
         <w:t xml:space="preserve"> </w:t>
@@ -4544,7 +4763,7 @@
         <w:t xml:space="preserve"> </w:t>
       </w:r>
       <w:r>
-        <w:t xml:space="preserve">external-tracker SUB-TASK model — the item task's description stays the item (§11.4.148 D2, NOT polluted with diary text), each run a CHILD sub-task (type</w:t>
+        <w:t xml:space="preserve">external-tracker SUB-TASK model — the item task’s description stays the item (§11.4.148 D2, NOT polluted with diary text), each run a CHILD sub-task (type</w:t>
       </w:r>
       <w:r>
         <w:t xml:space="preserve"> </w:t>
@@ -4602,7 +4821,7 @@
         <w:t xml:space="preserve"> </w:t>
       </w:r>
       <w:r>
-        <w:t xml:space="preserve">prose is authored by whoever ran the test; tooling only stores/renders/pushes/validates), 100% test-covered §11.4.27 (unit + integration-against-the-real-tracker with an honest §11.4.3 SKIP-when-token-absent never a faked PASS + export + HelixQA Challenge + paired §1.1 mutation) so a diary PASS-bluff is mechanically impossible. Honest boundary §11.4.6 — the diary guarantees a complete auditable per-item test-history, NOT that any single run's verdict is correct (rests on its own §11.4.69/.107/.123 evidence). Composes §11.4.6/.27/.45/.50/.55/.65/.69/.86/.93/.95/.106/.107/.123/.132/.148/.10/.13/.28/.33/.112/§1.1. Classification: universal (§11.4.17) — consumer supplies its DB path, diary doc layout, export formats, tracker sub-task field map, docs_chain context per §11.4.35. Propagation gate</w:t>
+        <w:t xml:space="preserve">prose is authored by whoever ran the test; tooling only stores/renders/pushes/validates), 100% test-covered §11.4.27 (unit + integration-against-the-real-tracker with an honest §11.4.3 SKIP-when-token-absent never a faked PASS + export + HelixQA Challenge + paired §1.1 mutation) so a diary PASS-bluff is mechanically impossible. Honest boundary §11.4.6 — the diary guarantees a complete auditable per-item test-history, NOT that any single run’s verdict is correct (rests on its own §11.4.69/.107/.123 evidence). Composes §11.4.6/.27/.45/.50/.55/.65/.69/.86/.93/.95/.106/.107/.123/.132/.148/.10/.13/.28/.33/.112/§1.1. Classification: universal (§11.4.17) — consumer supplies its DB path, diary doc layout, export formats, tracker sub-task field map, docs_chain context per §11.4.35. Propagation gate</w:t>
       </w:r>
       <w:r>
         <w:t xml:space="preserve"> </w:t>
@@ -4785,7 +5004,19 @@
         <w:t xml:space="preserve"> </w:t>
       </w:r>
       <w:r>
-        <w:t xml:space="preserve">Verbatim operator mandate: "For every single issue we fix or improvement we make — besides tight systematic-debugging, fixing, code review by independent agents, comprehensive tests — we MUST ALWAYS do deep web research from various angles! No matter how big/small/simple/complex, dig deep the internet for articles, technical documentation, APIs, open-source code — EVERYTHING that can help make the best possible solution OR confirm we don't have a more serious problem we're unaware of! We MUST do everything possible to STOP the constant issue-reopening and finally start closing items as fixed+working! Do this ALWAYS in parallel with the main work stream!" For EVERY fix / improvement / change / closure — no matter how big, small, simple, or complex — the agent MUST, IN ADDITION to tight systematic-debugging (§11.4.102), the fix, independent-agent code review (§11.4.125 / §11.4.142), and comprehensive multi-layer tests (§11.4.4(b) / §11.4.40), perform a DOCUMENTED</w:t>
+        <w:t xml:space="preserve">Verbatim operator mandate:</w:t>
+      </w:r>
+      <w:r>
+        <w:t xml:space="preserve"> </w:t>
+      </w:r>
+      <w:r>
+        <w:t xml:space="preserve">“For every single issue we fix or improvement we make — besides tight systematic-debugging, fixing, code review by independent agents, comprehensive tests — we MUST ALWAYS do deep web research from various angles! No matter how big/small/simple/complex, dig deep the internet for articles, technical documentation, APIs, open-source code — EVERYTHING that can help make the best possible solution OR confirm we don’t have a more serious problem we’re unaware of! We MUST do everything possible to STOP the constant issue-reopening and finally start closing items as fixed+working! Do this ALWAYS in parallel with the main work stream!”</w:t>
+      </w:r>
+      <w:r>
+        <w:t xml:space="preserve"> </w:t>
+      </w:r>
+      <w:r>
+        <w:t xml:space="preserve">For EVERY fix / improvement / change / closure — no matter how big, small, simple, or complex — the agent MUST, IN ADDITION to tight systematic-debugging (§11.4.102), the fix, independent-agent code review (§11.4.125 / §11.4.142), and comprehensive multi-layer tests (§11.4.4(b) / §11.4.40), perform a DOCUMENTED</w:t>
       </w:r>
       <w:r>
         <w:t xml:space="preserve"> </w:t>
@@ -4816,7 +5047,19 @@
         <w:t xml:space="preserve"> </w:t>
       </w:r>
       <w:r>
-        <w:t xml:space="preserve">(§11.4.112 secure-surface pixel-blanking) was OVERTURNED by a deep multi-angle research pass that surfaced the real OCR-of-the-PRIMARY-display path — a "we can't" became a shipped capability; the canonical anti-pattern of a structural verdict reached for want of research. The mandate (ALL hold):</w:t>
+        <w:t xml:space="preserve">(§11.4.112 secure-surface pixel-blanking) was OVERTURNED by a deep multi-angle research pass that surfaced the real OCR-of-the-PRIMARY-display path — a</w:t>
+      </w:r>
+      <w:r>
+        <w:t xml:space="preserve"> </w:t>
+      </w:r>
+      <w:r>
+        <w:t xml:space="preserve">“we can’t”</w:t>
+      </w:r>
+      <w:r>
+        <w:t xml:space="preserve"> </w:t>
+      </w:r>
+      <w:r>
+        <w:t xml:space="preserve">became a shipped capability; the canonical anti-pattern of a structural verdict reached for want of research. The mandate (ALL hold):</w:t>
       </w:r>
       <w:r>
         <w:t xml:space="preserve"> </w:t>
@@ -4880,7 +5123,7 @@
         <w:t xml:space="preserve"> </w:t>
       </w:r>
       <w:r>
-        <w:t xml:space="preserve">won't-fix (§11.4.112) until a deep multi-angle pass is documented; §11.4.150 makes §11.4.8's pass UNCONDITIONAL (every item, however trivial, at the closure AND structural-verdict gates).</w:t>
+        <w:t xml:space="preserve">won’t-fix (§11.4.112) until a deep multi-angle pass is documented; §11.4.150 makes §11.4.8’s pass UNCONDITIONAL (every item, however trivial, at the closure AND structural-verdict gates).</w:t>
       </w:r>
       <w:r>
         <w:t xml:space="preserve"> </w:t>
@@ -4912,7 +5155,19 @@
         <w:t xml:space="preserve"> </w:t>
       </w:r>
       <w:r>
-        <w:t xml:space="preserve">— explicitly seek evidence the fix does not mask a deeper defect AND the closure/verdict is genuinely safe; "we found nothing worse" requires the enumerated search (§11.4.118).</w:t>
+        <w:t xml:space="preserve">— explicitly seek evidence the fix does not mask a deeper defect AND the closure/verdict is genuinely safe;</w:t>
+      </w:r>
+      <w:r>
+        <w:t xml:space="preserve"> </w:t>
+      </w:r>
+      <w:r>
+        <w:t xml:space="preserve">“we found nothing worse”</w:t>
+      </w:r>
+      <w:r>
+        <w:t xml:space="preserve"> </w:t>
+      </w:r>
+      <w:r>
+        <w:t xml:space="preserve">requires the enumerated search (§11.4.118).</w:t>
       </w:r>
       <w:r>
         <w:t xml:space="preserve"> </w:t>
@@ -5003,7 +5258,19 @@
         <w:t xml:space="preserve"> </w:t>
       </w:r>
       <w:r>
-        <w:t xml:space="preserve">— retroactively + going forward across the §11.4.93 / §11.4.95 SSoT; items closed without a documented pass are re-audited in the §11.4.40 / §11.4.42 release-gate sweep. Honest boundary (§11.4.6): the pass reduces the unknown-unknown surface + breaks the most common reopen causes — it does NOT prove zero remaining defects (§11.4.118) and does NOT replace §11.4.108 runtime-signature verification, §11.4.125 / §11.4.142 review, or §11.4.40 retest; it is the research layer every fix/closure/structural-verdict additionally crosses, and "we probably don't have a bigger problem" without the enumerated multi-angle search is a guess (§11.4.6), never a finding. Composes §11.4.8 / §11.4.99 / §11.4.123 / §11.4.118 / §11.4.145 / §11.4.125 / §11.4.142 / §11.4.7 / §11.4.112 / §11.4.34 / §11.4.55 / §11.4.70 / §11.4.20 / §11.4.89 / §11.4.103 / §11.4.40 / §11.4.42 / §11.4.93 / §11.4.95 / §11.4.6 / §1.1. Classification: universal (§11.4.17) — the consuming project supplies its concrete research corpora, angle set, item tracker, and closure-commit-footer convention per §11.4.35. Propagation gate</w:t>
+        <w:t xml:space="preserve">— retroactively + going forward across the §11.4.93 / §11.4.95 SSoT; items closed without a documented pass are re-audited in the §11.4.40 / §11.4.42 release-gate sweep. Honest boundary (§11.4.6): the pass reduces the unknown-unknown surface + breaks the most common reopen causes — it does NOT prove zero remaining defects (§11.4.118) and does NOT replace §11.4.108 runtime-signature verification, §11.4.125 / §11.4.142 review, or §11.4.40 retest; it is the research layer every fix/closure/structural-verdict additionally crosses, and</w:t>
+      </w:r>
+      <w:r>
+        <w:t xml:space="preserve"> </w:t>
+      </w:r>
+      <w:r>
+        <w:t xml:space="preserve">“we probably don’t have a bigger problem”</w:t>
+      </w:r>
+      <w:r>
+        <w:t xml:space="preserve"> </w:t>
+      </w:r>
+      <w:r>
+        <w:t xml:space="preserve">without the enumerated multi-angle search is a guess (§11.4.6), never a finding. Composes §11.4.8 / §11.4.99 / §11.4.123 / §11.4.118 / §11.4.145 / §11.4.125 / §11.4.142 / §11.4.7 / §11.4.112 / §11.4.34 / §11.4.55 / §11.4.70 / §11.4.20 / §11.4.89 / §11.4.103 / §11.4.40 / §11.4.42 / §11.4.93 / §11.4.95 / §11.4.6 / §1.1. Classification: universal (§11.4.17) — the consuming project supplies its concrete research corpora, angle set, item tracker, and closure-commit-footer convention per §11.4.35. Propagation gate</w:t>
       </w:r>
       <w:r>
         <w:t xml:space="preserve"> </w:t>
@@ -5213,10 +5480,13 @@
         <w:t xml:space="preserve"> </w:t>
       </w:r>
       <w:r>
-        <w:t xml:space="preserve">Verbatim operator mandate: "Every release tag and version name we create — on the main repository and on every Submodule we own — MUST be prefixed with the project's release prefix, e.g.</w:t>
-      </w:r>
-      <w:r>
-        <w:t xml:space="preserve"> </w:t>
+        <w:t xml:space="preserve">Verbatim operator mandate:</w:t>
+      </w:r>
+      <w:r>
+        <w:t xml:space="preserve"> </w:t>
+      </w:r>
+      <w:r>
+        <w:t xml:space="preserve">“Every release tag and version name we create — on the main repository and on every Submodule we own — MUST be prefixed with the project’s release prefix, e.g. </w:t>
       </w:r>
       <w:r>
         <w:rPr>
@@ -5255,7 +5525,13 @@
         <w:t xml:space="preserve"> </w:t>
       </w:r>
       <w:r>
-        <w:t xml:space="preserve">if it is set, otherwise from the lowercased project root directory name. The SAME prefix MUST be used across the main repo and all owned Submodules in one release so a release is greppable across every repository." Every release tag AND every version name created on the main repository AND on every owned-by-us submodule (§11.4.28) MUST be prefixed with the project's release prefix, form</w:t>
+        <w:t xml:space="preserve">if it is set, otherwise from the lowercased project root directory name. The SAME prefix MUST be used across the main repo and all owned Submodules in one release so a release is greppable across every repository.”</w:t>
+      </w:r>
+      <w:r>
+        <w:t xml:space="preserve"> </w:t>
+      </w:r>
+      <w:r>
+        <w:t xml:space="preserve">Every release tag AND every version name created on the main repository AND on every owned-by-us submodule (§11.4.28) MUST be prefixed with the project’s release prefix, form</w:t>
       </w:r>
       <w:r>
         <w:t xml:space="preserve"> </w:t>
@@ -5328,7 +5604,7 @@
         <w:t xml:space="preserve"> </w:t>
       </w:r>
       <w:r>
-        <w:t xml:space="preserve">from the project's</w:t>
+        <w:t xml:space="preserve">from the project’s</w:t>
       </w:r>
       <w:r>
         <w:t xml:space="preserve"> </w:t>
@@ -5620,7 +5896,19 @@
         <w:t xml:space="preserve"> </w:t>
       </w:r>
       <w:r>
-        <w:t xml:space="preserve">Verbatim operator intent: "For every project that has Firebase Crashlytics enabled / wired, we MUST continuously monitor ALL of the Crashlytics-recorded data — crashes, ANRs, performance traces, and non-fatals — systematically debug each, fix and improve, and cover everything with validation and verification tests. This MUST be checked regularly, with no false results and no bluff of any kind!" Every project that has Firebase Crashlytics enabled/wired (SDK linked into a shipping artifact, crash+non-fatal+ANR reporting active) MUST treat the Crashlytics console as a first-class captured-evidence channel from real end-user devices and continuously process every datum it records — an open Crashlytics issue with a green test suite is a §11.4 PASS-bluff at the field-telemetry layer (a real user hitting a broken feature while the suite reports green). STRENGTHENS+COMPLETES §11.4.47: §11.4.47 owns the periodic REVIEW + dedup + Issue-creation pass that SURFACES Crashlytics/Analytics/Performance findings; §11.4.152 owns what happens to each surfaced item AFTER — the systematic-debug → fix/improve → regression-test-coverage lifecycle that drives it to a proven regression-immune closure (§11.4.47 finds it; §11.4.152 fixes it + proves it stays fixed; both mandatory, neither substitutes). The mandate (ALL hold): (1)</w:t>
+        <w:t xml:space="preserve">Verbatim operator intent:</w:t>
+      </w:r>
+      <w:r>
+        <w:t xml:space="preserve"> </w:t>
+      </w:r>
+      <w:r>
+        <w:t xml:space="preserve">“For every project that has Firebase Crashlytics enabled / wired, we MUST continuously monitor ALL of the Crashlytics-recorded data — crashes, ANRs, performance traces, and non-fatals — systematically debug each, fix and improve, and cover everything with validation and verification tests. This MUST be checked regularly, with no false results and no bluff of any kind!”</w:t>
+      </w:r>
+      <w:r>
+        <w:t xml:space="preserve"> </w:t>
+      </w:r>
+      <w:r>
+        <w:t xml:space="preserve">Every project that has Firebase Crashlytics enabled/wired (SDK linked into a shipping artifact, crash+non-fatal+ANR reporting active) MUST treat the Crashlytics console as a first-class captured-evidence channel from real end-user devices and continuously process every datum it records — an open Crashlytics issue with a green test suite is a §11.4 PASS-bluff at the field-telemetry layer (a real user hitting a broken feature while the suite reports green). STRENGTHENS+COMPLETES §11.4.47: §11.4.47 owns the periodic REVIEW + dedup + Issue-creation pass that SURFACES Crashlytics/Analytics/Performance findings; §11.4.152 owns what happens to each surfaced item AFTER — the systematic-debug → fix/improve → regression-test-coverage lifecycle that drives it to a proven regression-immune closure (§11.4.47 finds it; §11.4.152 fixes it + proves it stays fixed; both mandatory, neither substitutes). The mandate (ALL hold): (1)</w:t>
       </w:r>
       <w:r>
         <w:t xml:space="preserve"> </w:t>
@@ -5668,7 +5956,19 @@
         <w:t xml:space="preserve"> </w:t>
       </w:r>
       <w:r>
-        <w:t xml:space="preserve">against its proven root cause (§11.4.9/.43/.108), "acknowledged in console" is not a fix, muting a recurring issue without a tracked rationale is a §11.4.6/.90 violation; (4)</w:t>
+        <w:t xml:space="preserve">against its proven root cause (§11.4.9/.43/.108),</w:t>
+      </w:r>
+      <w:r>
+        <w:t xml:space="preserve"> </w:t>
+      </w:r>
+      <w:r>
+        <w:t xml:space="preserve">“acknowledged in console”</w:t>
+      </w:r>
+      <w:r>
+        <w:t xml:space="preserve"> </w:t>
+      </w:r>
+      <w:r>
+        <w:t xml:space="preserve">is not a fix, muting a recurring issue without a tracked rationale is a §11.4.6/.90 violation; (4)</w:t>
       </w:r>
       <w:r>
         <w:t xml:space="preserve"> </w:t>
@@ -5746,7 +6046,43 @@
         <w:t xml:space="preserve"> </w:t>
       </w:r>
       <w:r>
-        <w:t xml:space="preserve">(§11.4/.1/.6 — "no new issues" requires the enumerated monitored-surfaces+window §11.4.118; "fixed" requires the RED→GREEN flip §11.4.115/.130; a guard whose §1.1 mutation does not FAIL it is a bluff gate). Honest boundary §11.4.6: processing every recorded issue breaks the silent-recurrence vector — it does NOT prove zero remaining field defects nor replace §11.4.108/.40; an issue is "closed" only when its guard is GREEN on a clean artifact, never when the console mark is flipped. Classification: universal (§11.4.17) — the consuming project supplies its Crashlytics handle, console-access credential (§11.4.10, never logged), severity table, and per-issue closure-log path per §11.4.35; the reference project-level instantiation is a consuming project's §6.O (Crashlytics-Resolved Issue Coverage — per-issue validation test + Challenge test +</w:t>
+        <w:t xml:space="preserve">(§11.4/.1/.6 —</w:t>
+      </w:r>
+      <w:r>
+        <w:t xml:space="preserve"> </w:t>
+      </w:r>
+      <w:r>
+        <w:t xml:space="preserve">“no new issues”</w:t>
+      </w:r>
+      <w:r>
+        <w:t xml:space="preserve"> </w:t>
+      </w:r>
+      <w:r>
+        <w:t xml:space="preserve">requires the enumerated monitored-surfaces+window §11.4.118;</w:t>
+      </w:r>
+      <w:r>
+        <w:t xml:space="preserve"> </w:t>
+      </w:r>
+      <w:r>
+        <w:t xml:space="preserve">“fixed”</w:t>
+      </w:r>
+      <w:r>
+        <w:t xml:space="preserve"> </w:t>
+      </w:r>
+      <w:r>
+        <w:t xml:space="preserve">requires the RED→GREEN flip §11.4.115/.130; a guard whose §1.1 mutation does not FAIL it is a bluff gate). Honest boundary §11.4.6: processing every recorded issue breaks the silent-recurrence vector — it does NOT prove zero remaining field defects nor replace §11.4.108/.40; an issue is</w:t>
+      </w:r>
+      <w:r>
+        <w:t xml:space="preserve"> </w:t>
+      </w:r>
+      <w:r>
+        <w:t xml:space="preserve">“closed”</w:t>
+      </w:r>
+      <w:r>
+        <w:t xml:space="preserve"> </w:t>
+      </w:r>
+      <w:r>
+        <w:t xml:space="preserve">only when its guard is GREEN on a clean artifact, never when the console mark is flipped. Classification: universal (§11.4.17) — the consuming project supplies its Crashlytics handle, console-access credential (§11.4.10, never logged), severity table, and per-issue closure-log path per §11.4.35; the reference project-level instantiation is a consuming project’s §6.O (Crashlytics-Resolved Issue Coverage — per-issue validation test + Challenge test +</w:t>
       </w:r>
       <w:r>
         <w:t xml:space="preserve"> </w:t>
@@ -6044,7 +6380,19 @@
         <w:t xml:space="preserve"> </w:t>
       </w:r>
       <w:r>
-        <w:t xml:space="preserve">— every user-visible "confirmed" claim backed by a recorded real-use video of a genuine end-user scenario (real prompts → real LLM/service responses → real results), NEVER a frozen/stale frame (§11.4.107), NEVER faked/mocked/demo-loop/bluff response or LLM error passed off as success (§11.4.2/§11.4.5), stored at the project-declared recording path (§11.4.35); a confirmed row with no real video or a bluff video = §11.4 PASS-bluff; autonomous-infeasible ⇒ honest §11.4.3/§11.4.52 SKIP + tracked migration item, NEVER a faked confirmation. (4)</w:t>
+        <w:t xml:space="preserve">— every user-visible</w:t>
+      </w:r>
+      <w:r>
+        <w:t xml:space="preserve"> </w:t>
+      </w:r>
+      <w:r>
+        <w:t xml:space="preserve">“confirmed”</w:t>
+      </w:r>
+      <w:r>
+        <w:t xml:space="preserve"> </w:t>
+      </w:r>
+      <w:r>
+        <w:t xml:space="preserve">claim backed by a recorded real-use video of a genuine end-user scenario (real prompts → real LLM/service responses → real results), NEVER a frozen/stale frame (§11.4.107), NEVER faked/mocked/demo-loop/bluff response or LLM error passed off as success (§11.4.2/§11.4.5), stored at the project-declared recording path (§11.4.35); a confirmed row with no real video or a bluff video = §11.4 PASS-bluff; autonomous-infeasible ⇒ honest §11.4.3/§11.4.52 SKIP + tracked migration item, NEVER a faked confirmation. (4)</w:t>
       </w:r>
       <w:r>
         <w:t xml:space="preserve"> </w:t>
@@ -6060,7 +6408,19 @@
         <w:t xml:space="preserve"> </w:t>
       </w:r>
       <w:r>
-        <w:t xml:space="preserve">— every video analysed; any defect it surfaces triggers §11.4.102 systematic-debug → fix → §11.4.146 retest → re-record → clean GO per §11.4.134 before "confirmed" (a video exposing a broken feature is a §11.4.4 test-interrupt). (5)</w:t>
+        <w:t xml:space="preserve">— every video analysed; any defect it surfaces triggers §11.4.102 systematic-debug → fix → §11.4.146 retest → re-record → clean GO per §11.4.134 before</w:t>
+      </w:r>
+      <w:r>
+        <w:t xml:space="preserve"> </w:t>
+      </w:r>
+      <w:r>
+        <w:t xml:space="preserve">“confirmed”</w:t>
+      </w:r>
+      <w:r>
+        <w:t xml:space="preserve"> </w:t>
+      </w:r>
+      <w:r>
+        <w:t xml:space="preserve">(a video exposing a broken feature is a §11.4.4 test-interrupt). (5)</w:t>
       </w:r>
       <w:r>
         <w:t xml:space="preserve"> </w:t>
@@ -6154,7 +6514,7 @@
         <w:t xml:space="preserve"> </w:t>
       </w:r>
       <w:r>
-        <w:t xml:space="preserve">files are supplementary only. Honest boundary §11.4.6 — guarantees a complete video-confirmed always-synced ledger, NOT per-feature correctness (rests on each row's §11.4.69/.107/.123 evidence) and NOT a §11.4.40 retest substitute. Classification: universal (§11.4.17). Composes §11.4.2/.5/.44/.45/.52/.56/.57/.59/.60/.65/.86/.102/.106/.107/.108/.118/.123/.134/.146/§1.1. Propagation gate</w:t>
+        <w:t xml:space="preserve">files are supplementary only. Honest boundary §11.4.6 — guarantees a complete video-confirmed always-synced ledger, NOT per-feature correctness (rests on each row’s §11.4.69/.107/.123 evidence) and NOT a §11.4.40 retest substitute. Classification: universal (§11.4.17). Composes §11.4.2/.5/.44/.45/.52/.56/.57/.59/.60/.65/.86/.102/.106/.107/.108/.118/.123/.134/.146/§1.1. Propagation gate</w:t>
       </w:r>
       <w:r>
         <w:t xml:space="preserve"> </w:t>
@@ -6363,7 +6723,31 @@
         <w:t xml:space="preserve"> </w:t>
       </w:r>
       <w:r>
-        <w:t xml:space="preserve">Verbatim: "recording you perform does record the window containing apps and services, not the whole desktop or monitor screen!" + "All old recording files MUST BE removed when new one starts!" Refines §11.4.2/.5/.107/.153 recording discipline with two capture-hygiene invariants.</w:t>
+        <w:t xml:space="preserve">Verbatim:</w:t>
+      </w:r>
+      <w:r>
+        <w:t xml:space="preserve"> </w:t>
+      </w:r>
+      <w:r>
+        <w:t xml:space="preserve">“recording you perform does record the window containing apps and services, not the whole desktop or monitor screen!”</w:t>
+      </w:r>
+      <w:r>
+        <w:t xml:space="preserve"> </w:t>
+      </w:r>
+      <w:r>
+        <w:t xml:space="preserve">+</w:t>
+      </w:r>
+      <w:r>
+        <w:t xml:space="preserve"> </w:t>
+      </w:r>
+      <w:r>
+        <w:t xml:space="preserve">“All old recording files MUST BE removed when new one starts!”</w:t>
+      </w:r>
+      <w:r>
+        <w:t xml:space="preserve"> </w:t>
+      </w:r>
+      <w:r>
+        <w:t xml:space="preserve">Refines §11.4.2/.5/.107/.153 recording discipline with two capture-hygiene invariants.</w:t>
       </w:r>
       <w:r>
         <w:t xml:space="preserve"> </w:t>
@@ -6395,7 +6779,19 @@
         <w:t xml:space="preserve"> </w:t>
       </w:r>
       <w:r>
-        <w:t xml:space="preserve">— when a new recording run for a scope begins, the agent's OWN prior in-scope stale recordings at the raw recording path MUST be removed FIRST so the live corpus reflects the current run (§11.4.107 not-stale + §11.4.86 roster-freshness). Honest boundary (§11.4.6 + §9.2): "remove old" = the agent's own prior recordings for the SAME scope/project ONLY — NEVER another project's/scope's/operator-authored files; uncertain ⇒ surface, don't delete (§11.4.122); committed</w:t>
+        <w:t xml:space="preserve">— when a new recording run for a scope begins, the agent’s OWN prior in-scope stale recordings at the raw recording path MUST be removed FIRST so the live corpus reflects the current run (§11.4.107 not-stale + §11.4.86 roster-freshness). Honest boundary (§11.4.6 + §9.2):</w:t>
+      </w:r>
+      <w:r>
+        <w:t xml:space="preserve"> </w:t>
+      </w:r>
+      <w:r>
+        <w:t xml:space="preserve">“remove old”</w:t>
+      </w:r>
+      <w:r>
+        <w:t xml:space="preserve"> </w:t>
+      </w:r>
+      <w:r>
+        <w:t xml:space="preserve">= the agent’s own prior recordings for the SAME scope/project ONLY — NEVER another project’s/scope’s/operator-authored files; uncertain ⇒ surface, don’t delete (§11.4.122); committed</w:t>
       </w:r>
       <w:r>
         <w:t xml:space="preserve"> </w:t>
@@ -6674,7 +7070,19 @@
         <w:t xml:space="preserve"> </w:t>
       </w:r>
       <w:r>
-        <w:t xml:space="preserve">Verbatim: "All recorded videos MUST START with prefix: the PROJECT NAME (ALWAYS USE THE PROJECT NAME). Project name MUST be obtained according to the constitution's own project-name resolution." Every recorded video the project produces — every feature/QA real-use recording (§11.4.153), every window-scoped capture (§11.4.154), every always-on device recording (§11.4.128), every raw or curated artefact at the project-declared recording path (§11.4.35) + the committed</w:t>
+        <w:t xml:space="preserve">Verbatim:</w:t>
+      </w:r>
+      <w:r>
+        <w:t xml:space="preserve"> </w:t>
+      </w:r>
+      <w:r>
+        <w:t xml:space="preserve">“All recorded videos MUST START with prefix: the PROJECT NAME (ALWAYS USE THE PROJECT NAME). Project name MUST be obtained according to the constitution’s own project-name resolution.”</w:t>
+      </w:r>
+      <w:r>
+        <w:t xml:space="preserve"> </w:t>
+      </w:r>
+      <w:r>
+        <w:t xml:space="preserve">Every recorded video the project produces — every feature/QA real-use recording (§11.4.153), every window-scoped capture (§11.4.154), every always-on device recording (§11.4.128), every raw or curated artefact at the project-declared recording path (§11.4.35) + the committed</w:t>
       </w:r>
       <w:r>
         <w:t xml:space="preserve"> </w:t>
@@ -6792,7 +7200,7 @@
         <w:t xml:space="preserve"> </w:t>
       </w:r>
       <w:r>
-        <w:t xml:space="preserve">delimits the prefix unambiguously); MUST equal the §11.4.151-resolved release-tag prefix (divergence is itself a §11.4.155 violation — one project, one name). Honest boundary (§11.4.6): the prefix guarantees attribution + greppability, NOT content validity (still §11.4.107/.137/.153) and does NOT relax §11.4.154's window-scope/rotation (rotation removes the agent's OWN</w:t>
+        <w:t xml:space="preserve">delimits the prefix unambiguously); MUST equal the §11.4.151-resolved release-tag prefix (divergence is itself a §11.4.155 violation — one project, one name). Honest boundary (§11.4.6): the prefix guarantees attribution + greppability, NOT content validity (still §11.4.107/.137/.153) and does NOT relax §11.4.154’s window-scope/rotation (rotation removes the agent’s OWN</w:t>
       </w:r>
       <w:r>
         <w:t xml:space="preserve"> </w:t>
@@ -6965,7 +7373,19 @@
         <w:t xml:space="preserve"> </w:t>
       </w:r>
       <w:r>
-        <w:t xml:space="preserve">Verbatim operator mandate: "Any GitHub actions or GitLab pipelines MUST BE disabled! Add this critical mandatory rule / mandatory constraint into the root constitution Submodule, commit and fetch all its changes to all upstreams and make sure we respect and follow this rule (we do apply it) ASAP!!!" Every repository this Constitution governs — main repo, this constitution submodule, every owned + nested submodule we author and push — MUST ship with ALL server-side CI/CD automation DISABLED: no push to any owned upstream may trigger a GitHub Actions run, GitLab pipeline, or equivalent (Jenkins/CircleCI/Travis/Drone/Woodpecker/Bitbucket/Azure, any</w:t>
+        <w:t xml:space="preserve">Verbatim operator mandate:</w:t>
+      </w:r>
+      <w:r>
+        <w:t xml:space="preserve"> </w:t>
+      </w:r>
+      <w:r>
+        <w:t xml:space="preserve">“Any GitHub actions or GitLab pipelines MUST BE disabled! Add this critical mandatory rule / mandatory constraint into the root constitution Submodule, commit and fetch all its changes to all upstreams and make sure we respect and follow this rule (we do apply it) ASAP!!!”</w:t>
+      </w:r>
+      <w:r>
+        <w:t xml:space="preserve"> </w:t>
+      </w:r>
+      <w:r>
+        <w:t xml:space="preserve">Every repository this Constitution governs — main repo, this constitution submodule, every owned + nested submodule we author and push — MUST ship with ALL server-side CI/CD automation DISABLED: no push to any owned upstream may trigger a GitHub Actions run, GitLab pipeline, or equivalent (Jenkins/CircleCI/Travis/Drone/Woodpecker/Bitbucket/Azure, any</w:t>
       </w:r>
       <w:r>
         <w:t xml:space="preserve"> </w:t>
@@ -7099,7 +7519,13 @@
         <w:t xml:space="preserve"> </w:t>
       </w:r>
       <w:r>
-        <w:t xml:space="preserve">"disabled" = a push triggers ZERO runs — delete OR rename to a non-trigger name (§11.4.75</w:t>
+        <w:t xml:space="preserve">“disabled”</w:t>
+      </w:r>
+      <w:r>
+        <w:t xml:space="preserve"> </w:t>
+      </w:r>
+      <w:r>
+        <w:t xml:space="preserve">= a push triggers ZERO runs — delete OR rename to a non-trigger name (§11.4.75</w:t>
       </w:r>
       <w:r>
         <w:t xml:space="preserve"> </w:t>
@@ -7181,7 +7607,19 @@
         <w:t xml:space="preserve">prebuilts/**</w:t>
       </w:r>
       <w:r>
-        <w:t xml:space="preserve">, vendored submodules) are INERT (a provider never runs a non-root config), OUT of scope, MUST NOT be mass-edited (§11.4.29 vendor-exempt); test = "does a push to OUR upstream trigger a run?" yes⇒disable, inert⇒document+leave (§11.4.6 verify-not-assume);</w:t>
+        <w:t xml:space="preserve">, vendored submodules) are INERT (a provider never runs a non-root config), OUT of scope, MUST NOT be mass-edited (§11.4.29 vendor-exempt); test =</w:t>
+      </w:r>
+      <w:r>
+        <w:t xml:space="preserve"> </w:t>
+      </w:r>
+      <w:r>
+        <w:t xml:space="preserve">“does a push to OUR upstream trigger a run?”</w:t>
+      </w:r>
+      <w:r>
+        <w:t xml:space="preserve"> </w:t>
+      </w:r>
+      <w:r>
+        <w:t xml:space="preserve">yes⇒disable, inert⇒document+leave (§11.4.6 verify-not-assume);</w:t>
       </w:r>
       <w:r>
         <w:t xml:space="preserve"> </w:t>
@@ -7414,7 +7852,19 @@
         <w:t xml:space="preserve"> </w:t>
       </w:r>
       <w:r>
-        <w:t xml:space="preserve">Verbatim operator mandate: "Make sure with CLAUDE.md, AGENTS.md, QWEN.md we maintain GEMINI.md too! Add this mandatory fact / rule to root constitution Submodule we are inheriting / extending - CONSITUTION.md, CLAUDE.md, QWEN.md, AGENTS.md, GEMINI.md and other related relevant files!" Forensic FACT (2026-06-15): when §11.4.156/§11.4.157 were authored, Constitution/CLAUDE/AGENTS/QWEN carried the family through §11.4.155 but GEMINI.md had silently drifted to §11.4.141 — 14 mandates (§11.4.142–155) never propagated — a §11.4 propagation-bluff (a Gemini-CLI agent reads a stale Constitution). GEMINI.md is a FIRST-CLASS governance context carrier EQUAL to CLAUDE.md/AGENTS.md/QWEN.md, never optional/best-effort. ALL hold:</w:t>
+        <w:t xml:space="preserve">Verbatim operator mandate:</w:t>
+      </w:r>
+      <w:r>
+        <w:t xml:space="preserve"> </w:t>
+      </w:r>
+      <w:r>
+        <w:t xml:space="preserve">“Make sure with CLAUDE.md, AGENTS.md, QWEN.md we maintain GEMINI.md too! Add this mandatory fact / rule to root constitution Submodule we are inheriting / extending - CONSITUTION.md, CLAUDE.md, QWEN.md, AGENTS.md, GEMINI.md and other related relevant files!”</w:t>
+      </w:r>
+      <w:r>
+        <w:t xml:space="preserve"> </w:t>
+      </w:r>
+      <w:r>
+        <w:t xml:space="preserve">Forensic FACT (2026-06-15): when §11.4.156/§11.4.157 were authored, Constitution/CLAUDE/AGENTS/QWEN carried the family through §11.4.155 but GEMINI.md had silently drifted to §11.4.141 — 14 mandates (§11.4.142–155) never propagated — a §11.4 propagation-bluff (a Gemini-CLI agent reads a stale Constitution). GEMINI.md is a FIRST-CLASS governance context carrier EQUAL to CLAUDE.md/AGENTS.md/QWEN.md, never optional/best-effort. ALL hold:</w:t>
       </w:r>
       <w:r>
         <w:t xml:space="preserve"> </w:t>
@@ -7446,7 +7896,7 @@
         <w:t xml:space="preserve"> </w:t>
       </w:r>
       <w:r>
-        <w:t xml:space="preserve">no silent drift — GEMINI.md lagging the other mirrors' highest rule is a §11.4.157 violation (§11.4.65-class), back-fill required;</w:t>
+        <w:t xml:space="preserve">no silent drift — GEMINI.md lagging the other mirrors’ highest rule is a §11.4.157 violation (§11.4.65-class), back-fill required;</w:t>
       </w:r>
       <w:r>
         <w:t xml:space="preserve"> </w:t>
@@ -7493,7 +7943,19 @@
         <w:t xml:space="preserve"> </w:t>
       </w:r>
       <w:r>
-        <w:t xml:space="preserve">consumer projects' own CLAUDE/AGENTS/QWEN/GEMINI bind too (§11.4.35). Honest boundary (§11.4.6): the §11.4.142–155 GEMINI.md back-fill is a tracked release-blocking remediation; claiming GEMINI.md "in sync" while the back-fill is incomplete is itself a §11.4.157 violation. Composes §11.4.26/.35/.17/.44/.65/.140/.156/§1.1. Classification: universal (§11.4.17). Propagation gate</w:t>
+        <w:t xml:space="preserve">consumer projects’ own CLAUDE/AGENTS/QWEN/GEMINI bind too (§11.4.35). Honest boundary (§11.4.6): the §11.4.142–155 GEMINI.md back-fill is a tracked release-blocking remediation; claiming GEMINI.md</w:t>
+      </w:r>
+      <w:r>
+        <w:t xml:space="preserve"> </w:t>
+      </w:r>
+      <w:r>
+        <w:t xml:space="preserve">“in sync”</w:t>
+      </w:r>
+      <w:r>
+        <w:t xml:space="preserve"> </w:t>
+      </w:r>
+      <w:r>
+        <w:t xml:space="preserve">while the back-fill is incomplete is itself a §11.4.157 violation. Composes §11.4.26/.35/.17/.44/.65/.140/.156/§1.1. Classification: universal (§11.4.17). Propagation gate</w:t>
       </w:r>
       <w:r>
         <w:t xml:space="preserve"> </w:t>
@@ -7637,7 +8099,31 @@
         <w:t xml:space="preserve"> </w:t>
       </w:r>
       <w:r>
-        <w:t xml:space="preserve">Every project MUST be covered by intensive automated testing that exercises + RECORDS every feature/flow/use-case/edge-case (valid/invalid/boundary/concurrent/failure-injection §11.4.85), each recording showing the feature GENUINELY WORKING with REAL results (real prompts→real responses→real outputs §11.4.153) and NO false/simulated/stale/frozen result (§11.4.2/.5/.107) — a recording showing an error/bluff/non-working feature is a FINDING (→§11.4.153(4)/§11.4.4 fix→retest→re-record), never a confirmation. The testing System MUST ACTUALLY READ every shown log line / message / UI label / dialog / toast / status text and VERIFY it is a genuine working result (OCR/ROI §11.4.117/.137 + confidence floor for pixel surfaces; direct capture for terminal/log; §11.4.107(10) self-validated golden-good/golden-bad analyzer) — "a video was produced" is NOT evidence, "the System read the screen + confirmed a genuine result" is. HelixQA (§11.4.27) MUST drive this exercise→record→read→score pass, PASS only on a read-confirmed genuine result + captured artefact path (§11.4.69). Default recording save path =</w:t>
+        <w:t xml:space="preserve">Every project MUST be covered by intensive automated testing that exercises + RECORDS every feature/flow/use-case/edge-case (valid/invalid/boundary/concurrent/failure-injection §11.4.85), each recording showing the feature GENUINELY WORKING with REAL results (real prompts→real responses→real outputs §11.4.153) and NO false/simulated/stale/frozen result (§11.4.2/.5/.107) — a recording showing an error/bluff/non-working feature is a FINDING (→§11.4.153(4)/§11.4.4 fix→retest→re-record), never a confirmation. The testing System MUST ACTUALLY READ every shown log line / message / UI label / dialog / toast / status text and VERIFY it is a genuine working result (OCR/ROI §11.4.117/.137 + confidence floor for pixel surfaces; direct capture for terminal/log; §11.4.107(10) self-validated golden-good/golden-bad analyzer) —</w:t>
+      </w:r>
+      <w:r>
+        <w:t xml:space="preserve"> </w:t>
+      </w:r>
+      <w:r>
+        <w:t xml:space="preserve">“a video was produced”</w:t>
+      </w:r>
+      <w:r>
+        <w:t xml:space="preserve"> </w:t>
+      </w:r>
+      <w:r>
+        <w:t xml:space="preserve">is NOT evidence,</w:t>
+      </w:r>
+      <w:r>
+        <w:t xml:space="preserve"> </w:t>
+      </w:r>
+      <w:r>
+        <w:t xml:space="preserve">“the System read the screen + confirmed a genuine result”</w:t>
+      </w:r>
+      <w:r>
+        <w:t xml:space="preserve"> </w:t>
+      </w:r>
+      <w:r>
+        <w:t xml:space="preserve">is. HelixQA (§11.4.27) MUST drive this exercise→record→read→score pass, PASS only on a read-confirmed genuine result + captured artefact path (§11.4.69). Default recording save path =</w:t>
       </w:r>
       <w:r>
         <w:t xml:space="preserve"> </w:t>
@@ -7652,7 +8138,7 @@
         <w:t xml:space="preserve"> </w:t>
       </w:r>
       <w:r>
-        <w:t xml:space="preserve">(host user's home Downloads, resolved at runtime never hardcoded) unless a project declares an override per §11.4.35; §11.4.155 project-prefix + §11.4.154 window-scope/rotation + §11.4.128 git-ignored raw corpus + §11.4.83 curated docs/qa evidence apply.</w:t>
+        <w:t xml:space="preserve">(host user’s home Downloads, resolved at runtime never hardcoded) unless a project declares an override per §11.4.35; §11.4.155 project-prefix + §11.4.154 window-scope/rotation + §11.4.128 git-ignored raw corpus + §11.4.83 curated docs/qa evidence apply.</w:t>
       </w:r>
       <w:r>
         <w:t xml:space="preserve"> </w:t>
@@ -8068,7 +8554,43 @@
         <w:t xml:space="preserve"> </w:t>
       </w:r>
       <w:r>
-        <w:t xml:space="preserve">— after EVERY recording, the agent MUST read the terminal output / video content and verify: (i) feature ACTUALLY WORKS, (ii) LLM responses are REAL, (iii) all tests show PASS, (iv) no "TODO implement" / "simulate" / "for now" patterns, (v) output demonstrates end-user working feature; MUST produce a verdict (PASS/FAIL) with evidence path (§11.4.69).</w:t>
+        <w:t xml:space="preserve">— after EVERY recording, the agent MUST read the terminal output / video content and verify: (i) feature ACTUALLY WORKS, (ii) LLM responses are REAL, (iii) all tests show PASS, (iv) no</w:t>
+      </w:r>
+      <w:r>
+        <w:t xml:space="preserve"> </w:t>
+      </w:r>
+      <w:r>
+        <w:t xml:space="preserve">“TODO implement”</w:t>
+      </w:r>
+      <w:r>
+        <w:t xml:space="preserve"> </w:t>
+      </w:r>
+      <w:r>
+        <w:t xml:space="preserve">/</w:t>
+      </w:r>
+      <w:r>
+        <w:t xml:space="preserve"> </w:t>
+      </w:r>
+      <w:r>
+        <w:t xml:space="preserve">“simulate”</w:t>
+      </w:r>
+      <w:r>
+        <w:t xml:space="preserve"> </w:t>
+      </w:r>
+      <w:r>
+        <w:t xml:space="preserve">/</w:t>
+      </w:r>
+      <w:r>
+        <w:t xml:space="preserve"> </w:t>
+      </w:r>
+      <w:r>
+        <w:t xml:space="preserve">“for now”</w:t>
+      </w:r>
+      <w:r>
+        <w:t xml:space="preserve"> </w:t>
+      </w:r>
+      <w:r>
+        <w:t xml:space="preserve">patterns, (v) output demonstrates end-user working feature; MUST produce a verdict (PASS/FAIL) with evidence path (§11.4.69).</w:t>
       </w:r>
       <w:r>
         <w:t xml:space="preserve"> </w:t>
@@ -8153,7 +8675,7 @@
         <w:t xml:space="preserve"> </w:t>
       </w:r>
       <w:r>
-        <w:t xml:space="preserve">— remove agent's own prior in-scope stale recordings FIRST (§11.4.154).</w:t>
+        <w:t xml:space="preserve">— remove agent’s own prior in-scope stale recordings FIRST (§11.4.154).</w:t>
       </w:r>
       <w:r>
         <w:t xml:space="preserve"> </w:t>
@@ -8169,7 +8691,28 @@
         <w:t xml:space="preserve"> </w:t>
       </w:r>
       <w:r>
-        <w:t xml:space="preserve">— the value of a recording is NOT its duration but its CONTENT; a recording MUST demonstrate the ACTUAL feature being used with REAL results; before accepting ANY recording, the agent MUST verify: expected output patterns ARE present (e.g., test PASS lines, API response data, feature-specific output), the feature ACTUALLY WORKS as demonstrated (not just "something ran"), LLM responses are REAL content (not simulated, not placeholder, not empty), every claim of "working" is backed by visible evidence; a 5-second recording showing a feature working correctly is MORE valuable than a 60-second recording of empty terminal; duration is NOT a proxy for quality.</w:t>
+        <w:t xml:space="preserve">— the value of a recording is NOT its duration but its CONTENT; a recording MUST demonstrate the ACTUAL feature being used with REAL results; before accepting ANY recording, the agent MUST verify: expected output patterns ARE present (e.g., test PASS lines, API response data, feature-specific output), the feature ACTUALLY WORKS as demonstrated (not just</w:t>
+      </w:r>
+      <w:r>
+        <w:t xml:space="preserve"> </w:t>
+      </w:r>
+      <w:r>
+        <w:t xml:space="preserve">“something ran”</w:t>
+      </w:r>
+      <w:r>
+        <w:t xml:space="preserve">), LLM responses are REAL content (not simulated, not placeholder, not empty), every claim of</w:t>
+      </w:r>
+      <w:r>
+        <w:t xml:space="preserve"> </w:t>
+      </w:r>
+      <w:r>
+        <w:t xml:space="preserve">“working”</w:t>
+      </w:r>
+      <w:r>
+        <w:t xml:space="preserve"> </w:t>
+      </w:r>
+      <w:r>
+        <w:t xml:space="preserve">is backed by visible evidence; a 5-second recording showing a feature working correctly is MORE valuable than a 60-second recording of empty terminal; duration is NOT a proxy for quality.</w:t>
       </w:r>
       <w:r>
         <w:t xml:space="preserve"> </w:t>
@@ -8401,7 +8944,7 @@
         <w:t xml:space="preserve"> </w:t>
       </w:r>
       <w:r>
-        <w:t xml:space="preserve">Compact summary: every video recording for feature/QA evidence MUST be processed through a vision/OCR pipeline that reads on-screen content and confirms expected results BEFORE acceptance; the recording system MUST provide a bridge feeding captured frames to HelixQA's test infrastructure (or equivalent) for automated read-the-screen verification against SPECIFY-phase expected patterns (§11.4.159(J)); capture frames at ≤5s intervals, run OCR/vision with self-validated analyzer (§11.4.107(10)), compare text against patterns, produce per-frame PASS/FAIL with evidence path, surface failures immediately for re-record (§11.4.159(L)). Project-configured parameters per §11.4.35. Honest boundary: does NOT replace §11.4.5 quality analysis nor §11.4.108 runtime-signature; FLAG_SECURE uses §11.4.117 proxy oracle. Classification: universal (§11.4.17). Propagation gate</w:t>
+        <w:t xml:space="preserve">Compact summary: every video recording for feature/QA evidence MUST be processed through a vision/OCR pipeline that reads on-screen content and confirms expected results BEFORE acceptance; the recording system MUST provide a bridge feeding captured frames to HelixQA’s test infrastructure (or equivalent) for automated read-the-screen verification against SPECIFY-phase expected patterns (§11.4.159(J)); capture frames at ≤5s intervals, run OCR/vision with self-validated analyzer (§11.4.107(10)), compare text against patterns, produce per-frame PASS/FAIL with evidence path, surface failures immediately for re-record (§11.4.159(L)). Project-configured parameters per §11.4.35. Honest boundary: does NOT replace §11.4.5 quality analysis nor §11.4.108 runtime-signature; FLAG_SECURE uses §11.4.117 proxy oracle. Classification: universal (§11.4.17). Propagation gate</w:t>
       </w:r>
       <w:r>
         <w:t xml:space="preserve"> </w:t>
@@ -8542,18 +9085,7 @@
         <w:t xml:space="preserve"> </w:t>
       </w:r>
       <w:r>
-        <w:t xml:space="preserve">Compact summary: every project with user-facing interfaces MUST use OpenDesign (</w:t>
-      </w:r>
-      <w:hyperlink r:id="rId13">
-        <w:r>
-          <w:rPr>
-            <w:rStyle w:val="Hyperlink"/>
-          </w:rPr>
-          <w:t xml:space="preserve">https://github.com/nexu-io/open-design</w:t>
-        </w:r>
-      </w:hyperlink>
-      <w:r>
-        <w:t xml:space="preserve">) as mandatory UI design system — NOT ad-hoc CSS; install as dependency, use token system for all color (light+dark from brand assets), typography, spacing, component tokens; extend upstream (§11.4.74) for unsupported patterns; every UI component ships light+dark + token-diff regression tests via visual regression; no element overlap/font collision/label overlay. Honest boundary: does NOT replace §11.4.27 functional testing nor §11.4.48/.49 UI testing. Classification: universal (§11.4.17). Propagation gate</w:t>
+        <w:t xml:space="preserve">Compact summary: every project with user-facing interfaces MUST use OpenDesign (https://github.com/nexu-io/open-design) as mandatory UI design system — NOT ad-hoc CSS; install as dependency, use token system for all color (light+dark from brand assets), typography, spacing, component tokens; extend upstream (§11.4.74) for unsupported patterns; every UI component ships light+dark + token-diff regression tests via visual regression; no element overlap/font collision/label overlay. Honest boundary: does NOT replace §11.4.27 functional testing nor §11.4.48/.49 UI testing. Classification: universal (§11.4.17). Propagation gate</w:t>
       </w:r>
       <w:r>
         <w:t xml:space="preserve"> </w:t>
@@ -8895,7 +9427,7 @@
         <w:t xml:space="preserve"> </w:t>
       </w:r>
       <w:r>
-        <w:t xml:space="preserve">GC'd (§11.4.77). (G) every change crosses full gauntlet (§11.4.142/.125/.134/.145 + anti-bluff). (H) stream registry (§11.4.116/.147) + atomic</w:t>
+        <w:t xml:space="preserve">GC’d (§11.4.77). (G) every change crosses full gauntlet (§11.4.142/.125/.134/.145 + anti-bluff). (H) stream registry (§11.4.116/.147) + atomic</w:t>
       </w:r>
       <w:r>
         <w:t xml:space="preserve"> </w:t>
@@ -9139,7 +9671,19 @@
         <w:t xml:space="preserve"> </w:t>
       </w:r>
       <w:r>
-        <w:t xml:space="preserve">MUST FAIL); iterate to clean GO §11.4.134. Forensic FACT (2026-06-23): a "green" Mermaid fix shipped raw gantt source as readable text into user PDFs because validation grepped HTML for</w:t>
+        <w:t xml:space="preserve">MUST FAIL); iterate to clean GO §11.4.134. Forensic FACT (2026-06-23): a</w:t>
+      </w:r>
+      <w:r>
+        <w:t xml:space="preserve"> </w:t>
+      </w:r>
+      <w:r>
+        <w:t xml:space="preserve">“green”</w:t>
+      </w:r>
+      <w:r>
+        <w:t xml:space="preserve"> </w:t>
+      </w:r>
+      <w:r>
+        <w:t xml:space="preserve">Mermaid fix shipped raw gantt source as readable text into user PDFs because validation grepped HTML for</w:t>
       </w:r>
       <w:r>
         <w:t xml:space="preserve"> </w:t>
@@ -9336,7 +9880,43 @@
         <w:t xml:space="preserve"> </w:t>
       </w:r>
       <w:r>
-        <w:t xml:space="preserve">Compact summary: every change to ANY user-facing UI surface (screen/component/view/widget/layout/theme on any platform — Android-Compose, iOS-SwiftUI/UIKit, web, desktop, TUI) MUST be proven by DEVICE-INDEPENDENT host-side RENDERED PIXELS before it may be claimed correct — the real component rendered to a PNG ON THE HOST (NO device, NO emulator, NO running app) via a host-render harness (Compose→Roborazzi/Paparazzi on the JVM; web→Playwright/Storybook snapshot; SwiftUI→snapshot-testing; equivalent per stack), for EVERY relevant screen×state×{light,dark} theme, with the PNG validated by BOTH (i) golden image-diff (per-pixel/perceptual PASS/FAIL) AND (ii) an OCR/vision oracle reading rendered text+labels+control bounds to assert legibility + NO overlap / NO label-over-label / NO clipping / NO off-screen control / NO collapsed-or-giant-unbounded widget (the §11.4.162 layout invariants PROVEN on real pixels). Forensic FACT (2026-06-25): UI work was "validated" by VALUE-EQUALITY unit tests (a hex colour string / an sp/dp size integer / a design-token field == a constant) that NEVER RENDERED A PIXEL — GREEN while the operator opened a broken unbounded giant-button screen. A value/token-equality / property-assertion UI test is FORBIDDEN as the PROOF a UI is correct (it may SUPPLEMENT, NEVER SUBSTITUTE the rendered-pixel proof); a "green" UI suite with no rendered-pixel artefact for the changed surface is a §11.4 PASS-bluff at the visual layer. Self-validated golden-good/golden-bad analyzer §11.4.107(10), thresholds calibrated on the project's own fixtures §11.4.6. "device offline" is NEVER a valid skip — host-render IS the device-independent path; honest §11.4.3 SKIP only where the platform genuinely has no host-render harness (tracked migration item, never a value-only fallback). Honest boundary §11.4.6: host-render proves the COMPONENT renders correctly device-independently per commit — it does NOT prove the running app on real hardware (that remains §11.4.153/.158/.159/.160's live-device recording + read-the-screen layer, which §11.4.170 COMPLEMENTS not replaces — both mandatory), does NOT replace §11.4.162 OpenDesign token/theme governance (§11.4.170 PROVES the rendered RESULT of those tokens), DISTINCT from §11.4.168 exported-document visual validation. Classification: universal (§11.4.17). Composes §11.4.3/.5/.27/.40/.69/.107/.108/.117/.153/.158/.159/.160/.162/.163/.168/.169/§1.1. Propagation gate</w:t>
+        <w:t xml:space="preserve">Compact summary: every change to ANY user-facing UI surface (screen/component/view/widget/layout/theme on any platform — Android-Compose, iOS-SwiftUI/UIKit, web, desktop, TUI) MUST be proven by DEVICE-INDEPENDENT host-side RENDERED PIXELS before it may be claimed correct — the real component rendered to a PNG ON THE HOST (NO device, NO emulator, NO running app) via a host-render harness (Compose→Roborazzi/Paparazzi on the JVM; web→Playwright/Storybook snapshot; SwiftUI→snapshot-testing; equivalent per stack), for EVERY relevant screen×state×{light,dark} theme, with the PNG validated by BOTH (i) golden image-diff (per-pixel/perceptual PASS/FAIL) AND (ii) an OCR/vision oracle reading rendered text+labels+control bounds to assert legibility + NO overlap / NO label-over-label / NO clipping / NO off-screen control / NO collapsed-or-giant-unbounded widget (the §11.4.162 layout invariants PROVEN on real pixels). Forensic FACT (2026-06-25): UI work was</w:t>
+      </w:r>
+      <w:r>
+        <w:t xml:space="preserve"> </w:t>
+      </w:r>
+      <w:r>
+        <w:t xml:space="preserve">“validated”</w:t>
+      </w:r>
+      <w:r>
+        <w:t xml:space="preserve"> </w:t>
+      </w:r>
+      <w:r>
+        <w:t xml:space="preserve">by VALUE-EQUALITY unit tests (a hex colour string / an sp/dp size integer / a design-token field == a constant) that NEVER RENDERED A PIXEL — GREEN while the operator opened a broken unbounded giant-button screen. A value/token-equality / property-assertion UI test is FORBIDDEN as the PROOF a UI is correct (it may SUPPLEMENT, NEVER SUBSTITUTE the rendered-pixel proof); a</w:t>
+      </w:r>
+      <w:r>
+        <w:t xml:space="preserve"> </w:t>
+      </w:r>
+      <w:r>
+        <w:t xml:space="preserve">“green”</w:t>
+      </w:r>
+      <w:r>
+        <w:t xml:space="preserve"> </w:t>
+      </w:r>
+      <w:r>
+        <w:t xml:space="preserve">UI suite with no rendered-pixel artefact for the changed surface is a §11.4 PASS-bluff at the visual layer. Self-validated golden-good/golden-bad analyzer §11.4.107(10), thresholds calibrated on the project’s own fixtures §11.4.6.</w:t>
+      </w:r>
+      <w:r>
+        <w:t xml:space="preserve"> </w:t>
+      </w:r>
+      <w:r>
+        <w:t xml:space="preserve">“device offline”</w:t>
+      </w:r>
+      <w:r>
+        <w:t xml:space="preserve"> </w:t>
+      </w:r>
+      <w:r>
+        <w:t xml:space="preserve">is NEVER a valid skip — host-render IS the device-independent path; honest §11.4.3 SKIP only where the platform genuinely has no host-render harness (tracked migration item, never a value-only fallback). Honest boundary §11.4.6: host-render proves the COMPONENT renders correctly device-independently per commit — it does NOT prove the running app on real hardware (that remains §11.4.153/.158/.159/.160’s live-device recording + read-the-screen layer, which §11.4.170 COMPLEMENTS not replaces — both mandatory), does NOT replace §11.4.162 OpenDesign token/theme governance (§11.4.170 PROVES the rendered RESULT of those tokens), DISTINCT from §11.4.168 exported-document visual validation. Classification: universal (§11.4.17). Composes §11.4.3/.5/.27/.40/.69/.107/.108/.117/.153/.158/.159/.160/.162/.163/.168/.169/§1.1. Propagation gate</w:t>
       </w:r>
       <w:r>
         <w:t xml:space="preserve"> </w:t>
@@ -9501,8 +10081,8 @@
         <w:t xml:space="preserve">flag.</w:t>
       </w:r>
     </w:p>
-    <w:bookmarkEnd w:id="14"/>
-    <w:bookmarkStart w:id="15" w:name="when-in-doubt"/>
+    <w:bookmarkEnd w:id="13"/>
+    <w:bookmarkStart w:id="14" w:name="when-in-doubt"/>
     <w:p>
       <w:pPr>
         <w:pStyle w:val="Heading2"/>
@@ -9622,7 +10202,7 @@
         <w:t xml:space="preserve"> </w:t>
       </w:r>
       <w:r>
-        <w:t xml:space="preserve">Every workable item (ATM-NNN ticket) in the project's workable-items database, Issues.md, Fixed.md, Issues_Summary.md, Fixed_Summary.md, and ALL derived documents MUST carry a comprehensive human-readable description that explains the item in plain, non-technical language suitable for non-developers (project managers, stakeholders, team leads, business partners). The description MUST be 5-7 sentences minimum, written so that ANY person — regardless of technical background — can understand: (a) WHAT the item is (the feature, fix, or task in simple terms); (b) WHY it matters (the user/business value); (c) HOW it works (the mechanism, without code references); (d) WHO benefits (the end user or stakeholder); (e) WHAT the expected outcome is (the measurable result). The description is MANDATORY — an item without a human-readable description is a §11.4 violation at the documentation layer. Descriptions MUST NOT use jargon, acronyms without expansion, code references, or technical implementation details as the primary explanation. Technical details MAY appear as supplementary context AFTER the plain-language explanation. The</w:t>
+        <w:t xml:space="preserve">Every workable item (ATM-NNN ticket) in the project’s workable-items database, Issues.md, Fixed.md, Issues_Summary.md, Fixed_Summary.md, and ALL derived documents MUST carry a comprehensive human-readable description that explains the item in plain, non-technical language suitable for non-developers (project managers, stakeholders, team leads, business partners). The description MUST be 5-7 sentences minimum, written so that ANY person — regardless of technical background — can understand: (a) WHAT the item is (the feature, fix, or task in simple terms); (b) WHY it matters (the user/business value); (c) HOW it works (the mechanism, without code references); (d) WHO benefits (the end user or stakeholder); (e) WHAT the expected outcome is (the measurable result). The description is MANDATORY — an item without a human-readable description is a §11.4 violation at the documentation layer. Descriptions MUST NOT use jargon, acronyms without expansion, code references, or technical implementation details as the primary explanation. Technical details MAY appear as supplementary context AFTER the plain-language explanation. The</w:t>
       </w:r>
       <w:r>
         <w:t xml:space="preserve"> </w:t>
@@ -9766,8 +10346,182 @@
         <w:t xml:space="preserve">) + paired §1.1 mutation.</w:t>
       </w:r>
     </w:p>
+    <w:p>
+      <w:pPr>
+        <w:pStyle w:val="BodyText"/>
+      </w:pPr>
+      <w:r>
+        <w:rPr>
+          <w:b/>
+          <w:bCs/>
+        </w:rPr>
+        <w:t xml:space="preserve">§11.4.173 — Shared-host process-ownership verification mandate (User mandate, 2026-06-29).</w:t>
+      </w:r>
+      <w:r>
+        <w:t xml:space="preserve"> </w:t>
+      </w:r>
+      <w:r>
+        <w:t xml:space="preserve">On any shared host where other projects/users/agents may run concurrently, every inspection of or action on a process, build, daemon, port, lock, or system-state signal MUST first positively VERIFY the target is OURS before diagnosing or acting. Attribute a process to us ONLY by a strong discriminator — cwd inside this project’s tree, argv naming our scripts/artifacts/repo path, a PID we launched + recorded (§11.4.147), or a lock/port path under our tree — NEVER a loose</w:t>
+      </w:r>
+      <w:r>
+        <w:t xml:space="preserve"> </w:t>
+      </w:r>
+      <w:r>
+        <w:rPr>
+          <w:rStyle w:val="VerbatimChar"/>
+        </w:rPr>
+        <w:t xml:space="preserve">pgrep java/gradle/node</w:t>
+      </w:r>
+      <w:r>
+        <w:t xml:space="preserve"> </w:t>
+      </w:r>
+      <w:r>
+        <w:t xml:space="preserve">name match (it matches every project on the host). NEVER kill/signal/restart a process not positively ours (other projects’ gradle/java/podman/zig are off-limits — operator-workload-safety, §12/§11.4.133); the §12.8 daemon-kill remediation MUST be scoped to OUR daemons. When our work waits on host contention from another project’s process, surface it (§11.4.66/§11.4.101) — block-don’t-break. Every pgrep/ps filter MUST exclude self-matches + other-project matches. Forensic anchor (FACT 2026-06-29): a 200%-CPU java+gradlew on the shared host was a separate</w:t>
+      </w:r>
+      <w:r>
+        <w:t xml:space="preserve"> </w:t>
+      </w:r>
+      <w:r>
+        <w:rPr>
+          <w:rStyle w:val="VerbatimChar"/>
+        </w:rPr>
+        <w:t xml:space="preserve">catalogizer</w:t>
+      </w:r>
+      <w:r>
+        <w:t xml:space="preserve"> </w:t>
+      </w:r>
+      <w:r>
+        <w:t xml:space="preserve">project’s gradle test (cwd=Projects/catalogizer), nearly mis-attributed to our build. Composes §11.4.6/§11.4.66/§11.4.101/§11.4.147/§12/§12.8/§11.4.133. Classification: universal (§11.4.17). Propagation gate</w:t>
+      </w:r>
+      <w:r>
+        <w:t xml:space="preserve"> </w:t>
+      </w:r>
+      <w:r>
+        <w:rPr>
+          <w:rStyle w:val="VerbatimChar"/>
+        </w:rPr>
+        <w:t xml:space="preserve">CM-COVENANT-114-173-PROPAGATION</w:t>
+      </w:r>
+      <w:r>
+        <w:t xml:space="preserve"> </w:t>
+      </w:r>
+      <w:r>
+        <w:t xml:space="preserve">(literal</w:t>
+      </w:r>
+      <w:r>
+        <w:t xml:space="preserve"> </w:t>
+      </w:r>
+      <w:r>
+        <w:rPr>
+          <w:rStyle w:val="VerbatimChar"/>
+        </w:rPr>
+        <w:t xml:space="preserve">11.4.173</w:t>
+      </w:r>
+      <w:r>
+        <w:t xml:space="preserve">) + recommended gate</w:t>
+      </w:r>
+      <w:r>
+        <w:t xml:space="preserve"> </w:t>
+      </w:r>
+      <w:r>
+        <w:rPr>
+          <w:rStyle w:val="VerbatimChar"/>
+        </w:rPr>
+        <w:t xml:space="preserve">CM-PROCESS-OWNERSHIP-VERIFIED</w:t>
+      </w:r>
+      <w:r>
+        <w:t xml:space="preserve"> </w:t>
+      </w:r>
+      <w:r>
+        <w:t xml:space="preserve">+ paired §1.1 mutation.</w:t>
+      </w:r>
+      <w:r>
+        <w:t xml:space="preserve"> </w:t>
+      </w:r>
+      <w:r>
+        <w:rPr>
+          <w:b/>
+          <w:bCs/>
+        </w:rPr>
+        <w:t xml:space="preserve">Canonical authority:</w:t>
+      </w:r>
+      <w:r>
+        <w:t xml:space="preserve"> </w:t>
+      </w:r>
+      <w:r>
+        <w:t xml:space="preserve">constitution submodule</w:t>
+      </w:r>
+      <w:r>
+        <w:t xml:space="preserve"> </w:t>
+      </w:r>
+      <w:hyperlink r:id="rId10">
+        <w:r>
+          <w:rPr>
+            <w:rStyle w:val="VerbatimChar"/>
+          </w:rPr>
+          <w:t xml:space="preserve">Constitution.md</w:t>
+        </w:r>
+      </w:hyperlink>
+      <w:r>
+        <w:t xml:space="preserve"> </w:t>
+      </w:r>
+      <w:r>
+        <w:t xml:space="preserve">§11.4.173. Non-compliance is a release blocker. No escape hatch — no</w:t>
+      </w:r>
+      <w:r>
+        <w:t xml:space="preserve"> </w:t>
+      </w:r>
+      <w:r>
+        <w:rPr>
+          <w:rStyle w:val="VerbatimChar"/>
+        </w:rPr>
+        <w:t xml:space="preserve">--assume-process-ours</w:t>
+      </w:r>
+      <w:r>
+        <w:t xml:space="preserve">,</w:t>
+      </w:r>
+      <w:r>
+        <w:t xml:space="preserve"> </w:t>
+      </w:r>
+      <w:r>
+        <w:rPr>
+          <w:rStyle w:val="VerbatimChar"/>
+        </w:rPr>
+        <w:t xml:space="preserve">--loose-pgrep-ok</w:t>
+      </w:r>
+      <w:r>
+        <w:t xml:space="preserve">,</w:t>
+      </w:r>
+      <w:r>
+        <w:t xml:space="preserve"> </w:t>
+      </w:r>
+      <w:r>
+        <w:rPr>
+          <w:rStyle w:val="VerbatimChar"/>
+        </w:rPr>
+        <w:t xml:space="preserve">--kill-any-matching-process</w:t>
+      </w:r>
+      <w:r>
+        <w:t xml:space="preserve">,</w:t>
+      </w:r>
+      <w:r>
+        <w:t xml:space="preserve"> </w:t>
+      </w:r>
+      <w:r>
+        <w:rPr>
+          <w:rStyle w:val="VerbatimChar"/>
+        </w:rPr>
+        <w:t xml:space="preserve">--skip-ownership-check</w:t>
+      </w:r>
+      <w:r>
+        <w:t xml:space="preserve"> </w:t>
+      </w:r>
+      <w:r>
+        <w:t xml:space="preserve">flag.</w:t>
+      </w:r>
+    </w:p>
+    <w:bookmarkEnd w:id="14"/>
     <w:bookmarkEnd w:id="15"/>
-    <w:bookmarkEnd w:id="16"/>
     <w:sectPr>
       <w:footnotePr>
         <w:numRestart w:val="eachSect"/>
@@ -9998,7 +10752,7 @@
         <w:rFonts w:asciiTheme="minorHAnsi" w:cstheme="minorBidi" w:eastAsiaTheme="minorEastAsia" w:hAnsiTheme="minorHAnsi"/>
         <w:sz w:val="24"/>
         <w:szCs w:val="24"/>
-        <w:lang w:bidi="ar-SA" w:eastAsia="zh-CN" w:val="en"/>
+        <w:lang w:bidi="ar-SA" w:eastAsia="zh-CN" w:val="en-US"/>
       </w:rPr>
     </w:rPrDefault>
     <w:pPrDefault>

</xml_diff>

<commit_message>
feat(multitrack): universal git-hardening anchors §11.4.177-180 + consumer mirrors + 4-format exports
Lands 4 new universal anchors after the existing §11.4.176 (BG-007 device-lock):
- §11.4.177 Developer-tooling project-decoupling + invocation-directory operation
- §11.4.178 Track-qualified identity for parallel work streams (session-name collision ban)
- §11.4.179 Corruption-isolated parallel git streams (own-.git, not shared-common-dir worktrees)
- §11.4.180 Commit/push wrappers MUST auto-reap provably-stale locks before acquiring
Rev 32->33; mirrors appended to CLAUDE/AGENTS/QWEN/GEMINI; BG-007 refs made numeric (§11.4.176).
PWU-5 launch machinery (multitrack-up/down, cwd_hook) intentionally excluded (separate work item).

Co-Authored-By: Claude Opus 4.8 (1M context) <noreply@anthropic.com>
</commit_message>
<xml_diff>
--- a/GEMINI.docx
+++ b/GEMINI.docx
@@ -2,7 +2,7 @@
 <file path=word/document.xml><?xml version="1.0" encoding="utf-8"?>
 <w:document xmlns:w="http://schemas.openxmlformats.org/wordprocessingml/2006/main" xmlns:m="http://schemas.openxmlformats.org/officeDocument/2006/math" xmlns:r="http://schemas.openxmlformats.org/officeDocument/2006/relationships" xmlns:o="urn:schemas-microsoft-com:office:office" xmlns:v="urn:schemas-microsoft-com:vml" xmlns:w10="urn:schemas-microsoft-com:office:word" xmlns:a="http://schemas.openxmlformats.org/drawingml/2006/main" xmlns:pic="http://schemas.openxmlformats.org/drawingml/2006/picture" xmlns:wp="http://schemas.openxmlformats.org/drawingml/2006/wordprocessingDrawing">
   <w:body>
-    <w:bookmarkStart w:id="16" w:name="helix-constitution--universal-geminimd"/>
+    <w:bookmarkStart w:id="15" w:name="helix-constitution-universal-gemini.md"/>
     <w:p>
       <w:pPr>
         <w:pStyle w:val="Heading1"/>
@@ -14,7 +14,8 @@
     <w:tbl>
       <w:tblPr>
         <w:tblStyle w:val="Table"/>
-        <w:tblW w:type="auto" w:w="0"/>
+        <w:tblW w:type="pct" w:w="5000"/>
+        <w:tblLayout w:type="fixed"/>
         <w:tblLook w:firstRow="1" w:lastRow="0" w:firstColumn="0" w:lastColumn="0" w:noHBand="0" w:noVBand="0" w:val="0020"/>
       </w:tblPr>
       <w:tblGrid>
@@ -67,7 +68,7 @@
               <w:pStyle w:val="Compact"/>
             </w:pPr>
             <w:r>
-              <w:t xml:space="preserve">6</w:t>
+              <w:t xml:space="preserve">7</w:t>
             </w:r>
           </w:p>
         </w:tc>
@@ -115,7 +116,7 @@
               <w:pStyle w:val="Compact"/>
             </w:pPr>
             <w:r>
-              <w:t xml:space="preserve">2026-07-03T00:00:00Z</w:t>
+              <w:t xml:space="preserve">2026-07-04T00:00:00Z</w:t>
             </w:r>
           </w:p>
         </w:tc>
@@ -499,7 +500,7 @@
         <w:t xml:space="preserve"> </w:t>
       </w:r>
       <w:r>
-        <w:t xml:space="preserve">project's own repo-root</w:t>
+        <w:t xml:space="preserve">project’s own repo-root</w:t>
       </w:r>
       <w:r>
         <w:t xml:space="preserve"> </w:t>
@@ -534,7 +535,7 @@
         <w:pStyle w:val="BodyText"/>
       </w:pPr>
       <w:r>
-        <w:t xml:space="preserve">For agents driven from a consuming project, the project's repo-root carrier</w:t>
+        <w:t xml:space="preserve">For agents driven from a consuming project, the project’s repo-root carrier</w:t>
       </w:r>
       <w:r>
         <w:t xml:space="preserve"> </w:t>
@@ -603,7 +604,7 @@
       </w:r>
     </w:p>
     <w:bookmarkEnd w:id="9"/>
-    <w:bookmarkStart w:id="11" w:name="Xa248266842dbec6af31dbcf1ca91a15c9292d5b"/>
+    <w:bookmarkStart w:id="11" w:name="X2c10a2e76b685975585d4bbddc3d6345f162bd6"/>
     <w:p>
       <w:pPr>
         <w:pStyle w:val="Heading2"/>
@@ -721,7 +722,7 @@
         <w:t xml:space="preserve"> </w:t>
       </w:r>
       <w:r>
-        <w:t xml:space="preserve">user prompt's FIRST</w:t>
+        <w:t xml:space="preserve">user prompt’s FIRST</w:t>
       </w:r>
       <w:r>
         <w:t xml:space="preserve"> </w:t>
@@ -766,7 +767,7 @@
         <w:t xml:space="preserve"> </w:t>
       </w:r>
       <w:r>
-        <w:t xml:space="preserve">(2) if it is a registered action, REPLACE the prefix with that action's</w:t>
+        <w:t xml:space="preserve">(2) if it is a registered action, REPLACE the prefix with that action’s</w:t>
       </w:r>
       <w:r>
         <w:t xml:space="preserve"> </w:t>
@@ -1504,7 +1505,7 @@
           <w:i/>
           <w:iCs/>
         </w:rPr>
-        <w:t xml:space="preserve">"The following prompt that we will provide MUST BE executed in background</w:t>
+        <w:t xml:space="preserve">“The following prompt that we will provide MUST BE executed in background</w:t>
       </w:r>
       <w:r>
         <w:rPr>
@@ -1560,7 +1561,7 @@
           <w:i/>
           <w:iCs/>
         </w:rPr>
-        <w:t xml:space="preserve">any false results and without any bluff!"</w:t>
+        <w:t xml:space="preserve">any false results and without any bluff!”</w:t>
       </w:r>
       <w:r>
         <w:t xml:space="preserve"> </w:t>
@@ -1765,9 +1766,12 @@
       <w:r>
         <w:t xml:space="preserve">flag.</w:t>
       </w:r>
+      <w:r>
+        <w:t xml:space="preserve"> </w:t>
+      </w:r>
     </w:p>
     <w:bookmarkEnd w:id="11"/>
-    <w:bookmarkStart w:id="14" w:name="token-efficiency-mandate-114141"/>
+    <w:bookmarkStart w:id="13" w:name="token-efficiency-mandate-11.4.141"/>
     <w:p>
       <w:pPr>
         <w:pStyle w:val="Heading2"/>
@@ -2210,7 +2214,70 @@
         <w:t xml:space="preserve"> </w:t>
       </w:r>
       <w:r>
-        <w:t xml:space="preserve">Verbatim operator mandate: "ALL changes we do MUST pass through the code review step!!! ALWAYS!!!" EVERY change made to ANY repository this Constitution governs — without exception — MUST pass through an INDEPENDENT code-review step BEFORE it is accepted, committed, or built. NO change class is exempt: source code, fixes, tests, gates, meta-test mutations, documentation, doc-tooling, build/CI scripts, configuration, governance files (Constitution / CLAUDE / AGENTS / QWEN), conductor main-stream edits, sub-agent output, refactors, single-line edits — if a diff exists, it gets an independent review. This is the ABSOLUTE form of §11.4.125 (code-review agent gate after a batch, before pre-build sweep + main build): §11.4.142 strips every implicit scoping §11.4.125's "after all fixes/changes/implementations are done" phrasing could leave open — no "just a doc edit", no "just a one-liner", no "the author already self-reviewed (§11.4.92)", no "trivial change" carve-out.</w:t>
+        <w:t xml:space="preserve">Verbatim operator mandate:</w:t>
+      </w:r>
+      <w:r>
+        <w:t xml:space="preserve"> </w:t>
+      </w:r>
+      <w:r>
+        <w:t xml:space="preserve">“ALL changes we do MUST pass through the code review step!!! ALWAYS!!!”</w:t>
+      </w:r>
+      <w:r>
+        <w:t xml:space="preserve"> </w:t>
+      </w:r>
+      <w:r>
+        <w:t xml:space="preserve">EVERY change made to ANY repository this Constitution governs — without exception — MUST pass through an INDEPENDENT code-review step BEFORE it is accepted, committed, or built. NO change class is exempt: source code, fixes, tests, gates, meta-test mutations, documentation, doc-tooling, build/CI scripts, configuration, governance files (Constitution / CLAUDE / AGENTS / QWEN), conductor main-stream edits, sub-agent output, refactors, single-line edits — if a diff exists, it gets an independent review. This is the ABSOLUTE form of §11.4.125 (code-review agent gate after a batch, before pre-build sweep + main build): §11.4.142 strips every implicit scoping §11.4.125’s</w:t>
+      </w:r>
+      <w:r>
+        <w:t xml:space="preserve"> </w:t>
+      </w:r>
+      <w:r>
+        <w:t xml:space="preserve">“after all fixes/changes/implementations are done”</w:t>
+      </w:r>
+      <w:r>
+        <w:t xml:space="preserve"> </w:t>
+      </w:r>
+      <w:r>
+        <w:t xml:space="preserve">phrasing could leave open — no</w:t>
+      </w:r>
+      <w:r>
+        <w:t xml:space="preserve"> </w:t>
+      </w:r>
+      <w:r>
+        <w:t xml:space="preserve">“just a doc edit”</w:t>
+      </w:r>
+      <w:r>
+        <w:t xml:space="preserve">, no</w:t>
+      </w:r>
+      <w:r>
+        <w:t xml:space="preserve"> </w:t>
+      </w:r>
+      <w:r>
+        <w:t xml:space="preserve">“just a one-liner”</w:t>
+      </w:r>
+      <w:r>
+        <w:t xml:space="preserve">, no</w:t>
+      </w:r>
+      <w:r>
+        <w:t xml:space="preserve"> </w:t>
+      </w:r>
+      <w:r>
+        <w:t xml:space="preserve">“the author already self-reviewed (§11.4.92)”</w:t>
+      </w:r>
+      <w:r>
+        <w:t xml:space="preserve">, no</w:t>
+      </w:r>
+      <w:r>
+        <w:t xml:space="preserve"> </w:t>
+      </w:r>
+      <w:r>
+        <w:t xml:space="preserve">“trivial change”</w:t>
+      </w:r>
+      <w:r>
+        <w:t xml:space="preserve"> </w:t>
+      </w:r>
+      <w:r>
+        <w:t xml:space="preserve">carve-out.</w:t>
       </w:r>
       <w:r>
         <w:t xml:space="preserve"> </w:t>
@@ -2226,7 +2293,7 @@
         <w:t xml:space="preserve"> </w:t>
       </w:r>
       <w:r>
-        <w:t xml:space="preserve">— the reviewer MUST be structurally separated from the author (a dedicated code-review agent, subagent-driven by default per §11.4.70 / §11.4.20, or a distinct human), NEVER the author re-reading their own work; §11.4.92's multi-pass self-evaluation is the AUTHOR-side discipline and PRECEDES (never satisfies) §11.4.142.</w:t>
+        <w:t xml:space="preserve">— the reviewer MUST be structurally separated from the author (a dedicated code-review agent, subagent-driven by default per §11.4.70 / §11.4.20, or a distinct human), NEVER the author re-reading their own work; §11.4.92’s multi-pass self-evaluation is the AUTHOR-side discipline and PRECEDES (never satisfies) §11.4.142.</w:t>
       </w:r>
       <w:r>
         <w:t xml:space="preserve"> </w:t>
@@ -2242,7 +2309,19 @@
         <w:t xml:space="preserve"> </w:t>
       </w:r>
       <w:r>
-        <w:t xml:space="preserve">(§11.4 / §11.4.1) — a rubber-stamp "looks good" is not a review; it MUST genuinely analyse correctness, safety (no host §12 / data §9 / target-hardware §11.4.133 regression), will-it-really-work (no solve-A-create-B), end-user behaviour (§11.4 / §107), and test-genuineness (§1.1), its conclusions captured evidence per §11.4.5 / §11.4.69, and</w:t>
+        <w:t xml:space="preserve">(§11.4 / §11.4.1) — a rubber-stamp</w:t>
+      </w:r>
+      <w:r>
+        <w:t xml:space="preserve"> </w:t>
+      </w:r>
+      <w:r>
+        <w:t xml:space="preserve">“looks good”</w:t>
+      </w:r>
+      <w:r>
+        <w:t xml:space="preserve"> </w:t>
+      </w:r>
+      <w:r>
+        <w:t xml:space="preserve">is not a review; it MUST genuinely analyse correctness, safety (no host §12 / data §9 / target-hardware §11.4.133 regression), will-it-really-work (no solve-A-create-B), end-user behaviour (§11.4 / §107), and test-genuineness (§1.1), its conclusions captured evidence per §11.4.5 / §11.4.69, and</w:t>
       </w:r>
       <w:r>
         <w:t xml:space="preserve"> </w:t>
@@ -2441,7 +2520,19 @@
         <w:t xml:space="preserve"> </w:t>
       </w:r>
       <w:r>
-        <w:t xml:space="preserve">Verbatim operator mandate: "All video streaming apps ... require to choose some title and to press proper UI button to start or resume playing! Proper UI interaction to play exact show with proper content and subtitles is MANDATORY! Without it we just eventually play on 2nd display sample, and that's it mostly! THIS MUST BE ADDED as MANDATORY RULE regarding testing of any video streaming app in general with full automation tests! Universal in root constitution + a consuming project's extensions." Any full-automation test that asserts a video player / streaming application plays content MUST drive the REAL end-user journey through the app's OWN UI — launch → BROWSE the actual catalog → choose a SPECIFIC title → press the real Play/Resume button → confirm THAT chosen content is genuinely playing, with its correct subtitles, on the intended routing target. A test that bypasses the journey with a sample / demo / built-in-loop clip, a deep-link /</w:t>
+        <w:t xml:space="preserve">Verbatim operator mandate:</w:t>
+      </w:r>
+      <w:r>
+        <w:t xml:space="preserve"> </w:t>
+      </w:r>
+      <w:r>
+        <w:t xml:space="preserve">“All video streaming apps … require to choose some title and to press proper UI button to start or resume playing! Proper UI interaction to play exact show with proper content and subtitles is MANDATORY! Without it we just eventually play on 2nd display sample, and that’s it mostly! THIS MUST BE ADDED as MANDATORY RULE regarding testing of any video streaming app in general with full automation tests! Universal in root constitution + a consuming project’s extensions.”</w:t>
+      </w:r>
+      <w:r>
+        <w:t xml:space="preserve"> </w:t>
+      </w:r>
+      <w:r>
+        <w:t xml:space="preserve">Any full-automation test that asserts a video player / streaming application plays content MUST drive the REAL end-user journey through the app’s OWN UI — launch → BROWSE the actual catalog → choose a SPECIFIC title → press the real Play/Resume button → confirm THAT chosen content is genuinely playing, with its correct subtitles, on the intended routing target. A test that bypasses the journey with a sample / demo / built-in-loop clip, a deep-link /</w:t>
       </w:r>
       <w:r>
         <w:t xml:space="preserve"> </w:t>
@@ -2456,7 +2547,7 @@
         <w:t xml:space="preserve"> </w:t>
       </w:r>
       <w:r>
-        <w:t xml:space="preserve">/ intent shortcut, a synthetic or pre-staged stream, or any path that does NOT exercise the app's own browse-select-play UI is a §11.4 PASS-bluff at the user-journey layer: it validates ROUTING (that</w:t>
+        <w:t xml:space="preserve">/ intent shortcut, a synthetic or pre-staged stream, or any path that does NOT exercise the app’s own browse-select-play UI is a §11.4 PASS-bluff at the user-journey layer: it validates ROUTING (that</w:t>
       </w:r>
       <w:r>
         <w:t xml:space="preserve"> </w:t>
@@ -2472,7 +2563,31 @@
         <w:t xml:space="preserve"> </w:t>
       </w:r>
       <w:r>
-        <w:t xml:space="preserve">reaches the display) while leaving the user-visible behaviour the operator cares about — "the show I picked actually plays" — unproven (the operator's "we just eventually play on 2nd display sample, and that's it mostly" gap). The mandate (ALL hold): (1)</w:t>
+        <w:t xml:space="preserve">reaches the display) while leaving the user-visible behaviour the operator cares about —</w:t>
+      </w:r>
+      <w:r>
+        <w:t xml:space="preserve"> </w:t>
+      </w:r>
+      <w:r>
+        <w:t xml:space="preserve">“the show I picked actually plays”</w:t>
+      </w:r>
+      <w:r>
+        <w:t xml:space="preserve"> </w:t>
+      </w:r>
+      <w:r>
+        <w:t xml:space="preserve">— unproven (the operator’s</w:t>
+      </w:r>
+      <w:r>
+        <w:t xml:space="preserve"> </w:t>
+      </w:r>
+      <w:r>
+        <w:t xml:space="preserve">“we just eventually play on 2nd display sample, and that’s it mostly”</w:t>
+      </w:r>
+      <w:r>
+        <w:t xml:space="preserve"> </w:t>
+      </w:r>
+      <w:r>
+        <w:t xml:space="preserve">gap). The mandate (ALL hold): (1)</w:t>
       </w:r>
       <w:r>
         <w:t xml:space="preserve"> </w:t>
@@ -2488,7 +2603,7 @@
         <w:t xml:space="preserve"> </w:t>
       </w:r>
       <w:r>
-        <w:t xml:space="preserve">— launch → catalog browse → specific-title selection → real Play/Resume press through the app's own UI (§11.4.48 UI-driven), NEVER a deep-link / intent / sample / loop-clip shortcut; (2)</w:t>
+        <w:t xml:space="preserve">— launch → catalog browse → specific-title selection → real Play/Resume press through the app’s own UI (§11.4.48 UI-driven), NEVER a deep-link / intent / sample / loop-clip shortcut; (2)</w:t>
       </w:r>
       <w:r>
         <w:t xml:space="preserve"> </w:t>
@@ -2504,7 +2619,7 @@
         <w:t xml:space="preserve"> </w:t>
       </w:r>
       <w:r>
-        <w:t xml:space="preserve">— the PASS proves the SPECIFIC selected title is playing (not merely that pixels move on the target) via the §11.4.107 liveness battery on the §11.4.136 real-content path + the §11.4.137 subtitle content-correctness oracle for the chosen title's captions; (3)</w:t>
+        <w:t xml:space="preserve">— the PASS proves the SPECIFIC selected title is playing (not merely that pixels move on the target) via the §11.4.107 liveness battery on the §11.4.136 real-content path + the §11.4.137 subtitle content-correctness oracle for the chosen title’s captions; (3)</w:t>
       </w:r>
       <w:r>
         <w:t xml:space="preserve"> </w:t>
@@ -2520,7 +2635,7 @@
         <w:t xml:space="preserve"> </w:t>
       </w:r>
       <w:r>
-        <w:t xml:space="preserve">— when the app's accessibility hierarchy is blank/unreliable (TV-Compose / leanback / canvas / GL), DRIVE input + ASSERT content via the §11.4.117 CV/OCR pixel oracle, never a hierarchy-only tool; (4)</w:t>
+        <w:t xml:space="preserve">— when the app’s accessibility hierarchy is blank/unreliable (TV-Compose / leanback / canvas / GL), DRIVE input + ASSERT content via the §11.4.117 CV/OCR pixel oracle, never a hierarchy-only tool; (4)</w:t>
       </w:r>
       <w:r>
         <w:t xml:space="preserve"> </w:t>
@@ -2567,7 +2682,19 @@
         <w:t xml:space="preserve"> </w:t>
       </w:r>
       <w:r>
-        <w:t xml:space="preserve">SKIP-with-reason per §11.4.52 + §11.4.3 with a tracked migration item — NEVER a metadata-only / sample-played / routing-only PASS. Honest boundary (§11.4.6): "the routing fired so the title is playing" is a guess — only the chosen-content liveness + subtitle oracle on the real journey proves it. Composes §11.4.48 / §11.4.107 / §11.4.117 / §11.4.136 / §11.4.137 / §11.4.52 / §11.4.3 / §107 / §1.1. Classification: universal (§11.4.17) — the consuming project supplies its concrete app roster, login-credential source, routing target, and UI-driving / pixel-oracle harness per §11.4.35. Propagation gate</w:t>
+        <w:t xml:space="preserve">SKIP-with-reason per §11.4.52 + §11.4.3 with a tracked migration item — NEVER a metadata-only / sample-played / routing-only PASS. Honest boundary (§11.4.6):</w:t>
+      </w:r>
+      <w:r>
+        <w:t xml:space="preserve"> </w:t>
+      </w:r>
+      <w:r>
+        <w:t xml:space="preserve">“the routing fired so the title is playing”</w:t>
+      </w:r>
+      <w:r>
+        <w:t xml:space="preserve"> </w:t>
+      </w:r>
+      <w:r>
+        <w:t xml:space="preserve">is a guess — only the chosen-content liveness + subtitle oracle on the real journey proves it. Composes §11.4.48 / §11.4.107 / §11.4.117 / §11.4.136 / §11.4.137 / §11.4.52 / §11.4.3 / §107 / §1.1. Classification: universal (§11.4.17) — the consuming project supplies its concrete app roster, login-credential source, routing target, and UI-driving / pixel-oracle harness per §11.4.35. Propagation gate</w:t>
       </w:r>
       <w:r>
         <w:t xml:space="preserve"> </w:t>
@@ -2609,7 +2736,7 @@
         <w:t xml:space="preserve"> </w:t>
       </w:r>
       <w:r>
-        <w:t xml:space="preserve">(every video-streaming-app playback test drives the real browse-select-play journey + confirms the chosen content + subtitles, or SKIPs-with-reason) + paired §1.1 mutation (replace a real-journey test's browse-select-play path with a deep-link / sample shortcut → gate FAILs; strip the literal → propagation gate FAILs; gate-code = separate work item).</w:t>
+        <w:t xml:space="preserve">(every video-streaming-app playback test drives the real browse-select-play journey + confirms the chosen content + subtitles, or SKIPs-with-reason) + paired §1.1 mutation (replace a real-journey test’s browse-select-play path with a deep-link / sample shortcut → gate FAILs; strip the literal → propagation gate FAILs; gate-code = separate work item).</w:t>
       </w:r>
       <w:r>
         <w:t xml:space="preserve"> </w:t>
@@ -2771,7 +2898,7 @@
         <w:t xml:space="preserve"> </w:t>
       </w:r>
       <w:r>
-        <w:t xml:space="preserve">for the device to return using the project's ALREADY-DEFINED reconnection timings — never invented numbers (§11.4.6), the SAME grace / reconnect / poll budgets the project's recovery path already uses; (c)</w:t>
+        <w:t xml:space="preserve">for the device to return using the project’s ALREADY-DEFINED reconnection timings — never invented numbers (§11.4.6), the SAME grace / reconnect / poll budgets the project’s recovery path already uses; (c)</w:t>
       </w:r>
       <w:r>
         <w:t xml:space="preserve"> </w:t>
@@ -2803,7 +2930,7 @@
         <w:t xml:space="preserve"> </w:t>
       </w:r>
       <w:r>
-        <w:t xml:space="preserve">to the project's sanctioned device-recovery path (per §11.4.69 feature class</w:t>
+        <w:t xml:space="preserve">to the project’s sanctioned device-recovery path (per §11.4.69 feature class</w:t>
       </w:r>
       <w:r>
         <w:t xml:space="preserve"> </w:t>
@@ -2815,7 +2942,7 @@
         <w:t xml:space="preserve">device_recovery</w:t>
       </w:r>
       <w:r>
-        <w:t xml:space="preserve">) if the device does not return within the defined timeout — through the sanctioned, authorization-gated recovery entry point ONLY, never bypassing its gate and never performing a destructive recovery (e.g. a power-cycle) autonomously without that authorization (§11.4.21 / §11.4.101 — high-blast-radius recovery is gated; while blocked the system keeps following the device, logging the blocked-escalation honestly). A tracked-device drop that produces a silent corpus hole, a never-resumed recording, or a never-escalated permanent absence is the bluff this anchor forbids. Composes §11.4.128 (always-on recording — §11.4.144 closes its drop-handling gap) / §11.4.69 (</w:t>
+        <w:t xml:space="preserve">) if the device does not return within the defined timeout — through the sanctioned, authorization-gated recovery entry point ONLY, never bypassing its gate and never performing a destructive recovery (e.g. a power-cycle) autonomously without that authorization (§11.4.21 / §11.4.101 — high-blast-radius recovery is gated; while blocked the system keeps following the device, logging the blocked-escalation honestly). A tracked-device drop that produces a silent corpus hole, a never-resumed recording, or a never-escalated permanent absence is the bluff this anchor forbids. Composes §11.4.128 (always-on recording — §11.4.144 closes its drop-handling gap) / §11.4.69 (</w:t>
       </w:r>
       <w:r>
         <w:rPr>
@@ -2995,7 +3122,28 @@
         <w:t xml:space="preserve"> </w:t>
       </w:r>
       <w:r>
-        <w:t xml:space="preserve">For EVERY fix / change / new feature, INDEPENDENT impact-research agents (subagent-driven §11.4.70/§11.4.20, structurally separate from the author — §11.4.92 self-eval PRECEDES, never satisfies — adversarial "refute-the-change" stance to defeat the documented LLM confirmation-bias failure mode) MUST research the change AND its connected/dependent features across a CLOSED SET OF EIGHT ANGLES — (1) correctness/logic, (2) regression (what existing working feature could break — via call-graph impact enumerating every direct + transitive caller and contract-dependent feature, each mapped to its test), (3) latent/dangerous-code — the recents class (runtime-only failure, interface/ABI/contract mismatch, concurrency/data-race, resource lifecycle), (4) security (taint/injection/secret/unsafe-API), (5) performance (latency/memory/thermal under load vs baseline), (6) host/data/target-hardware safety per §12/§9/§11.4.133, (7) cross-feature interaction (shared state/timing/hardware contention), (8) business-logic conformance (matches the spec AND the connected features' contracts, not merely compiles). Forensic anchor (FACT, project-internal): the recents / 3-button-nav path shipped a latent AIDL-interface-contract mismatch that PASSED code review yet failed at RUNTIME ONLY (ANR on a recents-reaping gesture) because no review angle interrogated the interface contract / concurrency-lifecycle / silently-broken connected feature — the §11.4.108 SOURCE→ARTIFACT→RUNTIME→USER-VISIBLE gap caught only after the fact; §11.4.145 shifts that discovery LEFT. Each angle MUST name the TOOL(S) used + obtain the required DEPTH (the diff, the full changed unit, its declared contract, the spec section, every connected feature — NEVER the diff lines alone) + emit a captured-evidence conclusion per §11.4.5/§11.4.69 ("looks fine" forbidden, §11.4.1); a genuinely-N/A angle is recorded</w:t>
+        <w:t xml:space="preserve">For EVERY fix / change / new feature, INDEPENDENT impact-research agents (subagent-driven §11.4.70/§11.4.20, structurally separate from the author — §11.4.92 self-eval PRECEDES, never satisfies — adversarial</w:t>
+      </w:r>
+      <w:r>
+        <w:t xml:space="preserve"> </w:t>
+      </w:r>
+      <w:r>
+        <w:t xml:space="preserve">“refute-the-change”</w:t>
+      </w:r>
+      <w:r>
+        <w:t xml:space="preserve"> </w:t>
+      </w:r>
+      <w:r>
+        <w:t xml:space="preserve">stance to defeat the documented LLM confirmation-bias failure mode) MUST research the change AND its connected/dependent features across a CLOSED SET OF EIGHT ANGLES — (1) correctness/logic, (2) regression (what existing working feature could break — via call-graph impact enumerating every direct + transitive caller and contract-dependent feature, each mapped to its test), (3) latent/dangerous-code — the recents class (runtime-only failure, interface/ABI/contract mismatch, concurrency/data-race, resource lifecycle), (4) security (taint/injection/secret/unsafe-API), (5) performance (latency/memory/thermal under load vs baseline), (6) host/data/target-hardware safety per §12/§9/§11.4.133, (7) cross-feature interaction (shared state/timing/hardware contention), (8) business-logic conformance (matches the spec AND the connected features’ contracts, not merely compiles). Forensic anchor (FACT, project-internal): the recents / 3-button-nav path shipped a latent AIDL-interface-contract mismatch that PASSED code review yet failed at RUNTIME ONLY (ANR on a recents-reaping gesture) because no review angle interrogated the interface contract / concurrency-lifecycle / silently-broken connected feature — the §11.4.108 SOURCE→ARTIFACT→RUNTIME→USER-VISIBLE gap caught only after the fact; §11.4.145 shifts that discovery LEFT. Each angle MUST name the TOOL(S) used + obtain the required DEPTH (the diff, the full changed unit, its declared contract, the spec section, every connected feature — NEVER the diff lines alone) + emit a captured-evidence conclusion per §11.4.5/§11.4.69 (</w:t>
+      </w:r>
+      <w:r>
+        <w:t xml:space="preserve">“looks fine”</w:t>
+      </w:r>
+      <w:r>
+        <w:t xml:space="preserve"> </w:t>
+      </w:r>
+      <w:r>
+        <w:t xml:space="preserve">forbidden, §11.4.1); a genuinely-N/A angle is recorded</w:t>
       </w:r>
       <w:r>
         <w:t xml:space="preserve"> </w:t>
@@ -3193,7 +3341,7 @@
         <w:t xml:space="preserve"> </w:t>
       </w:r>
       <w:r>
-        <w:t xml:space="preserve">Every reported problem MUST be handled by a NAMED three-step test workflow — §11.4.146 does NOT re-author its component disciplines, it NAMES + BINDS them into the operator's exact per-defect sequence and adds ONLY the two emphases the components leave implicit.</w:t>
+        <w:t xml:space="preserve">Every reported problem MUST be handled by a NAMED three-step test workflow — §11.4.146 does NOT re-author its component disciplines, it NAMES + BINDS them into the operator’s exact per-defect sequence and adds ONLY the two emphases the components leave implicit.</w:t>
       </w:r>
       <w:r>
         <w:t xml:space="preserve"> </w:t>
@@ -3253,7 +3401,16 @@
         <w:t xml:space="preserve"> </w:t>
       </w:r>
       <w:r>
-        <w:t xml:space="preserve">NEW EMPHASIS (D2) immediately after STEP 2 the test MUST be FANNED OUT across the full case-space of the SAME functionality — all flows, valid + invalid + boundary (§11.4.85 empty/max/off-by-one) + concurrent (§11.4.85 contention) + failure-injection (§11.4.85 chaos) + topology variants (§11.4.3) — confirming no issue of any kind, with PROVABLE enumerated coverage per §11.4.118 (a listed case-set with per-case outcome, never "no other issues found"); a REQUIRED step, NOT deferred to a release-cycle discovery sweep and NOT reduced to a single guard; each user-visible case carries rock-solid physical evidence per §11.4.123 + is registered into the §11.4.135 standing regression-guard suite; a newly-discovered fan-out defect triggers §11.4.4 test-interrupt + re-enters STEP 1. (ANTI-BLUFF, all steps) every PASS is rock-solid CAPTURED physical evidence per §11.4.123 (§11.4.5/§11.4.69/§11.4.107) — metadata-only / config-only / absence-of-error / grep-without-runtime PASS forbidden (§11.4/§11.4.1); unclear validation method ⇒ deep-research-before-declaring-untestable per §11.4.123/§11.4.8/§11.4.99; an operator-found defect the green suite missed triggers §11.4.138. Honest boundary (§11.4.6): STEP 3 reduces the unknown-unknown surface but does not prove zero remaining defects (§11.4.118) — un-exercised cases stated as honest gaps, never silently implied clean. Composes §11.4.43/.115/.102/.130/.108/.139/.50/.85/.118/.135/.3/.123/.5/.69/.107/.138/.4/§107/§1.1. Classification: universal (§11.4.17). Propagation gate</w:t>
+        <w:t xml:space="preserve">NEW EMPHASIS (D2) immediately after STEP 2 the test MUST be FANNED OUT across the full case-space of the SAME functionality — all flows, valid + invalid + boundary (§11.4.85 empty/max/off-by-one) + concurrent (§11.4.85 contention) + failure-injection (§11.4.85 chaos) + topology variants (§11.4.3) — confirming no issue of any kind, with PROVABLE enumerated coverage per §11.4.118 (a listed case-set with per-case outcome, never</w:t>
+      </w:r>
+      <w:r>
+        <w:t xml:space="preserve"> </w:t>
+      </w:r>
+      <w:r>
+        <w:t xml:space="preserve">“no other issues found”</w:t>
+      </w:r>
+      <w:r>
+        <w:t xml:space="preserve">); a REQUIRED step, NOT deferred to a release-cycle discovery sweep and NOT reduced to a single guard; each user-visible case carries rock-solid physical evidence per §11.4.123 + is registered into the §11.4.135 standing regression-guard suite; a newly-discovered fan-out defect triggers §11.4.4 test-interrupt + re-enters STEP 1. (ANTI-BLUFF, all steps) every PASS is rock-solid CAPTURED physical evidence per §11.4.123 (§11.4.5/§11.4.69/§11.4.107) — metadata-only / config-only / absence-of-error / grep-without-runtime PASS forbidden (§11.4/§11.4.1); unclear validation method ⇒ deep-research-before-declaring-untestable per §11.4.123/§11.4.8/§11.4.99; an operator-found defect the green suite missed triggers §11.4.138. Honest boundary (§11.4.6): STEP 3 reduces the unknown-unknown surface but does not prove zero remaining defects (§11.4.118) — un-exercised cases stated as honest gaps, never silently implied clean. Composes §11.4.43/.115/.102/.130/.108/.139/.50/.85/.118/.135/.3/.123/.5/.69/.107/.138/.4/§107/§1.1. Classification: universal (§11.4.17). Propagation gate</w:t>
       </w:r>
       <w:r>
         <w:t xml:space="preserve"> </w:t>
@@ -3295,7 +3452,7 @@
         <w:t xml:space="preserve"> </w:t>
       </w:r>
       <w:r>
-        <w:t xml:space="preserve">(every closed defect's fix carries a §11.4.115 reproduce-first polarity test with captured defect-characterisation [STEP 1] + its</w:t>
+        <w:t xml:space="preserve">(every closed defect’s fix carries a §11.4.115 reproduce-first polarity test with captured defect-characterisation [STEP 1] + its</w:t>
       </w:r>
       <w:r>
         <w:t xml:space="preserve"> </w:t>
@@ -3463,7 +3620,19 @@
         <w:t xml:space="preserve"> </w:t>
       </w:r>
       <w:r>
-        <w:t xml:space="preserve">Verbatim operator intent: "any agent that crashed because of something MUST BE respawned and finish its work at some point! We MUST NOT lose any work, forget about or have it corrupted!" Forensic case study (FACT): dispatched subagents died on TRANSIENT causes (</w:t>
+        <w:t xml:space="preserve">Verbatim operator intent:</w:t>
+      </w:r>
+      <w:r>
+        <w:t xml:space="preserve"> </w:t>
+      </w:r>
+      <w:r>
+        <w:t xml:space="preserve">“any agent that crashed because of something MUST BE respawned and finish its work at some point! We MUST NOT lose any work, forget about or have it corrupted!”</w:t>
+      </w:r>
+      <w:r>
+        <w:t xml:space="preserve"> </w:t>
+      </w:r>
+      <w:r>
+        <w:t xml:space="preserve">Forensic case study (FACT): dispatched subagents died on TRANSIENT causes (</w:t>
       </w:r>
       <w:r>
         <w:rPr>
@@ -3490,7 +3659,19 @@
         <w:t xml:space="preserve"> </w:t>
       </w:r>
       <w:r>
-        <w:t xml:space="preserve">killed 2, one left PARTIAL edits — two source files written, the dependent SystemUI sliders + doc + test NOT done), each re-dispatched by pure conductor vigilance with NO mechanical guarantee — the moment conductor context is lost / compacted / the conductor itself crashes, an in-flight-but-dead work unit is silently dropped (lost / forgotten / corrupted). Every dispatched agent/subagent MUST be tracked through its full lifecycle so a crash NEVER loses, forgets, or corrupts its work; a crashed agent is NOT a completed agent (§11.4.6 — "it probably finished before dying" is a forbidden guess; abnormal termination is positive evidence the unit is OPEN). The mandate (ALL hold):</w:t>
+        <w:t xml:space="preserve">killed 2, one left PARTIAL edits — two source files written, the dependent SystemUI sliders + doc + test NOT done), each re-dispatched by pure conductor vigilance with NO mechanical guarantee — the moment conductor context is lost / compacted / the conductor itself crashes, an in-flight-but-dead work unit is silently dropped (lost / forgotten / corrupted). Every dispatched agent/subagent MUST be tracked through its full lifecycle so a crash NEVER loses, forgets, or corrupts its work; a crashed agent is NOT a completed agent (§11.4.6 —</w:t>
+      </w:r>
+      <w:r>
+        <w:t xml:space="preserve"> </w:t>
+      </w:r>
+      <w:r>
+        <w:t xml:space="preserve">“it probably finished before dying”</w:t>
+      </w:r>
+      <w:r>
+        <w:t xml:space="preserve"> </w:t>
+      </w:r>
+      <w:r>
+        <w:t xml:space="preserve">is a forbidden guess; abnormal termination is positive evidence the unit is OPEN). The mandate (ALL hold):</w:t>
       </w:r>
       <w:r>
         <w:t xml:space="preserve"> </w:t>
@@ -3518,7 +3699,13 @@
         <w:t xml:space="preserve">{dispatched | in-flight | crashed | respawned | complete}</w:t>
       </w:r>
       <w:r>
-        <w:t xml:space="preserve">), reusing the §11.4.116 sync substrate (JSONL event stream + atomic status snapshot; "an entry with no dispatch-event cannot show</w:t>
+        <w:t xml:space="preserve">), reusing the §11.4.116 sync substrate (JSONL event stream + atomic status snapshot;</w:t>
+      </w:r>
+      <w:r>
+        <w:t xml:space="preserve"> </w:t>
+      </w:r>
+      <w:r>
+        <w:t xml:space="preserve">“an entry with no dispatch-event cannot show</w:t>
       </w:r>
       <w:r>
         <w:t xml:space="preserve"> </w:t>
@@ -3530,7 +3717,22 @@
         <w:t xml:space="preserve">complete</w:t>
       </w:r>
       <w:r>
-        <w:t xml:space="preserve">"); the registry is the SINGLE SOURCE OF TRUTH for "is this work owed?" and an unregistered dispatch is itself a violation;</w:t>
+        <w:t xml:space="preserve">”</w:t>
+      </w:r>
+      <w:r>
+        <w:t xml:space="preserve">); the registry is the SINGLE SOURCE OF TRUTH for</w:t>
+      </w:r>
+      <w:r>
+        <w:t xml:space="preserve"> </w:t>
+      </w:r>
+      <w:r>
+        <w:t xml:space="preserve">“is this work owed?”</w:t>
+      </w:r>
+      <w:r>
+        <w:t xml:space="preserve"> </w:t>
+      </w:r>
+      <w:r>
+        <w:t xml:space="preserve">and an unregistered dispatch is itself a violation;</w:t>
       </w:r>
       <w:r>
         <w:t xml:space="preserve"> </w:t>
@@ -3546,7 +3748,7 @@
         <w:t xml:space="preserve"> </w:t>
       </w:r>
       <w:r>
-        <w:t xml:space="preserve">— any abnormal termination (transient rate-limit/socket-close, any non-completion exit, or a terminal error after the runtime's own retries are exhausted) flips the entry to</w:t>
+        <w:t xml:space="preserve">— any abnormal termination (transient rate-limit/socket-close, any non-completion exit, or a terminal error after the runtime’s own retries are exhausted) flips the entry to</w:t>
       </w:r>
       <w:r>
         <w:t xml:space="preserve"> </w:t>
@@ -3573,7 +3775,7 @@
         <w:t xml:space="preserve">complete</w:t>
       </w:r>
       <w:r>
-        <w:t xml:space="preserve">; respawn is the safe/reversible/bounded decision taken autonomously per §11.4.101 (never blocks the loop for a human), transient causes use the project's ALREADY-DEFINED backoff budgets (never invented, §11.4.6), a deterministically-reproducible non-transient terminal error is investigated per §11.4.102 before further respawn (never a blind retry loop);</w:t>
+        <w:t xml:space="preserve">; respawn is the safe/reversible/bounded decision taken autonomously per §11.4.101 (never blocks the loop for a human), transient causes use the project’s ALREADY-DEFINED backoff budgets (never invented, §11.4.6), a deterministically-reproducible non-transient terminal error is investigated per §11.4.102 before further respawn (never a blind retry loop);</w:t>
       </w:r>
       <w:r>
         <w:t xml:space="preserve"> </w:t>
@@ -3589,7 +3791,7 @@
         <w:t xml:space="preserve"> </w:t>
       </w:r>
       <w:r>
-        <w:t xml:space="preserve">— the crashed agent's uncommitted edits + output doc are PRESERVED (never silently discarded → lost, never blindly committed → corruption), the respawn runs the §11.4.84 quiescence check on the preserved tree (every modified file accounted-for vs scope, no mutation/</w:t>
+        <w:t xml:space="preserve">— the crashed agent’s uncommitted edits + output doc are PRESERVED (never silently discarded → lost, never blindly committed → corruption), the respawn runs the §11.4.84 quiescence check on the preserved tree (every modified file accounted-for vs scope, no mutation/</w:t>
       </w:r>
       <w:r>
         <w:rPr>
@@ -3635,7 +3837,35 @@
           <w:b/>
           <w:bCs/>
         </w:rPr>
-        <w:t xml:space="preserve">(d) "crash ≠ done" COMPLETION criterion</w:t>
+        <w:t xml:space="preserve">(d)</w:t>
+      </w:r>
+      <w:r>
+        <w:rPr>
+          <w:b/>
+          <w:bCs/>
+        </w:rPr>
+        <w:t xml:space="preserve"> </w:t>
+      </w:r>
+      <w:r>
+        <w:rPr>
+          <w:b/>
+          <w:bCs/>
+        </w:rPr>
+        <w:t xml:space="preserve">“crash ≠ done”</w:t>
+      </w:r>
+      <w:r>
+        <w:rPr>
+          <w:b/>
+          <w:bCs/>
+        </w:rPr>
+        <w:t xml:space="preserve"> </w:t>
+      </w:r>
+      <w:r>
+        <w:rPr>
+          <w:b/>
+          <w:bCs/>
+        </w:rPr>
+        <w:t xml:space="preserve">COMPLETION criterion</w:t>
       </w:r>
       <w:r>
         <w:t xml:space="preserve"> </w:t>
@@ -3788,7 +4018,7 @@
         <w:t xml:space="preserve"> </w:t>
       </w:r>
       <w:r>
-        <w:t xml:space="preserve">entry as the loop's done-condition</w:t>
+        <w:t xml:space="preserve">entry as the loop’s done-condition</w:t>
       </w:r>
       <w:r>
         <w:t xml:space="preserve"> </w:t>
@@ -3956,7 +4186,7 @@
         <w:t xml:space="preserve"> </w:t>
       </w:r>
       <w:r>
-        <w:t xml:space="preserve">BINDS + STRENGTHENS the workable-item discipline (§11.4.15 status / §11.4.16 type / §11.4.54 id / §11.4.21 Operator-blocked / §11.4.91 description-clarity / §11.4.93 + §11.4.95 SQLite SSoT / §11.4.106 docs_chain) into ONE integrity contract spanning DB ↔ docs ↔ external tracker, adding the operator's three emphases:</w:t>
+        <w:t xml:space="preserve">BINDS + STRENGTHENS the workable-item discipline (§11.4.15 status / §11.4.16 type / §11.4.54 id / §11.4.21 Operator-blocked / §11.4.91 description-clarity / §11.4.93 + §11.4.95 SQLite SSoT / §11.4.106 docs_chain) into ONE integrity contract spanning DB ↔ docs ↔ external tracker, adding the operator’s three emphases:</w:t>
       </w:r>
       <w:r>
         <w:t xml:space="preserve"> </w:t>
@@ -4034,10 +4264,7 @@
         <w:t xml:space="preserve"> </w:t>
       </w:r>
       <w:r>
-        <w:t xml:space="preserve">item (incl.</w:t>
-      </w:r>
-      <w:r>
-        <w:t xml:space="preserve"> </w:t>
+        <w:t xml:space="preserve">item (incl. </w:t>
       </w:r>
       <w:r>
         <w:rPr>
@@ -4079,7 +4306,7 @@
         <w:t xml:space="preserve">[A]…·[B]…·[C]…</w:t>
       </w:r>
       <w:r>
-        <w:t xml:space="preserve">, mirroring §11.4.66's 2–4-option shape); a BLOCKED item with no enumerated choices FAILs;</w:t>
+        <w:t xml:space="preserve">, mirroring §11.4.66’s 2–4-option shape); a BLOCKED item with no enumerated choices FAILs;</w:t>
       </w:r>
       <w:r>
         <w:t xml:space="preserve"> </w:t>
@@ -4138,7 +4365,7 @@
         <w:t xml:space="preserve"> </w:t>
       </w:r>
       <w:r>
-        <w:t xml:space="preserve">carries statuses (collapsed onto the tracker's native set per §11.4.33/.112 when fixed, precise value preserved in a header, never lost), types, assignee (§11.4.104 participant handle, UNSET defaults from a project env var, never hardcoded/logged §11.4.10), and sub-tasks, IDEMPOTENT (dry-run-then-real, match-by-stable-key</w:t>
+        <w:t xml:space="preserve">carries statuses (collapsed onto the tracker’s native set per §11.4.33/.112 when fixed, precise value preserved in a header, never lost), types, assignee (§11.4.104 participant handle, UNSET defaults from a project env var, never hardcoded/logged §11.4.10), and sub-tasks, IDEMPOTENT (dry-run-then-real, match-by-stable-key</w:t>
       </w:r>
       <w:r>
         <w:t xml:space="preserve"> </w:t>
@@ -4703,7 +4930,7 @@
         <w:t xml:space="preserve"> </w:t>
       </w:r>
       <w:r>
-        <w:t xml:space="preserve">external-tracker SUB-TASK model — the item task's description stays the item (§11.4.148 D2, NOT polluted with diary text), each run a CHILD sub-task (type</w:t>
+        <w:t xml:space="preserve">external-tracker SUB-TASK model — the item task’s description stays the item (§11.4.148 D2, NOT polluted with diary text), each run a CHILD sub-task (type</w:t>
       </w:r>
       <w:r>
         <w:t xml:space="preserve"> </w:t>
@@ -4761,7 +4988,7 @@
         <w:t xml:space="preserve"> </w:t>
       </w:r>
       <w:r>
-        <w:t xml:space="preserve">prose is authored by whoever ran the test; tooling only stores/renders/pushes/validates), 100% test-covered §11.4.27 (unit + integration-against-the-real-tracker with an honest §11.4.3 SKIP-when-token-absent never a faked PASS + export + HelixQA Challenge + paired §1.1 mutation) so a diary PASS-bluff is mechanically impossible. Honest boundary §11.4.6 — the diary guarantees a complete auditable per-item test-history, NOT that any single run's verdict is correct (rests on its own §11.4.69/.107/.123 evidence). Composes §11.4.6/.27/.45/.50/.55/.65/.69/.86/.93/.95/.106/.107/.123/.132/.148/.10/.13/.28/.33/.112/§1.1. Classification: universal (§11.4.17) — consumer supplies its DB path, diary doc layout, export formats, tracker sub-task field map, docs_chain context per §11.4.35. Propagation gate</w:t>
+        <w:t xml:space="preserve">prose is authored by whoever ran the test; tooling only stores/renders/pushes/validates), 100% test-covered §11.4.27 (unit + integration-against-the-real-tracker with an honest §11.4.3 SKIP-when-token-absent never a faked PASS + export + HelixQA Challenge + paired §1.1 mutation) so a diary PASS-bluff is mechanically impossible. Honest boundary §11.4.6 — the diary guarantees a complete auditable per-item test-history, NOT that any single run’s verdict is correct (rests on its own §11.4.69/.107/.123 evidence). Composes §11.4.6/.27/.45/.50/.55/.65/.69/.86/.93/.95/.106/.107/.123/.132/.148/.10/.13/.28/.33/.112/§1.1. Classification: universal (§11.4.17) — consumer supplies its DB path, diary doc layout, export formats, tracker sub-task field map, docs_chain context per §11.4.35. Propagation gate</w:t>
       </w:r>
       <w:r>
         <w:t xml:space="preserve"> </w:t>
@@ -4944,7 +5171,19 @@
         <w:t xml:space="preserve"> </w:t>
       </w:r>
       <w:r>
-        <w:t xml:space="preserve">Verbatim operator mandate: "For every single issue we fix or improvement we make — besides tight systematic-debugging, fixing, code review by independent agents, comprehensive tests — we MUST ALWAYS do deep web research from various angles! No matter how big/small/simple/complex, dig deep the internet for articles, technical documentation, APIs, open-source code — EVERYTHING that can help make the best possible solution OR confirm we don't have a more serious problem we're unaware of! We MUST do everything possible to STOP the constant issue-reopening and finally start closing items as fixed+working! Do this ALWAYS in parallel with the main work stream!" For EVERY fix / improvement / change / closure — no matter how big, small, simple, or complex — the agent MUST, IN ADDITION to tight systematic-debugging (§11.4.102), the fix, independent-agent code review (§11.4.125 / §11.4.142), and comprehensive multi-layer tests (§11.4.4(b) / §11.4.40), perform a DOCUMENTED</w:t>
+        <w:t xml:space="preserve">Verbatim operator mandate:</w:t>
+      </w:r>
+      <w:r>
+        <w:t xml:space="preserve"> </w:t>
+      </w:r>
+      <w:r>
+        <w:t xml:space="preserve">“For every single issue we fix or improvement we make — besides tight systematic-debugging, fixing, code review by independent agents, comprehensive tests — we MUST ALWAYS do deep web research from various angles! No matter how big/small/simple/complex, dig deep the internet for articles, technical documentation, APIs, open-source code — EVERYTHING that can help make the best possible solution OR confirm we don’t have a more serious problem we’re unaware of! We MUST do everything possible to STOP the constant issue-reopening and finally start closing items as fixed+working! Do this ALWAYS in parallel with the main work stream!”</w:t>
+      </w:r>
+      <w:r>
+        <w:t xml:space="preserve"> </w:t>
+      </w:r>
+      <w:r>
+        <w:t xml:space="preserve">For EVERY fix / improvement / change / closure — no matter how big, small, simple, or complex — the agent MUST, IN ADDITION to tight systematic-debugging (§11.4.102), the fix, independent-agent code review (§11.4.125 / §11.4.142), and comprehensive multi-layer tests (§11.4.4(b) / §11.4.40), perform a DOCUMENTED</w:t>
       </w:r>
       <w:r>
         <w:t xml:space="preserve"> </w:t>
@@ -4975,7 +5214,19 @@
         <w:t xml:space="preserve"> </w:t>
       </w:r>
       <w:r>
-        <w:t xml:space="preserve">(§11.4.112 secure-surface pixel-blanking) was OVERTURNED by a deep multi-angle research pass that surfaced the real OCR-of-the-PRIMARY-display path — a "we can't" became a shipped capability; the canonical anti-pattern of a structural verdict reached for want of research. The mandate (ALL hold):</w:t>
+        <w:t xml:space="preserve">(§11.4.112 secure-surface pixel-blanking) was OVERTURNED by a deep multi-angle research pass that surfaced the real OCR-of-the-PRIMARY-display path — a</w:t>
+      </w:r>
+      <w:r>
+        <w:t xml:space="preserve"> </w:t>
+      </w:r>
+      <w:r>
+        <w:t xml:space="preserve">“we can’t”</w:t>
+      </w:r>
+      <w:r>
+        <w:t xml:space="preserve"> </w:t>
+      </w:r>
+      <w:r>
+        <w:t xml:space="preserve">became a shipped capability; the canonical anti-pattern of a structural verdict reached for want of research. The mandate (ALL hold):</w:t>
       </w:r>
       <w:r>
         <w:t xml:space="preserve"> </w:t>
@@ -5039,7 +5290,7 @@
         <w:t xml:space="preserve"> </w:t>
       </w:r>
       <w:r>
-        <w:t xml:space="preserve">won't-fix (§11.4.112) until a deep multi-angle pass is documented; §11.4.150 makes §11.4.8's pass UNCONDITIONAL (every item, however trivial, at the closure AND structural-verdict gates).</w:t>
+        <w:t xml:space="preserve">won’t-fix (§11.4.112) until a deep multi-angle pass is documented; §11.4.150 makes §11.4.8’s pass UNCONDITIONAL (every item, however trivial, at the closure AND structural-verdict gates).</w:t>
       </w:r>
       <w:r>
         <w:t xml:space="preserve"> </w:t>
@@ -5071,7 +5322,19 @@
         <w:t xml:space="preserve"> </w:t>
       </w:r>
       <w:r>
-        <w:t xml:space="preserve">— explicitly seek evidence the fix does not mask a deeper defect AND the closure/verdict is genuinely safe; "we found nothing worse" requires the enumerated search (§11.4.118).</w:t>
+        <w:t xml:space="preserve">— explicitly seek evidence the fix does not mask a deeper defect AND the closure/verdict is genuinely safe;</w:t>
+      </w:r>
+      <w:r>
+        <w:t xml:space="preserve"> </w:t>
+      </w:r>
+      <w:r>
+        <w:t xml:space="preserve">“we found nothing worse”</w:t>
+      </w:r>
+      <w:r>
+        <w:t xml:space="preserve"> </w:t>
+      </w:r>
+      <w:r>
+        <w:t xml:space="preserve">requires the enumerated search (§11.4.118).</w:t>
       </w:r>
       <w:r>
         <w:t xml:space="preserve"> </w:t>
@@ -5162,7 +5425,19 @@
         <w:t xml:space="preserve"> </w:t>
       </w:r>
       <w:r>
-        <w:t xml:space="preserve">— retroactively + going forward across the §11.4.93 / §11.4.95 SSoT; items closed without a documented pass are re-audited in the §11.4.40 / §11.4.42 release-gate sweep. Honest boundary (§11.4.6): the pass reduces the unknown-unknown surface + breaks the most common reopen causes — it does NOT prove zero remaining defects (§11.4.118) and does NOT replace §11.4.108 runtime-signature verification, §11.4.125 / §11.4.142 review, or §11.4.40 retest; it is the research layer every fix/closure/structural-verdict additionally crosses, and "we probably don't have a bigger problem" without the enumerated multi-angle search is a guess (§11.4.6), never a finding. Composes §11.4.8 / §11.4.99 / §11.4.123 / §11.4.118 / §11.4.145 / §11.4.125 / §11.4.142 / §11.4.7 / §11.4.112 / §11.4.34 / §11.4.55 / §11.4.70 / §11.4.20 / §11.4.89 / §11.4.103 / §11.4.40 / §11.4.42 / §11.4.93 / §11.4.95 / §11.4.6 / §1.1. Classification: universal (§11.4.17) — the consuming project supplies its concrete research corpora, angle set, item tracker, and closure-commit-footer convention per §11.4.35. Propagation gate</w:t>
+        <w:t xml:space="preserve">— retroactively + going forward across the §11.4.93 / §11.4.95 SSoT; items closed without a documented pass are re-audited in the §11.4.40 / §11.4.42 release-gate sweep. Honest boundary (§11.4.6): the pass reduces the unknown-unknown surface + breaks the most common reopen causes — it does NOT prove zero remaining defects (§11.4.118) and does NOT replace §11.4.108 runtime-signature verification, §11.4.125 / §11.4.142 review, or §11.4.40 retest; it is the research layer every fix/closure/structural-verdict additionally crosses, and</w:t>
+      </w:r>
+      <w:r>
+        <w:t xml:space="preserve"> </w:t>
+      </w:r>
+      <w:r>
+        <w:t xml:space="preserve">“we probably don’t have a bigger problem”</w:t>
+      </w:r>
+      <w:r>
+        <w:t xml:space="preserve"> </w:t>
+      </w:r>
+      <w:r>
+        <w:t xml:space="preserve">without the enumerated multi-angle search is a guess (§11.4.6), never a finding. Composes §11.4.8 / §11.4.99 / §11.4.123 / §11.4.118 / §11.4.145 / §11.4.125 / §11.4.142 / §11.4.7 / §11.4.112 / §11.4.34 / §11.4.55 / §11.4.70 / §11.4.20 / §11.4.89 / §11.4.103 / §11.4.40 / §11.4.42 / §11.4.93 / §11.4.95 / §11.4.6 / §1.1. Classification: universal (§11.4.17) — the consuming project supplies its concrete research corpora, angle set, item tracker, and closure-commit-footer convention per §11.4.35. Propagation gate</w:t>
       </w:r>
       <w:r>
         <w:t xml:space="preserve"> </w:t>
@@ -5372,10 +5647,13 @@
         <w:t xml:space="preserve"> </w:t>
       </w:r>
       <w:r>
-        <w:t xml:space="preserve">Verbatim operator mandate: "Every release tag and version name we create — on the main repository and on every Submodule we own — MUST be prefixed with the project's release prefix, e.g.</w:t>
-      </w:r>
-      <w:r>
-        <w:t xml:space="preserve"> </w:t>
+        <w:t xml:space="preserve">Verbatim operator mandate:</w:t>
+      </w:r>
+      <w:r>
+        <w:t xml:space="preserve"> </w:t>
+      </w:r>
+      <w:r>
+        <w:t xml:space="preserve">“Every release tag and version name we create — on the main repository and on every Submodule we own — MUST be prefixed with the project’s release prefix, e.g. </w:t>
       </w:r>
       <w:r>
         <w:rPr>
@@ -5414,7 +5692,13 @@
         <w:t xml:space="preserve"> </w:t>
       </w:r>
       <w:r>
-        <w:t xml:space="preserve">if it is set, otherwise from the lowercased project root directory name. The SAME prefix MUST be used across the main repo and all owned Submodules in one release so a release is greppable across every repository." Every release tag AND every version name created on the main repository AND on every owned-by-us submodule (§11.4.28) MUST be prefixed with the project's release prefix, form</w:t>
+        <w:t xml:space="preserve">if it is set, otherwise from the lowercased project root directory name. The SAME prefix MUST be used across the main repo and all owned Submodules in one release so a release is greppable across every repository.”</w:t>
+      </w:r>
+      <w:r>
+        <w:t xml:space="preserve"> </w:t>
+      </w:r>
+      <w:r>
+        <w:t xml:space="preserve">Every release tag AND every version name created on the main repository AND on every owned-by-us submodule (§11.4.28) MUST be prefixed with the project’s release prefix, form</w:t>
       </w:r>
       <w:r>
         <w:t xml:space="preserve"> </w:t>
@@ -5487,7 +5771,7 @@
         <w:t xml:space="preserve"> </w:t>
       </w:r>
       <w:r>
-        <w:t xml:space="preserve">from the project's</w:t>
+        <w:t xml:space="preserve">from the project’s</w:t>
       </w:r>
       <w:r>
         <w:t xml:space="preserve"> </w:t>
@@ -5779,7 +6063,19 @@
         <w:t xml:space="preserve"> </w:t>
       </w:r>
       <w:r>
-        <w:t xml:space="preserve">Verbatim operator intent: "For every project that has Firebase Crashlytics enabled / wired, we MUST continuously monitor ALL of the Crashlytics-recorded data — crashes, ANRs, performance traces, and non-fatals — systematically debug each, fix and improve, and cover everything with validation and verification tests. This MUST be checked regularly, with no false results and no bluff of any kind!" Every project that has Firebase Crashlytics enabled/wired (SDK linked into a shipping artifact, crash+non-fatal+ANR reporting active) MUST treat the Crashlytics console as a first-class captured-evidence channel from real end-user devices and continuously process every datum it records — an open Crashlytics issue with a green test suite is a §11.4 PASS-bluff at the field-telemetry layer (a real user hitting a broken feature while the suite reports green). STRENGTHENS+COMPLETES §11.4.47: §11.4.47 owns the periodic REVIEW + dedup + Issue-creation pass that SURFACES Crashlytics/Analytics/Performance findings; §11.4.152 owns what happens to each surfaced item AFTER — the systematic-debug → fix/improve → regression-test-coverage lifecycle that drives it to a proven regression-immune closure (§11.4.47 finds it; §11.4.152 fixes it + proves it stays fixed; both mandatory, neither substitutes). The mandate (ALL hold): (1)</w:t>
+        <w:t xml:space="preserve">Verbatim operator intent:</w:t>
+      </w:r>
+      <w:r>
+        <w:t xml:space="preserve"> </w:t>
+      </w:r>
+      <w:r>
+        <w:t xml:space="preserve">“For every project that has Firebase Crashlytics enabled / wired, we MUST continuously monitor ALL of the Crashlytics-recorded data — crashes, ANRs, performance traces, and non-fatals — systematically debug each, fix and improve, and cover everything with validation and verification tests. This MUST be checked regularly, with no false results and no bluff of any kind!”</w:t>
+      </w:r>
+      <w:r>
+        <w:t xml:space="preserve"> </w:t>
+      </w:r>
+      <w:r>
+        <w:t xml:space="preserve">Every project that has Firebase Crashlytics enabled/wired (SDK linked into a shipping artifact, crash+non-fatal+ANR reporting active) MUST treat the Crashlytics console as a first-class captured-evidence channel from real end-user devices and continuously process every datum it records — an open Crashlytics issue with a green test suite is a §11.4 PASS-bluff at the field-telemetry layer (a real user hitting a broken feature while the suite reports green). STRENGTHENS+COMPLETES §11.4.47: §11.4.47 owns the periodic REVIEW + dedup + Issue-creation pass that SURFACES Crashlytics/Analytics/Performance findings; §11.4.152 owns what happens to each surfaced item AFTER — the systematic-debug → fix/improve → regression-test-coverage lifecycle that drives it to a proven regression-immune closure (§11.4.47 finds it; §11.4.152 fixes it + proves it stays fixed; both mandatory, neither substitutes). The mandate (ALL hold): (1)</w:t>
       </w:r>
       <w:r>
         <w:t xml:space="preserve"> </w:t>
@@ -5827,7 +6123,19 @@
         <w:t xml:space="preserve"> </w:t>
       </w:r>
       <w:r>
-        <w:t xml:space="preserve">against its proven root cause (§11.4.9/.43/.108), "acknowledged in console" is not a fix, muting a recurring issue without a tracked rationale is a §11.4.6/.90 violation; (4)</w:t>
+        <w:t xml:space="preserve">against its proven root cause (§11.4.9/.43/.108),</w:t>
+      </w:r>
+      <w:r>
+        <w:t xml:space="preserve"> </w:t>
+      </w:r>
+      <w:r>
+        <w:t xml:space="preserve">“acknowledged in console”</w:t>
+      </w:r>
+      <w:r>
+        <w:t xml:space="preserve"> </w:t>
+      </w:r>
+      <w:r>
+        <w:t xml:space="preserve">is not a fix, muting a recurring issue without a tracked rationale is a §11.4.6/.90 violation; (4)</w:t>
       </w:r>
       <w:r>
         <w:t xml:space="preserve"> </w:t>
@@ -5905,7 +6213,43 @@
         <w:t xml:space="preserve"> </w:t>
       </w:r>
       <w:r>
-        <w:t xml:space="preserve">(§11.4/.1/.6 — "no new issues" requires the enumerated monitored-surfaces+window §11.4.118; "fixed" requires the RED→GREEN flip §11.4.115/.130; a guard whose §1.1 mutation does not FAIL it is a bluff gate). Honest boundary §11.4.6: processing every recorded issue breaks the silent-recurrence vector — it does NOT prove zero remaining field defects nor replace §11.4.108/.40; an issue is "closed" only when its guard is GREEN on a clean artifact, never when the console mark is flipped. Classification: universal (§11.4.17) — the consuming project supplies its Crashlytics handle, console-access credential (§11.4.10, never logged), severity table, and per-issue closure-log path per §11.4.35; the reference project-level instantiation is a consuming project's §6.O (Crashlytics-Resolved Issue Coverage — per-issue validation test + Challenge test +</w:t>
+        <w:t xml:space="preserve">(§11.4/.1/.6 —</w:t>
+      </w:r>
+      <w:r>
+        <w:t xml:space="preserve"> </w:t>
+      </w:r>
+      <w:r>
+        <w:t xml:space="preserve">“no new issues”</w:t>
+      </w:r>
+      <w:r>
+        <w:t xml:space="preserve"> </w:t>
+      </w:r>
+      <w:r>
+        <w:t xml:space="preserve">requires the enumerated monitored-surfaces+window §11.4.118;</w:t>
+      </w:r>
+      <w:r>
+        <w:t xml:space="preserve"> </w:t>
+      </w:r>
+      <w:r>
+        <w:t xml:space="preserve">“fixed”</w:t>
+      </w:r>
+      <w:r>
+        <w:t xml:space="preserve"> </w:t>
+      </w:r>
+      <w:r>
+        <w:t xml:space="preserve">requires the RED→GREEN flip §11.4.115/.130; a guard whose §1.1 mutation does not FAIL it is a bluff gate). Honest boundary §11.4.6: processing every recorded issue breaks the silent-recurrence vector — it does NOT prove zero remaining field defects nor replace §11.4.108/.40; an issue is</w:t>
+      </w:r>
+      <w:r>
+        <w:t xml:space="preserve"> </w:t>
+      </w:r>
+      <w:r>
+        <w:t xml:space="preserve">“closed”</w:t>
+      </w:r>
+      <w:r>
+        <w:t xml:space="preserve"> </w:t>
+      </w:r>
+      <w:r>
+        <w:t xml:space="preserve">only when its guard is GREEN on a clean artifact, never when the console mark is flipped. Classification: universal (§11.4.17) — the consuming project supplies its Crashlytics handle, console-access credential (§11.4.10, never logged), severity table, and per-issue closure-log path per §11.4.35; the reference project-level instantiation is a consuming project’s §6.O (Crashlytics-Resolved Issue Coverage — per-issue validation test + Challenge test +</w:t>
       </w:r>
       <w:r>
         <w:t xml:space="preserve"> </w:t>
@@ -6203,7 +6547,19 @@
         <w:t xml:space="preserve"> </w:t>
       </w:r>
       <w:r>
-        <w:t xml:space="preserve">— every user-visible "confirmed" claim backed by a recorded real-use video of a genuine end-user scenario (real prompts → real LLM/service responses → real results), NEVER a frozen/stale frame (§11.4.107), NEVER faked/mocked/demo-loop/bluff response or LLM error passed off as success (§11.4.2/§11.4.5), stored at the project-declared recording path (§11.4.35); a confirmed row with no real video or a bluff video = §11.4 PASS-bluff; autonomous-infeasible ⇒ honest §11.4.3/§11.4.52 SKIP + tracked migration item, NEVER a faked confirmation. (4)</w:t>
+        <w:t xml:space="preserve">— every user-visible</w:t>
+      </w:r>
+      <w:r>
+        <w:t xml:space="preserve"> </w:t>
+      </w:r>
+      <w:r>
+        <w:t xml:space="preserve">“confirmed”</w:t>
+      </w:r>
+      <w:r>
+        <w:t xml:space="preserve"> </w:t>
+      </w:r>
+      <w:r>
+        <w:t xml:space="preserve">claim backed by a recorded real-use video of a genuine end-user scenario (real prompts → real LLM/service responses → real results), NEVER a frozen/stale frame (§11.4.107), NEVER faked/mocked/demo-loop/bluff response or LLM error passed off as success (§11.4.2/§11.4.5), stored at the project-declared recording path (§11.4.35); a confirmed row with no real video or a bluff video = §11.4 PASS-bluff; autonomous-infeasible ⇒ honest §11.4.3/§11.4.52 SKIP + tracked migration item, NEVER a faked confirmation. (4)</w:t>
       </w:r>
       <w:r>
         <w:t xml:space="preserve"> </w:t>
@@ -6219,7 +6575,19 @@
         <w:t xml:space="preserve"> </w:t>
       </w:r>
       <w:r>
-        <w:t xml:space="preserve">— every video analysed; any defect it surfaces triggers §11.4.102 systematic-debug → fix → §11.4.146 retest → re-record → clean GO per §11.4.134 before "confirmed" (a video exposing a broken feature is a §11.4.4 test-interrupt). (5)</w:t>
+        <w:t xml:space="preserve">— every video analysed; any defect it surfaces triggers §11.4.102 systematic-debug → fix → §11.4.146 retest → re-record → clean GO per §11.4.134 before</w:t>
+      </w:r>
+      <w:r>
+        <w:t xml:space="preserve"> </w:t>
+      </w:r>
+      <w:r>
+        <w:t xml:space="preserve">“confirmed”</w:t>
+      </w:r>
+      <w:r>
+        <w:t xml:space="preserve"> </w:t>
+      </w:r>
+      <w:r>
+        <w:t xml:space="preserve">(a video exposing a broken feature is a §11.4.4 test-interrupt). (5)</w:t>
       </w:r>
       <w:r>
         <w:t xml:space="preserve"> </w:t>
@@ -6313,7 +6681,7 @@
         <w:t xml:space="preserve"> </w:t>
       </w:r>
       <w:r>
-        <w:t xml:space="preserve">files are supplementary only. Honest boundary §11.4.6 — guarantees a complete video-confirmed always-synced ledger, NOT per-feature correctness (rests on each row's §11.4.69/.107/.123 evidence) and NOT a §11.4.40 retest substitute. Classification: universal (§11.4.17). Composes §11.4.2/.5/.44/.45/.52/.56/.57/.59/.60/.65/.86/.102/.106/.107/.108/.118/.123/.134/.146/§1.1. Propagation gate</w:t>
+        <w:t xml:space="preserve">files are supplementary only. Honest boundary §11.4.6 — guarantees a complete video-confirmed always-synced ledger, NOT per-feature correctness (rests on each row’s §11.4.69/.107/.123 evidence) and NOT a §11.4.40 retest substitute. Classification: universal (§11.4.17). Composes §11.4.2/.5/.44/.45/.52/.56/.57/.59/.60/.65/.86/.102/.106/.107/.108/.118/.123/.134/.146/§1.1. Propagation gate</w:t>
       </w:r>
       <w:r>
         <w:t xml:space="preserve"> </w:t>
@@ -6522,7 +6890,31 @@
         <w:t xml:space="preserve"> </w:t>
       </w:r>
       <w:r>
-        <w:t xml:space="preserve">Verbatim: "recording you perform does record the window containing apps and services, not the whole desktop or monitor screen!" + "All old recording files MUST BE removed when new one starts!" Refines §11.4.2/.5/.107/.153 recording discipline with two capture-hygiene invariants.</w:t>
+        <w:t xml:space="preserve">Verbatim:</w:t>
+      </w:r>
+      <w:r>
+        <w:t xml:space="preserve"> </w:t>
+      </w:r>
+      <w:r>
+        <w:t xml:space="preserve">“recording you perform does record the window containing apps and services, not the whole desktop or monitor screen!”</w:t>
+      </w:r>
+      <w:r>
+        <w:t xml:space="preserve"> </w:t>
+      </w:r>
+      <w:r>
+        <w:t xml:space="preserve">+</w:t>
+      </w:r>
+      <w:r>
+        <w:t xml:space="preserve"> </w:t>
+      </w:r>
+      <w:r>
+        <w:t xml:space="preserve">“All old recording files MUST BE removed when new one starts!”</w:t>
+      </w:r>
+      <w:r>
+        <w:t xml:space="preserve"> </w:t>
+      </w:r>
+      <w:r>
+        <w:t xml:space="preserve">Refines §11.4.2/.5/.107/.153 recording discipline with two capture-hygiene invariants.</w:t>
       </w:r>
       <w:r>
         <w:t xml:space="preserve"> </w:t>
@@ -6554,7 +6946,19 @@
         <w:t xml:space="preserve"> </w:t>
       </w:r>
       <w:r>
-        <w:t xml:space="preserve">— when a new recording run for a scope begins, the agent's OWN prior in-scope stale recordings at the raw recording path MUST be removed FIRST so the live corpus reflects the current run (§11.4.107 not-stale + §11.4.86 roster-freshness). Honest boundary (§11.4.6 + §9.2): "remove old" = the agent's own prior recordings for the SAME scope/project ONLY — NEVER another project's/scope's/operator-authored files; uncertain ⇒ surface, don't delete (§11.4.122); committed</w:t>
+        <w:t xml:space="preserve">— when a new recording run for a scope begins, the agent’s OWN prior in-scope stale recordings at the raw recording path MUST be removed FIRST so the live corpus reflects the current run (§11.4.107 not-stale + §11.4.86 roster-freshness). Honest boundary (§11.4.6 + §9.2):</w:t>
+      </w:r>
+      <w:r>
+        <w:t xml:space="preserve"> </w:t>
+      </w:r>
+      <w:r>
+        <w:t xml:space="preserve">“remove old”</w:t>
+      </w:r>
+      <w:r>
+        <w:t xml:space="preserve"> </w:t>
+      </w:r>
+      <w:r>
+        <w:t xml:space="preserve">= the agent’s own prior recordings for the SAME scope/project ONLY — NEVER another project’s/scope’s/operator-authored files; uncertain ⇒ surface, don’t delete (§11.4.122); committed</w:t>
       </w:r>
       <w:r>
         <w:t xml:space="preserve"> </w:t>
@@ -6833,7 +7237,19 @@
         <w:t xml:space="preserve"> </w:t>
       </w:r>
       <w:r>
-        <w:t xml:space="preserve">Verbatim: "All recorded videos MUST START with prefix: the PROJECT NAME (ALWAYS USE THE PROJECT NAME). Project name MUST be obtained according to the constitution's own project-name resolution." Every recorded video the project produces — every feature/QA real-use recording (§11.4.153), every window-scoped capture (§11.4.154), every always-on device recording (§11.4.128), every raw or curated artefact at the project-declared recording path (§11.4.35) + the committed</w:t>
+        <w:t xml:space="preserve">Verbatim:</w:t>
+      </w:r>
+      <w:r>
+        <w:t xml:space="preserve"> </w:t>
+      </w:r>
+      <w:r>
+        <w:t xml:space="preserve">“All recorded videos MUST START with prefix: the PROJECT NAME (ALWAYS USE THE PROJECT NAME). Project name MUST be obtained according to the constitution’s own project-name resolution.”</w:t>
+      </w:r>
+      <w:r>
+        <w:t xml:space="preserve"> </w:t>
+      </w:r>
+      <w:r>
+        <w:t xml:space="preserve">Every recorded video the project produces — every feature/QA real-use recording (§11.4.153), every window-scoped capture (§11.4.154), every always-on device recording (§11.4.128), every raw or curated artefact at the project-declared recording path (§11.4.35) + the committed</w:t>
       </w:r>
       <w:r>
         <w:t xml:space="preserve"> </w:t>
@@ -6951,7 +7367,7 @@
         <w:t xml:space="preserve"> </w:t>
       </w:r>
       <w:r>
-        <w:t xml:space="preserve">delimits the prefix unambiguously); MUST equal the §11.4.151-resolved release-tag prefix (divergence is itself a §11.4.155 violation — one project, one name). Honest boundary (§11.4.6): the prefix guarantees attribution + greppability, NOT content validity (still §11.4.107/.137/.153) and does NOT relax §11.4.154's window-scope/rotation (rotation removes the agent's OWN</w:t>
+        <w:t xml:space="preserve">delimits the prefix unambiguously); MUST equal the §11.4.151-resolved release-tag prefix (divergence is itself a §11.4.155 violation — one project, one name). Honest boundary (§11.4.6): the prefix guarantees attribution + greppability, NOT content validity (still §11.4.107/.137/.153) and does NOT relax §11.4.154’s window-scope/rotation (rotation removes the agent’s OWN</w:t>
       </w:r>
       <w:r>
         <w:t xml:space="preserve"> </w:t>
@@ -7124,7 +7540,19 @@
         <w:t xml:space="preserve"> </w:t>
       </w:r>
       <w:r>
-        <w:t xml:space="preserve">Verbatim operator mandate: "Any GitHub actions or GitLab pipelines MUST BE disabled! Add this critical mandatory rule / mandatory constraint into the root constitution Submodule, commit and fetch all its changes to all upstreams and make sure we respect and follow this rule (we do apply it) ASAP!!!" Every repository this Constitution governs — main repo, this constitution submodule, every owned + nested submodule we author and push — MUST ship with ALL server-side CI/CD automation DISABLED: no push to any owned upstream may trigger a GitHub Actions run, GitLab pipeline, or equivalent (Jenkins/CircleCI/Travis/Drone/Woodpecker/Bitbucket/Azure, any</w:t>
+        <w:t xml:space="preserve">Verbatim operator mandate:</w:t>
+      </w:r>
+      <w:r>
+        <w:t xml:space="preserve"> </w:t>
+      </w:r>
+      <w:r>
+        <w:t xml:space="preserve">“Any GitHub actions or GitLab pipelines MUST BE disabled! Add this critical mandatory rule / mandatory constraint into the root constitution Submodule, commit and fetch all its changes to all upstreams and make sure we respect and follow this rule (we do apply it) ASAP!!!”</w:t>
+      </w:r>
+      <w:r>
+        <w:t xml:space="preserve"> </w:t>
+      </w:r>
+      <w:r>
+        <w:t xml:space="preserve">Every repository this Constitution governs — main repo, this constitution submodule, every owned + nested submodule we author and push — MUST ship with ALL server-side CI/CD automation DISABLED: no push to any owned upstream may trigger a GitHub Actions run, GitLab pipeline, or equivalent (Jenkins/CircleCI/Travis/Drone/Woodpecker/Bitbucket/Azure, any</w:t>
       </w:r>
       <w:r>
         <w:t xml:space="preserve"> </w:t>
@@ -7258,7 +7686,13 @@
         <w:t xml:space="preserve"> </w:t>
       </w:r>
       <w:r>
-        <w:t xml:space="preserve">"disabled" = a push triggers ZERO runs — delete OR rename to a non-trigger name (§11.4.75</w:t>
+        <w:t xml:space="preserve">“disabled”</w:t>
+      </w:r>
+      <w:r>
+        <w:t xml:space="preserve"> </w:t>
+      </w:r>
+      <w:r>
+        <w:t xml:space="preserve">= a push triggers ZERO runs — delete OR rename to a non-trigger name (§11.4.75</w:t>
       </w:r>
       <w:r>
         <w:t xml:space="preserve"> </w:t>
@@ -7340,7 +7774,19 @@
         <w:t xml:space="preserve">prebuilts/**</w:t>
       </w:r>
       <w:r>
-        <w:t xml:space="preserve">, vendored submodules) are INERT (a provider never runs a non-root config), OUT of scope, MUST NOT be mass-edited (§11.4.29 vendor-exempt); test = "does a push to OUR upstream trigger a run?" yes⇒disable, inert⇒document+leave (§11.4.6 verify-not-assume);</w:t>
+        <w:t xml:space="preserve">, vendored submodules) are INERT (a provider never runs a non-root config), OUT of scope, MUST NOT be mass-edited (§11.4.29 vendor-exempt); test =</w:t>
+      </w:r>
+      <w:r>
+        <w:t xml:space="preserve"> </w:t>
+      </w:r>
+      <w:r>
+        <w:t xml:space="preserve">“does a push to OUR upstream trigger a run?”</w:t>
+      </w:r>
+      <w:r>
+        <w:t xml:space="preserve"> </w:t>
+      </w:r>
+      <w:r>
+        <w:t xml:space="preserve">yes⇒disable, inert⇒document+leave (§11.4.6 verify-not-assume);</w:t>
       </w:r>
       <w:r>
         <w:t xml:space="preserve"> </w:t>
@@ -7573,7 +8019,19 @@
         <w:t xml:space="preserve"> </w:t>
       </w:r>
       <w:r>
-        <w:t xml:space="preserve">Verbatim operator mandate: "Make sure with CLAUDE.md, AGENTS.md, QWEN.md we maintain GEMINI.md too! Add this mandatory fact / rule to root constitution Submodule we are inheriting / extending - CONSITUTION.md, CLAUDE.md, QWEN.md, AGENTS.md, GEMINI.md and other related relevant files!" Forensic FACT (2026-06-15): when §11.4.156/§11.4.157 were authored, Constitution/CLAUDE/AGENTS/QWEN carried the family through §11.4.155 but GEMINI.md had silently drifted to §11.4.141 — 14 mandates (§11.4.142–155) never propagated — a §11.4 propagation-bluff (a Gemini-CLI agent reads a stale Constitution). GEMINI.md is a FIRST-CLASS governance context carrier EQUAL to CLAUDE.md/AGENTS.md/QWEN.md, never optional/best-effort. ALL hold:</w:t>
+        <w:t xml:space="preserve">Verbatim operator mandate:</w:t>
+      </w:r>
+      <w:r>
+        <w:t xml:space="preserve"> </w:t>
+      </w:r>
+      <w:r>
+        <w:t xml:space="preserve">“Make sure with CLAUDE.md, AGENTS.md, QWEN.md we maintain GEMINI.md too! Add this mandatory fact / rule to root constitution Submodule we are inheriting / extending - CONSITUTION.md, CLAUDE.md, QWEN.md, AGENTS.md, GEMINI.md and other related relevant files!”</w:t>
+      </w:r>
+      <w:r>
+        <w:t xml:space="preserve"> </w:t>
+      </w:r>
+      <w:r>
+        <w:t xml:space="preserve">Forensic FACT (2026-06-15): when §11.4.156/§11.4.157 were authored, Constitution/CLAUDE/AGENTS/QWEN carried the family through §11.4.155 but GEMINI.md had silently drifted to §11.4.141 — 14 mandates (§11.4.142–155) never propagated — a §11.4 propagation-bluff (a Gemini-CLI agent reads a stale Constitution). GEMINI.md is a FIRST-CLASS governance context carrier EQUAL to CLAUDE.md/AGENTS.md/QWEN.md, never optional/best-effort. ALL hold:</w:t>
       </w:r>
       <w:r>
         <w:t xml:space="preserve"> </w:t>
@@ -7605,7 +8063,7 @@
         <w:t xml:space="preserve"> </w:t>
       </w:r>
       <w:r>
-        <w:t xml:space="preserve">no silent drift — GEMINI.md lagging the other mirrors' highest rule is a §11.4.157 violation (§11.4.65-class), back-fill required;</w:t>
+        <w:t xml:space="preserve">no silent drift — GEMINI.md lagging the other mirrors’ highest rule is a §11.4.157 violation (§11.4.65-class), back-fill required;</w:t>
       </w:r>
       <w:r>
         <w:t xml:space="preserve"> </w:t>
@@ -7652,7 +8110,19 @@
         <w:t xml:space="preserve"> </w:t>
       </w:r>
       <w:r>
-        <w:t xml:space="preserve">consumer projects' own CLAUDE/AGENTS/QWEN/GEMINI bind too (§11.4.35). Honest boundary (§11.4.6): the §11.4.142–155 GEMINI.md back-fill is a tracked release-blocking remediation; claiming GEMINI.md "in sync" while the back-fill is incomplete is itself a §11.4.157 violation. Composes §11.4.26/.35/.17/.44/.65/.140/.156/§1.1. Classification: universal (§11.4.17). Propagation gate</w:t>
+        <w:t xml:space="preserve">consumer projects’ own CLAUDE/AGENTS/QWEN/GEMINI bind too (§11.4.35). Honest boundary (§11.4.6): the §11.4.142–155 GEMINI.md back-fill is a tracked release-blocking remediation; claiming GEMINI.md</w:t>
+      </w:r>
+      <w:r>
+        <w:t xml:space="preserve"> </w:t>
+      </w:r>
+      <w:r>
+        <w:t xml:space="preserve">“in sync”</w:t>
+      </w:r>
+      <w:r>
+        <w:t xml:space="preserve"> </w:t>
+      </w:r>
+      <w:r>
+        <w:t xml:space="preserve">while the back-fill is incomplete is itself a §11.4.157 violation. Composes §11.4.26/.35/.17/.44/.65/.140/.156/§1.1. Classification: universal (§11.4.17). Propagation gate</w:t>
       </w:r>
       <w:r>
         <w:t xml:space="preserve"> </w:t>
@@ -7796,7 +8266,31 @@
         <w:t xml:space="preserve"> </w:t>
       </w:r>
       <w:r>
-        <w:t xml:space="preserve">Every project MUST be covered by intensive automated testing that exercises + RECORDS every feature/flow/use-case/edge-case (valid/invalid/boundary/concurrent/failure-injection §11.4.85), each recording showing the feature GENUINELY WORKING with REAL results (real prompts→real responses→real outputs §11.4.153) and NO false/simulated/stale/frozen result (§11.4.2/.5/.107) — a recording showing an error/bluff/non-working feature is a FINDING (→§11.4.153(4)/§11.4.4 fix→retest→re-record), never a confirmation. The testing System MUST ACTUALLY READ every shown log line / message / UI label / dialog / toast / status text and VERIFY it is a genuine working result (OCR/ROI §11.4.117/.137 + confidence floor for pixel surfaces; direct capture for terminal/log; §11.4.107(10) self-validated golden-good/golden-bad analyzer) — "a video was produced" is NOT evidence, "the System read the screen + confirmed a genuine result" is. HelixQA (§11.4.27) MUST drive this exercise→record→read→score pass, PASS only on a read-confirmed genuine result + captured artefact path (§11.4.69). Default recording save path =</w:t>
+        <w:t xml:space="preserve">Every project MUST be covered by intensive automated testing that exercises + RECORDS every feature/flow/use-case/edge-case (valid/invalid/boundary/concurrent/failure-injection §11.4.85), each recording showing the feature GENUINELY WORKING with REAL results (real prompts→real responses→real outputs §11.4.153) and NO false/simulated/stale/frozen result (§11.4.2/.5/.107) — a recording showing an error/bluff/non-working feature is a FINDING (→§11.4.153(4)/§11.4.4 fix→retest→re-record), never a confirmation. The testing System MUST ACTUALLY READ every shown log line / message / UI label / dialog / toast / status text and VERIFY it is a genuine working result (OCR/ROI §11.4.117/.137 + confidence floor for pixel surfaces; direct capture for terminal/log; §11.4.107(10) self-validated golden-good/golden-bad analyzer) —</w:t>
+      </w:r>
+      <w:r>
+        <w:t xml:space="preserve"> </w:t>
+      </w:r>
+      <w:r>
+        <w:t xml:space="preserve">“a video was produced”</w:t>
+      </w:r>
+      <w:r>
+        <w:t xml:space="preserve"> </w:t>
+      </w:r>
+      <w:r>
+        <w:t xml:space="preserve">is NOT evidence,</w:t>
+      </w:r>
+      <w:r>
+        <w:t xml:space="preserve"> </w:t>
+      </w:r>
+      <w:r>
+        <w:t xml:space="preserve">“the System read the screen + confirmed a genuine result”</w:t>
+      </w:r>
+      <w:r>
+        <w:t xml:space="preserve"> </w:t>
+      </w:r>
+      <w:r>
+        <w:t xml:space="preserve">is. HelixQA (§11.4.27) MUST drive this exercise→record→read→score pass, PASS only on a read-confirmed genuine result + captured artefact path (§11.4.69). Default recording save path =</w:t>
       </w:r>
       <w:r>
         <w:t xml:space="preserve"> </w:t>
@@ -7811,7 +8305,7 @@
         <w:t xml:space="preserve"> </w:t>
       </w:r>
       <w:r>
-        <w:t xml:space="preserve">(host user's home Downloads, resolved at runtime never hardcoded) unless a project declares an override per §11.4.35; §11.4.155 project-prefix + §11.4.154 window-scope/rotation + §11.4.128 git-ignored raw corpus + §11.4.83 curated docs/qa evidence apply.</w:t>
+        <w:t xml:space="preserve">(host user’s home Downloads, resolved at runtime never hardcoded) unless a project declares an override per §11.4.35; §11.4.155 project-prefix + §11.4.154 window-scope/rotation + §11.4.128 git-ignored raw corpus + §11.4.83 curated docs/qa evidence apply.</w:t>
       </w:r>
       <w:r>
         <w:t xml:space="preserve"> </w:t>
@@ -8227,7 +8721,43 @@
         <w:t xml:space="preserve"> </w:t>
       </w:r>
       <w:r>
-        <w:t xml:space="preserve">— after EVERY recording, the agent MUST read the terminal output / video content and verify: (i) feature ACTUALLY WORKS, (ii) LLM responses are REAL, (iii) all tests show PASS, (iv) no "TODO implement" / "simulate" / "for now" patterns, (v) output demonstrates end-user working feature; MUST produce a verdict (PASS/FAIL) with evidence path (§11.4.69).</w:t>
+        <w:t xml:space="preserve">— after EVERY recording, the agent MUST read the terminal output / video content and verify: (i) feature ACTUALLY WORKS, (ii) LLM responses are REAL, (iii) all tests show PASS, (iv) no</w:t>
+      </w:r>
+      <w:r>
+        <w:t xml:space="preserve"> </w:t>
+      </w:r>
+      <w:r>
+        <w:t xml:space="preserve">“TODO implement”</w:t>
+      </w:r>
+      <w:r>
+        <w:t xml:space="preserve"> </w:t>
+      </w:r>
+      <w:r>
+        <w:t xml:space="preserve">/</w:t>
+      </w:r>
+      <w:r>
+        <w:t xml:space="preserve"> </w:t>
+      </w:r>
+      <w:r>
+        <w:t xml:space="preserve">“simulate”</w:t>
+      </w:r>
+      <w:r>
+        <w:t xml:space="preserve"> </w:t>
+      </w:r>
+      <w:r>
+        <w:t xml:space="preserve">/</w:t>
+      </w:r>
+      <w:r>
+        <w:t xml:space="preserve"> </w:t>
+      </w:r>
+      <w:r>
+        <w:t xml:space="preserve">“for now”</w:t>
+      </w:r>
+      <w:r>
+        <w:t xml:space="preserve"> </w:t>
+      </w:r>
+      <w:r>
+        <w:t xml:space="preserve">patterns, (v) output demonstrates end-user working feature; MUST produce a verdict (PASS/FAIL) with evidence path (§11.4.69).</w:t>
       </w:r>
       <w:r>
         <w:t xml:space="preserve"> </w:t>
@@ -8312,7 +8842,7 @@
         <w:t xml:space="preserve"> </w:t>
       </w:r>
       <w:r>
-        <w:t xml:space="preserve">— remove agent's own prior in-scope stale recordings FIRST (§11.4.154).</w:t>
+        <w:t xml:space="preserve">— remove agent’s own prior in-scope stale recordings FIRST (§11.4.154).</w:t>
       </w:r>
       <w:r>
         <w:t xml:space="preserve"> </w:t>
@@ -8328,7 +8858,28 @@
         <w:t xml:space="preserve"> </w:t>
       </w:r>
       <w:r>
-        <w:t xml:space="preserve">— the value of a recording is NOT its duration but its CONTENT; a recording MUST demonstrate the ACTUAL feature being used with REAL results; before accepting ANY recording, the agent MUST verify: expected output patterns ARE present (e.g., test PASS lines, API response data, feature-specific output), the feature ACTUALLY WORKS as demonstrated (not just "something ran"), LLM responses are REAL content (not simulated, not placeholder, not empty), every claim of "working" is backed by visible evidence; a 5-second recording showing a feature working correctly is MORE valuable than a 60-second recording of empty terminal; duration is NOT a proxy for quality.</w:t>
+        <w:t xml:space="preserve">— the value of a recording is NOT its duration but its CONTENT; a recording MUST demonstrate the ACTUAL feature being used with REAL results; before accepting ANY recording, the agent MUST verify: expected output patterns ARE present (e.g., test PASS lines, API response data, feature-specific output), the feature ACTUALLY WORKS as demonstrated (not just</w:t>
+      </w:r>
+      <w:r>
+        <w:t xml:space="preserve"> </w:t>
+      </w:r>
+      <w:r>
+        <w:t xml:space="preserve">“something ran”</w:t>
+      </w:r>
+      <w:r>
+        <w:t xml:space="preserve">), LLM responses are REAL content (not simulated, not placeholder, not empty), every claim of</w:t>
+      </w:r>
+      <w:r>
+        <w:t xml:space="preserve"> </w:t>
+      </w:r>
+      <w:r>
+        <w:t xml:space="preserve">“working”</w:t>
+      </w:r>
+      <w:r>
+        <w:t xml:space="preserve"> </w:t>
+      </w:r>
+      <w:r>
+        <w:t xml:space="preserve">is backed by visible evidence; a 5-second recording showing a feature working correctly is MORE valuable than a 60-second recording of empty terminal; duration is NOT a proxy for quality.</w:t>
       </w:r>
       <w:r>
         <w:t xml:space="preserve"> </w:t>
@@ -8560,7 +9111,7 @@
         <w:t xml:space="preserve"> </w:t>
       </w:r>
       <w:r>
-        <w:t xml:space="preserve">Compact summary: every video recording for feature/QA evidence MUST be processed through a vision/OCR pipeline that reads on-screen content and confirms expected results BEFORE acceptance; the recording system MUST provide a bridge feeding captured frames to HelixQA's test infrastructure (or equivalent) for automated read-the-screen verification against SPECIFY-phase expected patterns (§11.4.159(J)); capture frames at ≤5s intervals, run OCR/vision with self-validated analyzer (§11.4.107(10)), compare text against patterns, produce per-frame PASS/FAIL with evidence path, surface failures immediately for re-record (§11.4.159(L)). Project-configured parameters per §11.4.35. Honest boundary: does NOT replace §11.4.5 quality analysis nor §11.4.108 runtime-signature; FLAG_SECURE uses §11.4.117 proxy oracle. Classification: universal (§11.4.17). Propagation gate</w:t>
+        <w:t xml:space="preserve">Compact summary: every video recording for feature/QA evidence MUST be processed through a vision/OCR pipeline that reads on-screen content and confirms expected results BEFORE acceptance; the recording system MUST provide a bridge feeding captured frames to HelixQA’s test infrastructure (or equivalent) for automated read-the-screen verification against SPECIFY-phase expected patterns (§11.4.159(J)); capture frames at ≤5s intervals, run OCR/vision with self-validated analyzer (§11.4.107(10)), compare text against patterns, produce per-frame PASS/FAIL with evidence path, surface failures immediately for re-record (§11.4.159(L)). Project-configured parameters per §11.4.35. Honest boundary: does NOT replace §11.4.5 quality analysis nor §11.4.108 runtime-signature; FLAG_SECURE uses §11.4.117 proxy oracle. Classification: universal (§11.4.17). Propagation gate</w:t>
       </w:r>
       <w:r>
         <w:t xml:space="preserve"> </w:t>
@@ -8701,18 +9252,7 @@
         <w:t xml:space="preserve"> </w:t>
       </w:r>
       <w:r>
-        <w:t xml:space="preserve">Compact summary: every project with user-facing interfaces MUST use OpenDesign (</w:t>
-      </w:r>
-      <w:hyperlink r:id="rId13">
-        <w:r>
-          <w:rPr>
-            <w:rStyle w:val="Hyperlink"/>
-          </w:rPr>
-          <w:t xml:space="preserve">https://github.com/nexu-io/open-design</w:t>
-        </w:r>
-      </w:hyperlink>
-      <w:r>
-        <w:t xml:space="preserve">) as mandatory UI design system — NOT ad-hoc CSS; install as dependency, use token system for all color (light+dark from brand assets), typography, spacing, component tokens; extend upstream (§11.4.74) for unsupported patterns; every UI component ships light+dark + token-diff regression tests via visual regression; no element overlap/font collision/label overlay. Honest boundary: does NOT replace §11.4.27 functional testing nor §11.4.48/.49 UI testing. Classification: universal (§11.4.17). Propagation gate</w:t>
+        <w:t xml:space="preserve">Compact summary: every project with user-facing interfaces MUST use OpenDesign (https://github.com/nexu-io/open-design) as mandatory UI design system — NOT ad-hoc CSS; install as dependency, use token system for all color (light+dark from brand assets), typography, spacing, component tokens; extend upstream (§11.4.74) for unsupported patterns; every UI component ships light+dark + token-diff regression tests via visual regression; no element overlap/font collision/label overlay. Honest boundary: does NOT replace §11.4.27 functional testing nor §11.4.48/.49 UI testing. Classification: universal (§11.4.17). Propagation gate</w:t>
       </w:r>
       <w:r>
         <w:t xml:space="preserve"> </w:t>
@@ -9054,7 +9594,7 @@
         <w:t xml:space="preserve"> </w:t>
       </w:r>
       <w:r>
-        <w:t xml:space="preserve">GC'd (§11.4.77). (G) every change crosses full gauntlet (§11.4.142/.125/.134/.145 + anti-bluff). (H) stream registry (§11.4.116/.147) + atomic</w:t>
+        <w:t xml:space="preserve">GC’d (§11.4.77). (G) every change crosses full gauntlet (§11.4.142/.125/.134/.145 + anti-bluff). (H) stream registry (§11.4.116/.147) + atomic</w:t>
       </w:r>
       <w:r>
         <w:t xml:space="preserve"> </w:t>
@@ -9298,7 +9838,19 @@
         <w:t xml:space="preserve"> </w:t>
       </w:r>
       <w:r>
-        <w:t xml:space="preserve">MUST FAIL); iterate to clean GO §11.4.134. Forensic FACT (2026-06-23): a "green" Mermaid fix shipped raw gantt source as readable text into user PDFs because validation grepped HTML for</w:t>
+        <w:t xml:space="preserve">MUST FAIL); iterate to clean GO §11.4.134. Forensic FACT (2026-06-23): a</w:t>
+      </w:r>
+      <w:r>
+        <w:t xml:space="preserve"> </w:t>
+      </w:r>
+      <w:r>
+        <w:t xml:space="preserve">“green”</w:t>
+      </w:r>
+      <w:r>
+        <w:t xml:space="preserve"> </w:t>
+      </w:r>
+      <w:r>
+        <w:t xml:space="preserve">Mermaid fix shipped raw gantt source as readable text into user PDFs because validation grepped HTML for</w:t>
       </w:r>
       <w:r>
         <w:t xml:space="preserve"> </w:t>
@@ -9495,7 +10047,43 @@
         <w:t xml:space="preserve"> </w:t>
       </w:r>
       <w:r>
-        <w:t xml:space="preserve">Compact summary: every change to ANY user-facing UI surface (screen/component/view/widget/layout/theme on any platform — Android-Compose, iOS-SwiftUI/UIKit, web, desktop, TUI) MUST be proven by DEVICE-INDEPENDENT host-side RENDERED PIXELS before it may be claimed correct — the real component rendered to a PNG ON THE HOST (NO device, NO emulator, NO running app) via a host-render harness (Compose→Roborazzi/Paparazzi on the JVM; web→Playwright/Storybook snapshot; SwiftUI→snapshot-testing; equivalent per stack), for EVERY relevant screen×state×{light,dark} theme, with the PNG validated by BOTH (i) golden image-diff (per-pixel/perceptual PASS/FAIL) AND (ii) an OCR/vision oracle reading rendered text+labels+control bounds to assert legibility + NO overlap / NO label-over-label / NO clipping / NO off-screen control / NO collapsed-or-giant-unbounded widget (the §11.4.162 layout invariants PROVEN on real pixels). Forensic FACT (2026-06-25): UI work was "validated" by VALUE-EQUALITY unit tests (a hex colour string / an sp/dp size integer / a design-token field == a constant) that NEVER RENDERED A PIXEL — GREEN while the operator opened a broken unbounded giant-button screen. A value/token-equality / property-assertion UI test is FORBIDDEN as the PROOF a UI is correct (it may SUPPLEMENT, NEVER SUBSTITUTE the rendered-pixel proof); a "green" UI suite with no rendered-pixel artefact for the changed surface is a §11.4 PASS-bluff at the visual layer. Self-validated golden-good/golden-bad analyzer §11.4.107(10), thresholds calibrated on the project's own fixtures §11.4.6. "device offline" is NEVER a valid skip — host-render IS the device-independent path; honest §11.4.3 SKIP only where the platform genuinely has no host-render harness (tracked migration item, never a value-only fallback). Honest boundary §11.4.6: host-render proves the COMPONENT renders correctly device-independently per commit — it does NOT prove the running app on real hardware (that remains §11.4.153/.158/.159/.160's live-device recording + read-the-screen layer, which §11.4.170 COMPLEMENTS not replaces — both mandatory), does NOT replace §11.4.162 OpenDesign token/theme governance (§11.4.170 PROVES the rendered RESULT of those tokens), DISTINCT from §11.4.168 exported-document visual validation. Classification: universal (§11.4.17). Composes §11.4.3/.5/.27/.40/.69/.107/.108/.117/.153/.158/.159/.160/.162/.163/.168/.169/§1.1. Propagation gate</w:t>
+        <w:t xml:space="preserve">Compact summary: every change to ANY user-facing UI surface (screen/component/view/widget/layout/theme on any platform — Android-Compose, iOS-SwiftUI/UIKit, web, desktop, TUI) MUST be proven by DEVICE-INDEPENDENT host-side RENDERED PIXELS before it may be claimed correct — the real component rendered to a PNG ON THE HOST (NO device, NO emulator, NO running app) via a host-render harness (Compose→Roborazzi/Paparazzi on the JVM; web→Playwright/Storybook snapshot; SwiftUI→snapshot-testing; equivalent per stack), for EVERY relevant screen×state×{light,dark} theme, with the PNG validated by BOTH (i) golden image-diff (per-pixel/perceptual PASS/FAIL) AND (ii) an OCR/vision oracle reading rendered text+labels+control bounds to assert legibility + NO overlap / NO label-over-label / NO clipping / NO off-screen control / NO collapsed-or-giant-unbounded widget (the §11.4.162 layout invariants PROVEN on real pixels). Forensic FACT (2026-06-25): UI work was</w:t>
+      </w:r>
+      <w:r>
+        <w:t xml:space="preserve"> </w:t>
+      </w:r>
+      <w:r>
+        <w:t xml:space="preserve">“validated”</w:t>
+      </w:r>
+      <w:r>
+        <w:t xml:space="preserve"> </w:t>
+      </w:r>
+      <w:r>
+        <w:t xml:space="preserve">by VALUE-EQUALITY unit tests (a hex colour string / an sp/dp size integer / a design-token field == a constant) that NEVER RENDERED A PIXEL — GREEN while the operator opened a broken unbounded giant-button screen. A value/token-equality / property-assertion UI test is FORBIDDEN as the PROOF a UI is correct (it may SUPPLEMENT, NEVER SUBSTITUTE the rendered-pixel proof); a</w:t>
+      </w:r>
+      <w:r>
+        <w:t xml:space="preserve"> </w:t>
+      </w:r>
+      <w:r>
+        <w:t xml:space="preserve">“green”</w:t>
+      </w:r>
+      <w:r>
+        <w:t xml:space="preserve"> </w:t>
+      </w:r>
+      <w:r>
+        <w:t xml:space="preserve">UI suite with no rendered-pixel artefact for the changed surface is a §11.4 PASS-bluff at the visual layer. Self-validated golden-good/golden-bad analyzer §11.4.107(10), thresholds calibrated on the project’s own fixtures §11.4.6.</w:t>
+      </w:r>
+      <w:r>
+        <w:t xml:space="preserve"> </w:t>
+      </w:r>
+      <w:r>
+        <w:t xml:space="preserve">“device offline”</w:t>
+      </w:r>
+      <w:r>
+        <w:t xml:space="preserve"> </w:t>
+      </w:r>
+      <w:r>
+        <w:t xml:space="preserve">is NEVER a valid skip — host-render IS the device-independent path; honest §11.4.3 SKIP only where the platform genuinely has no host-render harness (tracked migration item, never a value-only fallback). Honest boundary §11.4.6: host-render proves the COMPONENT renders correctly device-independently per commit — it does NOT prove the running app on real hardware (that remains §11.4.153/.158/.159/.160’s live-device recording + read-the-screen layer, which §11.4.170 COMPLEMENTS not replaces — both mandatory), does NOT replace §11.4.162 OpenDesign token/theme governance (§11.4.170 PROVES the rendered RESULT of those tokens), DISTINCT from §11.4.168 exported-document visual validation. Classification: universal (§11.4.17). Composes §11.4.3/.5/.27/.40/.69/.107/.108/.117/.153/.158/.159/.160/.162/.163/.168/.169/§1.1. Propagation gate</w:t>
       </w:r>
       <w:r>
         <w:t xml:space="preserve"> </w:t>
@@ -9660,8 +10248,8 @@
         <w:t xml:space="preserve">flag.</w:t>
       </w:r>
     </w:p>
-    <w:bookmarkEnd w:id="14"/>
-    <w:bookmarkStart w:id="15" w:name="when-in-doubt"/>
+    <w:bookmarkEnd w:id="13"/>
+    <w:bookmarkStart w:id="14" w:name="when-in-doubt"/>
     <w:p>
       <w:pPr>
         <w:pStyle w:val="Heading2"/>
@@ -9781,7 +10369,7 @@
         <w:t xml:space="preserve"> </w:t>
       </w:r>
       <w:r>
-        <w:t xml:space="preserve">Every workable item (ATM-NNN ticket) in the project's workable-items database, Issues.md, Fixed.md, Issues_Summary.md, Fixed_Summary.md, and ALL derived documents MUST carry a comprehensive human-readable description that explains the item in plain, non-technical language suitable for non-developers (project managers, stakeholders, team leads, business partners). The description MUST be 5-7 sentences minimum, written so that ANY person — regardless of technical background — can understand: (a) WHAT the item is (the feature, fix, or task in simple terms); (b) WHY it matters (the user/business value); (c) HOW it works (the mechanism, without code references); (d) WHO benefits (the end user or stakeholder); (e) WHAT the expected outcome is (the measurable result). The description is MANDATORY — an item without a human-readable description is a §11.4 violation at the documentation layer. Descriptions MUST NOT use jargon, acronyms without expansion, code references, or technical implementation details as the primary explanation. Technical details MAY appear as supplementary context AFTER the plain-language explanation. The</w:t>
+        <w:t xml:space="preserve">Every workable item (ATM-NNN ticket) in the project’s workable-items database, Issues.md, Fixed.md, Issues_Summary.md, Fixed_Summary.md, and ALL derived documents MUST carry a comprehensive human-readable description that explains the item in plain, non-technical language suitable for non-developers (project managers, stakeholders, team leads, business partners). The description MUST be 5-7 sentences minimum, written so that ANY person — regardless of technical background — can understand: (a) WHAT the item is (the feature, fix, or task in simple terms); (b) WHY it matters (the user/business value); (c) HOW it works (the mechanism, without code references); (d) WHO benefits (the end user or stakeholder); (e) WHAT the expected outcome is (the measurable result). The description is MANDATORY — an item without a human-readable description is a §11.4 violation at the documentation layer. Descriptions MUST NOT use jargon, acronyms without expansion, code references, or technical implementation details as the primary explanation. Technical details MAY appear as supplementary context AFTER the plain-language explanation. The</w:t>
       </w:r>
       <w:r>
         <w:t xml:space="preserve"> </w:t>
@@ -9955,10 +10543,7 @@
         <w:t xml:space="preserve"> </w:t>
       </w:r>
       <w:r>
-        <w:t xml:space="preserve">submodule (§11.4.76) — NEVER on the bare host. The build containers MUST be DISTRIBUTED to the designated remote build host(s) (e.g.</w:t>
-      </w:r>
-      <w:r>
-        <w:t xml:space="preserve"> </w:t>
+        <w:t xml:space="preserve">submodule (§11.4.76) — NEVER on the bare host. The build containers MUST be DISTRIBUTED to the designated remote build host(s) (e.g. </w:t>
       </w:r>
       <w:r>
         <w:rPr>
@@ -9967,7 +10552,19 @@
         <w:t xml:space="preserve">thinker.local</w:t>
       </w:r>
       <w:r>
-        <w:t xml:space="preserve">) via the SAME containers-submodule distribution mechanism the infra uses (§11.4.76 Distributor / remote compose over SSH, §11.4.161 rootless), so the build EXECUTES on the remote build host (offloading the developer/main host); once the build completes the produced artifacts MUST be brought BACK to the originating main host (scp/rsync/volume copy) for use/flashing/distribution. Building outside a container, or on the bare host, is FORBIDDEN — a release blocker (the "works on my machine" / unreproducible-build class §11.4.76 exists to prevent). The build-host target + build-container definitions are config-injected (§11.4.28, never hardcoded in the submodule); a missing build-container capability is added by EXTENDING the containers submodule upstream (§11.4.74), never by an ad-hoc host build. Honest boundary (§11.4.6): the containerized+distributed build guarantees reproducibility + host-isolation + capacity offload — it does NOT replace the §11.4.40 full-suite retest, §11.4.108 four-layer artifact→runtime verification, or §11.4.38 installable-asset evidence (those still run against the brought-back artifact). Classification: universal (§11.4.17). Composes §11.4.76 (containers submodule — sole orchestration layer), §11.4.161 (rootless runtime), §11.4.74 (extend-don't-reimplement), §11.4.28 (config injection / decoupling), §11.4.24 (build-resource stats), §11.4.82 (iteration speedup — persistent caches in the container), §11.4.121 (no-commit-while-build-writes-artifacts), §11.4.38 (installable-asset evidence on the brought-back artifact), §11.4.108 (artifact→runtime verification), §12.6 (host memory ceiling — offloading the build preserves the main host). Propagation gate</w:t>
+        <w:t xml:space="preserve">) via the SAME containers-submodule distribution mechanism the infra uses (§11.4.76 Distributor / remote compose over SSH, §11.4.161 rootless), so the build EXECUTES on the remote build host (offloading the developer/main host); once the build completes the produced artifacts MUST be brought BACK to the originating main host (scp/rsync/volume copy) for use/flashing/distribution. Building outside a container, or on the bare host, is FORBIDDEN — a release blocker (the</w:t>
+      </w:r>
+      <w:r>
+        <w:t xml:space="preserve"> </w:t>
+      </w:r>
+      <w:r>
+        <w:t xml:space="preserve">“works on my machine”</w:t>
+      </w:r>
+      <w:r>
+        <w:t xml:space="preserve"> </w:t>
+      </w:r>
+      <w:r>
+        <w:t xml:space="preserve">/ unreproducible-build class §11.4.76 exists to prevent). The build-host target + build-container definitions are config-injected (§11.4.28, never hardcoded in the submodule); a missing build-container capability is added by EXTENDING the containers submodule upstream (§11.4.74), never by an ad-hoc host build. Honest boundary (§11.4.6): the containerized+distributed build guarantees reproducibility + host-isolation + capacity offload — it does NOT replace the §11.4.40 full-suite retest, §11.4.108 four-layer artifact→runtime verification, or §11.4.38 installable-asset evidence (those still run against the brought-back artifact). Classification: universal (§11.4.17). Composes §11.4.76 (containers submodule — sole orchestration layer), §11.4.161 (rootless runtime), §11.4.74 (extend-don’t-reimplement), §11.4.28 (config injection / decoupling), §11.4.24 (build-resource stats), §11.4.82 (iteration speedup — persistent caches in the container), §11.4.121 (no-commit-while-build-writes-artifacts), §11.4.38 (installable-asset evidence on the brought-back artifact), §11.4.108 (artifact→runtime verification), §12.6 (host memory ceiling — offloading the build preserves the main host). Propagation gate</w:t>
       </w:r>
       <w:r>
         <w:t xml:space="preserve"> </w:t>
@@ -10123,7 +10720,7 @@
         <w:t xml:space="preserve"> </w:t>
       </w:r>
       <w:r>
-        <w:t xml:space="preserve">On any shared host where other projects/users/agents may run concurrently, every inspection of or action on a process, build, daemon, port, lock, or system-state signal MUST first positively VERIFY the target is OURS before diagnosing or acting. Attribute a process to us ONLY by a strong discriminator — cwd inside this project's tree, argv naming our scripts/artifacts/repo path, a PID we launched + recorded (§11.4.147), or a lock/port path under our tree — NEVER a loose</w:t>
+        <w:t xml:space="preserve">On any shared host where other projects/users/agents may run concurrently, every inspection of or action on a process, build, daemon, port, lock, or system-state signal MUST first positively VERIFY the target is OURS before diagnosing or acting. Attribute a process to us ONLY by a strong discriminator — cwd inside this project’s tree, argv naming our scripts/artifacts/repo path, a PID we launched + recorded (§11.4.147), or a lock/port path under our tree — NEVER a loose</w:t>
       </w:r>
       <w:r>
         <w:t xml:space="preserve"> </w:t>
@@ -10138,7 +10735,7 @@
         <w:t xml:space="preserve"> </w:t>
       </w:r>
       <w:r>
-        <w:t xml:space="preserve">name match (it matches every project on the host). NEVER kill/signal/restart a process not positively ours (other projects' gradle/java/podman/zig are off-limits — operator-workload-safety, §12/§11.4.133); the §12.8 daemon-kill remediation MUST be scoped to OUR daemons. When our work waits on host contention from another project's process, surface it (§11.4.66/§11.4.101) — block-don't-break. Every pgrep/ps filter MUST exclude self-matches + other-project matches. Forensic anchor (FACT 2026-06-29): a 200%-CPU java+gradlew on the shared host was a separate</w:t>
+        <w:t xml:space="preserve">name match (it matches every project on the host). NEVER kill/signal/restart a process not positively ours (other projects’ gradle/java/podman/zig are off-limits — operator-workload-safety, §12/§11.4.133); the §12.8 daemon-kill remediation MUST be scoped to OUR daemons. When our work waits on host contention from another project’s process, surface it (§11.4.66/§11.4.101) — block-don’t-break. Every pgrep/ps filter MUST exclude self-matches + other-project matches. Forensic anchor (FACT 2026-06-29): a 200%-CPU java+gradlew on the shared host was a separate</w:t>
       </w:r>
       <w:r>
         <w:t xml:space="preserve"> </w:t>
@@ -10153,7 +10750,7 @@
         <w:t xml:space="preserve"> </w:t>
       </w:r>
       <w:r>
-        <w:t xml:space="preserve">project's gradle test (cwd=Projects/catalogizer), nearly mis-attributed to our build. Composes §11.4.6/§11.4.66/§11.4.101/§11.4.147/§12/§12.8/§11.4.133. Classification: universal (§11.4.17). Propagation gate</w:t>
+        <w:t xml:space="preserve">project’s gradle test (cwd=Projects/catalogizer), nearly mis-attributed to our build. Composes §11.4.6/§11.4.66/§11.4.101/§11.4.147/§12/§12.8/§11.4.133. Classification: universal (§11.4.17). Propagation gate</w:t>
       </w:r>
       <w:r>
         <w:t xml:space="preserve"> </w:t>
@@ -10318,8 +10915,815 @@
         <w:t xml:space="preserve">The containerized build path (its OWN cgroup + own MemoryMax → OOM-kills ITSELF, never user.slice) MUST use the maximal SAFE fraction of host capacity, computed DYNAMICALLY per host: auto-detect nproc/MemTotal/RLIMIT_NPROC (never hardcode, §11.4.6), reserve explicit host headroom (cores+RAM), scale -j against BOTH the memory model AND the process rlimit (privileged nproc-raise for full -j; EAGAIN-safe -j otherwise), never break/bottleneck/wedge. NO fixed low -j for the containerized path. The §12.6 60% ceiling + bare-metal -j cap REMAIN, SCOPED to user.slice-resident work — §12.11 does NOT weaken §12.6, it scopes it. Classification: universal (§11.4.17). Gate CM-MAXRES-DYNAMIC-BUILD + CM-COVENANT-12-11-PROPAGATION + paired §1.1 mutation. Composes §12.1 §12.2 §12.3 §12.6 §12.10 §11.4.6 §11.4.24 §11.4.133 §9.2 §11.4.35 §12.11.</w:t>
       </w:r>
     </w:p>
+    <w:p>
+      <w:pPr>
+        <w:pStyle w:val="BodyText"/>
+      </w:pPr>
+      <w:r>
+        <w:rPr>
+          <w:b/>
+          <w:bCs/>
+        </w:rPr>
+        <w:t xml:space="preserve">§11.4.177 — Developer-tooling project-decoupling + invocation-directory operation (User mandate, 2026-07-04).</w:t>
+      </w:r>
+      <w:r>
+        <w:t xml:space="preserve"> </w:t>
+      </w:r>
+      <w:r>
+        <w:t xml:space="preserve">Compact summary: no project-specific script / hook / alias / binary may be wired (copied / symlinked / PATH-exported / aliased) into a global or shared developer-tooling PATH; shared tooling MUST be project-agnostic and operate on the INVOCATION directory (cwd / explicit path / config arg), NEVER a hardcoded project path; a project-specific helper lives in + runs from its own repo, a genuinely-reusable helper is promoted to the shared toolkit ONLY after being stripped of every project-specific assumption (paths, device serials, package names, region endpoints) + taking its target from the invocation context; a project script reachable on the global/shared PATH is a decoupling violation of equal severity to importing project-specific code into a shared submodule (§11.4.28); forensic FACT 2026-07-04 — a project cwd-hook symlinked into the global Claude-Toolkit PATH re-coupled every alias to one hardcoded checkout; honest boundary §11.4.6 — decoupling guarantees project-agnostic, not correct (still needs the tool’s own tests). Classification: universal (§11.4.17). Composes §11.4.28/.29/.35/.11/.6. Propagation gate</w:t>
+      </w:r>
+      <w:r>
+        <w:t xml:space="preserve"> </w:t>
+      </w:r>
+      <w:r>
+        <w:rPr>
+          <w:rStyle w:val="VerbatimChar"/>
+        </w:rPr>
+        <w:t xml:space="preserve">CM-COVENANT-114-177-PROPAGATION</w:t>
+      </w:r>
+      <w:r>
+        <w:t xml:space="preserve"> </w:t>
+      </w:r>
+      <w:r>
+        <w:t xml:space="preserve">(literal</w:t>
+      </w:r>
+      <w:r>
+        <w:t xml:space="preserve"> </w:t>
+      </w:r>
+      <w:r>
+        <w:rPr>
+          <w:rStyle w:val="VerbatimChar"/>
+        </w:rPr>
+        <w:t xml:space="preserve">11.4.177</w:t>
+      </w:r>
+      <w:r>
+        <w:t xml:space="preserve">) + recommended gate</w:t>
+      </w:r>
+      <w:r>
+        <w:t xml:space="preserve"> </w:t>
+      </w:r>
+      <w:r>
+        <w:rPr>
+          <w:rStyle w:val="VerbatimChar"/>
+        </w:rPr>
+        <w:t xml:space="preserve">CM-TOOLING-PROJECT-DECOUPLED</w:t>
+      </w:r>
+      <w:r>
+        <w:t xml:space="preserve"> </w:t>
+      </w:r>
+      <w:r>
+        <w:t xml:space="preserve">+ paired §1.1 mutation.</w:t>
+      </w:r>
+      <w:r>
+        <w:t xml:space="preserve"> </w:t>
+      </w:r>
+      <w:r>
+        <w:rPr>
+          <w:b/>
+          <w:bCs/>
+        </w:rPr>
+        <w:t xml:space="preserve">Canonical authority:</w:t>
+      </w:r>
+      <w:r>
+        <w:t xml:space="preserve"> </w:t>
+      </w:r>
+      <w:r>
+        <w:t xml:space="preserve">constitution submodule</w:t>
+      </w:r>
+      <w:r>
+        <w:t xml:space="preserve"> </w:t>
+      </w:r>
+      <w:hyperlink r:id="rId10">
+        <w:r>
+          <w:rPr>
+            <w:rStyle w:val="VerbatimChar"/>
+          </w:rPr>
+          <w:t xml:space="preserve">Constitution.md</w:t>
+        </w:r>
+      </w:hyperlink>
+      <w:r>
+        <w:t xml:space="preserve"> </w:t>
+      </w:r>
+      <w:r>
+        <w:t xml:space="preserve">§11.4.177. Non-compliance is a release blocker. No escape hatch — no</w:t>
+      </w:r>
+      <w:r>
+        <w:t xml:space="preserve"> </w:t>
+      </w:r>
+      <w:r>
+        <w:rPr>
+          <w:rStyle w:val="VerbatimChar"/>
+        </w:rPr>
+        <w:t xml:space="preserve">--global-symlink-ok</w:t>
+      </w:r>
+      <w:r>
+        <w:t xml:space="preserve">,</w:t>
+      </w:r>
+      <w:r>
+        <w:t xml:space="preserve"> </w:t>
+      </w:r>
+      <w:r>
+        <w:rPr>
+          <w:rStyle w:val="VerbatimChar"/>
+        </w:rPr>
+        <w:t xml:space="preserve">--hardcode-project-path</w:t>
+      </w:r>
+      <w:r>
+        <w:t xml:space="preserve">,</w:t>
+      </w:r>
+      <w:r>
+        <w:t xml:space="preserve"> </w:t>
+      </w:r>
+      <w:r>
+        <w:rPr>
+          <w:rStyle w:val="VerbatimChar"/>
+        </w:rPr>
+        <w:t xml:space="preserve">--wire-into-shared-path</w:t>
+      </w:r>
+      <w:r>
+        <w:t xml:space="preserve"> </w:t>
+      </w:r>
+      <w:r>
+        <w:t xml:space="preserve">flag.</w:t>
+      </w:r>
+    </w:p>
+    <w:p>
+      <w:pPr>
+        <w:pStyle w:val="BodyText"/>
+      </w:pPr>
+      <w:r>
+        <w:rPr>
+          <w:b/>
+          <w:bCs/>
+        </w:rPr>
+        <w:t xml:space="preserve">§11.4.178 — Track-qualified identity for parallel work streams (session-name collision ban) (User mandate, 2026-07-04).</w:t>
+      </w:r>
+      <w:r>
+        <w:t xml:space="preserve"> </w:t>
+      </w:r>
+      <w:r>
+        <w:t xml:space="preserve">Compact summary: parallel work streams sharing hardware / a git backing store / a tmux-session namespace / a lock namespace / any single-owner resource MUST be addressed by a TRACK-QUALIFIED identity (</w:t>
+      </w:r>
+      <w:r>
+        <w:rPr>
+          <w:rStyle w:val="VerbatimChar"/>
+        </w:rPr>
+        <w:t xml:space="preserve">&lt;project&gt;__&lt;track&gt;__&lt;role&gt;</w:t>
+      </w:r>
+      <w:r>
+        <w:t xml:space="preserve">), NEVER a bare directory basename; multiple checkouts/clones/worktrees sharing basename</w:t>
+      </w:r>
+      <w:r>
+        <w:t xml:space="preserve"> </w:t>
+      </w:r>
+      <w:r>
+        <w:rPr>
+          <w:rStyle w:val="VerbatimChar"/>
+        </w:rPr>
+        <w:t xml:space="preserve">atmosphere</w:t>
+      </w:r>
+      <w:r>
+        <w:t xml:space="preserve"> </w:t>
+      </w:r>
+      <w:r>
+        <w:t xml:space="preserve">collapse into one session/lock/log key + cross-wire tmux targets, lock files, device claims, log dirs (observed collision 2026-07-04); every registry row / session name / lock path / log dir / device claim for a ≥2-concurrent-claimant resource MUST carry the track-qualified key, a bare-basename identity for such a resource is a violation; honest boundary §11.4.6 — a unique identity prevents cross-wiring, it does not itself arbitrate ownership (that is §11.4.119 +</w:t>
+      </w:r>
+      <w:r>
+        <w:t xml:space="preserve"> </w:t>
+      </w:r>
+      <w:r>
+        <w:rPr>
+          <w:b/>
+          <w:bCs/>
+        </w:rPr>
+        <w:t xml:space="preserve">§11.4.176</w:t>
+      </w:r>
+      <w:r>
+        <w:t xml:space="preserve"> </w:t>
+      </w:r>
+      <w:r>
+        <w:t xml:space="preserve">(the multi-track work-division + exactly-once-claim + device-lock arbitration anchor)). Classification: universal (§11.4.17). Composes §11.4.111/.119/.29/.58 +</w:t>
+      </w:r>
+      <w:r>
+        <w:t xml:space="preserve"> </w:t>
+      </w:r>
+      <w:r>
+        <w:rPr>
+          <w:b/>
+          <w:bCs/>
+        </w:rPr>
+        <w:t xml:space="preserve">§11.4.176</w:t>
+      </w:r>
+      <w:r>
+        <w:t xml:space="preserve"> </w:t>
+      </w:r>
+      <w:r>
+        <w:t xml:space="preserve">(the multi-track work-division + exactly-once-claim + device-lock arbitration anchor). Propagation gate</w:t>
+      </w:r>
+      <w:r>
+        <w:t xml:space="preserve"> </w:t>
+      </w:r>
+      <w:r>
+        <w:rPr>
+          <w:rStyle w:val="VerbatimChar"/>
+        </w:rPr>
+        <w:t xml:space="preserve">CM-COVENANT-114-178-PROPAGATION</w:t>
+      </w:r>
+      <w:r>
+        <w:t xml:space="preserve"> </w:t>
+      </w:r>
+      <w:r>
+        <w:t xml:space="preserve">(literal</w:t>
+      </w:r>
+      <w:r>
+        <w:t xml:space="preserve"> </w:t>
+      </w:r>
+      <w:r>
+        <w:rPr>
+          <w:rStyle w:val="VerbatimChar"/>
+        </w:rPr>
+        <w:t xml:space="preserve">11.4.178</w:t>
+      </w:r>
+      <w:r>
+        <w:t xml:space="preserve">) + recommended gate</w:t>
+      </w:r>
+      <w:r>
+        <w:t xml:space="preserve"> </w:t>
+      </w:r>
+      <w:r>
+        <w:rPr>
+          <w:rStyle w:val="VerbatimChar"/>
+        </w:rPr>
+        <w:t xml:space="preserve">CM-TRACK-QUALIFIED-IDENTITY</w:t>
+      </w:r>
+      <w:r>
+        <w:t xml:space="preserve"> </w:t>
+      </w:r>
+      <w:r>
+        <w:t xml:space="preserve">+ paired §1.1 mutation.</w:t>
+      </w:r>
+      <w:r>
+        <w:t xml:space="preserve"> </w:t>
+      </w:r>
+      <w:r>
+        <w:rPr>
+          <w:b/>
+          <w:bCs/>
+        </w:rPr>
+        <w:t xml:space="preserve">Canonical authority:</w:t>
+      </w:r>
+      <w:r>
+        <w:t xml:space="preserve"> </w:t>
+      </w:r>
+      <w:r>
+        <w:t xml:space="preserve">constitution submodule</w:t>
+      </w:r>
+      <w:r>
+        <w:t xml:space="preserve"> </w:t>
+      </w:r>
+      <w:hyperlink r:id="rId10">
+        <w:r>
+          <w:rPr>
+            <w:rStyle w:val="VerbatimChar"/>
+          </w:rPr>
+          <w:t xml:space="preserve">Constitution.md</w:t>
+        </w:r>
+      </w:hyperlink>
+      <w:r>
+        <w:t xml:space="preserve"> </w:t>
+      </w:r>
+      <w:r>
+        <w:t xml:space="preserve">§11.4.178. Non-compliance is a release blocker. No escape hatch — no</w:t>
+      </w:r>
+      <w:r>
+        <w:t xml:space="preserve"> </w:t>
+      </w:r>
+      <w:r>
+        <w:rPr>
+          <w:rStyle w:val="VerbatimChar"/>
+        </w:rPr>
+        <w:t xml:space="preserve">--bare-basename-ok</w:t>
+      </w:r>
+      <w:r>
+        <w:t xml:space="preserve">,</w:t>
+      </w:r>
+      <w:r>
+        <w:t xml:space="preserve"> </w:t>
+      </w:r>
+      <w:r>
+        <w:rPr>
+          <w:rStyle w:val="VerbatimChar"/>
+        </w:rPr>
+        <w:t xml:space="preserve">--skip-track-qualifier</w:t>
+      </w:r>
+      <w:r>
+        <w:t xml:space="preserve">,</w:t>
+      </w:r>
+      <w:r>
+        <w:t xml:space="preserve"> </w:t>
+      </w:r>
+      <w:r>
+        <w:rPr>
+          <w:rStyle w:val="VerbatimChar"/>
+        </w:rPr>
+        <w:t xml:space="preserve">--shared-session-name</w:t>
+      </w:r>
+      <w:r>
+        <w:t xml:space="preserve"> </w:t>
+      </w:r>
+      <w:r>
+        <w:t xml:space="preserve">flag.</w:t>
+      </w:r>
+    </w:p>
+    <w:p>
+      <w:pPr>
+        <w:pStyle w:val="BodyText"/>
+      </w:pPr>
+      <w:r>
+        <w:rPr>
+          <w:b/>
+          <w:bCs/>
+        </w:rPr>
+        <w:t xml:space="preserve">§11.4.179 — Corruption-isolated parallel git streams (own-.git independent clones, not shared-common-dir worktrees) (User mandate, 2026-07-04).</w:t>
+      </w:r>
+      <w:r>
+        <w:t xml:space="preserve"> </w:t>
+      </w:r>
+      <w:r>
+        <w:t xml:space="preserve">Compact summary: when corruption-isolation is a requirement, parallel git work streams MUST each be an isolated repo with its OWN</w:t>
+      </w:r>
+      <w:r>
+        <w:t xml:space="preserve"> </w:t>
+      </w:r>
+      <w:r>
+        <w:rPr>
+          <w:rStyle w:val="VerbatimChar"/>
+        </w:rPr>
+        <w:t xml:space="preserve">.git</w:t>
+      </w:r>
+      <w:r>
+        <w:t xml:space="preserve"> </w:t>
+      </w:r>
+      <w:r>
+        <w:t xml:space="preserve">(own object store, own index, own lock namespace), NOT</w:t>
+      </w:r>
+      <w:r>
+        <w:t xml:space="preserve"> </w:t>
+      </w:r>
+      <w:r>
+        <w:rPr>
+          <w:rStyle w:val="VerbatimChar"/>
+        </w:rPr>
+        <w:t xml:space="preserve">git worktree</w:t>
+      </w:r>
+      <w:r>
+        <w:t xml:space="preserve"> </w:t>
+      </w:r>
+      <w:r>
+        <w:t xml:space="preserve">checkouts sharing one common</w:t>
+      </w:r>
+      <w:r>
+        <w:t xml:space="preserve"> </w:t>
+      </w:r>
+      <w:r>
+        <w:rPr>
+          <w:rStyle w:val="VerbatimChar"/>
+        </w:rPr>
+        <w:t xml:space="preserve">.git</w:t>
+      </w:r>
+      <w:r>
+        <w:t xml:space="preserve">; a shared common-dir is a single point of failure — one stale</w:t>
+      </w:r>
+      <w:r>
+        <w:t xml:space="preserve"> </w:t>
+      </w:r>
+      <w:r>
+        <w:rPr>
+          <w:rStyle w:val="VerbatimChar"/>
+        </w:rPr>
+        <w:t xml:space="preserve">index.lock</w:t>
+      </w:r>
+      <w:r>
+        <w:t xml:space="preserve"> </w:t>
+      </w:r>
+      <w:r>
+        <w:t xml:space="preserve">/</w:t>
+      </w:r>
+      <w:r>
+        <w:t xml:space="preserve"> </w:t>
+      </w:r>
+      <w:r>
+        <w:rPr>
+          <w:rStyle w:val="VerbatimChar"/>
+        </w:rPr>
+        <w:t xml:space="preserve">.commit_all.lock</w:t>
+      </w:r>
+      <w:r>
+        <w:t xml:space="preserve"> </w:t>
+      </w:r>
+      <w:r>
+        <w:t xml:space="preserve">/</w:t>
+      </w:r>
+      <w:r>
+        <w:t xml:space="preserve"> </w:t>
+      </w:r>
+      <w:r>
+        <w:rPr>
+          <w:rStyle w:val="VerbatimChar"/>
+        </w:rPr>
+        <w:t xml:space="preserve">.push_all.lock</w:t>
+      </w:r>
+      <w:r>
+        <w:t xml:space="preserve"> </w:t>
+      </w:r>
+      <w:r>
+        <w:t xml:space="preserve">freezes EVERY stream at once (observed 9-h all-track freeze 2026-07-04) + one corrupted object store loses every stream; each stream’s</w:t>
+      </w:r>
+      <w:r>
+        <w:t xml:space="preserve"> </w:t>
+      </w:r>
+      <w:r>
+        <w:rPr>
+          <w:rStyle w:val="VerbatimChar"/>
+        </w:rPr>
+        <w:t xml:space="preserve">git rev-parse --git-common-dir</w:t>
+      </w:r>
+      <w:r>
+        <w:t xml:space="preserve"> </w:t>
+      </w:r>
+      <w:r>
+        <w:t xml:space="preserve">MUST resolve INSIDE its own tree, a common-dir resolving to a shared parent is a violation; where CoW/reflink disk-feasibility is the constraint use the §11.4.167 reflink-clone-with-own-</w:t>
+      </w:r>
+      <w:r>
+        <w:rPr>
+          <w:rStyle w:val="VerbatimChar"/>
+        </w:rPr>
+        <w:t xml:space="preserve">.git</w:t>
+      </w:r>
+      <w:r>
+        <w:t xml:space="preserve"> </w:t>
+      </w:r>
+      <w:r>
+        <w:t xml:space="preserve">path (btrfs/XFS/ZFS/APFS reflink shares extents on disk while keeping a per-stream</w:t>
+      </w:r>
+      <w:r>
+        <w:t xml:space="preserve"> </w:t>
+      </w:r>
+      <w:r>
+        <w:rPr>
+          <w:rStyle w:val="VerbatimChar"/>
+        </w:rPr>
+        <w:t xml:space="preserve">.git</w:t>
+      </w:r>
+      <w:r>
+        <w:t xml:space="preserve">, so isolation + disk-feasibility both hold); honest boundary §11.4.6 — own-</w:t>
+      </w:r>
+      <w:r>
+        <w:rPr>
+          <w:rStyle w:val="VerbatimChar"/>
+        </w:rPr>
+        <w:t xml:space="preserve">.git</w:t>
+      </w:r>
+      <w:r>
+        <w:t xml:space="preserve"> </w:t>
+      </w:r>
+      <w:r>
+        <w:t xml:space="preserve">contains lock/corruption blast radius, it does NOT remove per-repo stale-lock reaping (§11.4.180) nor ff-only no-force integration (§11.4.113). Classification: universal (§11.4.17). Composes §11.4.167/.119/.58/§9.2 +</w:t>
+      </w:r>
+      <w:r>
+        <w:t xml:space="preserve"> </w:t>
+      </w:r>
+      <w:r>
+        <w:rPr>
+          <w:b/>
+          <w:bCs/>
+        </w:rPr>
+        <w:t xml:space="preserve">§11.4.176</w:t>
+      </w:r>
+      <w:r>
+        <w:t xml:space="preserve"> </w:t>
+      </w:r>
+      <w:r>
+        <w:t xml:space="preserve">(the multi-track work-division + exactly-once-claim + device-lock arbitration anchor). Propagation gate</w:t>
+      </w:r>
+      <w:r>
+        <w:t xml:space="preserve"> </w:t>
+      </w:r>
+      <w:r>
+        <w:rPr>
+          <w:rStyle w:val="VerbatimChar"/>
+        </w:rPr>
+        <w:t xml:space="preserve">CM-COVENANT-114-179-PROPAGATION</w:t>
+      </w:r>
+      <w:r>
+        <w:t xml:space="preserve"> </w:t>
+      </w:r>
+      <w:r>
+        <w:t xml:space="preserve">(literal</w:t>
+      </w:r>
+      <w:r>
+        <w:t xml:space="preserve"> </w:t>
+      </w:r>
+      <w:r>
+        <w:rPr>
+          <w:rStyle w:val="VerbatimChar"/>
+        </w:rPr>
+        <w:t xml:space="preserve">11.4.179</w:t>
+      </w:r>
+      <w:r>
+        <w:t xml:space="preserve">) + recommended gate</w:t>
+      </w:r>
+      <w:r>
+        <w:t xml:space="preserve"> </w:t>
+      </w:r>
+      <w:r>
+        <w:rPr>
+          <w:rStyle w:val="VerbatimChar"/>
+        </w:rPr>
+        <w:t xml:space="preserve">CM-GIT-STREAMS-OWN-COMMON-DIR</w:t>
+      </w:r>
+      <w:r>
+        <w:t xml:space="preserve"> </w:t>
+      </w:r>
+      <w:r>
+        <w:t xml:space="preserve">+ paired §1.1 mutation.</w:t>
+      </w:r>
+      <w:r>
+        <w:t xml:space="preserve"> </w:t>
+      </w:r>
+      <w:r>
+        <w:rPr>
+          <w:b/>
+          <w:bCs/>
+        </w:rPr>
+        <w:t xml:space="preserve">Canonical authority:</w:t>
+      </w:r>
+      <w:r>
+        <w:t xml:space="preserve"> </w:t>
+      </w:r>
+      <w:r>
+        <w:t xml:space="preserve">constitution submodule</w:t>
+      </w:r>
+      <w:r>
+        <w:t xml:space="preserve"> </w:t>
+      </w:r>
+      <w:hyperlink r:id="rId10">
+        <w:r>
+          <w:rPr>
+            <w:rStyle w:val="VerbatimChar"/>
+          </w:rPr>
+          <w:t xml:space="preserve">Constitution.md</w:t>
+        </w:r>
+      </w:hyperlink>
+      <w:r>
+        <w:t xml:space="preserve"> </w:t>
+      </w:r>
+      <w:r>
+        <w:t xml:space="preserve">§11.4.179. Non-compliance is a release blocker. No escape hatch — no</w:t>
+      </w:r>
+      <w:r>
+        <w:t xml:space="preserve"> </w:t>
+      </w:r>
+      <w:r>
+        <w:rPr>
+          <w:rStyle w:val="VerbatimChar"/>
+        </w:rPr>
+        <w:t xml:space="preserve">--shared-common-git</w:t>
+      </w:r>
+      <w:r>
+        <w:t xml:space="preserve">,</w:t>
+      </w:r>
+      <w:r>
+        <w:t xml:space="preserve"> </w:t>
+      </w:r>
+      <w:r>
+        <w:rPr>
+          <w:rStyle w:val="VerbatimChar"/>
+        </w:rPr>
+        <w:t xml:space="preserve">--worktree-when-isolation-required</w:t>
+      </w:r>
+      <w:r>
+        <w:t xml:space="preserve">,</w:t>
+      </w:r>
+      <w:r>
+        <w:t xml:space="preserve"> </w:t>
+      </w:r>
+      <w:r>
+        <w:rPr>
+          <w:rStyle w:val="VerbatimChar"/>
+        </w:rPr>
+        <w:t xml:space="preserve">--skip-git-isolation</w:t>
+      </w:r>
+      <w:r>
+        <w:t xml:space="preserve"> </w:t>
+      </w:r>
+      <w:r>
+        <w:t xml:space="preserve">flag.</w:t>
+      </w:r>
+    </w:p>
+    <w:p>
+      <w:pPr>
+        <w:pStyle w:val="BodyText"/>
+      </w:pPr>
+      <w:r>
+        <w:rPr>
+          <w:b/>
+          <w:bCs/>
+        </w:rPr>
+        <w:t xml:space="preserve">§11.4.180 — Commit/push (single-writer) wrappers MUST auto-reap provably-stale locks before acquiring (User mandate, 2026-07-04).</w:t>
+      </w:r>
+      <w:r>
+        <w:t xml:space="preserve"> </w:t>
+      </w:r>
+      <w:r>
+        <w:t xml:space="preserve">Compact summary: every commit / push / single-writer wrapper MUST, before acquiring its own lock, auto-reap any PROVABLY-stale git lock — one whose recorded holder PID is DEAD (</w:t>
+      </w:r>
+      <w:r>
+        <w:rPr>
+          <w:rStyle w:val="VerbatimChar"/>
+        </w:rPr>
+        <w:t xml:space="preserve">kill -0</w:t>
+      </w:r>
+      <w:r>
+        <w:t xml:space="preserve"> </w:t>
+      </w:r>
+      <w:r>
+        <w:t xml:space="preserve">fails), OR (no PID recorded) older than a defined threshold AND with no live wrapper/git process holding that repo; the reap covers the wrapper’s own lock plus the git-internal existence-based locks (</w:t>
+      </w:r>
+      <w:r>
+        <w:rPr>
+          <w:rStyle w:val="VerbatimChar"/>
+        </w:rPr>
+        <w:t xml:space="preserve">index.lock</w:t>
+      </w:r>
+      <w:r>
+        <w:t xml:space="preserve">,</w:t>
+      </w:r>
+      <w:r>
+        <w:t xml:space="preserve"> </w:t>
+      </w:r>
+      <w:r>
+        <w:rPr>
+          <w:rStyle w:val="VerbatimChar"/>
+        </w:rPr>
+        <w:t xml:space="preserve">HEAD.lock</w:t>
+      </w:r>
+      <w:r>
+        <w:t xml:space="preserve">,</w:t>
+      </w:r>
+      <w:r>
+        <w:t xml:space="preserve"> </w:t>
+      </w:r>
+      <w:r>
+        <w:rPr>
+          <w:rStyle w:val="VerbatimChar"/>
+        </w:rPr>
+        <w:t xml:space="preserve">refs/**/*.lock</w:t>
+      </w:r>
+      <w:r>
+        <w:t xml:space="preserve">) git does NOT auto-release on holder death; it MUST NEVER remove a lock whose holder is ALIVE (removing a live-held lock corrupts a concurrent writer — §9.2); each reap decision (REAPED / KEPT + reason) is logged as captured evidence (§11.4.6 — liveness PROVEN via</w:t>
+      </w:r>
+      <w:r>
+        <w:t xml:space="preserve"> </w:t>
+      </w:r>
+      <w:r>
+        <w:rPr>
+          <w:rStyle w:val="VerbatimChar"/>
+        </w:rPr>
+        <w:t xml:space="preserve">kill -0</w:t>
+      </w:r>
+      <w:r>
+        <w:t xml:space="preserve">, never assumed); a wrapper that blocks indefinitely on a dead-holder lock (observed 9-h freeze 2026-07-04) is a violation; honest boundary §11.4.6 — reaping clears dead-holder deadlock, it does NOT substitute for the own-</w:t>
+      </w:r>
+      <w:r>
+        <w:rPr>
+          <w:rStyle w:val="VerbatimChar"/>
+        </w:rPr>
+        <w:t xml:space="preserve">.git</w:t>
+      </w:r>
+      <w:r>
+        <w:t xml:space="preserve"> </w:t>
+      </w:r>
+      <w:r>
+        <w:t xml:space="preserve">isolation of §11.4.179. Classification: universal (§11.4.17). Composes §11.4.84/.88/.6/§9.2/§11.4.116/§11.4.179. Propagation gate</w:t>
+      </w:r>
+      <w:r>
+        <w:t xml:space="preserve"> </w:t>
+      </w:r>
+      <w:r>
+        <w:rPr>
+          <w:rStyle w:val="VerbatimChar"/>
+        </w:rPr>
+        <w:t xml:space="preserve">CM-COVENANT-114-180-PROPAGATION</w:t>
+      </w:r>
+      <w:r>
+        <w:t xml:space="preserve"> </w:t>
+      </w:r>
+      <w:r>
+        <w:t xml:space="preserve">(literal</w:t>
+      </w:r>
+      <w:r>
+        <w:t xml:space="preserve"> </w:t>
+      </w:r>
+      <w:r>
+        <w:rPr>
+          <w:rStyle w:val="VerbatimChar"/>
+        </w:rPr>
+        <w:t xml:space="preserve">11.4.180</w:t>
+      </w:r>
+      <w:r>
+        <w:t xml:space="preserve">) + recommended gate</w:t>
+      </w:r>
+      <w:r>
+        <w:t xml:space="preserve"> </w:t>
+      </w:r>
+      <w:r>
+        <w:rPr>
+          <w:rStyle w:val="VerbatimChar"/>
+        </w:rPr>
+        <w:t xml:space="preserve">CM-WRAPPER-STALE-LOCK-AUTO-REAP</w:t>
+      </w:r>
+      <w:r>
+        <w:t xml:space="preserve"> </w:t>
+      </w:r>
+      <w:r>
+        <w:t xml:space="preserve">+ paired §1.1 mutation.</w:t>
+      </w:r>
+      <w:r>
+        <w:t xml:space="preserve"> </w:t>
+      </w:r>
+      <w:r>
+        <w:rPr>
+          <w:b/>
+          <w:bCs/>
+        </w:rPr>
+        <w:t xml:space="preserve">Canonical authority:</w:t>
+      </w:r>
+      <w:r>
+        <w:t xml:space="preserve"> </w:t>
+      </w:r>
+      <w:r>
+        <w:t xml:space="preserve">constitution submodule</w:t>
+      </w:r>
+      <w:r>
+        <w:t xml:space="preserve"> </w:t>
+      </w:r>
+      <w:hyperlink r:id="rId10">
+        <w:r>
+          <w:rPr>
+            <w:rStyle w:val="VerbatimChar"/>
+          </w:rPr>
+          <w:t xml:space="preserve">Constitution.md</w:t>
+        </w:r>
+      </w:hyperlink>
+      <w:r>
+        <w:t xml:space="preserve"> </w:t>
+      </w:r>
+      <w:r>
+        <w:t xml:space="preserve">§11.4.180. Non-compliance is a release blocker. No escape hatch — no</w:t>
+      </w:r>
+      <w:r>
+        <w:t xml:space="preserve"> </w:t>
+      </w:r>
+      <w:r>
+        <w:rPr>
+          <w:rStyle w:val="VerbatimChar"/>
+        </w:rPr>
+        <w:t xml:space="preserve">--skip-stale-lock-reap</w:t>
+      </w:r>
+      <w:r>
+        <w:t xml:space="preserve">,</w:t>
+      </w:r>
+      <w:r>
+        <w:t xml:space="preserve"> </w:t>
+      </w:r>
+      <w:r>
+        <w:rPr>
+          <w:rStyle w:val="VerbatimChar"/>
+        </w:rPr>
+        <w:t xml:space="preserve">--force-remove-live-lock</w:t>
+      </w:r>
+      <w:r>
+        <w:t xml:space="preserve">,</w:t>
+      </w:r>
+      <w:r>
+        <w:t xml:space="preserve"> </w:t>
+      </w:r>
+      <w:r>
+        <w:rPr>
+          <w:rStyle w:val="VerbatimChar"/>
+        </w:rPr>
+        <w:t xml:space="preserve">--block-on-dead-holder</w:t>
+      </w:r>
+      <w:r>
+        <w:t xml:space="preserve"> </w:t>
+      </w:r>
+      <w:r>
+        <w:t xml:space="preserve">flag.</w:t>
+      </w:r>
+    </w:p>
+    <w:bookmarkEnd w:id="14"/>
     <w:bookmarkEnd w:id="15"/>
-    <w:bookmarkEnd w:id="16"/>
     <w:sectPr>
       <w:footnotePr>
         <w:numRestart w:val="eachSect"/>

</xml_diff>